<commit_message>
docs: clarify thesis citations and toc formatting
</commit_message>
<xml_diff>
--- a/docs/thesis/drafts/论文正文_程浩然_基于LangGraph的多Agent协作框架在医疗审计场景的设计与实现.docx
+++ b/docs/thesis/drafts/论文正文_程浩然_基于LangGraph的多Agent协作框架在医疗审计场景的设计与实现.docx
@@ -422,930 +422,1511 @@
         <w:t>目    录</w:t>
       </w:r>
     </w:p>
-    <w:p>
-      <w:pPr>
-        <w:tabs>
-          <w:tab w:pos="8617" w:val="right" w:leader="dot"/>
-        </w:tabs>
-        <w:spacing w:after="40" w:line="360" w:lineRule="exact"/>
-        <w:ind w:left="0"/>
-      </w:pPr>
-      <w:r>
-        <w:rPr>
-          <w:rFonts w:ascii="宋体" w:hAnsi="宋体" w:eastAsia="宋体" w:cs="宋体"/>
-          <w:b/>
-          <w:sz w:val="22"/>
-        </w:rPr>
-        <w:t>摘要（中文）</w:t>
-      </w:r>
-      <w:r>
-        <w:tab/>
-      </w:r>
-      <w:r>
-        <w:rPr>
-          <w:rFonts w:ascii="宋体" w:hAnsi="宋体" w:eastAsia="宋体" w:cs="宋体"/>
-          <w:b/>
-          <w:sz w:val="21"/>
-        </w:rPr>
-        <w:t>I</w:t>
-      </w:r>
-    </w:p>
-    <w:p>
-      <w:pPr>
-        <w:tabs>
-          <w:tab w:pos="8617" w:val="right" w:leader="dot"/>
-        </w:tabs>
-        <w:spacing w:after="40" w:line="360" w:lineRule="exact"/>
-        <w:ind w:left="369"/>
-      </w:pPr>
-      <w:r>
-        <w:rPr>
-          <w:rFonts w:ascii="宋体" w:hAnsi="宋体" w:eastAsia="宋体" w:cs="宋体"/>
-          <w:b w:val="0"/>
-          <w:sz w:val="21"/>
-        </w:rPr>
-        <w:t>（英文）</w:t>
-      </w:r>
-      <w:r>
-        <w:tab/>
-      </w:r>
-      <w:r>
-        <w:rPr>
-          <w:rFonts w:ascii="宋体" w:hAnsi="宋体" w:eastAsia="宋体" w:cs="宋体"/>
-          <w:b w:val="0"/>
-          <w:sz w:val="21"/>
-        </w:rPr>
-        <w:t>II</w:t>
-      </w:r>
-    </w:p>
-    <w:p>
-      <w:pPr>
-        <w:tabs>
-          <w:tab w:pos="8617" w:val="right" w:leader="dot"/>
-        </w:tabs>
-        <w:spacing w:after="40" w:line="360" w:lineRule="exact"/>
-        <w:ind w:left="0"/>
-      </w:pPr>
-      <w:r>
-        <w:rPr>
-          <w:rFonts w:ascii="宋体" w:hAnsi="宋体" w:eastAsia="宋体" w:cs="宋体"/>
-          <w:b/>
-          <w:sz w:val="22"/>
-        </w:rPr>
-        <w:t>第一章 绪论</w:t>
-      </w:r>
-      <w:r>
-        <w:tab/>
-      </w:r>
-      <w:r>
-        <w:rPr>
-          <w:rFonts w:ascii="宋体" w:hAnsi="宋体" w:eastAsia="宋体" w:cs="宋体"/>
-          <w:b/>
-          <w:sz w:val="21"/>
-        </w:rPr>
-        <w:t>1</w:t>
-      </w:r>
-    </w:p>
-    <w:p>
-      <w:pPr>
-        <w:tabs>
-          <w:tab w:pos="8617" w:val="right" w:leader="dot"/>
-        </w:tabs>
-        <w:spacing w:after="40" w:line="360" w:lineRule="exact"/>
-        <w:ind w:left="369"/>
-      </w:pPr>
-      <w:r>
-        <w:rPr>
-          <w:rFonts w:ascii="宋体" w:hAnsi="宋体" w:eastAsia="宋体" w:cs="宋体"/>
-          <w:b w:val="0"/>
-          <w:sz w:val="21"/>
-        </w:rPr>
-        <w:t>1.1 实现背景和意义</w:t>
-      </w:r>
-      <w:r>
-        <w:tab/>
-      </w:r>
-      <w:r>
-        <w:rPr>
-          <w:rFonts w:ascii="宋体" w:hAnsi="宋体" w:eastAsia="宋体" w:cs="宋体"/>
-          <w:b w:val="0"/>
-          <w:sz w:val="21"/>
-        </w:rPr>
-        <w:t>1</w:t>
-      </w:r>
-    </w:p>
-    <w:p>
-      <w:pPr>
-        <w:tabs>
-          <w:tab w:pos="8617" w:val="right" w:leader="dot"/>
-        </w:tabs>
-        <w:spacing w:after="40" w:line="360" w:lineRule="exact"/>
-        <w:ind w:left="369"/>
-      </w:pPr>
-      <w:r>
-        <w:rPr>
-          <w:rFonts w:ascii="宋体" w:hAnsi="宋体" w:eastAsia="宋体" w:cs="宋体"/>
-          <w:b w:val="0"/>
-          <w:sz w:val="21"/>
-        </w:rPr>
-        <w:t>1.2 国内外实现现状</w:t>
-      </w:r>
-      <w:r>
-        <w:tab/>
-      </w:r>
-      <w:r>
-        <w:rPr>
-          <w:rFonts w:ascii="宋体" w:hAnsi="宋体" w:eastAsia="宋体" w:cs="宋体"/>
-          <w:b w:val="0"/>
-          <w:sz w:val="21"/>
-        </w:rPr>
-        <w:t>2</w:t>
-      </w:r>
-    </w:p>
-    <w:p>
-      <w:pPr>
-        <w:tabs>
-          <w:tab w:pos="8617" w:val="right" w:leader="dot"/>
-        </w:tabs>
-        <w:spacing w:after="40" w:line="360" w:lineRule="exact"/>
-        <w:ind w:left="369"/>
-      </w:pPr>
-      <w:r>
-        <w:rPr>
-          <w:rFonts w:ascii="宋体" w:hAnsi="宋体" w:eastAsia="宋体" w:cs="宋体"/>
-          <w:b w:val="0"/>
-          <w:sz w:val="21"/>
-        </w:rPr>
-        <w:t>1.3 本文主要工作</w:t>
-      </w:r>
-      <w:r>
-        <w:tab/>
-      </w:r>
-      <w:r>
-        <w:rPr>
-          <w:rFonts w:ascii="宋体" w:hAnsi="宋体" w:eastAsia="宋体" w:cs="宋体"/>
-          <w:b w:val="0"/>
-          <w:sz w:val="21"/>
-        </w:rPr>
-        <w:t>3</w:t>
-      </w:r>
-    </w:p>
-    <w:p>
-      <w:pPr>
-        <w:tabs>
-          <w:tab w:pos="8617" w:val="right" w:leader="dot"/>
-        </w:tabs>
-        <w:spacing w:after="40" w:line="360" w:lineRule="exact"/>
-        <w:ind w:left="0"/>
-      </w:pPr>
-      <w:r>
-        <w:rPr>
-          <w:rFonts w:ascii="宋体" w:hAnsi="宋体" w:eastAsia="宋体" w:cs="宋体"/>
-          <w:b/>
-          <w:sz w:val="22"/>
-        </w:rPr>
-        <w:t>第二章 相关技术与系统基础</w:t>
-      </w:r>
-      <w:r>
-        <w:tab/>
-      </w:r>
-      <w:r>
-        <w:rPr>
-          <w:rFonts w:ascii="宋体" w:hAnsi="宋体" w:eastAsia="宋体" w:cs="宋体"/>
-          <w:b/>
-          <w:sz w:val="21"/>
-        </w:rPr>
-        <w:t>5</w:t>
-      </w:r>
-    </w:p>
-    <w:p>
-      <w:pPr>
-        <w:tabs>
-          <w:tab w:pos="8617" w:val="right" w:leader="dot"/>
-        </w:tabs>
-        <w:spacing w:after="40" w:line="360" w:lineRule="exact"/>
-        <w:ind w:left="369"/>
-      </w:pPr>
-      <w:r>
-        <w:rPr>
-          <w:rFonts w:ascii="宋体" w:hAnsi="宋体" w:eastAsia="宋体" w:cs="宋体"/>
-          <w:b w:val="0"/>
-          <w:sz w:val="21"/>
-        </w:rPr>
-        <w:t>2.1 医疗资料标准化与电子病历文本挖掘</w:t>
-      </w:r>
-      <w:r>
-        <w:tab/>
-      </w:r>
-      <w:r>
-        <w:rPr>
-          <w:rFonts w:ascii="宋体" w:hAnsi="宋体" w:eastAsia="宋体" w:cs="宋体"/>
-          <w:b w:val="0"/>
-          <w:sz w:val="21"/>
-        </w:rPr>
-        <w:t>5</w:t>
-      </w:r>
-    </w:p>
-    <w:p>
-      <w:pPr>
-        <w:tabs>
-          <w:tab w:pos="8617" w:val="right" w:leader="dot"/>
-        </w:tabs>
-        <w:spacing w:after="40" w:line="360" w:lineRule="exact"/>
-        <w:ind w:left="369"/>
-      </w:pPr>
-      <w:r>
-        <w:rPr>
-          <w:rFonts w:ascii="宋体" w:hAnsi="宋体" w:eastAsia="宋体" w:cs="宋体"/>
-          <w:b w:val="0"/>
-          <w:sz w:val="21"/>
-        </w:rPr>
-        <w:t>2.2 医疗大模型、知识增强与 RAG 方法</w:t>
-      </w:r>
-      <w:r>
-        <w:tab/>
-      </w:r>
-      <w:r>
-        <w:rPr>
-          <w:rFonts w:ascii="宋体" w:hAnsi="宋体" w:eastAsia="宋体" w:cs="宋体"/>
-          <w:b w:val="0"/>
-          <w:sz w:val="21"/>
-        </w:rPr>
-        <w:t>5</w:t>
-      </w:r>
-    </w:p>
-    <w:p>
-      <w:pPr>
-        <w:tabs>
-          <w:tab w:pos="8617" w:val="right" w:leader="dot"/>
-        </w:tabs>
-        <w:spacing w:after="40" w:line="360" w:lineRule="exact"/>
-        <w:ind w:left="369"/>
-      </w:pPr>
-      <w:r>
-        <w:rPr>
-          <w:rFonts w:ascii="宋体" w:hAnsi="宋体" w:eastAsia="宋体" w:cs="宋体"/>
-          <w:b w:val="0"/>
-          <w:sz w:val="21"/>
-        </w:rPr>
-        <w:t>2.3 Agent 工作流、工具调用与状态机编排</w:t>
-      </w:r>
-      <w:r>
-        <w:tab/>
-      </w:r>
-      <w:r>
-        <w:rPr>
-          <w:rFonts w:ascii="宋体" w:hAnsi="宋体" w:eastAsia="宋体" w:cs="宋体"/>
-          <w:b w:val="0"/>
-          <w:sz w:val="21"/>
-        </w:rPr>
-        <w:t>6</w:t>
-      </w:r>
-    </w:p>
-    <w:p>
-      <w:pPr>
-        <w:tabs>
-          <w:tab w:pos="8617" w:val="right" w:leader="dot"/>
-        </w:tabs>
-        <w:spacing w:after="40" w:line="360" w:lineRule="exact"/>
-        <w:ind w:left="369"/>
-      </w:pPr>
-      <w:r>
-        <w:rPr>
-          <w:rFonts w:ascii="宋体" w:hAnsi="宋体" w:eastAsia="宋体" w:cs="宋体"/>
-          <w:b w:val="0"/>
-          <w:sz w:val="21"/>
-        </w:rPr>
-        <w:t>2.4 Provider 抽象与外部能力接入</w:t>
-      </w:r>
-      <w:r>
-        <w:tab/>
-      </w:r>
-      <w:r>
-        <w:rPr>
-          <w:rFonts w:ascii="宋体" w:hAnsi="宋体" w:eastAsia="宋体" w:cs="宋体"/>
-          <w:b w:val="0"/>
-          <w:sz w:val="21"/>
-        </w:rPr>
-        <w:t>7</w:t>
-      </w:r>
-    </w:p>
-    <w:p>
-      <w:pPr>
-        <w:tabs>
-          <w:tab w:pos="8617" w:val="right" w:leader="dot"/>
-        </w:tabs>
-        <w:spacing w:after="40" w:line="360" w:lineRule="exact"/>
-        <w:ind w:left="369"/>
-      </w:pPr>
-      <w:r>
-        <w:rPr>
-          <w:rFonts w:ascii="宋体" w:hAnsi="宋体" w:eastAsia="宋体" w:cs="宋体"/>
-          <w:b w:val="0"/>
-          <w:sz w:val="21"/>
-        </w:rPr>
-        <w:t>2.5 本项目已有实现基础</w:t>
-      </w:r>
-      <w:r>
-        <w:tab/>
-      </w:r>
-      <w:r>
-        <w:rPr>
-          <w:rFonts w:ascii="宋体" w:hAnsi="宋体" w:eastAsia="宋体" w:cs="宋体"/>
-          <w:b w:val="0"/>
-          <w:sz w:val="21"/>
-        </w:rPr>
-        <w:t>8</w:t>
-      </w:r>
-    </w:p>
-    <w:p>
-      <w:pPr>
-        <w:tabs>
-          <w:tab w:pos="8617" w:val="right" w:leader="dot"/>
-        </w:tabs>
-        <w:spacing w:after="40" w:line="360" w:lineRule="exact"/>
-        <w:ind w:left="0"/>
-      </w:pPr>
-      <w:r>
-        <w:rPr>
-          <w:rFonts w:ascii="宋体" w:hAnsi="宋体" w:eastAsia="宋体" w:cs="宋体"/>
-          <w:b/>
-          <w:sz w:val="22"/>
-        </w:rPr>
-        <w:t>第三章 需求分析与总体设计</w:t>
-      </w:r>
-      <w:r>
-        <w:tab/>
-      </w:r>
-      <w:r>
-        <w:rPr>
-          <w:rFonts w:ascii="宋体" w:hAnsi="宋体" w:eastAsia="宋体" w:cs="宋体"/>
-          <w:b/>
-          <w:sz w:val="21"/>
-        </w:rPr>
-        <w:t>10</w:t>
-      </w:r>
-    </w:p>
-    <w:p>
-      <w:pPr>
-        <w:tabs>
-          <w:tab w:pos="8617" w:val="right" w:leader="dot"/>
-        </w:tabs>
-        <w:spacing w:after="40" w:line="360" w:lineRule="exact"/>
-        <w:ind w:left="369"/>
-      </w:pPr>
-      <w:r>
-        <w:rPr>
-          <w:rFonts w:ascii="宋体" w:hAnsi="宋体" w:eastAsia="宋体" w:cs="宋体"/>
-          <w:b w:val="0"/>
-          <w:sz w:val="21"/>
-        </w:rPr>
-        <w:t>3.1 需求分析</w:t>
-      </w:r>
-      <w:r>
-        <w:tab/>
-      </w:r>
-      <w:r>
-        <w:rPr>
-          <w:rFonts w:ascii="宋体" w:hAnsi="宋体" w:eastAsia="宋体" w:cs="宋体"/>
-          <w:b w:val="0"/>
-          <w:sz w:val="21"/>
-        </w:rPr>
-        <w:t>10</w:t>
-      </w:r>
-    </w:p>
-    <w:p>
-      <w:pPr>
-        <w:tabs>
-          <w:tab w:pos="8617" w:val="right" w:leader="dot"/>
-        </w:tabs>
-        <w:spacing w:after="40" w:line="360" w:lineRule="exact"/>
-        <w:ind w:left="369"/>
-      </w:pPr>
-      <w:r>
-        <w:rPr>
-          <w:rFonts w:ascii="宋体" w:hAnsi="宋体" w:eastAsia="宋体" w:cs="宋体"/>
-          <w:b w:val="0"/>
-          <w:sz w:val="21"/>
-        </w:rPr>
-        <w:t>3.2 系统总体架构</w:t>
-      </w:r>
-      <w:r>
-        <w:tab/>
-      </w:r>
-      <w:r>
-        <w:rPr>
-          <w:rFonts w:ascii="宋体" w:hAnsi="宋体" w:eastAsia="宋体" w:cs="宋体"/>
-          <w:b w:val="0"/>
-          <w:sz w:val="21"/>
-        </w:rPr>
-        <w:t>11</w:t>
-      </w:r>
-    </w:p>
-    <w:p>
-      <w:pPr>
-        <w:tabs>
-          <w:tab w:pos="8617" w:val="right" w:leader="dot"/>
-        </w:tabs>
-        <w:spacing w:after="40" w:line="360" w:lineRule="exact"/>
-        <w:ind w:left="369"/>
-      </w:pPr>
-      <w:r>
-        <w:rPr>
-          <w:rFonts w:ascii="宋体" w:hAnsi="宋体" w:eastAsia="宋体" w:cs="宋体"/>
-          <w:b w:val="0"/>
-          <w:sz w:val="21"/>
-        </w:rPr>
-        <w:t>3.3 业务流程设计</w:t>
-      </w:r>
-      <w:r>
-        <w:tab/>
-      </w:r>
-      <w:r>
-        <w:rPr>
-          <w:rFonts w:ascii="宋体" w:hAnsi="宋体" w:eastAsia="宋体" w:cs="宋体"/>
-          <w:b w:val="0"/>
-          <w:sz w:val="21"/>
-        </w:rPr>
-        <w:t>11</w:t>
-      </w:r>
-    </w:p>
-    <w:p>
-      <w:pPr>
-        <w:tabs>
-          <w:tab w:pos="8617" w:val="right" w:leader="dot"/>
-        </w:tabs>
-        <w:spacing w:after="40" w:line="360" w:lineRule="exact"/>
-        <w:ind w:left="369"/>
-      </w:pPr>
-      <w:r>
-        <w:rPr>
-          <w:rFonts w:ascii="宋体" w:hAnsi="宋体" w:eastAsia="宋体" w:cs="宋体"/>
-          <w:b w:val="0"/>
-          <w:sz w:val="21"/>
-        </w:rPr>
-        <w:t>3.4 后端分层与接口设计</w:t>
-      </w:r>
-      <w:r>
-        <w:tab/>
-      </w:r>
-      <w:r>
-        <w:rPr>
-          <w:rFonts w:ascii="宋体" w:hAnsi="宋体" w:eastAsia="宋体" w:cs="宋体"/>
-          <w:b w:val="0"/>
-          <w:sz w:val="21"/>
-        </w:rPr>
-        <w:t>12</w:t>
-      </w:r>
-    </w:p>
-    <w:p>
-      <w:pPr>
-        <w:tabs>
-          <w:tab w:pos="8617" w:val="right" w:leader="dot"/>
-        </w:tabs>
-        <w:spacing w:after="40" w:line="360" w:lineRule="exact"/>
-        <w:ind w:left="369"/>
-      </w:pPr>
-      <w:r>
-        <w:rPr>
-          <w:rFonts w:ascii="宋体" w:hAnsi="宋体" w:eastAsia="宋体" w:cs="宋体"/>
-          <w:b w:val="0"/>
-          <w:sz w:val="21"/>
-        </w:rPr>
-        <w:t>3.5 数据库设计</w:t>
-      </w:r>
-      <w:r>
-        <w:tab/>
-      </w:r>
-      <w:r>
-        <w:rPr>
-          <w:rFonts w:ascii="宋体" w:hAnsi="宋体" w:eastAsia="宋体" w:cs="宋体"/>
-          <w:b w:val="0"/>
-          <w:sz w:val="21"/>
-        </w:rPr>
-        <w:t>14</w:t>
-      </w:r>
-    </w:p>
-    <w:p>
-      <w:pPr>
-        <w:tabs>
-          <w:tab w:pos="8617" w:val="right" w:leader="dot"/>
-        </w:tabs>
-        <w:spacing w:after="40" w:line="360" w:lineRule="exact"/>
-        <w:ind w:left="369"/>
-      </w:pPr>
-      <w:r>
-        <w:rPr>
-          <w:rFonts w:ascii="宋体" w:hAnsi="宋体" w:eastAsia="宋体" w:cs="宋体"/>
-          <w:b w:val="0"/>
-          <w:sz w:val="21"/>
-        </w:rPr>
-        <w:t>3.6 安全与可追溯设计</w:t>
-      </w:r>
-      <w:r>
-        <w:tab/>
-      </w:r>
-      <w:r>
-        <w:rPr>
-          <w:rFonts w:ascii="宋体" w:hAnsi="宋体" w:eastAsia="宋体" w:cs="宋体"/>
-          <w:b w:val="0"/>
-          <w:sz w:val="21"/>
-        </w:rPr>
-        <w:t>16</w:t>
-      </w:r>
-    </w:p>
-    <w:p>
-      <w:pPr>
-        <w:tabs>
-          <w:tab w:pos="8617" w:val="right" w:leader="dot"/>
-        </w:tabs>
-        <w:spacing w:after="40" w:line="360" w:lineRule="exact"/>
-        <w:ind w:left="0"/>
-      </w:pPr>
-      <w:r>
-        <w:rPr>
-          <w:rFonts w:ascii="宋体" w:hAnsi="宋体" w:eastAsia="宋体" w:cs="宋体"/>
-          <w:b/>
-          <w:sz w:val="22"/>
-        </w:rPr>
-        <w:t>第四章 系统详细实现</w:t>
-      </w:r>
-      <w:r>
-        <w:tab/>
-      </w:r>
-      <w:r>
-        <w:rPr>
-          <w:rFonts w:ascii="宋体" w:hAnsi="宋体" w:eastAsia="宋体" w:cs="宋体"/>
-          <w:b/>
-          <w:sz w:val="21"/>
-        </w:rPr>
-        <w:t>19</w:t>
-      </w:r>
-    </w:p>
-    <w:p>
-      <w:pPr>
-        <w:tabs>
-          <w:tab w:pos="8617" w:val="right" w:leader="dot"/>
-        </w:tabs>
-        <w:spacing w:after="40" w:line="360" w:lineRule="exact"/>
-        <w:ind w:left="369"/>
-      </w:pPr>
-      <w:r>
-        <w:rPr>
-          <w:rFonts w:ascii="宋体" w:hAnsi="宋体" w:eastAsia="宋体" w:cs="宋体"/>
-          <w:b w:val="0"/>
-          <w:sz w:val="21"/>
-        </w:rPr>
-        <w:t>4.1 文件上传与 OCR 处理实现</w:t>
-      </w:r>
-      <w:r>
-        <w:tab/>
-      </w:r>
-      <w:r>
-        <w:rPr>
-          <w:rFonts w:ascii="宋体" w:hAnsi="宋体" w:eastAsia="宋体" w:cs="宋体"/>
-          <w:b w:val="0"/>
-          <w:sz w:val="21"/>
-        </w:rPr>
-        <w:t>19</w:t>
-      </w:r>
-    </w:p>
-    <w:p>
-      <w:pPr>
-        <w:tabs>
-          <w:tab w:pos="8617" w:val="right" w:leader="dot"/>
-        </w:tabs>
-        <w:spacing w:after="40" w:line="360" w:lineRule="exact"/>
-        <w:ind w:left="369"/>
-      </w:pPr>
-      <w:r>
-        <w:rPr>
-          <w:rFonts w:ascii="宋体" w:hAnsi="宋体" w:eastAsia="宋体" w:cs="宋体"/>
-          <w:b w:val="0"/>
-          <w:sz w:val="21"/>
-        </w:rPr>
-        <w:t>4.2 标准化与版本化入库实现</w:t>
-      </w:r>
-      <w:r>
-        <w:tab/>
-      </w:r>
-      <w:r>
-        <w:rPr>
-          <w:rFonts w:ascii="宋体" w:hAnsi="宋体" w:eastAsia="宋体" w:cs="宋体"/>
-          <w:b w:val="0"/>
-          <w:sz w:val="21"/>
-        </w:rPr>
-        <w:t>19</w:t>
-      </w:r>
-    </w:p>
-    <w:p>
-      <w:pPr>
-        <w:tabs>
-          <w:tab w:pos="8617" w:val="right" w:leader="dot"/>
-        </w:tabs>
-        <w:spacing w:after="40" w:line="360" w:lineRule="exact"/>
-        <w:ind w:left="369"/>
-      </w:pPr>
-      <w:r>
-        <w:rPr>
-          <w:rFonts w:ascii="宋体" w:hAnsi="宋体" w:eastAsia="宋体" w:cs="宋体"/>
-          <w:b w:val="0"/>
-          <w:sz w:val="21"/>
-        </w:rPr>
-        <w:t>4.3 综合审计报告 LangGraph 状态机实现</w:t>
-      </w:r>
-      <w:r>
-        <w:tab/>
-      </w:r>
-      <w:r>
-        <w:rPr>
-          <w:rFonts w:ascii="宋体" w:hAnsi="宋体" w:eastAsia="宋体" w:cs="宋体"/>
-          <w:b w:val="0"/>
-          <w:sz w:val="21"/>
-        </w:rPr>
-        <w:t>20</w:t>
-      </w:r>
-    </w:p>
-    <w:p>
-      <w:pPr>
-        <w:tabs>
-          <w:tab w:pos="8617" w:val="right" w:leader="dot"/>
-        </w:tabs>
-        <w:spacing w:after="40" w:line="360" w:lineRule="exact"/>
-        <w:ind w:left="369"/>
-      </w:pPr>
-      <w:r>
-        <w:rPr>
-          <w:rFonts w:ascii="宋体" w:hAnsi="宋体" w:eastAsia="宋体" w:cs="宋体"/>
-          <w:b w:val="0"/>
-          <w:sz w:val="21"/>
-        </w:rPr>
-        <w:t>4.4 审计事件与节点状态持久化</w:t>
-      </w:r>
-      <w:r>
-        <w:tab/>
-      </w:r>
-      <w:r>
-        <w:rPr>
-          <w:rFonts w:ascii="宋体" w:hAnsi="宋体" w:eastAsia="宋体" w:cs="宋体"/>
-          <w:b w:val="0"/>
-          <w:sz w:val="21"/>
-        </w:rPr>
-        <w:t>22</w:t>
-      </w:r>
-    </w:p>
-    <w:p>
-      <w:pPr>
-        <w:tabs>
-          <w:tab w:pos="8617" w:val="right" w:leader="dot"/>
-        </w:tabs>
-        <w:spacing w:after="40" w:line="360" w:lineRule="exact"/>
-        <w:ind w:left="369"/>
-      </w:pPr>
-      <w:r>
-        <w:rPr>
-          <w:rFonts w:ascii="宋体" w:hAnsi="宋体" w:eastAsia="宋体" w:cs="宋体"/>
-          <w:b w:val="0"/>
-          <w:sz w:val="21"/>
-        </w:rPr>
-        <w:t>4.5 前端模块实现</w:t>
-      </w:r>
-      <w:r>
-        <w:tab/>
-      </w:r>
-      <w:r>
-        <w:rPr>
-          <w:rFonts w:ascii="宋体" w:hAnsi="宋体" w:eastAsia="宋体" w:cs="宋体"/>
-          <w:b w:val="0"/>
-          <w:sz w:val="21"/>
-        </w:rPr>
-        <w:t>23</w:t>
-      </w:r>
-    </w:p>
-    <w:p>
-      <w:pPr>
-        <w:tabs>
-          <w:tab w:pos="8617" w:val="right" w:leader="dot"/>
-        </w:tabs>
-        <w:spacing w:after="40" w:line="360" w:lineRule="exact"/>
-        <w:ind w:left="0"/>
-      </w:pPr>
-      <w:r>
-        <w:rPr>
-          <w:rFonts w:ascii="宋体" w:hAnsi="宋体" w:eastAsia="宋体" w:cs="宋体"/>
-          <w:b/>
-          <w:sz w:val="22"/>
-        </w:rPr>
-        <w:t>第五章 测试与运行效果分析</w:t>
-      </w:r>
-      <w:r>
-        <w:tab/>
-      </w:r>
-      <w:r>
-        <w:rPr>
-          <w:rFonts w:ascii="宋体" w:hAnsi="宋体" w:eastAsia="宋体" w:cs="宋体"/>
-          <w:b/>
-          <w:sz w:val="21"/>
-        </w:rPr>
-        <w:t>26</w:t>
-      </w:r>
-    </w:p>
-    <w:p>
-      <w:pPr>
-        <w:tabs>
-          <w:tab w:pos="8617" w:val="right" w:leader="dot"/>
-        </w:tabs>
-        <w:spacing w:after="40" w:line="360" w:lineRule="exact"/>
-        <w:ind w:left="369"/>
-      </w:pPr>
-      <w:r>
-        <w:rPr>
-          <w:rFonts w:ascii="宋体" w:hAnsi="宋体" w:eastAsia="宋体" w:cs="宋体"/>
-          <w:b w:val="0"/>
-          <w:sz w:val="21"/>
-        </w:rPr>
-        <w:t>5.1 Mock 体检数据构造</w:t>
-      </w:r>
-      <w:r>
-        <w:tab/>
-      </w:r>
-      <w:r>
-        <w:rPr>
-          <w:rFonts w:ascii="宋体" w:hAnsi="宋体" w:eastAsia="宋体" w:cs="宋体"/>
-          <w:b w:val="0"/>
-          <w:sz w:val="21"/>
-        </w:rPr>
-        <w:t>26</w:t>
-      </w:r>
-    </w:p>
-    <w:p>
-      <w:pPr>
-        <w:tabs>
-          <w:tab w:pos="8617" w:val="right" w:leader="dot"/>
-        </w:tabs>
-        <w:spacing w:after="40" w:line="360" w:lineRule="exact"/>
-        <w:ind w:left="369"/>
-      </w:pPr>
-      <w:r>
-        <w:rPr>
-          <w:rFonts w:ascii="宋体" w:hAnsi="宋体" w:eastAsia="宋体" w:cs="宋体"/>
-          <w:b w:val="0"/>
-          <w:sz w:val="21"/>
-        </w:rPr>
-        <w:t>5.2 接口与端到端测试</w:t>
-      </w:r>
-      <w:r>
-        <w:tab/>
-      </w:r>
-      <w:r>
-        <w:rPr>
-          <w:rFonts w:ascii="宋体" w:hAnsi="宋体" w:eastAsia="宋体" w:cs="宋体"/>
-          <w:b w:val="0"/>
-          <w:sz w:val="21"/>
-        </w:rPr>
-        <w:t>27</w:t>
-      </w:r>
-    </w:p>
-    <w:p>
-      <w:pPr>
-        <w:tabs>
-          <w:tab w:pos="8617" w:val="right" w:leader="dot"/>
-        </w:tabs>
-        <w:spacing w:after="40" w:line="360" w:lineRule="exact"/>
-        <w:ind w:left="369"/>
-      </w:pPr>
-      <w:r>
-        <w:rPr>
-          <w:rFonts w:ascii="宋体" w:hAnsi="宋体" w:eastAsia="宋体" w:cs="宋体"/>
-          <w:b w:val="0"/>
-          <w:sz w:val="21"/>
-        </w:rPr>
-        <w:t>5.3 真实演示运行截图</w:t>
-      </w:r>
-      <w:r>
-        <w:tab/>
-      </w:r>
-      <w:r>
-        <w:rPr>
-          <w:rFonts w:ascii="宋体" w:hAnsi="宋体" w:eastAsia="宋体" w:cs="宋体"/>
-          <w:b w:val="0"/>
-          <w:sz w:val="21"/>
-        </w:rPr>
-        <w:t>29</w:t>
-      </w:r>
-    </w:p>
-    <w:p>
-      <w:pPr>
-        <w:tabs>
-          <w:tab w:pos="8617" w:val="right" w:leader="dot"/>
-        </w:tabs>
-        <w:spacing w:after="40" w:line="360" w:lineRule="exact"/>
-        <w:ind w:left="369"/>
-      </w:pPr>
-      <w:r>
-        <w:rPr>
-          <w:rFonts w:ascii="宋体" w:hAnsi="宋体" w:eastAsia="宋体" w:cs="宋体"/>
-          <w:b w:val="0"/>
-          <w:sz w:val="21"/>
-        </w:rPr>
-        <w:t>5.4 运行效果与不足分析</w:t>
-      </w:r>
-      <w:r>
-        <w:tab/>
-      </w:r>
-      <w:r>
-        <w:rPr>
-          <w:rFonts w:ascii="宋体" w:hAnsi="宋体" w:eastAsia="宋体" w:cs="宋体"/>
-          <w:b w:val="0"/>
-          <w:sz w:val="21"/>
-        </w:rPr>
-        <w:t>32</w:t>
-      </w:r>
-    </w:p>
-    <w:p>
-      <w:pPr>
-        <w:tabs>
-          <w:tab w:pos="8617" w:val="right" w:leader="dot"/>
-        </w:tabs>
-        <w:spacing w:after="40" w:line="360" w:lineRule="exact"/>
-        <w:ind w:left="0"/>
-      </w:pPr>
-      <w:r>
-        <w:rPr>
-          <w:rFonts w:ascii="宋体" w:hAnsi="宋体" w:eastAsia="宋体" w:cs="宋体"/>
-          <w:b/>
-          <w:sz w:val="22"/>
-        </w:rPr>
-        <w:t>结束语</w:t>
-      </w:r>
-      <w:r>
-        <w:tab/>
-      </w:r>
-      <w:r>
-        <w:rPr>
-          <w:rFonts w:ascii="宋体" w:hAnsi="宋体" w:eastAsia="宋体" w:cs="宋体"/>
-          <w:b/>
-          <w:sz w:val="21"/>
-        </w:rPr>
-        <w:t>34</w:t>
-      </w:r>
-    </w:p>
-    <w:p>
-      <w:pPr>
-        <w:tabs>
-          <w:tab w:pos="8617" w:val="right" w:leader="dot"/>
-        </w:tabs>
-        <w:spacing w:after="40" w:line="360" w:lineRule="exact"/>
-        <w:ind w:left="0"/>
-      </w:pPr>
-      <w:r>
-        <w:rPr>
-          <w:rFonts w:ascii="宋体" w:hAnsi="宋体" w:eastAsia="宋体" w:cs="宋体"/>
-          <w:b/>
-          <w:sz w:val="22"/>
-        </w:rPr>
-        <w:t>参考文献</w:t>
-      </w:r>
-      <w:r>
-        <w:tab/>
-      </w:r>
-      <w:r>
-        <w:rPr>
-          <w:rFonts w:ascii="宋体" w:hAnsi="宋体" w:eastAsia="宋体" w:cs="宋体"/>
-          <w:b/>
-          <w:sz w:val="21"/>
-        </w:rPr>
-        <w:t>35</w:t>
-      </w:r>
-    </w:p>
-    <w:p>
-      <w:pPr>
-        <w:tabs>
-          <w:tab w:pos="8617" w:val="right" w:leader="dot"/>
-        </w:tabs>
-        <w:spacing w:after="40" w:line="360" w:lineRule="exact"/>
-        <w:ind w:left="0"/>
-      </w:pPr>
-      <w:r>
-        <w:rPr>
-          <w:rFonts w:ascii="宋体" w:hAnsi="宋体" w:eastAsia="宋体" w:cs="宋体"/>
-          <w:b/>
-          <w:sz w:val="22"/>
-        </w:rPr>
-        <w:t>致谢</w:t>
-      </w:r>
-      <w:r>
-        <w:tab/>
-      </w:r>
-      <w:r>
-        <w:rPr>
-          <w:rFonts w:ascii="宋体" w:hAnsi="宋体" w:eastAsia="宋体" w:cs="宋体"/>
-          <w:b/>
-          <w:sz w:val="21"/>
-        </w:rPr>
-        <w:t>37</w:t>
-      </w:r>
-    </w:p>
+    <w:tbl>
+      <w:tblPr>
+        <w:tblW w:type="auto" w:w="0"/>
+        <w:jc w:val="center"/>
+        <w:tblLayout w:type="fixed"/>
+        <w:tblLook w:firstColumn="1" w:firstRow="1" w:lastColumn="0" w:lastRow="0" w:noHBand="0" w:noVBand="1" w:val="04A0"/>
+        <w:tblBorders>
+          <w:top w:val="nil" w:sz="0" w:space="0" w:color="FFFFFF"/>
+          <w:left w:val="nil" w:sz="0" w:space="0" w:color="FFFFFF"/>
+          <w:bottom w:val="nil" w:sz="0" w:space="0" w:color="FFFFFF"/>
+          <w:right w:val="nil" w:sz="0" w:space="0" w:color="FFFFFF"/>
+          <w:insideH w:val="nil" w:sz="0" w:space="0" w:color="FFFFFF"/>
+          <w:insideV w:val="nil" w:sz="0" w:space="0" w:color="FFFFFF"/>
+        </w:tblBorders>
+      </w:tblPr>
+      <w:tblGrid>
+        <w:gridCol w:w="4394"/>
+        <w:gridCol w:w="4394"/>
+      </w:tblGrid>
+      <w:tr>
+        <w:tc>
+          <w:tcPr>
+            <w:tcW w:type="dxa" w:w="8051"/>
+            <w:vAlign w:val="center"/>
+          </w:tcPr>
+          <w:p>
+            <w:pPr>
+              <w:spacing w:before="0" w:after="0" w:line="360" w:lineRule="exact"/>
+              <w:ind w:left="0"/>
+            </w:pPr>
+            <w:r/>
+            <w:r>
+              <w:rPr>
+                <w:rFonts w:ascii="宋体" w:hAnsi="宋体" w:eastAsia="宋体" w:cs="宋体"/>
+                <w:b/>
+                <w:sz w:val="22"/>
+              </w:rPr>
+              <w:t>摘要（中文）</w:t>
+            </w:r>
+          </w:p>
+        </w:tc>
+        <w:tc>
+          <w:tcPr>
+            <w:tcW w:type="dxa" w:w="680"/>
+            <w:vAlign w:val="center"/>
+          </w:tcPr>
+          <w:p>
+            <w:pPr>
+              <w:spacing w:before="0" w:after="0" w:line="360" w:lineRule="exact"/>
+              <w:ind w:left="0"/>
+              <w:jc w:val="right"/>
+            </w:pPr>
+            <w:r/>
+            <w:r>
+              <w:rPr>
+                <w:rFonts w:ascii="宋体" w:hAnsi="宋体" w:eastAsia="宋体" w:cs="宋体"/>
+                <w:b/>
+                <w:sz w:val="22"/>
+              </w:rPr>
+              <w:t>I</w:t>
+            </w:r>
+          </w:p>
+        </w:tc>
+      </w:tr>
+      <w:tr>
+        <w:tc>
+          <w:tcPr>
+            <w:tcW w:type="dxa" w:w="8051"/>
+            <w:vAlign w:val="center"/>
+          </w:tcPr>
+          <w:p>
+            <w:pPr>
+              <w:spacing w:before="0" w:after="0" w:line="360" w:lineRule="exact"/>
+              <w:ind w:left="369"/>
+            </w:pPr>
+            <w:r/>
+            <w:r>
+              <w:rPr>
+                <w:rFonts w:ascii="宋体" w:hAnsi="宋体" w:eastAsia="宋体" w:cs="宋体"/>
+                <w:b w:val="0"/>
+                <w:sz w:val="21"/>
+              </w:rPr>
+              <w:t>（英文）</w:t>
+            </w:r>
+          </w:p>
+        </w:tc>
+        <w:tc>
+          <w:tcPr>
+            <w:tcW w:type="dxa" w:w="680"/>
+            <w:vAlign w:val="center"/>
+          </w:tcPr>
+          <w:p>
+            <w:pPr>
+              <w:spacing w:before="0" w:after="0" w:line="360" w:lineRule="exact"/>
+              <w:ind w:left="0"/>
+              <w:jc w:val="right"/>
+            </w:pPr>
+            <w:r/>
+            <w:r>
+              <w:rPr>
+                <w:rFonts w:ascii="宋体" w:hAnsi="宋体" w:eastAsia="宋体" w:cs="宋体"/>
+                <w:b w:val="0"/>
+                <w:sz w:val="21"/>
+              </w:rPr>
+              <w:t>II</w:t>
+            </w:r>
+          </w:p>
+        </w:tc>
+      </w:tr>
+      <w:tr>
+        <w:tc>
+          <w:tcPr>
+            <w:tcW w:type="dxa" w:w="8051"/>
+            <w:vAlign w:val="center"/>
+          </w:tcPr>
+          <w:p>
+            <w:pPr>
+              <w:spacing w:before="0" w:after="0" w:line="360" w:lineRule="exact"/>
+              <w:ind w:left="0"/>
+            </w:pPr>
+            <w:r/>
+            <w:r>
+              <w:rPr>
+                <w:rFonts w:ascii="宋体" w:hAnsi="宋体" w:eastAsia="宋体" w:cs="宋体"/>
+                <w:b/>
+                <w:sz w:val="22"/>
+              </w:rPr>
+              <w:t>第一章 绪论</w:t>
+            </w:r>
+          </w:p>
+        </w:tc>
+        <w:tc>
+          <w:tcPr>
+            <w:tcW w:type="dxa" w:w="680"/>
+            <w:vAlign w:val="center"/>
+          </w:tcPr>
+          <w:p>
+            <w:pPr>
+              <w:spacing w:before="0" w:after="0" w:line="360" w:lineRule="exact"/>
+              <w:ind w:left="0"/>
+              <w:jc w:val="right"/>
+            </w:pPr>
+            <w:r/>
+            <w:r>
+              <w:rPr>
+                <w:rFonts w:ascii="宋体" w:hAnsi="宋体" w:eastAsia="宋体" w:cs="宋体"/>
+                <w:b/>
+                <w:sz w:val="22"/>
+              </w:rPr>
+              <w:t>1</w:t>
+            </w:r>
+          </w:p>
+        </w:tc>
+      </w:tr>
+      <w:tr>
+        <w:tc>
+          <w:tcPr>
+            <w:tcW w:type="dxa" w:w="8051"/>
+            <w:vAlign w:val="center"/>
+          </w:tcPr>
+          <w:p>
+            <w:pPr>
+              <w:spacing w:before="0" w:after="0" w:line="360" w:lineRule="exact"/>
+              <w:ind w:left="369"/>
+            </w:pPr>
+            <w:r/>
+            <w:r>
+              <w:rPr>
+                <w:rFonts w:ascii="宋体" w:hAnsi="宋体" w:eastAsia="宋体" w:cs="宋体"/>
+                <w:b w:val="0"/>
+                <w:sz w:val="21"/>
+              </w:rPr>
+              <w:t>1.1 实现背景和意义</w:t>
+            </w:r>
+          </w:p>
+        </w:tc>
+        <w:tc>
+          <w:tcPr>
+            <w:tcW w:type="dxa" w:w="680"/>
+            <w:vAlign w:val="center"/>
+          </w:tcPr>
+          <w:p>
+            <w:pPr>
+              <w:spacing w:before="0" w:after="0" w:line="360" w:lineRule="exact"/>
+              <w:ind w:left="0"/>
+              <w:jc w:val="right"/>
+            </w:pPr>
+            <w:r/>
+            <w:r>
+              <w:rPr>
+                <w:rFonts w:ascii="宋体" w:hAnsi="宋体" w:eastAsia="宋体" w:cs="宋体"/>
+                <w:b w:val="0"/>
+                <w:sz w:val="21"/>
+              </w:rPr>
+              <w:t>1</w:t>
+            </w:r>
+          </w:p>
+        </w:tc>
+      </w:tr>
+      <w:tr>
+        <w:tc>
+          <w:tcPr>
+            <w:tcW w:type="dxa" w:w="8051"/>
+            <w:vAlign w:val="center"/>
+          </w:tcPr>
+          <w:p>
+            <w:pPr>
+              <w:spacing w:before="0" w:after="0" w:line="360" w:lineRule="exact"/>
+              <w:ind w:left="369"/>
+            </w:pPr>
+            <w:r/>
+            <w:r>
+              <w:rPr>
+                <w:rFonts w:ascii="宋体" w:hAnsi="宋体" w:eastAsia="宋体" w:cs="宋体"/>
+                <w:b w:val="0"/>
+                <w:sz w:val="21"/>
+              </w:rPr>
+              <w:t>1.2 国内外实现现状</w:t>
+            </w:r>
+          </w:p>
+        </w:tc>
+        <w:tc>
+          <w:tcPr>
+            <w:tcW w:type="dxa" w:w="680"/>
+            <w:vAlign w:val="center"/>
+          </w:tcPr>
+          <w:p>
+            <w:pPr>
+              <w:spacing w:before="0" w:after="0" w:line="360" w:lineRule="exact"/>
+              <w:ind w:left="0"/>
+              <w:jc w:val="right"/>
+            </w:pPr>
+            <w:r/>
+            <w:r>
+              <w:rPr>
+                <w:rFonts w:ascii="宋体" w:hAnsi="宋体" w:eastAsia="宋体" w:cs="宋体"/>
+                <w:b w:val="0"/>
+                <w:sz w:val="21"/>
+              </w:rPr>
+              <w:t>2</w:t>
+            </w:r>
+          </w:p>
+        </w:tc>
+      </w:tr>
+      <w:tr>
+        <w:tc>
+          <w:tcPr>
+            <w:tcW w:type="dxa" w:w="8051"/>
+            <w:vAlign w:val="center"/>
+          </w:tcPr>
+          <w:p>
+            <w:pPr>
+              <w:spacing w:before="0" w:after="0" w:line="360" w:lineRule="exact"/>
+              <w:ind w:left="369"/>
+            </w:pPr>
+            <w:r/>
+            <w:r>
+              <w:rPr>
+                <w:rFonts w:ascii="宋体" w:hAnsi="宋体" w:eastAsia="宋体" w:cs="宋体"/>
+                <w:b w:val="0"/>
+                <w:sz w:val="21"/>
+              </w:rPr>
+              <w:t>1.3 本文主要工作</w:t>
+            </w:r>
+          </w:p>
+        </w:tc>
+        <w:tc>
+          <w:tcPr>
+            <w:tcW w:type="dxa" w:w="680"/>
+            <w:vAlign w:val="center"/>
+          </w:tcPr>
+          <w:p>
+            <w:pPr>
+              <w:spacing w:before="0" w:after="0" w:line="360" w:lineRule="exact"/>
+              <w:ind w:left="0"/>
+              <w:jc w:val="right"/>
+            </w:pPr>
+            <w:r/>
+            <w:r>
+              <w:rPr>
+                <w:rFonts w:ascii="宋体" w:hAnsi="宋体" w:eastAsia="宋体" w:cs="宋体"/>
+                <w:b w:val="0"/>
+                <w:sz w:val="21"/>
+              </w:rPr>
+              <w:t>3</w:t>
+            </w:r>
+          </w:p>
+        </w:tc>
+      </w:tr>
+      <w:tr>
+        <w:tc>
+          <w:tcPr>
+            <w:tcW w:type="dxa" w:w="8051"/>
+            <w:vAlign w:val="center"/>
+          </w:tcPr>
+          <w:p>
+            <w:pPr>
+              <w:spacing w:before="0" w:after="0" w:line="360" w:lineRule="exact"/>
+              <w:ind w:left="0"/>
+            </w:pPr>
+            <w:r/>
+            <w:r>
+              <w:rPr>
+                <w:rFonts w:ascii="宋体" w:hAnsi="宋体" w:eastAsia="宋体" w:cs="宋体"/>
+                <w:b/>
+                <w:sz w:val="22"/>
+              </w:rPr>
+              <w:t>第二章 相关技术与系统基础</w:t>
+            </w:r>
+          </w:p>
+        </w:tc>
+        <w:tc>
+          <w:tcPr>
+            <w:tcW w:type="dxa" w:w="680"/>
+            <w:vAlign w:val="center"/>
+          </w:tcPr>
+          <w:p>
+            <w:pPr>
+              <w:spacing w:before="0" w:after="0" w:line="360" w:lineRule="exact"/>
+              <w:ind w:left="0"/>
+              <w:jc w:val="right"/>
+            </w:pPr>
+            <w:r/>
+            <w:r>
+              <w:rPr>
+                <w:rFonts w:ascii="宋体" w:hAnsi="宋体" w:eastAsia="宋体" w:cs="宋体"/>
+                <w:b/>
+                <w:sz w:val="22"/>
+              </w:rPr>
+              <w:t>5</w:t>
+            </w:r>
+          </w:p>
+        </w:tc>
+      </w:tr>
+      <w:tr>
+        <w:tc>
+          <w:tcPr>
+            <w:tcW w:type="dxa" w:w="8051"/>
+            <w:vAlign w:val="center"/>
+          </w:tcPr>
+          <w:p>
+            <w:pPr>
+              <w:spacing w:before="0" w:after="0" w:line="360" w:lineRule="exact"/>
+              <w:ind w:left="369"/>
+            </w:pPr>
+            <w:r/>
+            <w:r>
+              <w:rPr>
+                <w:rFonts w:ascii="宋体" w:hAnsi="宋体" w:eastAsia="宋体" w:cs="宋体"/>
+                <w:b w:val="0"/>
+                <w:sz w:val="21"/>
+              </w:rPr>
+              <w:t>2.1 医疗资料标准化与电子病历文本挖掘</w:t>
+            </w:r>
+          </w:p>
+        </w:tc>
+        <w:tc>
+          <w:tcPr>
+            <w:tcW w:type="dxa" w:w="680"/>
+            <w:vAlign w:val="center"/>
+          </w:tcPr>
+          <w:p>
+            <w:pPr>
+              <w:spacing w:before="0" w:after="0" w:line="360" w:lineRule="exact"/>
+              <w:ind w:left="0"/>
+              <w:jc w:val="right"/>
+            </w:pPr>
+            <w:r/>
+            <w:r>
+              <w:rPr>
+                <w:rFonts w:ascii="宋体" w:hAnsi="宋体" w:eastAsia="宋体" w:cs="宋体"/>
+                <w:b w:val="0"/>
+                <w:sz w:val="21"/>
+              </w:rPr>
+              <w:t>5</w:t>
+            </w:r>
+          </w:p>
+        </w:tc>
+      </w:tr>
+      <w:tr>
+        <w:tc>
+          <w:tcPr>
+            <w:tcW w:type="dxa" w:w="8051"/>
+            <w:vAlign w:val="center"/>
+          </w:tcPr>
+          <w:p>
+            <w:pPr>
+              <w:spacing w:before="0" w:after="0" w:line="360" w:lineRule="exact"/>
+              <w:ind w:left="369"/>
+            </w:pPr>
+            <w:r/>
+            <w:r>
+              <w:rPr>
+                <w:rFonts w:ascii="宋体" w:hAnsi="宋体" w:eastAsia="宋体" w:cs="宋体"/>
+                <w:b w:val="0"/>
+                <w:sz w:val="21"/>
+              </w:rPr>
+              <w:t>2.2 医疗大模型、知识增强与 RAG 方法</w:t>
+            </w:r>
+          </w:p>
+        </w:tc>
+        <w:tc>
+          <w:tcPr>
+            <w:tcW w:type="dxa" w:w="680"/>
+            <w:vAlign w:val="center"/>
+          </w:tcPr>
+          <w:p>
+            <w:pPr>
+              <w:spacing w:before="0" w:after="0" w:line="360" w:lineRule="exact"/>
+              <w:ind w:left="0"/>
+              <w:jc w:val="right"/>
+            </w:pPr>
+            <w:r/>
+            <w:r>
+              <w:rPr>
+                <w:rFonts w:ascii="宋体" w:hAnsi="宋体" w:eastAsia="宋体" w:cs="宋体"/>
+                <w:b w:val="0"/>
+                <w:sz w:val="21"/>
+              </w:rPr>
+              <w:t>5</w:t>
+            </w:r>
+          </w:p>
+        </w:tc>
+      </w:tr>
+      <w:tr>
+        <w:tc>
+          <w:tcPr>
+            <w:tcW w:type="dxa" w:w="8051"/>
+            <w:vAlign w:val="center"/>
+          </w:tcPr>
+          <w:p>
+            <w:pPr>
+              <w:spacing w:before="0" w:after="0" w:line="360" w:lineRule="exact"/>
+              <w:ind w:left="369"/>
+            </w:pPr>
+            <w:r/>
+            <w:r>
+              <w:rPr>
+                <w:rFonts w:ascii="宋体" w:hAnsi="宋体" w:eastAsia="宋体" w:cs="宋体"/>
+                <w:b w:val="0"/>
+                <w:sz w:val="21"/>
+              </w:rPr>
+              <w:t>2.3 Agent 工作流与状态机编排</w:t>
+            </w:r>
+          </w:p>
+        </w:tc>
+        <w:tc>
+          <w:tcPr>
+            <w:tcW w:type="dxa" w:w="680"/>
+            <w:vAlign w:val="center"/>
+          </w:tcPr>
+          <w:p>
+            <w:pPr>
+              <w:spacing w:before="0" w:after="0" w:line="360" w:lineRule="exact"/>
+              <w:ind w:left="0"/>
+              <w:jc w:val="right"/>
+            </w:pPr>
+            <w:r/>
+            <w:r>
+              <w:rPr>
+                <w:rFonts w:ascii="宋体" w:hAnsi="宋体" w:eastAsia="宋体" w:cs="宋体"/>
+                <w:b w:val="0"/>
+                <w:sz w:val="21"/>
+              </w:rPr>
+              <w:t>6</w:t>
+            </w:r>
+          </w:p>
+        </w:tc>
+      </w:tr>
+      <w:tr>
+        <w:tc>
+          <w:tcPr>
+            <w:tcW w:type="dxa" w:w="8051"/>
+            <w:vAlign w:val="center"/>
+          </w:tcPr>
+          <w:p>
+            <w:pPr>
+              <w:spacing w:before="0" w:after="0" w:line="360" w:lineRule="exact"/>
+              <w:ind w:left="369"/>
+            </w:pPr>
+            <w:r/>
+            <w:r>
+              <w:rPr>
+                <w:rFonts w:ascii="宋体" w:hAnsi="宋体" w:eastAsia="宋体" w:cs="宋体"/>
+                <w:b w:val="0"/>
+                <w:sz w:val="21"/>
+              </w:rPr>
+              <w:t>2.4 Provider 抽象与外部能力接入</w:t>
+            </w:r>
+          </w:p>
+        </w:tc>
+        <w:tc>
+          <w:tcPr>
+            <w:tcW w:type="dxa" w:w="680"/>
+            <w:vAlign w:val="center"/>
+          </w:tcPr>
+          <w:p>
+            <w:pPr>
+              <w:spacing w:before="0" w:after="0" w:line="360" w:lineRule="exact"/>
+              <w:ind w:left="0"/>
+              <w:jc w:val="right"/>
+            </w:pPr>
+            <w:r/>
+            <w:r>
+              <w:rPr>
+                <w:rFonts w:ascii="宋体" w:hAnsi="宋体" w:eastAsia="宋体" w:cs="宋体"/>
+                <w:b w:val="0"/>
+                <w:sz w:val="21"/>
+              </w:rPr>
+              <w:t>7</w:t>
+            </w:r>
+          </w:p>
+        </w:tc>
+      </w:tr>
+      <w:tr>
+        <w:tc>
+          <w:tcPr>
+            <w:tcW w:type="dxa" w:w="8051"/>
+            <w:vAlign w:val="center"/>
+          </w:tcPr>
+          <w:p>
+            <w:pPr>
+              <w:spacing w:before="0" w:after="0" w:line="360" w:lineRule="exact"/>
+              <w:ind w:left="369"/>
+            </w:pPr>
+            <w:r/>
+            <w:r>
+              <w:rPr>
+                <w:rFonts w:ascii="宋体" w:hAnsi="宋体" w:eastAsia="宋体" w:cs="宋体"/>
+                <w:b w:val="0"/>
+                <w:sz w:val="21"/>
+              </w:rPr>
+              <w:t>2.5 本项目已有实现基础</w:t>
+            </w:r>
+          </w:p>
+        </w:tc>
+        <w:tc>
+          <w:tcPr>
+            <w:tcW w:type="dxa" w:w="680"/>
+            <w:vAlign w:val="center"/>
+          </w:tcPr>
+          <w:p>
+            <w:pPr>
+              <w:spacing w:before="0" w:after="0" w:line="360" w:lineRule="exact"/>
+              <w:ind w:left="0"/>
+              <w:jc w:val="right"/>
+            </w:pPr>
+            <w:r/>
+            <w:r>
+              <w:rPr>
+                <w:rFonts w:ascii="宋体" w:hAnsi="宋体" w:eastAsia="宋体" w:cs="宋体"/>
+                <w:b w:val="0"/>
+                <w:sz w:val="21"/>
+              </w:rPr>
+              <w:t>8</w:t>
+            </w:r>
+          </w:p>
+        </w:tc>
+      </w:tr>
+      <w:tr>
+        <w:tc>
+          <w:tcPr>
+            <w:tcW w:type="dxa" w:w="8051"/>
+            <w:vAlign w:val="center"/>
+          </w:tcPr>
+          <w:p>
+            <w:pPr>
+              <w:spacing w:before="0" w:after="0" w:line="360" w:lineRule="exact"/>
+              <w:ind w:left="0"/>
+            </w:pPr>
+            <w:r/>
+            <w:r>
+              <w:rPr>
+                <w:rFonts w:ascii="宋体" w:hAnsi="宋体" w:eastAsia="宋体" w:cs="宋体"/>
+                <w:b/>
+                <w:sz w:val="22"/>
+              </w:rPr>
+              <w:t>第三章 需求分析与总体设计</w:t>
+            </w:r>
+          </w:p>
+        </w:tc>
+        <w:tc>
+          <w:tcPr>
+            <w:tcW w:type="dxa" w:w="680"/>
+            <w:vAlign w:val="center"/>
+          </w:tcPr>
+          <w:p>
+            <w:pPr>
+              <w:spacing w:before="0" w:after="0" w:line="360" w:lineRule="exact"/>
+              <w:ind w:left="0"/>
+              <w:jc w:val="right"/>
+            </w:pPr>
+            <w:r/>
+            <w:r>
+              <w:rPr>
+                <w:rFonts w:ascii="宋体" w:hAnsi="宋体" w:eastAsia="宋体" w:cs="宋体"/>
+                <w:b/>
+                <w:sz w:val="22"/>
+              </w:rPr>
+              <w:t>10</w:t>
+            </w:r>
+          </w:p>
+        </w:tc>
+      </w:tr>
+      <w:tr>
+        <w:tc>
+          <w:tcPr>
+            <w:tcW w:type="dxa" w:w="8051"/>
+            <w:vAlign w:val="center"/>
+          </w:tcPr>
+          <w:p>
+            <w:pPr>
+              <w:spacing w:before="0" w:after="0" w:line="360" w:lineRule="exact"/>
+              <w:ind w:left="369"/>
+            </w:pPr>
+            <w:r/>
+            <w:r>
+              <w:rPr>
+                <w:rFonts w:ascii="宋体" w:hAnsi="宋体" w:eastAsia="宋体" w:cs="宋体"/>
+                <w:b w:val="0"/>
+                <w:sz w:val="21"/>
+              </w:rPr>
+              <w:t>3.1 需求分析</w:t>
+            </w:r>
+          </w:p>
+        </w:tc>
+        <w:tc>
+          <w:tcPr>
+            <w:tcW w:type="dxa" w:w="680"/>
+            <w:vAlign w:val="center"/>
+          </w:tcPr>
+          <w:p>
+            <w:pPr>
+              <w:spacing w:before="0" w:after="0" w:line="360" w:lineRule="exact"/>
+              <w:ind w:left="0"/>
+              <w:jc w:val="right"/>
+            </w:pPr>
+            <w:r/>
+            <w:r>
+              <w:rPr>
+                <w:rFonts w:ascii="宋体" w:hAnsi="宋体" w:eastAsia="宋体" w:cs="宋体"/>
+                <w:b w:val="0"/>
+                <w:sz w:val="21"/>
+              </w:rPr>
+              <w:t>10</w:t>
+            </w:r>
+          </w:p>
+        </w:tc>
+      </w:tr>
+      <w:tr>
+        <w:tc>
+          <w:tcPr>
+            <w:tcW w:type="dxa" w:w="8051"/>
+            <w:vAlign w:val="center"/>
+          </w:tcPr>
+          <w:p>
+            <w:pPr>
+              <w:spacing w:before="0" w:after="0" w:line="360" w:lineRule="exact"/>
+              <w:ind w:left="369"/>
+            </w:pPr>
+            <w:r/>
+            <w:r>
+              <w:rPr>
+                <w:rFonts w:ascii="宋体" w:hAnsi="宋体" w:eastAsia="宋体" w:cs="宋体"/>
+                <w:b w:val="0"/>
+                <w:sz w:val="21"/>
+              </w:rPr>
+              <w:t>3.2 系统总体架构</w:t>
+            </w:r>
+          </w:p>
+        </w:tc>
+        <w:tc>
+          <w:tcPr>
+            <w:tcW w:type="dxa" w:w="680"/>
+            <w:vAlign w:val="center"/>
+          </w:tcPr>
+          <w:p>
+            <w:pPr>
+              <w:spacing w:before="0" w:after="0" w:line="360" w:lineRule="exact"/>
+              <w:ind w:left="0"/>
+              <w:jc w:val="right"/>
+            </w:pPr>
+            <w:r/>
+            <w:r>
+              <w:rPr>
+                <w:rFonts w:ascii="宋体" w:hAnsi="宋体" w:eastAsia="宋体" w:cs="宋体"/>
+                <w:b w:val="0"/>
+                <w:sz w:val="21"/>
+              </w:rPr>
+              <w:t>11</w:t>
+            </w:r>
+          </w:p>
+        </w:tc>
+      </w:tr>
+      <w:tr>
+        <w:tc>
+          <w:tcPr>
+            <w:tcW w:type="dxa" w:w="8051"/>
+            <w:vAlign w:val="center"/>
+          </w:tcPr>
+          <w:p>
+            <w:pPr>
+              <w:spacing w:before="0" w:after="0" w:line="360" w:lineRule="exact"/>
+              <w:ind w:left="369"/>
+            </w:pPr>
+            <w:r/>
+            <w:r>
+              <w:rPr>
+                <w:rFonts w:ascii="宋体" w:hAnsi="宋体" w:eastAsia="宋体" w:cs="宋体"/>
+                <w:b w:val="0"/>
+                <w:sz w:val="21"/>
+              </w:rPr>
+              <w:t>3.3 业务流程设计</w:t>
+            </w:r>
+          </w:p>
+        </w:tc>
+        <w:tc>
+          <w:tcPr>
+            <w:tcW w:type="dxa" w:w="680"/>
+            <w:vAlign w:val="center"/>
+          </w:tcPr>
+          <w:p>
+            <w:pPr>
+              <w:spacing w:before="0" w:after="0" w:line="360" w:lineRule="exact"/>
+              <w:ind w:left="0"/>
+              <w:jc w:val="right"/>
+            </w:pPr>
+            <w:r/>
+            <w:r>
+              <w:rPr>
+                <w:rFonts w:ascii="宋体" w:hAnsi="宋体" w:eastAsia="宋体" w:cs="宋体"/>
+                <w:b w:val="0"/>
+                <w:sz w:val="21"/>
+              </w:rPr>
+              <w:t>11</w:t>
+            </w:r>
+          </w:p>
+        </w:tc>
+      </w:tr>
+      <w:tr>
+        <w:tc>
+          <w:tcPr>
+            <w:tcW w:type="dxa" w:w="8051"/>
+            <w:vAlign w:val="center"/>
+          </w:tcPr>
+          <w:p>
+            <w:pPr>
+              <w:spacing w:before="0" w:after="0" w:line="360" w:lineRule="exact"/>
+              <w:ind w:left="369"/>
+            </w:pPr>
+            <w:r/>
+            <w:r>
+              <w:rPr>
+                <w:rFonts w:ascii="宋体" w:hAnsi="宋体" w:eastAsia="宋体" w:cs="宋体"/>
+                <w:b w:val="0"/>
+                <w:sz w:val="21"/>
+              </w:rPr>
+              <w:t>3.4 后端分层与接口设计</w:t>
+            </w:r>
+          </w:p>
+        </w:tc>
+        <w:tc>
+          <w:tcPr>
+            <w:tcW w:type="dxa" w:w="680"/>
+            <w:vAlign w:val="center"/>
+          </w:tcPr>
+          <w:p>
+            <w:pPr>
+              <w:spacing w:before="0" w:after="0" w:line="360" w:lineRule="exact"/>
+              <w:ind w:left="0"/>
+              <w:jc w:val="right"/>
+            </w:pPr>
+            <w:r/>
+            <w:r>
+              <w:rPr>
+                <w:rFonts w:ascii="宋体" w:hAnsi="宋体" w:eastAsia="宋体" w:cs="宋体"/>
+                <w:b w:val="0"/>
+                <w:sz w:val="21"/>
+              </w:rPr>
+              <w:t>12</w:t>
+            </w:r>
+          </w:p>
+        </w:tc>
+      </w:tr>
+      <w:tr>
+        <w:tc>
+          <w:tcPr>
+            <w:tcW w:type="dxa" w:w="8051"/>
+            <w:vAlign w:val="center"/>
+          </w:tcPr>
+          <w:p>
+            <w:pPr>
+              <w:spacing w:before="0" w:after="0" w:line="360" w:lineRule="exact"/>
+              <w:ind w:left="369"/>
+            </w:pPr>
+            <w:r/>
+            <w:r>
+              <w:rPr>
+                <w:rFonts w:ascii="宋体" w:hAnsi="宋体" w:eastAsia="宋体" w:cs="宋体"/>
+                <w:b w:val="0"/>
+                <w:sz w:val="21"/>
+              </w:rPr>
+              <w:t>3.5 数据库设计</w:t>
+            </w:r>
+          </w:p>
+        </w:tc>
+        <w:tc>
+          <w:tcPr>
+            <w:tcW w:type="dxa" w:w="680"/>
+            <w:vAlign w:val="center"/>
+          </w:tcPr>
+          <w:p>
+            <w:pPr>
+              <w:spacing w:before="0" w:after="0" w:line="360" w:lineRule="exact"/>
+              <w:ind w:left="0"/>
+              <w:jc w:val="right"/>
+            </w:pPr>
+            <w:r/>
+            <w:r>
+              <w:rPr>
+                <w:rFonts w:ascii="宋体" w:hAnsi="宋体" w:eastAsia="宋体" w:cs="宋体"/>
+                <w:b w:val="0"/>
+                <w:sz w:val="21"/>
+              </w:rPr>
+              <w:t>14</w:t>
+            </w:r>
+          </w:p>
+        </w:tc>
+      </w:tr>
+      <w:tr>
+        <w:tc>
+          <w:tcPr>
+            <w:tcW w:type="dxa" w:w="8051"/>
+            <w:vAlign w:val="center"/>
+          </w:tcPr>
+          <w:p>
+            <w:pPr>
+              <w:spacing w:before="0" w:after="0" w:line="360" w:lineRule="exact"/>
+              <w:ind w:left="369"/>
+            </w:pPr>
+            <w:r/>
+            <w:r>
+              <w:rPr>
+                <w:rFonts w:ascii="宋体" w:hAnsi="宋体" w:eastAsia="宋体" w:cs="宋体"/>
+                <w:b w:val="0"/>
+                <w:sz w:val="21"/>
+              </w:rPr>
+              <w:t>3.6 安全与可追溯设计</w:t>
+            </w:r>
+          </w:p>
+        </w:tc>
+        <w:tc>
+          <w:tcPr>
+            <w:tcW w:type="dxa" w:w="680"/>
+            <w:vAlign w:val="center"/>
+          </w:tcPr>
+          <w:p>
+            <w:pPr>
+              <w:spacing w:before="0" w:after="0" w:line="360" w:lineRule="exact"/>
+              <w:ind w:left="0"/>
+              <w:jc w:val="right"/>
+            </w:pPr>
+            <w:r/>
+            <w:r>
+              <w:rPr>
+                <w:rFonts w:ascii="宋体" w:hAnsi="宋体" w:eastAsia="宋体" w:cs="宋体"/>
+                <w:b w:val="0"/>
+                <w:sz w:val="21"/>
+              </w:rPr>
+              <w:t>16</w:t>
+            </w:r>
+          </w:p>
+        </w:tc>
+      </w:tr>
+      <w:tr>
+        <w:tc>
+          <w:tcPr>
+            <w:tcW w:type="dxa" w:w="8051"/>
+            <w:vAlign w:val="center"/>
+          </w:tcPr>
+          <w:p>
+            <w:pPr>
+              <w:spacing w:before="0" w:after="0" w:line="360" w:lineRule="exact"/>
+              <w:ind w:left="0"/>
+            </w:pPr>
+            <w:r/>
+            <w:r>
+              <w:rPr>
+                <w:rFonts w:ascii="宋体" w:hAnsi="宋体" w:eastAsia="宋体" w:cs="宋体"/>
+                <w:b/>
+                <w:sz w:val="22"/>
+              </w:rPr>
+              <w:t>第四章 系统详细实现</w:t>
+            </w:r>
+          </w:p>
+        </w:tc>
+        <w:tc>
+          <w:tcPr>
+            <w:tcW w:type="dxa" w:w="680"/>
+            <w:vAlign w:val="center"/>
+          </w:tcPr>
+          <w:p>
+            <w:pPr>
+              <w:spacing w:before="0" w:after="0" w:line="360" w:lineRule="exact"/>
+              <w:ind w:left="0"/>
+              <w:jc w:val="right"/>
+            </w:pPr>
+            <w:r/>
+            <w:r>
+              <w:rPr>
+                <w:rFonts w:ascii="宋体" w:hAnsi="宋体" w:eastAsia="宋体" w:cs="宋体"/>
+                <w:b/>
+                <w:sz w:val="22"/>
+              </w:rPr>
+              <w:t>19</w:t>
+            </w:r>
+          </w:p>
+        </w:tc>
+      </w:tr>
+      <w:tr>
+        <w:tc>
+          <w:tcPr>
+            <w:tcW w:type="dxa" w:w="8051"/>
+            <w:vAlign w:val="center"/>
+          </w:tcPr>
+          <w:p>
+            <w:pPr>
+              <w:spacing w:before="0" w:after="0" w:line="360" w:lineRule="exact"/>
+              <w:ind w:left="369"/>
+            </w:pPr>
+            <w:r/>
+            <w:r>
+              <w:rPr>
+                <w:rFonts w:ascii="宋体" w:hAnsi="宋体" w:eastAsia="宋体" w:cs="宋体"/>
+                <w:b w:val="0"/>
+                <w:sz w:val="21"/>
+              </w:rPr>
+              <w:t>4.1 文件上传与 OCR 处理实现</w:t>
+            </w:r>
+          </w:p>
+        </w:tc>
+        <w:tc>
+          <w:tcPr>
+            <w:tcW w:type="dxa" w:w="680"/>
+            <w:vAlign w:val="center"/>
+          </w:tcPr>
+          <w:p>
+            <w:pPr>
+              <w:spacing w:before="0" w:after="0" w:line="360" w:lineRule="exact"/>
+              <w:ind w:left="0"/>
+              <w:jc w:val="right"/>
+            </w:pPr>
+            <w:r/>
+            <w:r>
+              <w:rPr>
+                <w:rFonts w:ascii="宋体" w:hAnsi="宋体" w:eastAsia="宋体" w:cs="宋体"/>
+                <w:b w:val="0"/>
+                <w:sz w:val="21"/>
+              </w:rPr>
+              <w:t>19</w:t>
+            </w:r>
+          </w:p>
+        </w:tc>
+      </w:tr>
+      <w:tr>
+        <w:tc>
+          <w:tcPr>
+            <w:tcW w:type="dxa" w:w="8051"/>
+            <w:vAlign w:val="center"/>
+          </w:tcPr>
+          <w:p>
+            <w:pPr>
+              <w:spacing w:before="0" w:after="0" w:line="360" w:lineRule="exact"/>
+              <w:ind w:left="369"/>
+            </w:pPr>
+            <w:r/>
+            <w:r>
+              <w:rPr>
+                <w:rFonts w:ascii="宋体" w:hAnsi="宋体" w:eastAsia="宋体" w:cs="宋体"/>
+                <w:b w:val="0"/>
+                <w:sz w:val="21"/>
+              </w:rPr>
+              <w:t>4.2 标准化与版本化入库实现</w:t>
+            </w:r>
+          </w:p>
+        </w:tc>
+        <w:tc>
+          <w:tcPr>
+            <w:tcW w:type="dxa" w:w="680"/>
+            <w:vAlign w:val="center"/>
+          </w:tcPr>
+          <w:p>
+            <w:pPr>
+              <w:spacing w:before="0" w:after="0" w:line="360" w:lineRule="exact"/>
+              <w:ind w:left="0"/>
+              <w:jc w:val="right"/>
+            </w:pPr>
+            <w:r/>
+            <w:r>
+              <w:rPr>
+                <w:rFonts w:ascii="宋体" w:hAnsi="宋体" w:eastAsia="宋体" w:cs="宋体"/>
+                <w:b w:val="0"/>
+                <w:sz w:val="21"/>
+              </w:rPr>
+              <w:t>19</w:t>
+            </w:r>
+          </w:p>
+        </w:tc>
+      </w:tr>
+      <w:tr>
+        <w:tc>
+          <w:tcPr>
+            <w:tcW w:type="dxa" w:w="8051"/>
+            <w:vAlign w:val="center"/>
+          </w:tcPr>
+          <w:p>
+            <w:pPr>
+              <w:spacing w:before="0" w:after="0" w:line="360" w:lineRule="exact"/>
+              <w:ind w:left="369"/>
+            </w:pPr>
+            <w:r/>
+            <w:r>
+              <w:rPr>
+                <w:rFonts w:ascii="宋体" w:hAnsi="宋体" w:eastAsia="宋体" w:cs="宋体"/>
+                <w:b w:val="0"/>
+                <w:sz w:val="21"/>
+              </w:rPr>
+              <w:t>4.3 综合审计报告 LangGraph 实现</w:t>
+            </w:r>
+          </w:p>
+        </w:tc>
+        <w:tc>
+          <w:tcPr>
+            <w:tcW w:type="dxa" w:w="680"/>
+            <w:vAlign w:val="center"/>
+          </w:tcPr>
+          <w:p>
+            <w:pPr>
+              <w:spacing w:before="0" w:after="0" w:line="360" w:lineRule="exact"/>
+              <w:ind w:left="0"/>
+              <w:jc w:val="right"/>
+            </w:pPr>
+            <w:r/>
+            <w:r>
+              <w:rPr>
+                <w:rFonts w:ascii="宋体" w:hAnsi="宋体" w:eastAsia="宋体" w:cs="宋体"/>
+                <w:b w:val="0"/>
+                <w:sz w:val="21"/>
+              </w:rPr>
+              <w:t>20</w:t>
+            </w:r>
+          </w:p>
+        </w:tc>
+      </w:tr>
+      <w:tr>
+        <w:tc>
+          <w:tcPr>
+            <w:tcW w:type="dxa" w:w="8051"/>
+            <w:vAlign w:val="center"/>
+          </w:tcPr>
+          <w:p>
+            <w:pPr>
+              <w:spacing w:before="0" w:after="0" w:line="360" w:lineRule="exact"/>
+              <w:ind w:left="369"/>
+            </w:pPr>
+            <w:r/>
+            <w:r>
+              <w:rPr>
+                <w:rFonts w:ascii="宋体" w:hAnsi="宋体" w:eastAsia="宋体" w:cs="宋体"/>
+                <w:b w:val="0"/>
+                <w:sz w:val="21"/>
+              </w:rPr>
+              <w:t>4.4 审计事件与节点状态持久化</w:t>
+            </w:r>
+          </w:p>
+        </w:tc>
+        <w:tc>
+          <w:tcPr>
+            <w:tcW w:type="dxa" w:w="680"/>
+            <w:vAlign w:val="center"/>
+          </w:tcPr>
+          <w:p>
+            <w:pPr>
+              <w:spacing w:before="0" w:after="0" w:line="360" w:lineRule="exact"/>
+              <w:ind w:left="0"/>
+              <w:jc w:val="right"/>
+            </w:pPr>
+            <w:r/>
+            <w:r>
+              <w:rPr>
+                <w:rFonts w:ascii="宋体" w:hAnsi="宋体" w:eastAsia="宋体" w:cs="宋体"/>
+                <w:b w:val="0"/>
+                <w:sz w:val="21"/>
+              </w:rPr>
+              <w:t>22</w:t>
+            </w:r>
+          </w:p>
+        </w:tc>
+      </w:tr>
+      <w:tr>
+        <w:tc>
+          <w:tcPr>
+            <w:tcW w:type="dxa" w:w="8051"/>
+            <w:vAlign w:val="center"/>
+          </w:tcPr>
+          <w:p>
+            <w:pPr>
+              <w:spacing w:before="0" w:after="0" w:line="360" w:lineRule="exact"/>
+              <w:ind w:left="369"/>
+            </w:pPr>
+            <w:r/>
+            <w:r>
+              <w:rPr>
+                <w:rFonts w:ascii="宋体" w:hAnsi="宋体" w:eastAsia="宋体" w:cs="宋体"/>
+                <w:b w:val="0"/>
+                <w:sz w:val="21"/>
+              </w:rPr>
+              <w:t>4.5 前端模块实现</w:t>
+            </w:r>
+          </w:p>
+        </w:tc>
+        <w:tc>
+          <w:tcPr>
+            <w:tcW w:type="dxa" w:w="680"/>
+            <w:vAlign w:val="center"/>
+          </w:tcPr>
+          <w:p>
+            <w:pPr>
+              <w:spacing w:before="0" w:after="0" w:line="360" w:lineRule="exact"/>
+              <w:ind w:left="0"/>
+              <w:jc w:val="right"/>
+            </w:pPr>
+            <w:r/>
+            <w:r>
+              <w:rPr>
+                <w:rFonts w:ascii="宋体" w:hAnsi="宋体" w:eastAsia="宋体" w:cs="宋体"/>
+                <w:b w:val="0"/>
+                <w:sz w:val="21"/>
+              </w:rPr>
+              <w:t>23</w:t>
+            </w:r>
+          </w:p>
+        </w:tc>
+      </w:tr>
+      <w:tr>
+        <w:tc>
+          <w:tcPr>
+            <w:tcW w:type="dxa" w:w="8051"/>
+            <w:vAlign w:val="center"/>
+          </w:tcPr>
+          <w:p>
+            <w:pPr>
+              <w:spacing w:before="0" w:after="0" w:line="360" w:lineRule="exact"/>
+              <w:ind w:left="0"/>
+            </w:pPr>
+            <w:r/>
+            <w:r>
+              <w:rPr>
+                <w:rFonts w:ascii="宋体" w:hAnsi="宋体" w:eastAsia="宋体" w:cs="宋体"/>
+                <w:b/>
+                <w:sz w:val="22"/>
+              </w:rPr>
+              <w:t>第五章 测试与运行效果分析</w:t>
+            </w:r>
+          </w:p>
+        </w:tc>
+        <w:tc>
+          <w:tcPr>
+            <w:tcW w:type="dxa" w:w="680"/>
+            <w:vAlign w:val="center"/>
+          </w:tcPr>
+          <w:p>
+            <w:pPr>
+              <w:spacing w:before="0" w:after="0" w:line="360" w:lineRule="exact"/>
+              <w:ind w:left="0"/>
+              <w:jc w:val="right"/>
+            </w:pPr>
+            <w:r/>
+            <w:r>
+              <w:rPr>
+                <w:rFonts w:ascii="宋体" w:hAnsi="宋体" w:eastAsia="宋体" w:cs="宋体"/>
+                <w:b/>
+                <w:sz w:val="22"/>
+              </w:rPr>
+              <w:t>26</w:t>
+            </w:r>
+          </w:p>
+        </w:tc>
+      </w:tr>
+      <w:tr>
+        <w:tc>
+          <w:tcPr>
+            <w:tcW w:type="dxa" w:w="8051"/>
+            <w:vAlign w:val="center"/>
+          </w:tcPr>
+          <w:p>
+            <w:pPr>
+              <w:spacing w:before="0" w:after="0" w:line="360" w:lineRule="exact"/>
+              <w:ind w:left="369"/>
+            </w:pPr>
+            <w:r/>
+            <w:r>
+              <w:rPr>
+                <w:rFonts w:ascii="宋体" w:hAnsi="宋体" w:eastAsia="宋体" w:cs="宋体"/>
+                <w:b w:val="0"/>
+                <w:sz w:val="21"/>
+              </w:rPr>
+              <w:t>5.1 Mock 体检数据构造</w:t>
+            </w:r>
+          </w:p>
+        </w:tc>
+        <w:tc>
+          <w:tcPr>
+            <w:tcW w:type="dxa" w:w="680"/>
+            <w:vAlign w:val="center"/>
+          </w:tcPr>
+          <w:p>
+            <w:pPr>
+              <w:spacing w:before="0" w:after="0" w:line="360" w:lineRule="exact"/>
+              <w:ind w:left="0"/>
+              <w:jc w:val="right"/>
+            </w:pPr>
+            <w:r/>
+            <w:r>
+              <w:rPr>
+                <w:rFonts w:ascii="宋体" w:hAnsi="宋体" w:eastAsia="宋体" w:cs="宋体"/>
+                <w:b w:val="0"/>
+                <w:sz w:val="21"/>
+              </w:rPr>
+              <w:t>26</w:t>
+            </w:r>
+          </w:p>
+        </w:tc>
+      </w:tr>
+      <w:tr>
+        <w:tc>
+          <w:tcPr>
+            <w:tcW w:type="dxa" w:w="8051"/>
+            <w:vAlign w:val="center"/>
+          </w:tcPr>
+          <w:p>
+            <w:pPr>
+              <w:spacing w:before="0" w:after="0" w:line="360" w:lineRule="exact"/>
+              <w:ind w:left="369"/>
+            </w:pPr>
+            <w:r/>
+            <w:r>
+              <w:rPr>
+                <w:rFonts w:ascii="宋体" w:hAnsi="宋体" w:eastAsia="宋体" w:cs="宋体"/>
+                <w:b w:val="0"/>
+                <w:sz w:val="21"/>
+              </w:rPr>
+              <w:t>5.2 接口与端到端测试</w:t>
+            </w:r>
+          </w:p>
+        </w:tc>
+        <w:tc>
+          <w:tcPr>
+            <w:tcW w:type="dxa" w:w="680"/>
+            <w:vAlign w:val="center"/>
+          </w:tcPr>
+          <w:p>
+            <w:pPr>
+              <w:spacing w:before="0" w:after="0" w:line="360" w:lineRule="exact"/>
+              <w:ind w:left="0"/>
+              <w:jc w:val="right"/>
+            </w:pPr>
+            <w:r/>
+            <w:r>
+              <w:rPr>
+                <w:rFonts w:ascii="宋体" w:hAnsi="宋体" w:eastAsia="宋体" w:cs="宋体"/>
+                <w:b w:val="0"/>
+                <w:sz w:val="21"/>
+              </w:rPr>
+              <w:t>27</w:t>
+            </w:r>
+          </w:p>
+        </w:tc>
+      </w:tr>
+      <w:tr>
+        <w:tc>
+          <w:tcPr>
+            <w:tcW w:type="dxa" w:w="8051"/>
+            <w:vAlign w:val="center"/>
+          </w:tcPr>
+          <w:p>
+            <w:pPr>
+              <w:spacing w:before="0" w:after="0" w:line="360" w:lineRule="exact"/>
+              <w:ind w:left="369"/>
+            </w:pPr>
+            <w:r/>
+            <w:r>
+              <w:rPr>
+                <w:rFonts w:ascii="宋体" w:hAnsi="宋体" w:eastAsia="宋体" w:cs="宋体"/>
+                <w:b w:val="0"/>
+                <w:sz w:val="21"/>
+              </w:rPr>
+              <w:t>5.3 真实演示运行截图</w:t>
+            </w:r>
+          </w:p>
+        </w:tc>
+        <w:tc>
+          <w:tcPr>
+            <w:tcW w:type="dxa" w:w="680"/>
+            <w:vAlign w:val="center"/>
+          </w:tcPr>
+          <w:p>
+            <w:pPr>
+              <w:spacing w:before="0" w:after="0" w:line="360" w:lineRule="exact"/>
+              <w:ind w:left="0"/>
+              <w:jc w:val="right"/>
+            </w:pPr>
+            <w:r/>
+            <w:r>
+              <w:rPr>
+                <w:rFonts w:ascii="宋体" w:hAnsi="宋体" w:eastAsia="宋体" w:cs="宋体"/>
+                <w:b w:val="0"/>
+                <w:sz w:val="21"/>
+              </w:rPr>
+              <w:t>29</w:t>
+            </w:r>
+          </w:p>
+        </w:tc>
+      </w:tr>
+      <w:tr>
+        <w:tc>
+          <w:tcPr>
+            <w:tcW w:type="dxa" w:w="8051"/>
+            <w:vAlign w:val="center"/>
+          </w:tcPr>
+          <w:p>
+            <w:pPr>
+              <w:spacing w:before="0" w:after="0" w:line="360" w:lineRule="exact"/>
+              <w:ind w:left="369"/>
+            </w:pPr>
+            <w:r/>
+            <w:r>
+              <w:rPr>
+                <w:rFonts w:ascii="宋体" w:hAnsi="宋体" w:eastAsia="宋体" w:cs="宋体"/>
+                <w:b w:val="0"/>
+                <w:sz w:val="21"/>
+              </w:rPr>
+              <w:t>5.4 运行效果与不足分析</w:t>
+            </w:r>
+          </w:p>
+        </w:tc>
+        <w:tc>
+          <w:tcPr>
+            <w:tcW w:type="dxa" w:w="680"/>
+            <w:vAlign w:val="center"/>
+          </w:tcPr>
+          <w:p>
+            <w:pPr>
+              <w:spacing w:before="0" w:after="0" w:line="360" w:lineRule="exact"/>
+              <w:ind w:left="0"/>
+              <w:jc w:val="right"/>
+            </w:pPr>
+            <w:r/>
+            <w:r>
+              <w:rPr>
+                <w:rFonts w:ascii="宋体" w:hAnsi="宋体" w:eastAsia="宋体" w:cs="宋体"/>
+                <w:b w:val="0"/>
+                <w:sz w:val="21"/>
+              </w:rPr>
+              <w:t>32</w:t>
+            </w:r>
+          </w:p>
+        </w:tc>
+      </w:tr>
+      <w:tr>
+        <w:tc>
+          <w:tcPr>
+            <w:tcW w:type="dxa" w:w="8051"/>
+            <w:vAlign w:val="center"/>
+          </w:tcPr>
+          <w:p>
+            <w:pPr>
+              <w:spacing w:before="0" w:after="0" w:line="360" w:lineRule="exact"/>
+              <w:ind w:left="0"/>
+            </w:pPr>
+            <w:r/>
+            <w:r>
+              <w:rPr>
+                <w:rFonts w:ascii="宋体" w:hAnsi="宋体" w:eastAsia="宋体" w:cs="宋体"/>
+                <w:b/>
+                <w:sz w:val="22"/>
+              </w:rPr>
+              <w:t>结束语</w:t>
+            </w:r>
+          </w:p>
+        </w:tc>
+        <w:tc>
+          <w:tcPr>
+            <w:tcW w:type="dxa" w:w="680"/>
+            <w:vAlign w:val="center"/>
+          </w:tcPr>
+          <w:p>
+            <w:pPr>
+              <w:spacing w:before="0" w:after="0" w:line="360" w:lineRule="exact"/>
+              <w:ind w:left="0"/>
+              <w:jc w:val="right"/>
+            </w:pPr>
+            <w:r/>
+            <w:r>
+              <w:rPr>
+                <w:rFonts w:ascii="宋体" w:hAnsi="宋体" w:eastAsia="宋体" w:cs="宋体"/>
+                <w:b/>
+                <w:sz w:val="22"/>
+              </w:rPr>
+              <w:t>34</w:t>
+            </w:r>
+          </w:p>
+        </w:tc>
+      </w:tr>
+      <w:tr>
+        <w:tc>
+          <w:tcPr>
+            <w:tcW w:type="dxa" w:w="8051"/>
+            <w:vAlign w:val="center"/>
+          </w:tcPr>
+          <w:p>
+            <w:pPr>
+              <w:spacing w:before="0" w:after="0" w:line="360" w:lineRule="exact"/>
+              <w:ind w:left="0"/>
+            </w:pPr>
+            <w:r/>
+            <w:r>
+              <w:rPr>
+                <w:rFonts w:ascii="宋体" w:hAnsi="宋体" w:eastAsia="宋体" w:cs="宋体"/>
+                <w:b/>
+                <w:sz w:val="22"/>
+              </w:rPr>
+              <w:t>参考文献</w:t>
+            </w:r>
+          </w:p>
+        </w:tc>
+        <w:tc>
+          <w:tcPr>
+            <w:tcW w:type="dxa" w:w="680"/>
+            <w:vAlign w:val="center"/>
+          </w:tcPr>
+          <w:p>
+            <w:pPr>
+              <w:spacing w:before="0" w:after="0" w:line="360" w:lineRule="exact"/>
+              <w:ind w:left="0"/>
+              <w:jc w:val="right"/>
+            </w:pPr>
+            <w:r/>
+            <w:r>
+              <w:rPr>
+                <w:rFonts w:ascii="宋体" w:hAnsi="宋体" w:eastAsia="宋体" w:cs="宋体"/>
+                <w:b/>
+                <w:sz w:val="22"/>
+              </w:rPr>
+              <w:t>35</w:t>
+            </w:r>
+          </w:p>
+        </w:tc>
+      </w:tr>
+      <w:tr>
+        <w:tc>
+          <w:tcPr>
+            <w:tcW w:type="dxa" w:w="8051"/>
+            <w:vAlign w:val="center"/>
+          </w:tcPr>
+          <w:p>
+            <w:pPr>
+              <w:spacing w:before="0" w:after="0" w:line="360" w:lineRule="exact"/>
+              <w:ind w:left="0"/>
+            </w:pPr>
+            <w:r/>
+            <w:r>
+              <w:rPr>
+                <w:rFonts w:ascii="宋体" w:hAnsi="宋体" w:eastAsia="宋体" w:cs="宋体"/>
+                <w:b/>
+                <w:sz w:val="22"/>
+              </w:rPr>
+              <w:t>致谢</w:t>
+            </w:r>
+          </w:p>
+        </w:tc>
+        <w:tc>
+          <w:tcPr>
+            <w:tcW w:type="dxa" w:w="680"/>
+            <w:vAlign w:val="center"/>
+          </w:tcPr>
+          <w:p>
+            <w:pPr>
+              <w:spacing w:before="0" w:after="0" w:line="360" w:lineRule="exact"/>
+              <w:ind w:left="0"/>
+              <w:jc w:val="right"/>
+            </w:pPr>
+            <w:r/>
+            <w:r>
+              <w:rPr>
+                <w:rFonts w:ascii="宋体" w:hAnsi="宋体" w:eastAsia="宋体" w:cs="宋体"/>
+                <w:b/>
+                <w:sz w:val="22"/>
+              </w:rPr>
+              <w:t>37</w:t>
+            </w:r>
+          </w:p>
+        </w:tc>
+      </w:tr>
+    </w:tbl>
     <w:p>
       <w:pPr>
         <w:sectPr>
@@ -1434,7 +2015,6 @@
           <w:rFonts w:ascii="Times New Roman" w:hAnsi="Times New Roman" w:eastAsia="Times New Roman" w:cs="Times New Roman"/>
           <w:b w:val="0"/>
           <w:sz w:val="21"/>
-          <w:vertAlign w:val="superscript"/>
         </w:rPr>
         <w:t>[9-13]</w:t>
       </w:r>
@@ -1465,7 +2045,6 @@
           <w:rFonts w:ascii="Times New Roman" w:hAnsi="Times New Roman" w:eastAsia="Times New Roman" w:cs="Times New Roman"/>
           <w:b w:val="0"/>
           <w:sz w:val="21"/>
-          <w:vertAlign w:val="superscript"/>
         </w:rPr>
         <w:t>[1-2]</w:t>
       </w:r>
@@ -1482,7 +2061,6 @@
           <w:rFonts w:ascii="Times New Roman" w:hAnsi="Times New Roman" w:eastAsia="Times New Roman" w:cs="Times New Roman"/>
           <w:b w:val="0"/>
           <w:sz w:val="21"/>
-          <w:vertAlign w:val="superscript"/>
         </w:rPr>
         <w:t>[3]</w:t>
       </w:r>
@@ -1610,7 +2188,6 @@
           <w:rFonts w:ascii="Times New Roman" w:hAnsi="Times New Roman" w:eastAsia="Times New Roman" w:cs="Times New Roman"/>
           <w:b w:val="0"/>
           <w:sz w:val="21"/>
-          <w:vertAlign w:val="superscript"/>
         </w:rPr>
         <w:t>[9-13]</w:t>
       </w:r>
@@ -1627,7 +2204,6 @@
           <w:rFonts w:ascii="Times New Roman" w:hAnsi="Times New Roman" w:eastAsia="Times New Roman" w:cs="Times New Roman"/>
           <w:b w:val="0"/>
           <w:sz w:val="21"/>
-          <w:vertAlign w:val="superscript"/>
         </w:rPr>
         <w:t>[4-8]</w:t>
       </w:r>
@@ -1658,7 +2234,6 @@
           <w:rFonts w:ascii="Times New Roman" w:hAnsi="Times New Roman" w:eastAsia="Times New Roman" w:cs="Times New Roman"/>
           <w:b w:val="0"/>
           <w:sz w:val="21"/>
-          <w:vertAlign w:val="superscript"/>
         </w:rPr>
         <w:t>[19]</w:t>
       </w:r>
@@ -1675,7 +2250,6 @@
           <w:rFonts w:ascii="Times New Roman" w:hAnsi="Times New Roman" w:eastAsia="Times New Roman" w:cs="Times New Roman"/>
           <w:b w:val="0"/>
           <w:sz w:val="21"/>
-          <w:vertAlign w:val="superscript"/>
         </w:rPr>
         <w:t>[20]</w:t>
       </w:r>
@@ -1692,7 +2266,6 @@
           <w:rFonts w:ascii="Times New Roman" w:hAnsi="Times New Roman" w:eastAsia="Times New Roman" w:cs="Times New Roman"/>
           <w:b w:val="0"/>
           <w:sz w:val="21"/>
-          <w:vertAlign w:val="superscript"/>
         </w:rPr>
         <w:t>[21]</w:t>
       </w:r>
@@ -1723,7 +2296,6 @@
           <w:rFonts w:ascii="Times New Roman" w:hAnsi="Times New Roman" w:eastAsia="Times New Roman" w:cs="Times New Roman"/>
           <w:b w:val="0"/>
           <w:sz w:val="21"/>
-          <w:vertAlign w:val="superscript"/>
         </w:rPr>
         <w:t>[14-15]</w:t>
       </w:r>
@@ -1740,7 +2312,6 @@
           <w:rFonts w:ascii="Times New Roman" w:hAnsi="Times New Roman" w:eastAsia="Times New Roman" w:cs="Times New Roman"/>
           <w:b w:val="0"/>
           <w:sz w:val="21"/>
-          <w:vertAlign w:val="superscript"/>
         </w:rPr>
         <w:t>[16-18]</w:t>
       </w:r>
@@ -1973,7 +2544,6 @@
           <w:rFonts w:ascii="Times New Roman" w:hAnsi="Times New Roman" w:eastAsia="Times New Roman" w:cs="Times New Roman"/>
           <w:b w:val="0"/>
           <w:sz w:val="21"/>
-          <w:vertAlign w:val="superscript"/>
         </w:rPr>
         <w:t>[1-2]</w:t>
       </w:r>
@@ -1990,7 +2560,6 @@
           <w:rFonts w:ascii="Times New Roman" w:hAnsi="Times New Roman" w:eastAsia="Times New Roman" w:cs="Times New Roman"/>
           <w:b w:val="0"/>
           <w:sz w:val="21"/>
-          <w:vertAlign w:val="superscript"/>
         </w:rPr>
         <w:t>[3]</w:t>
       </w:r>
@@ -2021,7 +2590,6 @@
           <w:rFonts w:ascii="Times New Roman" w:hAnsi="Times New Roman" w:eastAsia="Times New Roman" w:cs="Times New Roman"/>
           <w:b w:val="0"/>
           <w:sz w:val="21"/>
-          <w:vertAlign w:val="superscript"/>
         </w:rPr>
         <w:t>[4]</w:t>
       </w:r>
@@ -2038,7 +2606,6 @@
           <w:rFonts w:ascii="Times New Roman" w:hAnsi="Times New Roman" w:eastAsia="Times New Roman" w:cs="Times New Roman"/>
           <w:b w:val="0"/>
           <w:sz w:val="21"/>
-          <w:vertAlign w:val="superscript"/>
         </w:rPr>
         <w:t>[5]</w:t>
       </w:r>
@@ -2069,7 +2636,6 @@
           <w:rFonts w:ascii="Times New Roman" w:hAnsi="Times New Roman" w:eastAsia="Times New Roman" w:cs="Times New Roman"/>
           <w:b w:val="0"/>
           <w:sz w:val="21"/>
-          <w:vertAlign w:val="superscript"/>
         </w:rPr>
         <w:t>[6-7]</w:t>
       </w:r>
@@ -2100,7 +2666,6 @@
           <w:rFonts w:ascii="Times New Roman" w:hAnsi="Times New Roman" w:eastAsia="Times New Roman" w:cs="Times New Roman"/>
           <w:b w:val="0"/>
           <w:sz w:val="21"/>
-          <w:vertAlign w:val="superscript"/>
         </w:rPr>
         <w:t>[8]</w:t>
       </w:r>
@@ -2145,7 +2710,6 @@
           <w:rFonts w:ascii="Times New Roman" w:hAnsi="Times New Roman" w:eastAsia="Times New Roman" w:cs="Times New Roman"/>
           <w:b w:val="0"/>
           <w:sz w:val="21"/>
-          <w:vertAlign w:val="superscript"/>
         </w:rPr>
         <w:t>[9-13]</w:t>
       </w:r>
@@ -2162,7 +2726,6 @@
           <w:rFonts w:ascii="Times New Roman" w:hAnsi="Times New Roman" w:eastAsia="Times New Roman" w:cs="Times New Roman"/>
           <w:b w:val="0"/>
           <w:sz w:val="21"/>
-          <w:vertAlign w:val="superscript"/>
         </w:rPr>
         <w:t>[23]</w:t>
       </w:r>
@@ -2193,7 +2756,6 @@
           <w:rFonts w:ascii="Times New Roman" w:hAnsi="Times New Roman" w:eastAsia="Times New Roman" w:cs="Times New Roman"/>
           <w:b w:val="0"/>
           <w:sz w:val="21"/>
-          <w:vertAlign w:val="superscript"/>
         </w:rPr>
         <w:t>[19]</w:t>
       </w:r>
@@ -2224,7 +2786,6 @@
           <w:rFonts w:ascii="Times New Roman" w:hAnsi="Times New Roman" w:eastAsia="Times New Roman" w:cs="Times New Roman"/>
           <w:b w:val="0"/>
           <w:sz w:val="21"/>
-          <w:vertAlign w:val="superscript"/>
         </w:rPr>
         <w:t>[12]</w:t>
       </w:r>
@@ -2241,7 +2802,6 @@
           <w:rFonts w:ascii="Times New Roman" w:hAnsi="Times New Roman" w:eastAsia="Times New Roman" w:cs="Times New Roman"/>
           <w:b w:val="0"/>
           <w:sz w:val="21"/>
-          <w:vertAlign w:val="superscript"/>
         </w:rPr>
         <w:t>[24]</w:t>
       </w:r>
@@ -2279,7 +2839,7 @@
           <w:color w:val="000000"/>
           <w:sz w:val="24"/>
         </w:rPr>
-        <w:t>2.3 Agent 工作流、工具调用与状态机编排</w:t>
+        <w:t>2.3 Agent 工作流与状态机编排</w:t>
       </w:r>
     </w:p>
     <w:p>
@@ -2300,7 +2860,6 @@
           <w:rFonts w:ascii="Times New Roman" w:hAnsi="Times New Roman" w:eastAsia="Times New Roman" w:cs="Times New Roman"/>
           <w:b w:val="0"/>
           <w:sz w:val="21"/>
-          <w:vertAlign w:val="superscript"/>
         </w:rPr>
         <w:t>[20]</w:t>
       </w:r>
@@ -2317,7 +2876,6 @@
           <w:rFonts w:ascii="Times New Roman" w:hAnsi="Times New Roman" w:eastAsia="Times New Roman" w:cs="Times New Roman"/>
           <w:b w:val="0"/>
           <w:sz w:val="21"/>
-          <w:vertAlign w:val="superscript"/>
         </w:rPr>
         <w:t>[21]</w:t>
       </w:r>
@@ -2348,7 +2906,6 @@
           <w:rFonts w:ascii="Times New Roman" w:hAnsi="Times New Roman" w:eastAsia="Times New Roman" w:cs="Times New Roman"/>
           <w:b w:val="0"/>
           <w:sz w:val="21"/>
-          <w:vertAlign w:val="superscript"/>
         </w:rPr>
         <w:t>[22]</w:t>
       </w:r>
@@ -2814,7 +3371,23 @@
           <w:b w:val="0"/>
           <w:sz w:val="21"/>
         </w:rPr>
-        <w:t>Provider 抽象的核心作用是隔离业务流程与外部能力。OCR、LLM 和存储服务具有明显的不稳定性和环境差异：本地演示时可能只处理纯文本，生产部署时可能需要百度 OCR、视觉模型或对象存储；标准化能力也可能在规则解析、LLM 解析和混合解析之间切换。如果业务服务直接依赖某个具体 SDK，后续替换成本会很高，也不利于记录调用耗时、错误类别和重试结果。</w:t>
+        <w:t>Provider 抽象的核心作用是隔离业务流程与外部能力。OCR、LLM 和存储服务具有明显的不稳定性和环境差异：本地演示时可能只处理纯文本，生产部署时可能需要百度 OCR、视觉模型或对象存储；标准化能力也可能在规则解析、LLM 解析和混合解析之间切换。如果业务服务直接依赖某个具体 SDK，后续替换成本会很高，也不利于记录调用耗时、错误类别和重试结果。该设计符合软件工程中通过接口边界降低模块耦合、提高可维护性的基本思想</w:t>
+      </w:r>
+      <w:r>
+        <w:rPr>
+          <w:rFonts w:ascii="Times New Roman" w:hAnsi="Times New Roman" w:eastAsia="Times New Roman" w:cs="Times New Roman"/>
+          <w:b w:val="0"/>
+          <w:sz w:val="21"/>
+        </w:rPr>
+        <w:t>[14]</w:t>
+      </w:r>
+      <w:r>
+        <w:rPr>
+          <w:rFonts w:ascii="宋体" w:hAnsi="宋体" w:eastAsia="宋体" w:cs="宋体"/>
+          <w:b w:val="0"/>
+          <w:sz w:val="21"/>
+        </w:rPr>
+        <w:t>。</w:t>
       </w:r>
     </w:p>
     <w:p>
@@ -2925,7 +3498,23 @@
           <w:b w:val="0"/>
           <w:sz w:val="21"/>
         </w:rPr>
-        <w:t>在当前版本中，后端路由统一挂载到 /api，已包含 auth、files、ocr、ingestion、documents、document-versions、records、measurements、query、tasks、knowledge、insight、chat 和 audit-reports 等分组。数据库模型覆盖核心业务对象，测试脚本能够创建 admin@qq.com 测试账户并写入 25 份 Mock 文档，其中包含 20 份体检类单据、5 份报告型单据和 85 条结构化指标。综合审计报告模块已经能够持久化 audit_report_runs、audit_report_events 和 audit_report_node_states。</w:t>
+        <w:t>在当前版本中，后端路由统一挂载到 /api，已包含 auth、files、ocr、ingestion、documents、document-versions、records、measurements、query、tasks、knowledge、insight、chat 和 audit-reports 等分组。数据库模型覆盖核心业务对象，符合关系数据库通过主键、外键和关系模式组织业务对象的建模思路</w:t>
+      </w:r>
+      <w:r>
+        <w:rPr>
+          <w:rFonts w:ascii="Times New Roman" w:hAnsi="Times New Roman" w:eastAsia="Times New Roman" w:cs="Times New Roman"/>
+          <w:b w:val="0"/>
+          <w:sz w:val="21"/>
+        </w:rPr>
+        <w:t>[15]</w:t>
+      </w:r>
+      <w:r>
+        <w:rPr>
+          <w:rFonts w:ascii="宋体" w:hAnsi="宋体" w:eastAsia="宋体" w:cs="宋体"/>
+          <w:b w:val="0"/>
+          <w:sz w:val="21"/>
+        </w:rPr>
+        <w:t>；测试脚本能够创建 admin@qq.com 测试账户并写入 25 份 Mock 文档，其中包含 20 份体检类单据、5 份报告型单据和 85 条结构化指标。综合审计报告模块已经能够持久化 audit_report_runs、audit_report_events 和 audit_report_node_states。</w:t>
       </w:r>
     </w:p>
     <w:p>
@@ -2953,21 +3542,23 @@
           <w:b w:val="0"/>
           <w:sz w:val="21"/>
         </w:rPr>
-        <w:t>医疗资料标准化的关键是确定哪些信息必须结构化，哪些信息可以作为叙事事实保存。对于数值型检验指标，系统需要保存指标名称、数值、单位、参考范围、异常标记和观察时间；对于病历摘要、影像结论和总检建议，系统更适合保存为 prose_facts 或 narrative_context，避免把自然语言强行拆成错误的数值字段。这样的区分能够降低标准化失败对后续审计的影响，也使系统在面对不同报告模板时具有更好的容错能力。</w:t>
+        <w:t>医疗资料标准化的关键是确定哪些信息必须结构化，哪些信息可以作为叙事事实保存。对于数值型检验指标，系统需要保存指标名称、数值、单位、参考范围、异常标记和观察时间；对于病历摘要、影像结论和总检建议，系统更适合保存为 prose_facts 或 narrative_context，避免把自然语言强行拆成错误的数值字段。这样的区分能够降低标准化失败对后续审计的影响，也使系统在面对不同报告模板时具有更好的容错能力</w:t>
       </w:r>
-    </w:p>
-    <w:p>
-      <w:pPr>
-        <w:spacing w:before="0" w:after="0" w:line="360" w:lineRule="exact"/>
-        <w:ind w:firstLine="420"/>
-      </w:pPr>
+      <w:r>
+        <w:rPr>
+          <w:rFonts w:ascii="Times New Roman" w:hAnsi="Times New Roman" w:eastAsia="Times New Roman" w:cs="Times New Roman"/>
+          <w:b w:val="0"/>
+          <w:sz w:val="21"/>
+        </w:rPr>
+        <w:t>[4-8]</w:t>
+      </w:r>
       <w:r>
         <w:rPr>
           <w:rFonts w:ascii="宋体" w:hAnsi="宋体" w:eastAsia="宋体" w:cs="宋体"/>
           <w:b w:val="0"/>
           <w:sz w:val="21"/>
         </w:rPr>
-        <w:t>在本文系统中，标准化不是一次性覆盖操作，而是一个可版本化过程。每次 OCR 结果进入标准化服务后，系统会生成 ExtractedDocument 当前投影，同时创建 DocumentVersion 保存版本快照。这样做的原因是 OCR Provider、LLM Provider 和规则库都可能发生变化，若系统直接覆盖旧结果，就无法解释历史报告为何得出当时的结论。版本化设计让每次综合审计报告都可以绑定具体 document_version_id，从而保证报告证据能够回到当时使用的结构化结果。</w:t>
+        <w:t>。</w:t>
       </w:r>
     </w:p>
     <w:p>
@@ -2981,21 +3572,23 @@
           <w:b w:val="0"/>
           <w:sz w:val="21"/>
         </w:rPr>
-        <w:t>Provider 抽象在本项目中承担了工程隔离作用。OCR、LLM、标准化和存储都可能在不同环境下切换具体实现，例如文本样本使用 plaintext，图片样本在密钥配置后使用百度 OCR，部署时还可以接入视觉模型或对象存储；标准化在网络不可用时使用规则兜底，在可用时调用兼容 OpenAI 协议的模型。若业务服务直接依赖某个具体 SDK，后续替换成本会很高。本文通过 ProviderGateway 记录调用事件、耗时、状态和错误信息，使外部能力既可替换，又可被审计。</w:t>
+        <w:t>在本文系统中，标准化不是一次性覆盖操作，而是一个可版本化过程。每次 OCR 结果进入标准化服务后，系统会生成 ExtractedDocument 当前投影，同时创建 DocumentVersion 保存版本快照。这样做的原因是 OCR Provider、LLM Provider 和规则库都可能发生变化，若系统直接覆盖旧结果，就无法解释历史报告为何得出当时的结论。版本化设计让每次综合审计报告都可以绑定具体 document_version_id，从而保证报告证据能够回到当时使用的结构化结果</w:t>
       </w:r>
-    </w:p>
-    <w:p>
-      <w:pPr>
-        <w:spacing w:before="0" w:after="0" w:line="360" w:lineRule="exact"/>
-        <w:ind w:firstLine="420"/>
-      </w:pPr>
+      <w:r>
+        <w:rPr>
+          <w:rFonts w:ascii="Times New Roman" w:hAnsi="Times New Roman" w:eastAsia="Times New Roman" w:cs="Times New Roman"/>
+          <w:b w:val="0"/>
+          <w:sz w:val="21"/>
+        </w:rPr>
+        <w:t>[8,15]</w:t>
+      </w:r>
       <w:r>
         <w:rPr>
           <w:rFonts w:ascii="宋体" w:hAnsi="宋体" w:eastAsia="宋体" w:cs="宋体"/>
           <w:b w:val="0"/>
           <w:sz w:val="21"/>
         </w:rPr>
-        <w:t>LangGraph 状态机的核心不是“多写几个函数”，而是把节点之间的控制权交给状态和条件边。AuditGraphState 中保存 selected_document_version_ids、documents、measurements、knowledge_chunks、knowledge_context、completed_agents、route_history、evidence_items、citation_issues、safety_issues、report_draft 和 final_report 等字段。每个节点只负责读取必要字段并返回局部更新，路由节点根据状态决定下一步。这样可以避免单个服务函数无限膨胀，也便于前端根据事件流展示节点执行过程。</w:t>
+        <w:t>。</w:t>
       </w:r>
     </w:p>
     <w:p>
@@ -3009,21 +3602,113 @@
           <w:b w:val="0"/>
           <w:sz w:val="21"/>
         </w:rPr>
-        <w:t>多 Agent 协作在本文中采用职责拆分，而不是多个模型互相聊天。document_quality_agent 检查资料是否完整，timeline_builder 组织时间线，measurement_consistency_agent 检查指标变化和异常，risk_agent 生成非诊断性关注点，knowledge_retrieval_agent 检索医学审计知识，evidence_agent 负责证据绑定，conflict_agent 检查叙事事实与结构化指标之间的冲突，compliance_agent 检查结论是否缺少证据，report_composer 负责报告组织，citation_checker 和 safety_reviewer 分别进行引用和安全审查。各节点职责边界清晰，便于测试和论文说明。</w:t>
+        <w:t>Provider 抽象在本项目中承担了工程隔离作用。OCR、LLM、标准化和存储都可能在不同环境下切换具体实现，例如文本样本使用 plaintext，图片样本在密钥配置后使用百度 OCR，部署时还可以接入视觉模型或对象存储；标准化在网络不可用时使用规则兜底，在可用时调用兼容 OpenAI 协议的模型。若业务服务直接依赖某个具体 SDK，后续替换成本会很高。本文通过 ProviderGateway 记录调用事件、耗时、状态和错误信息，使外部能力既可替换，又可被审计</w:t>
       </w:r>
-    </w:p>
-    <w:p>
-      <w:pPr>
-        <w:spacing w:before="0" w:after="0" w:line="360" w:lineRule="exact"/>
-        <w:ind w:firstLine="420"/>
-      </w:pPr>
+      <w:r>
+        <w:rPr>
+          <w:rFonts w:ascii="Times New Roman" w:hAnsi="Times New Roman" w:eastAsia="Times New Roman" w:cs="Times New Roman"/>
+          <w:b w:val="0"/>
+          <w:sz w:val="21"/>
+        </w:rPr>
+        <w:t>[14]</w:t>
+      </w:r>
       <w:r>
         <w:rPr>
           <w:rFonts w:ascii="宋体" w:hAnsi="宋体" w:eastAsia="宋体" w:cs="宋体"/>
           <w:b w:val="0"/>
           <w:sz w:val="21"/>
         </w:rPr>
-        <w:t>项目已有基础包括 FastAPI 路由、SQLAlchemy 模型、Pydantic 数据校验、React 前端模块和 Mock 体检数据脚本。这些基础并不是论文外的附属内容，而是支撑 LangGraph 架构落地的工程条件。若没有稳定的数据模型，状态机无法获得可靠输入；若没有事件表和节点状态表，前端无法展示真实流转；若没有 Mock 数据，测试和答辩演示无法稳定复现。因此本章所述基础技术与后续系统实现之间存在直接对应关系。</w:t>
+        <w:t>。</w:t>
+      </w:r>
+    </w:p>
+    <w:p>
+      <w:pPr>
+        <w:spacing w:before="0" w:after="0" w:line="360" w:lineRule="exact"/>
+        <w:ind w:firstLine="420"/>
+      </w:pPr>
+      <w:r>
+        <w:rPr>
+          <w:rFonts w:ascii="宋体" w:hAnsi="宋体" w:eastAsia="宋体" w:cs="宋体"/>
+          <w:b w:val="0"/>
+          <w:sz w:val="21"/>
+        </w:rPr>
+        <w:t>LangGraph 状态机的核心不是“多写几个函数”，而是把节点之间的控制权交给状态和条件边。AuditGraphState 中保存 selected_document_version_ids、documents、measurements、knowledge_chunks、knowledge_context、completed_agents、route_history、evidence_items、citation_issues、safety_issues、report_draft 和 final_report 等字段。每个节点只负责读取必要字段并返回局部更新，路由节点根据状态决定下一步。这样可以避免单个服务函数无限膨胀，也便于前端根据事件流展示节点执行过程</w:t>
+      </w:r>
+      <w:r>
+        <w:rPr>
+          <w:rFonts w:ascii="Times New Roman" w:hAnsi="Times New Roman" w:eastAsia="Times New Roman" w:cs="Times New Roman"/>
+          <w:b w:val="0"/>
+          <w:sz w:val="21"/>
+        </w:rPr>
+        <w:t>[22]</w:t>
+      </w:r>
+      <w:r>
+        <w:rPr>
+          <w:rFonts w:ascii="宋体" w:hAnsi="宋体" w:eastAsia="宋体" w:cs="宋体"/>
+          <w:b w:val="0"/>
+          <w:sz w:val="21"/>
+        </w:rPr>
+        <w:t>。</w:t>
+      </w:r>
+    </w:p>
+    <w:p>
+      <w:pPr>
+        <w:spacing w:before="0" w:after="0" w:line="360" w:lineRule="exact"/>
+        <w:ind w:firstLine="420"/>
+      </w:pPr>
+      <w:r>
+        <w:rPr>
+          <w:rFonts w:ascii="宋体" w:hAnsi="宋体" w:eastAsia="宋体" w:cs="宋体"/>
+          <w:b w:val="0"/>
+          <w:sz w:val="21"/>
+        </w:rPr>
+        <w:t>多 Agent 协作在本文中采用职责拆分，而不是多个模型互相聊天。document_quality_agent 检查资料是否完整，timeline_builder 组织时间线，measurement_consistency_agent 检查指标变化和异常，risk_agent 生成非诊断性关注点，knowledge_retrieval_agent 检索医学审计知识，evidence_agent 负责证据绑定，conflict_agent 检查叙事事实与结构化指标之间的冲突，compliance_agent 检查结论是否缺少证据，report_composer 负责报告组织，citation_checker 和 safety_reviewer 分别进行引用和安全审查。各节点职责边界清晰，便于测试和论文说明</w:t>
+      </w:r>
+      <w:r>
+        <w:rPr>
+          <w:rFonts w:ascii="Times New Roman" w:hAnsi="Times New Roman" w:eastAsia="Times New Roman" w:cs="Times New Roman"/>
+          <w:b w:val="0"/>
+          <w:sz w:val="21"/>
+        </w:rPr>
+        <w:t>[20-22]</w:t>
+      </w:r>
+      <w:r>
+        <w:rPr>
+          <w:rFonts w:ascii="宋体" w:hAnsi="宋体" w:eastAsia="宋体" w:cs="宋体"/>
+          <w:b w:val="0"/>
+          <w:sz w:val="21"/>
+        </w:rPr>
+        <w:t>。</w:t>
+      </w:r>
+    </w:p>
+    <w:p>
+      <w:pPr>
+        <w:spacing w:before="0" w:after="0" w:line="360" w:lineRule="exact"/>
+        <w:ind w:firstLine="420"/>
+      </w:pPr>
+      <w:r>
+        <w:rPr>
+          <w:rFonts w:ascii="宋体" w:hAnsi="宋体" w:eastAsia="宋体" w:cs="宋体"/>
+          <w:b w:val="0"/>
+          <w:sz w:val="21"/>
+        </w:rPr>
+        <w:t>项目已有基础包括 FastAPI 路由、SQLAlchemy 模型、Pydantic 数据校验、React 前端模块和 Mock 体检数据脚本。这些基础并不是论文外的附属内容，而是支撑 LangGraph 架构落地的工程条件。若没有稳定的数据模型，状态机无法获得可靠输入；若没有事件表和节点状态表，前端无法展示真实流转；若没有 Mock 数据，测试和答辩演示无法稳定复现。因此本章所述基础技术与后续系统实现之间存在直接对应关系</w:t>
+      </w:r>
+      <w:r>
+        <w:rPr>
+          <w:rFonts w:ascii="Times New Roman" w:hAnsi="Times New Roman" w:eastAsia="Times New Roman" w:cs="Times New Roman"/>
+          <w:b w:val="0"/>
+          <w:sz w:val="21"/>
+        </w:rPr>
+        <w:t>[14-15]</w:t>
+      </w:r>
+      <w:r>
+        <w:rPr>
+          <w:rFonts w:ascii="宋体" w:hAnsi="宋体" w:eastAsia="宋体" w:cs="宋体"/>
+          <w:b w:val="0"/>
+          <w:sz w:val="21"/>
+        </w:rPr>
+        <w:t>。</w:t>
       </w:r>
     </w:p>
     <w:p>
@@ -5862,7 +6547,7 @@
           <w:color w:val="000000"/>
           <w:sz w:val="24"/>
         </w:rPr>
-        <w:t>4.3 综合审计报告 LangGraph 状态机实现</w:t>
+        <w:t>4.3 综合审计报告 LangGraph 实现</w:t>
       </w:r>
     </w:p>
     <w:p>

</xml_diff>

<commit_message>
docs: ground thesis literature review in real citations
</commit_message>
<xml_diff>
--- a/docs/thesis/drafts/论文正文_程浩然_基于LangGraph的多Agent协作框架在医疗审计场景的设计与实现.docx
+++ b/docs/thesis/drafts/论文正文_程浩然_基于LangGraph的多Agent协作框架在医疗审计场景的设计与实现.docx
@@ -796,7 +796,7 @@
                 <w:b w:val="0"/>
                 <w:sz w:val="21"/>
               </w:rPr>
-              <w:t>5</w:t>
+              <w:t>6</w:t>
             </w:r>
           </w:p>
         </w:tc>
@@ -841,7 +841,7 @@
                 <w:b w:val="0"/>
                 <w:sz w:val="21"/>
               </w:rPr>
-              <w:t>5</w:t>
+              <w:t>6</w:t>
             </w:r>
           </w:p>
         </w:tc>
@@ -886,7 +886,7 @@
                 <w:b w:val="0"/>
                 <w:sz w:val="21"/>
               </w:rPr>
-              <w:t>6</w:t>
+              <w:t>7</w:t>
             </w:r>
           </w:p>
         </w:tc>
@@ -931,7 +931,7 @@
                 <w:b w:val="0"/>
                 <w:sz w:val="21"/>
               </w:rPr>
-              <w:t>7</w:t>
+              <w:t>8</w:t>
             </w:r>
           </w:p>
         </w:tc>
@@ -976,7 +976,7 @@
                 <w:b w:val="0"/>
                 <w:sz w:val="21"/>
               </w:rPr>
-              <w:t>8</w:t>
+              <w:t>9</w:t>
             </w:r>
           </w:p>
         </w:tc>
@@ -1021,7 +1021,7 @@
                 <w:b/>
                 <w:sz w:val="22"/>
               </w:rPr>
-              <w:t>10</w:t>
+              <w:t>12</w:t>
             </w:r>
           </w:p>
         </w:tc>
@@ -1066,7 +1066,7 @@
                 <w:b w:val="0"/>
                 <w:sz w:val="21"/>
               </w:rPr>
-              <w:t>10</w:t>
+              <w:t>12</w:t>
             </w:r>
           </w:p>
         </w:tc>
@@ -1111,7 +1111,7 @@
                 <w:b w:val="0"/>
                 <w:sz w:val="21"/>
               </w:rPr>
-              <w:t>11</w:t>
+              <w:t>13</w:t>
             </w:r>
           </w:p>
         </w:tc>
@@ -1156,7 +1156,7 @@
                 <w:b w:val="0"/>
                 <w:sz w:val="21"/>
               </w:rPr>
-              <w:t>11</w:t>
+              <w:t>13</w:t>
             </w:r>
           </w:p>
         </w:tc>
@@ -1201,7 +1201,7 @@
                 <w:b w:val="0"/>
                 <w:sz w:val="21"/>
               </w:rPr>
-              <w:t>12</w:t>
+              <w:t>14</w:t>
             </w:r>
           </w:p>
         </w:tc>
@@ -1246,7 +1246,7 @@
                 <w:b w:val="0"/>
                 <w:sz w:val="21"/>
               </w:rPr>
-              <w:t>14</w:t>
+              <w:t>16</w:t>
             </w:r>
           </w:p>
         </w:tc>
@@ -1291,7 +1291,7 @@
                 <w:b w:val="0"/>
                 <w:sz w:val="21"/>
               </w:rPr>
-              <w:t>16</w:t>
+              <w:t>18</w:t>
             </w:r>
           </w:p>
         </w:tc>
@@ -1336,7 +1336,7 @@
                 <w:b/>
                 <w:sz w:val="22"/>
               </w:rPr>
-              <w:t>19</w:t>
+              <w:t>21</w:t>
             </w:r>
           </w:p>
         </w:tc>
@@ -1381,7 +1381,7 @@
                 <w:b w:val="0"/>
                 <w:sz w:val="21"/>
               </w:rPr>
-              <w:t>19</w:t>
+              <w:t>21</w:t>
             </w:r>
           </w:p>
         </w:tc>
@@ -1426,7 +1426,7 @@
                 <w:b w:val="0"/>
                 <w:sz w:val="21"/>
               </w:rPr>
-              <w:t>19</w:t>
+              <w:t>21</w:t>
             </w:r>
           </w:p>
         </w:tc>
@@ -1471,7 +1471,7 @@
                 <w:b w:val="0"/>
                 <w:sz w:val="21"/>
               </w:rPr>
-              <w:t>20</w:t>
+              <w:t>22</w:t>
             </w:r>
           </w:p>
         </w:tc>
@@ -1516,7 +1516,7 @@
                 <w:b w:val="0"/>
                 <w:sz w:val="21"/>
               </w:rPr>
-              <w:t>22</w:t>
+              <w:t>24</w:t>
             </w:r>
           </w:p>
         </w:tc>
@@ -1561,7 +1561,7 @@
                 <w:b w:val="0"/>
                 <w:sz w:val="21"/>
               </w:rPr>
-              <w:t>23</w:t>
+              <w:t>25</w:t>
             </w:r>
           </w:p>
         </w:tc>
@@ -1606,7 +1606,7 @@
                 <w:b/>
                 <w:sz w:val="22"/>
               </w:rPr>
-              <w:t>26</w:t>
+              <w:t>28</w:t>
             </w:r>
           </w:p>
         </w:tc>
@@ -1651,7 +1651,7 @@
                 <w:b w:val="0"/>
                 <w:sz w:val="21"/>
               </w:rPr>
-              <w:t>26</w:t>
+              <w:t>28</w:t>
             </w:r>
           </w:p>
         </w:tc>
@@ -1696,7 +1696,7 @@
                 <w:b w:val="0"/>
                 <w:sz w:val="21"/>
               </w:rPr>
-              <w:t>27</w:t>
+              <w:t>29</w:t>
             </w:r>
           </w:p>
         </w:tc>
@@ -1741,7 +1741,7 @@
                 <w:b w:val="0"/>
                 <w:sz w:val="21"/>
               </w:rPr>
-              <w:t>29</w:t>
+              <w:t>31</w:t>
             </w:r>
           </w:p>
         </w:tc>
@@ -1786,7 +1786,7 @@
                 <w:b w:val="0"/>
                 <w:sz w:val="21"/>
               </w:rPr>
-              <w:t>32</w:t>
+              <w:t>34</w:t>
             </w:r>
           </w:p>
         </w:tc>
@@ -1831,7 +1831,7 @@
                 <w:b/>
                 <w:sz w:val="22"/>
               </w:rPr>
-              <w:t>34</w:t>
+              <w:t>36</w:t>
             </w:r>
           </w:p>
         </w:tc>
@@ -1876,7 +1876,7 @@
                 <w:b/>
                 <w:sz w:val="22"/>
               </w:rPr>
-              <w:t>35</w:t>
+              <w:t>37</w:t>
             </w:r>
           </w:p>
         </w:tc>
@@ -1921,7 +1921,7 @@
                 <w:b/>
                 <w:sz w:val="22"/>
               </w:rPr>
-              <w:t>37</w:t>
+              <w:t>39</w:t>
             </w:r>
           </w:p>
         </w:tc>
@@ -2509,9 +2509,602 @@
           <w:b w:val="0"/>
           <w:sz w:val="21"/>
         </w:rPr>
-        <w:t>本章从医疗资料标准化、医疗大模型与知识增强、Agent 工作流和 Provider 工程抽象四个方面梳理相关技术与已有研究，并说明本文系统在这些研究基础上的实现取舍。与第一章的问题背景不同，本章重点回答“已有工作通常怎么做、本文为什么这样实现”。</w:t>
+        <w:t>本章不把参考文献简单堆放在章末，而是围绕医疗资料标准化、医疗大模型与知识增强、Agent 工作流和 Provider 工程抽象四条线索，逐篇梳理已有研究的做法，并说明这些研究如何影响本文系统设计。表2-1列出本章核心引用文献及其对本文实现的直接启示。</w:t>
       </w:r>
     </w:p>
+    <w:p>
+      <w:pPr>
+        <w:spacing w:before="0" w:after="60" w:line="360" w:lineRule="exact"/>
+        <w:jc w:val="center"/>
+      </w:pPr>
+      <w:r>
+        <w:rPr>
+          <w:rFonts w:ascii="宋体" w:hAnsi="宋体" w:eastAsia="宋体" w:cs="宋体"/>
+          <w:b/>
+          <w:sz w:val="21"/>
+        </w:rPr>
+        <w:t>表2-1 相关研究引用依据与本文启示</w:t>
+      </w:r>
+    </w:p>
+    <w:tbl>
+      <w:tblPr>
+        <w:tblStyle w:val="TableGrid"/>
+        <w:tblW w:type="auto" w:w="0"/>
+        <w:jc w:val="center"/>
+        <w:tblLayout w:type="autofit"/>
+        <w:tblLook w:firstColumn="1" w:firstRow="1" w:lastColumn="0" w:lastRow="0" w:noHBand="0" w:noVBand="1" w:val="04A0"/>
+      </w:tblPr>
+      <w:tblGrid>
+        <w:gridCol w:w="2929"/>
+        <w:gridCol w:w="2929"/>
+        <w:gridCol w:w="2929"/>
+      </w:tblGrid>
+      <w:tr>
+        <w:tc>
+          <w:tcPr>
+            <w:tcW w:type="dxa" w:w="2929"/>
+            <w:vAlign w:val="center"/>
+            <w:shd w:fill="FFFFFF"/>
+          </w:tcPr>
+          <w:p>
+            <w:pPr>
+              <w:spacing w:before="0" w:after="0" w:line="360" w:lineRule="exact"/>
+              <w:jc w:val="center"/>
+            </w:pPr>
+            <w:r/>
+            <w:r>
+              <w:rPr>
+                <w:rFonts w:ascii="宋体" w:hAnsi="宋体" w:eastAsia="宋体" w:cs="宋体"/>
+                <w:b/>
+                <w:sz w:val="19"/>
+              </w:rPr>
+              <w:t>文献</w:t>
+            </w:r>
+          </w:p>
+        </w:tc>
+        <w:tc>
+          <w:tcPr>
+            <w:tcW w:type="dxa" w:w="2929"/>
+            <w:vAlign w:val="center"/>
+            <w:shd w:fill="FFFFFF"/>
+          </w:tcPr>
+          <w:p>
+            <w:pPr>
+              <w:spacing w:before="0" w:after="0" w:line="360" w:lineRule="exact"/>
+              <w:jc w:val="center"/>
+            </w:pPr>
+            <w:r/>
+            <w:r>
+              <w:rPr>
+                <w:rFonts w:ascii="宋体" w:hAnsi="宋体" w:eastAsia="宋体" w:cs="宋体"/>
+                <w:b/>
+                <w:sz w:val="19"/>
+              </w:rPr>
+              <w:t>已有工作做法</w:t>
+            </w:r>
+          </w:p>
+        </w:tc>
+        <w:tc>
+          <w:tcPr>
+            <w:tcW w:type="dxa" w:w="2929"/>
+            <w:vAlign w:val="center"/>
+            <w:shd w:fill="FFFFFF"/>
+          </w:tcPr>
+          <w:p>
+            <w:pPr>
+              <w:spacing w:before="0" w:after="0" w:line="360" w:lineRule="exact"/>
+              <w:jc w:val="center"/>
+            </w:pPr>
+            <w:r/>
+            <w:r>
+              <w:rPr>
+                <w:rFonts w:ascii="宋体" w:hAnsi="宋体" w:eastAsia="宋体" w:cs="宋体"/>
+                <w:b/>
+                <w:sz w:val="19"/>
+              </w:rPr>
+              <w:t>本文设计启示</w:t>
+            </w:r>
+          </w:p>
+        </w:tc>
+      </w:tr>
+      <w:tr>
+        <w:tc>
+          <w:tcPr>
+            <w:tcW w:type="dxa" w:w="2929"/>
+            <w:vAlign w:val="center"/>
+          </w:tcPr>
+          <w:p>
+            <w:pPr>
+              <w:spacing w:before="0" w:after="0" w:line="360" w:lineRule="exact"/>
+            </w:pPr>
+            <w:r/>
+            <w:r>
+              <w:rPr>
+                <w:rFonts w:ascii="宋体" w:hAnsi="宋体" w:eastAsia="宋体" w:cs="宋体"/>
+                <w:b w:val="0"/>
+                <w:sz w:val="19"/>
+              </w:rPr>
+              <w:t>吴宗友等[4]</w:t>
+            </w:r>
+          </w:p>
+        </w:tc>
+        <w:tc>
+          <w:tcPr>
+            <w:tcW w:type="dxa" w:w="2929"/>
+            <w:vAlign w:val="center"/>
+          </w:tcPr>
+          <w:p>
+            <w:pPr>
+              <w:spacing w:before="0" w:after="0" w:line="360" w:lineRule="exact"/>
+            </w:pPr>
+            <w:r/>
+            <w:r>
+              <w:rPr>
+                <w:rFonts w:ascii="宋体" w:hAnsi="宋体" w:eastAsia="宋体" w:cs="宋体"/>
+                <w:b w:val="0"/>
+                <w:sz w:val="19"/>
+              </w:rPr>
+              <w:t>综述电子病历文本挖掘，将任务归纳为清洗、集成、命名实体识别、关系抽取、检索和问答等环节。</w:t>
+            </w:r>
+          </w:p>
+        </w:tc>
+        <w:tc>
+          <w:tcPr>
+            <w:tcW w:type="dxa" w:w="2929"/>
+            <w:vAlign w:val="center"/>
+          </w:tcPr>
+          <w:p>
+            <w:pPr>
+              <w:spacing w:before="0" w:after="0" w:line="360" w:lineRule="exact"/>
+            </w:pPr>
+            <w:r/>
+            <w:r>
+              <w:rPr>
+                <w:rFonts w:ascii="宋体" w:hAnsi="宋体" w:eastAsia="宋体" w:cs="宋体"/>
+                <w:b w:val="0"/>
+                <w:sz w:val="19"/>
+              </w:rPr>
+              <w:t>本文采用 OCR、标准化、指标入库、审计报告的分层链路。</w:t>
+            </w:r>
+          </w:p>
+        </w:tc>
+      </w:tr>
+      <w:tr>
+        <w:tc>
+          <w:tcPr>
+            <w:tcW w:type="dxa" w:w="2929"/>
+            <w:vAlign w:val="center"/>
+          </w:tcPr>
+          <w:p>
+            <w:pPr>
+              <w:spacing w:before="0" w:after="0" w:line="360" w:lineRule="exact"/>
+            </w:pPr>
+            <w:r/>
+            <w:r>
+              <w:rPr>
+                <w:rFonts w:ascii="宋体" w:hAnsi="宋体" w:eastAsia="宋体" w:cs="宋体"/>
+                <w:b w:val="0"/>
+                <w:sz w:val="19"/>
+              </w:rPr>
+              <w:t>韩普等[6]</w:t>
+            </w:r>
+          </w:p>
+        </w:tc>
+        <w:tc>
+          <w:tcPr>
+            <w:tcW w:type="dxa" w:w="2929"/>
+            <w:vAlign w:val="center"/>
+          </w:tcPr>
+          <w:p>
+            <w:pPr>
+              <w:spacing w:before="0" w:after="0" w:line="360" w:lineRule="exact"/>
+            </w:pPr>
+            <w:r/>
+            <w:r>
+              <w:rPr>
+                <w:rFonts w:ascii="宋体" w:hAnsi="宋体" w:eastAsia="宋体" w:cs="宋体"/>
+                <w:b w:val="0"/>
+                <w:sz w:val="19"/>
+              </w:rPr>
+              <w:t>提出结合外部语义特征、深度学习与 CRF/Voting 的中文电子病历实体识别方法，实验 F 值达到 94.06%。</w:t>
+            </w:r>
+          </w:p>
+        </w:tc>
+        <w:tc>
+          <w:tcPr>
+            <w:tcW w:type="dxa" w:w="2929"/>
+            <w:vAlign w:val="center"/>
+          </w:tcPr>
+          <w:p>
+            <w:pPr>
+              <w:spacing w:before="0" w:after="0" w:line="360" w:lineRule="exact"/>
+            </w:pPr>
+            <w:r/>
+            <w:r>
+              <w:rPr>
+                <w:rFonts w:ascii="宋体" w:hAnsi="宋体" w:eastAsia="宋体" w:cs="宋体"/>
+                <w:b w:val="0"/>
+                <w:sz w:val="19"/>
+              </w:rPr>
+              <w:t>本文承认专门模型对标准语料有效，但本系统先做工程化标准化和证据留痕。</w:t>
+            </w:r>
+          </w:p>
+        </w:tc>
+      </w:tr>
+      <w:tr>
+        <w:tc>
+          <w:tcPr>
+            <w:tcW w:type="dxa" w:w="2929"/>
+            <w:vAlign w:val="center"/>
+          </w:tcPr>
+          <w:p>
+            <w:pPr>
+              <w:spacing w:before="0" w:after="0" w:line="360" w:lineRule="exact"/>
+            </w:pPr>
+            <w:r/>
+            <w:r>
+              <w:rPr>
+                <w:rFonts w:ascii="宋体" w:hAnsi="宋体" w:eastAsia="宋体" w:cs="宋体"/>
+                <w:b w:val="0"/>
+                <w:sz w:val="19"/>
+              </w:rPr>
+              <w:t>崔少国等[7]</w:t>
+            </w:r>
+          </w:p>
+        </w:tc>
+        <w:tc>
+          <w:tcPr>
+            <w:tcW w:type="dxa" w:w="2929"/>
+            <w:vAlign w:val="center"/>
+          </w:tcPr>
+          <w:p>
+            <w:pPr>
+              <w:spacing w:before="0" w:after="0" w:line="360" w:lineRule="exact"/>
+            </w:pPr>
+            <w:r/>
+            <w:r>
+              <w:rPr>
+                <w:rFonts w:ascii="宋体" w:hAnsi="宋体" w:eastAsia="宋体" w:cs="宋体"/>
+                <w:b w:val="0"/>
+                <w:sz w:val="19"/>
+              </w:rPr>
+              <w:t>融合汉字图像、五笔、医学词典和 Lattice 结构，提升中文电子病历命名实体识别效果。</w:t>
+            </w:r>
+          </w:p>
+        </w:tc>
+        <w:tc>
+          <w:tcPr>
+            <w:tcW w:type="dxa" w:w="2929"/>
+            <w:vAlign w:val="center"/>
+          </w:tcPr>
+          <w:p>
+            <w:pPr>
+              <w:spacing w:before="0" w:after="0" w:line="360" w:lineRule="exact"/>
+            </w:pPr>
+            <w:r/>
+            <w:r>
+              <w:rPr>
+                <w:rFonts w:ascii="宋体" w:hAnsi="宋体" w:eastAsia="宋体" w:cs="宋体"/>
+                <w:b w:val="0"/>
+                <w:sz w:val="19"/>
+              </w:rPr>
+              <w:t>本文保留指标别名、单位和原文证据，避免只依赖通用模型。</w:t>
+            </w:r>
+          </w:p>
+        </w:tc>
+      </w:tr>
+      <w:tr>
+        <w:tc>
+          <w:tcPr>
+            <w:tcW w:type="dxa" w:w="2929"/>
+            <w:vAlign w:val="center"/>
+          </w:tcPr>
+          <w:p>
+            <w:pPr>
+              <w:spacing w:before="0" w:after="0" w:line="360" w:lineRule="exact"/>
+            </w:pPr>
+            <w:r/>
+            <w:r>
+              <w:rPr>
+                <w:rFonts w:ascii="宋体" w:hAnsi="宋体" w:eastAsia="宋体" w:cs="宋体"/>
+                <w:b w:val="0"/>
+                <w:sz w:val="19"/>
+              </w:rPr>
+              <w:t>盖彦蓉等[8]</w:t>
+            </w:r>
+          </w:p>
+        </w:tc>
+        <w:tc>
+          <w:tcPr>
+            <w:tcW w:type="dxa" w:w="2929"/>
+            <w:vAlign w:val="center"/>
+          </w:tcPr>
+          <w:p>
+            <w:pPr>
+              <w:spacing w:before="0" w:after="0" w:line="360" w:lineRule="exact"/>
+            </w:pPr>
+            <w:r/>
+            <w:r>
+              <w:rPr>
+                <w:rFonts w:ascii="宋体" w:hAnsi="宋体" w:eastAsia="宋体" w:cs="宋体"/>
+                <w:b w:val="0"/>
+                <w:sz w:val="19"/>
+              </w:rPr>
+              <w:t>真实世界电子病历抽取实验显示，模型在真实数据上的表现明显低于公开数据集，问题来自表述不规范、数据稀疏和治理不足。</w:t>
+            </w:r>
+          </w:p>
+        </w:tc>
+        <w:tc>
+          <w:tcPr>
+            <w:tcW w:type="dxa" w:w="2929"/>
+            <w:vAlign w:val="center"/>
+          </w:tcPr>
+          <w:p>
+            <w:pPr>
+              <w:spacing w:before="0" w:after="0" w:line="360" w:lineRule="exact"/>
+            </w:pPr>
+            <w:r/>
+            <w:r>
+              <w:rPr>
+                <w:rFonts w:ascii="宋体" w:hAnsi="宋体" w:eastAsia="宋体" w:cs="宋体"/>
+                <w:b w:val="0"/>
+                <w:sz w:val="19"/>
+              </w:rPr>
+              <w:t>本文把版本、原文、任务事件和审计事件都保存下来，强调数据治理。</w:t>
+            </w:r>
+          </w:p>
+        </w:tc>
+      </w:tr>
+      <w:tr>
+        <w:tc>
+          <w:tcPr>
+            <w:tcW w:type="dxa" w:w="2929"/>
+            <w:vAlign w:val="center"/>
+          </w:tcPr>
+          <w:p>
+            <w:pPr>
+              <w:spacing w:before="0" w:after="0" w:line="360" w:lineRule="exact"/>
+            </w:pPr>
+            <w:r/>
+            <w:r>
+              <w:rPr>
+                <w:rFonts w:ascii="宋体" w:hAnsi="宋体" w:eastAsia="宋体" w:cs="宋体"/>
+                <w:b w:val="0"/>
+                <w:sz w:val="19"/>
+              </w:rPr>
+              <w:t>Lewis 等[19]</w:t>
+            </w:r>
+          </w:p>
+        </w:tc>
+        <w:tc>
+          <w:tcPr>
+            <w:tcW w:type="dxa" w:w="2929"/>
+            <w:vAlign w:val="center"/>
+          </w:tcPr>
+          <w:p>
+            <w:pPr>
+              <w:spacing w:before="0" w:after="0" w:line="360" w:lineRule="exact"/>
+            </w:pPr>
+            <w:r/>
+            <w:r>
+              <w:rPr>
+                <w:rFonts w:ascii="宋体" w:hAnsi="宋体" w:eastAsia="宋体" w:cs="宋体"/>
+                <w:b w:val="0"/>
+                <w:sz w:val="19"/>
+              </w:rPr>
+              <w:t>提出 RAG，将参数化模型和非参数化检索记忆结合，用外部文档提高知识密集任务的事实性和可解释性。</w:t>
+            </w:r>
+          </w:p>
+        </w:tc>
+        <w:tc>
+          <w:tcPr>
+            <w:tcW w:type="dxa" w:w="2929"/>
+            <w:vAlign w:val="center"/>
+          </w:tcPr>
+          <w:p>
+            <w:pPr>
+              <w:spacing w:before="0" w:after="0" w:line="360" w:lineRule="exact"/>
+            </w:pPr>
+            <w:r/>
+            <w:r>
+              <w:rPr>
+                <w:rFonts w:ascii="宋体" w:hAnsi="宋体" w:eastAsia="宋体" w:cs="宋体"/>
+                <w:b w:val="0"/>
+                <w:sz w:val="19"/>
+              </w:rPr>
+              <w:t>本文把 RAG 作为审计状态机中的知识检索节点，而不是独立聊天功能。</w:t>
+            </w:r>
+          </w:p>
+        </w:tc>
+      </w:tr>
+      <w:tr>
+        <w:tc>
+          <w:tcPr>
+            <w:tcW w:type="dxa" w:w="2929"/>
+            <w:vAlign w:val="center"/>
+          </w:tcPr>
+          <w:p>
+            <w:pPr>
+              <w:spacing w:before="0" w:after="0" w:line="360" w:lineRule="exact"/>
+            </w:pPr>
+            <w:r/>
+            <w:r>
+              <w:rPr>
+                <w:rFonts w:ascii="宋体" w:hAnsi="宋体" w:eastAsia="宋体" w:cs="宋体"/>
+                <w:b w:val="0"/>
+                <w:sz w:val="19"/>
+              </w:rPr>
+              <w:t>Yao 等[20]</w:t>
+            </w:r>
+          </w:p>
+        </w:tc>
+        <w:tc>
+          <w:tcPr>
+            <w:tcW w:type="dxa" w:w="2929"/>
+            <w:vAlign w:val="center"/>
+          </w:tcPr>
+          <w:p>
+            <w:pPr>
+              <w:spacing w:before="0" w:after="0" w:line="360" w:lineRule="exact"/>
+            </w:pPr>
+            <w:r/>
+            <w:r>
+              <w:rPr>
+                <w:rFonts w:ascii="宋体" w:hAnsi="宋体" w:eastAsia="宋体" w:cs="宋体"/>
+                <w:b w:val="0"/>
+                <w:sz w:val="19"/>
+              </w:rPr>
+              <w:t>提出 ReAct，将推理轨迹和外部行动交替组织，使模型能够通过工具或知识库获得外部信息。</w:t>
+            </w:r>
+          </w:p>
+        </w:tc>
+        <w:tc>
+          <w:tcPr>
+            <w:tcW w:type="dxa" w:w="2929"/>
+            <w:vAlign w:val="center"/>
+          </w:tcPr>
+          <w:p>
+            <w:pPr>
+              <w:spacing w:before="0" w:after="0" w:line="360" w:lineRule="exact"/>
+            </w:pPr>
+            <w:r/>
+            <w:r>
+              <w:rPr>
+                <w:rFonts w:ascii="宋体" w:hAnsi="宋体" w:eastAsia="宋体" w:cs="宋体"/>
+                <w:b w:val="0"/>
+                <w:sz w:val="19"/>
+              </w:rPr>
+              <w:t>本文把审计拆成节点和工具调用，避免一次性生成报告。</w:t>
+            </w:r>
+          </w:p>
+        </w:tc>
+      </w:tr>
+      <w:tr>
+        <w:tc>
+          <w:tcPr>
+            <w:tcW w:type="dxa" w:w="2929"/>
+            <w:vAlign w:val="center"/>
+          </w:tcPr>
+          <w:p>
+            <w:pPr>
+              <w:spacing w:before="0" w:after="0" w:line="360" w:lineRule="exact"/>
+            </w:pPr>
+            <w:r/>
+            <w:r>
+              <w:rPr>
+                <w:rFonts w:ascii="宋体" w:hAnsi="宋体" w:eastAsia="宋体" w:cs="宋体"/>
+                <w:b w:val="0"/>
+                <w:sz w:val="19"/>
+              </w:rPr>
+              <w:t>Wu 等[21]</w:t>
+            </w:r>
+          </w:p>
+        </w:tc>
+        <w:tc>
+          <w:tcPr>
+            <w:tcW w:type="dxa" w:w="2929"/>
+            <w:vAlign w:val="center"/>
+          </w:tcPr>
+          <w:p>
+            <w:pPr>
+              <w:spacing w:before="0" w:after="0" w:line="360" w:lineRule="exact"/>
+            </w:pPr>
+            <w:r/>
+            <w:r>
+              <w:rPr>
+                <w:rFonts w:ascii="宋体" w:hAnsi="宋体" w:eastAsia="宋体" w:cs="宋体"/>
+                <w:b w:val="0"/>
+                <w:sz w:val="19"/>
+              </w:rPr>
+              <w:t>AutoGen 将多 Agent 对话用于复杂任务，支持 LLM、工具和人类输入组合。</w:t>
+            </w:r>
+          </w:p>
+        </w:tc>
+        <w:tc>
+          <w:tcPr>
+            <w:tcW w:type="dxa" w:w="2929"/>
+            <w:vAlign w:val="center"/>
+          </w:tcPr>
+          <w:p>
+            <w:pPr>
+              <w:spacing w:before="0" w:after="0" w:line="360" w:lineRule="exact"/>
+            </w:pPr>
+            <w:r/>
+            <w:r>
+              <w:rPr>
+                <w:rFonts w:ascii="宋体" w:hAnsi="宋体" w:eastAsia="宋体" w:cs="宋体"/>
+                <w:b w:val="0"/>
+                <w:sz w:val="19"/>
+              </w:rPr>
+              <w:t>本文借鉴职责拆分思想，但采用状态机而非纯聊天式 Agent。</w:t>
+            </w:r>
+          </w:p>
+        </w:tc>
+      </w:tr>
+      <w:tr>
+        <w:tc>
+          <w:tcPr>
+            <w:tcW w:type="dxa" w:w="2929"/>
+            <w:vAlign w:val="center"/>
+          </w:tcPr>
+          <w:p>
+            <w:pPr>
+              <w:spacing w:before="0" w:after="0" w:line="360" w:lineRule="exact"/>
+            </w:pPr>
+            <w:r/>
+            <w:r>
+              <w:rPr>
+                <w:rFonts w:ascii="宋体" w:hAnsi="宋体" w:eastAsia="宋体" w:cs="宋体"/>
+                <w:b w:val="0"/>
+                <w:sz w:val="19"/>
+              </w:rPr>
+              <w:t>LangChain[22]</w:t>
+            </w:r>
+          </w:p>
+        </w:tc>
+        <w:tc>
+          <w:tcPr>
+            <w:tcW w:type="dxa" w:w="2929"/>
+            <w:vAlign w:val="center"/>
+          </w:tcPr>
+          <w:p>
+            <w:pPr>
+              <w:spacing w:before="0" w:after="0" w:line="360" w:lineRule="exact"/>
+            </w:pPr>
+            <w:r/>
+            <w:r>
+              <w:rPr>
+                <w:rFonts w:ascii="宋体" w:hAnsi="宋体" w:eastAsia="宋体" w:cs="宋体"/>
+                <w:b w:val="0"/>
+                <w:sz w:val="19"/>
+              </w:rPr>
+              <w:t>LangGraph 强调长运行、有状态、可持久化的 Agent 工作流，并提供状态图、边和条件路由。</w:t>
+            </w:r>
+          </w:p>
+        </w:tc>
+        <w:tc>
+          <w:tcPr>
+            <w:tcW w:type="dxa" w:w="2929"/>
+            <w:vAlign w:val="center"/>
+          </w:tcPr>
+          <w:p>
+            <w:pPr>
+              <w:spacing w:before="0" w:after="0" w:line="360" w:lineRule="exact"/>
+            </w:pPr>
+            <w:r/>
+            <w:r>
+              <w:rPr>
+                <w:rFonts w:ascii="宋体" w:hAnsi="宋体" w:eastAsia="宋体" w:cs="宋体"/>
+                <w:b w:val="0"/>
+                <w:sz w:val="19"/>
+              </w:rPr>
+              <w:t>本文用 LangGraph 表达审计回环、引用检查和安全审查。</w:t>
+            </w:r>
+          </w:p>
+        </w:tc>
+      </w:tr>
+    </w:tbl>
+    <w:p/>
     <w:p>
       <w:pPr>
         <w:pStyle w:val="Heading2"/>
@@ -2537,7 +3130,7 @@
           <w:b w:val="0"/>
           <w:sz w:val="21"/>
         </w:rPr>
-        <w:t>医疗资料标准化首先面对的是非结构化和半结构化文本。医院信息化规范和电子病历分级评价均强调数据质量、标准化、过程留痕和安全管理</w:t>
+        <w:t>医疗资料标准化首先面对的是非结构化和半结构化文本。国家卫生健康委员会发布的医院信息化建设标准强调医疗数据、系统功能和质量管理的规范化要求</w:t>
       </w:r>
       <w:r>
         <w:rPr>
@@ -2545,7 +3138,7 @@
           <w:b w:val="0"/>
           <w:sz w:val="21"/>
         </w:rPr>
-        <w:t>[1-2]</w:t>
+        <w:t>[1]</w:t>
       </w:r>
       <w:r>
         <w:rPr>
@@ -2553,7 +3146,23 @@
           <w:b w:val="0"/>
           <w:sz w:val="21"/>
         </w:rPr>
-        <w:t>，个人信息安全规范也要求敏感个人信息处理具有明确目的、访问控制和可追溯能力</w:t>
+        <w:t>，电子病历应用水平分级评价也把数据质量、业务闭环和过程留痕作为医院信息化建设的重要内容</w:t>
+      </w:r>
+      <w:r>
+        <w:rPr>
+          <w:rFonts w:ascii="Times New Roman" w:hAnsi="Times New Roman" w:eastAsia="Times New Roman" w:cs="Times New Roman"/>
+          <w:b w:val="0"/>
+          <w:sz w:val="21"/>
+        </w:rPr>
+        <w:t>[2]</w:t>
+      </w:r>
+      <w:r>
+        <w:rPr>
+          <w:rFonts w:ascii="宋体" w:hAnsi="宋体" w:eastAsia="宋体" w:cs="宋体"/>
+          <w:b w:val="0"/>
+          <w:sz w:val="21"/>
+        </w:rPr>
+        <w:t>。个人信息安全规范进一步要求敏感个人信息处理具备明确目的、访问控制和可追溯能力</w:t>
       </w:r>
       <w:r>
         <w:rPr>
@@ -2583,7 +3192,7 @@
           <w:b w:val="0"/>
           <w:sz w:val="21"/>
         </w:rPr>
-        <w:t>已有电子病历文本挖掘研究通常把处理流程拆为数据清洗、数据集成、命名实体识别、关系抽取、信息检索和临床问答等环节</w:t>
+        <w:t>吴宗友等在《电子病历文本挖掘研究综述》中将电子病历文本挖掘整理为数据清洗、数据集成、命名实体识别、关系抽取、信息检索和临床问答等任务，并指出电子病历文本包含大量非结构化信息，需要通过文本挖掘转化为可利用知识</w:t>
       </w:r>
       <w:r>
         <w:rPr>
@@ -2599,7 +3208,21 @@
           <w:b w:val="0"/>
           <w:sz w:val="21"/>
         </w:rPr>
-        <w:t>。在中文电子病历场景中，命名实体识别研究进一步关注疾病、症状、检查、药物、身体部位等实体识别，并指出中文病历文本存在用词不规范、专业术语密集、标注语料不足等挑战</w:t>
+        <w:t>。这一综述给本文的直接启示是：医疗资料审计不应从“报告生成”开始，而应先完成资料接入、OCR、标准化和指标索引，再进入审计报告状态机。</w:t>
+      </w:r>
+    </w:p>
+    <w:p>
+      <w:pPr>
+        <w:spacing w:before="0" w:after="0" w:line="360" w:lineRule="exact"/>
+        <w:ind w:firstLine="420"/>
+      </w:pPr>
+      <w:r>
+        <w:rPr>
+          <w:rFonts w:ascii="宋体" w:hAnsi="宋体" w:eastAsia="宋体" w:cs="宋体"/>
+          <w:b w:val="0"/>
+          <w:sz w:val="21"/>
+        </w:rPr>
+        <w:t>杜晋华等围绕中文电子病历命名实体识别进行综述，关注疾病、症状、检查、药物、身体部位等实体类型，并指出中文病历文本存在术语密集、表达不规范和标注语料不足等问题</w:t>
       </w:r>
       <w:r>
         <w:rPr>
@@ -2615,21 +3238,7 @@
           <w:b w:val="0"/>
           <w:sz w:val="21"/>
         </w:rPr>
-        <w:t>。这些研究说明，医疗文本处理的关键不是“生成一段看似通顺的解释”，而是把可复核的信息单元稳定抽取出来。</w:t>
-      </w:r>
-    </w:p>
-    <w:p>
-      <w:pPr>
-        <w:spacing w:before="0" w:after="0" w:line="360" w:lineRule="exact"/>
-        <w:ind w:firstLine="420"/>
-      </w:pPr>
-      <w:r>
-        <w:rPr>
-          <w:rFonts w:ascii="宋体" w:hAnsi="宋体" w:eastAsia="宋体" w:cs="宋体"/>
-          <w:b w:val="0"/>
-          <w:sz w:val="21"/>
-        </w:rPr>
-        <w:t>具体方法上，传统研究会使用规则词典、条件随机场、支持向量机和深度学习模型；近年来则更多使用 BiLSTM-CRF、注意力机制、BERT 类预训练模型以及多特征融合方法处理中文电子病历实体识别</w:t>
+        <w:t>。韩普等提出融合外部语义特征、深度学习模型和 CRF 输出的中文电子病历实体识别方法，实验 F 值达到 94.06%，说明专门模型在标注数据和任务边界清晰时能够取得较好效果</w:t>
       </w:r>
       <w:r>
         <w:rPr>
@@ -2637,7 +3246,7 @@
           <w:b w:val="0"/>
           <w:sz w:val="21"/>
         </w:rPr>
-        <w:t>[6-7]</w:t>
+        <w:t>[6]</w:t>
       </w:r>
       <w:r>
         <w:rPr>
@@ -2645,21 +3254,51 @@
           <w:b w:val="0"/>
           <w:sz w:val="21"/>
         </w:rPr>
-        <w:t>。这些方法对专门数据集有效，但在个人体检报告、化验单、影像结论和病历摘要混杂的本项目场景中，难点不只在模型精度，还包括模板差异、指标单位差异、版本留痕和最终审计证据绑定。</w:t>
+        <w:t>。崔少国等进一步融合汉字图像、五笔编码、医学词典和 Lattice 结构，用语义与边界信息提升中文电子病历 NER 效果</w:t>
       </w:r>
-    </w:p>
-    <w:p>
-      <w:pPr>
-        <w:spacing w:before="0" w:after="0" w:line="360" w:lineRule="exact"/>
-        <w:ind w:firstLine="420"/>
-      </w:pPr>
+      <w:r>
+        <w:rPr>
+          <w:rFonts w:ascii="Times New Roman" w:hAnsi="Times New Roman" w:eastAsia="Times New Roman" w:cs="Times New Roman"/>
+          <w:b w:val="0"/>
+          <w:sz w:val="21"/>
+        </w:rPr>
+        <w:t>[7]</w:t>
+      </w:r>
       <w:r>
         <w:rPr>
           <w:rFonts w:ascii="宋体" w:hAnsi="宋体" w:eastAsia="宋体" w:cs="宋体"/>
           <w:b w:val="0"/>
           <w:sz w:val="21"/>
         </w:rPr>
-        <w:t>因此，本文没有把医疗资料处理简化为单个 NER 模型，而是采用“原始文件、OCR 结果、当前文档投影、文档版本、结构化指标”五层数据结构。原始文件保存上传元数据和文件内容，OCR 结果保存识别文本和 Provider 信息，当前文档投影保存文档类型、报告日期和标准化 payload，文档版本保存每次标准化快照和 hash，指标表保存可搜索、可比较的数值指标。该设计与真实世界电子病历数据治理中强调的数据质量分析和治理思路一致</w:t>
+        <w:t>。</w:t>
+      </w:r>
+    </w:p>
+    <w:p>
+      <w:pPr>
+        <w:spacing w:before="0" w:after="0" w:line="360" w:lineRule="exact"/>
+        <w:ind w:firstLine="420"/>
+      </w:pPr>
+      <w:r>
+        <w:rPr>
+          <w:rFonts w:ascii="宋体" w:hAnsi="宋体" w:eastAsia="宋体" w:cs="宋体"/>
+          <w:b w:val="0"/>
+          <w:sz w:val="21"/>
+        </w:rPr>
+        <w:t>上述研究说明，中文医疗文本处理不是简单提示词可以完全解决的问题。专门 NER 模型强调实体边界、领域词典和训练语料，但本文面对的是个人体检报告、化验单、影像结论和病历摘要混杂的演示数据，难点不只在实体识别精度，还包括报告模板差异、指标单位差异、文档版本留痕和最终审计证据绑定。因此，本文没有把医疗资料处理简化为单个 NER 模型，而是采用“原始文件、OCR 结果、当前文档投影、文档版本、结构化指标”五层数据结构。</w:t>
+      </w:r>
+    </w:p>
+    <w:p>
+      <w:pPr>
+        <w:spacing w:before="0" w:after="0" w:line="360" w:lineRule="exact"/>
+        <w:ind w:firstLine="420"/>
+      </w:pPr>
+      <w:r>
+        <w:rPr>
+          <w:rFonts w:ascii="宋体" w:hAnsi="宋体" w:eastAsia="宋体" w:cs="宋体"/>
+          <w:b w:val="0"/>
+          <w:sz w:val="21"/>
+        </w:rPr>
+        <w:t>盖彦蓉等针对真实世界中文电子病历开展知识抽取和数据治理分析，发现即使采用 BERT+Bi-LSTM+CRF 等主流模型，真实世界数据上的实体和关系识别效果仍明显低于公开数据集，原因包括表述不规范、数据稀疏、科室术语差异、隐私保护与数据利用平衡不足、全流程治理缺失等</w:t>
       </w:r>
       <w:r>
         <w:rPr>
@@ -2675,7 +3314,7 @@
           <w:b w:val="0"/>
           <w:sz w:val="21"/>
         </w:rPr>
-        <w:t>。</w:t>
+        <w:t>。这与本文的工程取舍一致：系统需要保存 OCR 原文、标准化 payload、版本 hash、结构化指标、任务事件和审计事件，让后续报告能够回到具体数据来源，而不是只追求一次抽取结果。</w:t>
       </w:r>
     </w:p>
     <w:p>
@@ -2703,7 +3342,7 @@
           <w:b w:val="0"/>
           <w:sz w:val="21"/>
         </w:rPr>
-        <w:t>医疗大语言模型相关研究普遍认为，大模型在医疗文本生成、问答、医学教育和临床文档处理方面具有潜力，但同时存在幻觉、实时性、可解释性、数据安全和责任边界等问题</w:t>
+        <w:t>肖仰华和徐一丹从知识容器、能力引擎和自治智能体三个角度讨论生成式语言模型在医疗领域的机会，同时也指出医疗应用存在准确性、解释性、风险控制等局限</w:t>
       </w:r>
       <w:r>
         <w:rPr>
@@ -2711,7 +3350,7 @@
           <w:b w:val="0"/>
           <w:sz w:val="21"/>
         </w:rPr>
-        <w:t>[9-13]</w:t>
+        <w:t>[9]</w:t>
       </w:r>
       <w:r>
         <w:rPr>
@@ -2719,7 +3358,99 @@
           <w:b w:val="0"/>
           <w:sz w:val="21"/>
         </w:rPr>
-        <w:t>。Nature Medicine 的综述也指出，LLM 在医疗场景的效率提升和临床应用价值需要与局限性一起讨论，不能只看生成能力本身</w:t>
+        <w:t>。康砚澜等进一步提出知识增强医学语言模型，认为知识图谱和多模态数据融合可以提升模型的专业性、准确性和可信性</w:t>
+      </w:r>
+      <w:r>
+        <w:rPr>
+          <w:rFonts w:ascii="Times New Roman" w:hAnsi="Times New Roman" w:eastAsia="Times New Roman" w:cs="Times New Roman"/>
+          <w:b w:val="0"/>
+          <w:sz w:val="21"/>
+        </w:rPr>
+        <w:t>[10]</w:t>
+      </w:r>
+      <w:r>
+        <w:rPr>
+          <w:rFonts w:ascii="宋体" w:hAnsi="宋体" w:eastAsia="宋体" w:cs="宋体"/>
+          <w:b w:val="0"/>
+          <w:sz w:val="21"/>
+        </w:rPr>
+        <w:t>。颜见智等系统梳理了生成式大语言模型在医疗服务、医学研究和教育中的典型应用，也强调幻觉、隐私保护、伦理、结果可控性和可解释性等挑战</w:t>
+      </w:r>
+      <w:r>
+        <w:rPr>
+          <w:rFonts w:ascii="Times New Roman" w:hAnsi="Times New Roman" w:eastAsia="Times New Roman" w:cs="Times New Roman"/>
+          <w:b w:val="0"/>
+          <w:sz w:val="21"/>
+        </w:rPr>
+        <w:t>[11]</w:t>
+      </w:r>
+      <w:r>
+        <w:rPr>
+          <w:rFonts w:ascii="宋体" w:hAnsi="宋体" w:eastAsia="宋体" w:cs="宋体"/>
+          <w:b w:val="0"/>
+          <w:sz w:val="21"/>
+        </w:rPr>
+        <w:t>。</w:t>
+      </w:r>
+    </w:p>
+    <w:p>
+      <w:pPr>
+        <w:spacing w:before="0" w:after="0" w:line="360" w:lineRule="exact"/>
+        <w:ind w:firstLine="420"/>
+      </w:pPr>
+      <w:r>
+        <w:rPr>
+          <w:rFonts w:ascii="宋体" w:hAnsi="宋体" w:eastAsia="宋体" w:cs="宋体"/>
+          <w:b w:val="0"/>
+          <w:sz w:val="21"/>
+        </w:rPr>
+        <w:t>陈晓红等在医疗大模型技术及应用研究中提出，医疗大模型需要覆盖基础层、模型层、应用层和公共模块，并建立评价指标、数据集、模型对齐和评测平台等体系；该研究也把数据安全、技术风险、落地挑战和伦理道德列为核心问题</w:t>
+      </w:r>
+      <w:r>
+        <w:rPr>
+          <w:rFonts w:ascii="Times New Roman" w:hAnsi="Times New Roman" w:eastAsia="Times New Roman" w:cs="Times New Roman"/>
+          <w:b w:val="0"/>
+          <w:sz w:val="21"/>
+        </w:rPr>
+        <w:t>[12]</w:t>
+      </w:r>
+      <w:r>
+        <w:rPr>
+          <w:rFonts w:ascii="宋体" w:hAnsi="宋体" w:eastAsia="宋体" w:cs="宋体"/>
+          <w:b w:val="0"/>
+          <w:sz w:val="21"/>
+        </w:rPr>
+        <w:t>。何剑虎等采用系统性文献回顾方法梳理医疗大语言模型最新进展，指出未来研究应同时关注技术创新和伦理规范</w:t>
+      </w:r>
+      <w:r>
+        <w:rPr>
+          <w:rFonts w:ascii="Times New Roman" w:hAnsi="Times New Roman" w:eastAsia="Times New Roman" w:cs="Times New Roman"/>
+          <w:b w:val="0"/>
+          <w:sz w:val="21"/>
+        </w:rPr>
+        <w:t>[13]</w:t>
+      </w:r>
+      <w:r>
+        <w:rPr>
+          <w:rFonts w:ascii="宋体" w:hAnsi="宋体" w:eastAsia="宋体" w:cs="宋体"/>
+          <w:b w:val="0"/>
+          <w:sz w:val="21"/>
+        </w:rPr>
+        <w:t>。这些文献共同说明，医疗大模型不能脱离数据治理、评测体系和责任边界单独落地。</w:t>
+      </w:r>
+    </w:p>
+    <w:p>
+      <w:pPr>
+        <w:spacing w:before="0" w:after="0" w:line="360" w:lineRule="exact"/>
+        <w:ind w:firstLine="420"/>
+      </w:pPr>
+      <w:r>
+        <w:rPr>
+          <w:rFonts w:ascii="宋体" w:hAnsi="宋体" w:eastAsia="宋体" w:cs="宋体"/>
+          <w:b w:val="0"/>
+          <w:sz w:val="21"/>
+        </w:rPr>
+        <w:t>国际研究也给出类似提醒。Thirunavukarasu 等在 Nature Medicine 发表的综述指出，LLM 在医学问答、临床文档和医学教育等场景中具有潜力，但临床使用仍需重视偏差、可解释性、安全性和监管问题</w:t>
       </w:r>
       <w:r>
         <w:rPr>
@@ -2735,21 +3466,37 @@
           <w:b w:val="0"/>
           <w:sz w:val="21"/>
         </w:rPr>
-        <w:t>。这与本文的系统定位一致：系统可以辅助整理资料和形成审计报告，但不能把生成结果包装成诊断结论。</w:t>
+        <w:t>。Wornow 等在 npj Digital Medicine 中讨论面向电子健康记录的 LLM 和基础模型，强调 EHR 数据具有异质性、缺失性和编码差异，许多模型评估任务并不能充分说明其对真实医疗系统的有效性</w:t>
       </w:r>
-    </w:p>
-    <w:p>
-      <w:pPr>
-        <w:spacing w:before="0" w:after="0" w:line="360" w:lineRule="exact"/>
-        <w:ind w:firstLine="420"/>
-      </w:pPr>
+      <w:r>
+        <w:rPr>
+          <w:rFonts w:ascii="Times New Roman" w:hAnsi="Times New Roman" w:eastAsia="Times New Roman" w:cs="Times New Roman"/>
+          <w:b w:val="0"/>
+          <w:sz w:val="21"/>
+        </w:rPr>
+        <w:t>[24]</w:t>
+      </w:r>
       <w:r>
         <w:rPr>
           <w:rFonts w:ascii="宋体" w:hAnsi="宋体" w:eastAsia="宋体" w:cs="宋体"/>
           <w:b w:val="0"/>
           <w:sz w:val="21"/>
         </w:rPr>
-        <w:t>知识增强是降低生成式系统脱离事实的重要方向。RAG 方法把参数化语言模型与非参数化检索记忆结合，在回答前检索外部知识或业务文档，以增强知识密集型任务中的事实性和可更新性</w:t>
+        <w:t>。因此，本文系统只把大模型用于标准化、智能洞察和报告生成增强，不把生成结果直接等同于诊断结论。</w:t>
+      </w:r>
+    </w:p>
+    <w:p>
+      <w:pPr>
+        <w:spacing w:before="0" w:after="0" w:line="360" w:lineRule="exact"/>
+        <w:ind w:firstLine="420"/>
+      </w:pPr>
+      <w:r>
+        <w:rPr>
+          <w:rFonts w:ascii="宋体" w:hAnsi="宋体" w:eastAsia="宋体" w:cs="宋体"/>
+          <w:b w:val="0"/>
+          <w:sz w:val="21"/>
+        </w:rPr>
+        <w:t>知识增强是降低生成式系统脱离事实的重要方向。Lewis 等提出 Retrieval-Augmented Generation，将参数化 seq2seq 模型与非参数化检索记忆结合，生成前先从外部文档索引中检索相关内容，并指出这种方式有助于提供来源、更新知识和缓解纯参数模型的事实性问题</w:t>
       </w:r>
       <w:r>
         <w:rPr>
@@ -2779,7 +3526,7 @@
           <w:b w:val="0"/>
           <w:sz w:val="21"/>
         </w:rPr>
-        <w:t>已有医疗大模型研究也强调，医疗数据来源复杂，包含电子病历、医学影像、检验结果、用药记录和健康档案等多类型数据，模型应用需要数据治理、评测体系和监管机制共同支撑</w:t>
+        <w:t>在当前实现中，RAG 并不是独立的聊天功能，而是服务于综合审计报告状态机。系统内置医学审计知识块和默沙东医学手册摘要知识块，通过 knowledge_retrieval_agent 根据风险点和异常指标构造查询，使用确定性的词法排序召回相关知识，再将 knowledge_context 写入 AuditGraphState。最终报告中的 rag_summary、knowledge_sources 和 knowledge_chunk 类型证据，用于展示知识命中情况和来源。该设计对应 Lewis 等提出的“检索外部知识再生成”的思想</w:t>
       </w:r>
       <w:r>
         <w:rPr>
@@ -2787,7 +3534,7 @@
           <w:b w:val="0"/>
           <w:sz w:val="21"/>
         </w:rPr>
-        <w:t>[12]</w:t>
+        <w:t>[19]</w:t>
       </w:r>
       <w:r>
         <w:rPr>
@@ -2795,7 +3542,7 @@
           <w:b w:val="0"/>
           <w:sz w:val="21"/>
         </w:rPr>
-        <w:t>。面向电子健康记录的基础模型研究进一步提醒，EHR 数据具有异质性、缺失性和编码差异，直接套用通用大模型容易忽略数据表示和评估问题</w:t>
+        <w:t>，也回应了医疗大模型研究中对事实性、可追溯性和责任边界的要求</w:t>
       </w:r>
       <w:r>
         <w:rPr>
@@ -2803,7 +3550,7 @@
           <w:b w:val="0"/>
           <w:sz w:val="21"/>
         </w:rPr>
-        <w:t>[24]</w:t>
+        <w:t>[9-13,23-24]</w:t>
       </w:r>
       <w:r>
         <w:rPr>
@@ -2811,21 +3558,7 @@
           <w:b w:val="0"/>
           <w:sz w:val="21"/>
         </w:rPr>
-        <w:t>。因此，本文在综合审计报告中引入知识检索节点，但仍把文档版本、指标和证据作为主依据。</w:t>
-      </w:r>
-    </w:p>
-    <w:p>
-      <w:pPr>
-        <w:spacing w:before="0" w:after="0" w:line="360" w:lineRule="exact"/>
-        <w:ind w:firstLine="420"/>
-      </w:pPr>
-      <w:r>
-        <w:rPr>
-          <w:rFonts w:ascii="宋体" w:hAnsi="宋体" w:eastAsia="宋体" w:cs="宋体"/>
-          <w:b w:val="0"/>
-          <w:sz w:val="21"/>
-        </w:rPr>
-        <w:t>在当前实现中，RAG 并不是独立的聊天功能，而是服务于综合审计报告状态机。系统内置医学审计知识块和默沙东医学手册摘要知识块，通过 knowledge_retrieval_agent 根据风险点和异常指标构造查询，使用确定性的词法排序召回相关知识，再将 knowledge_context 写入 AuditGraphState。最终报告中的 rag_summary、knowledge_sources 和 knowledge_chunk 类型证据，用于展示知识命中情况和来源。</w:t>
+        <w:t>。</w:t>
       </w:r>
     </w:p>
     <w:p>
@@ -2853,7 +3586,7 @@
           <w:b w:val="0"/>
           <w:sz w:val="21"/>
         </w:rPr>
-        <w:t>在 Agent 工程方向，ReAct 提出将语言模型的推理轨迹和外部行动交替组织，使系统能够根据环境反馈更新计划，并通过工具或知识库获得额外信息</w:t>
+        <w:t>Yao 等提出的 ReAct 方法把语言模型的推理轨迹和任务行动交替组织：推理轨迹用于诱导、跟踪和更新行动计划，行动则用于与知识库或环境交互并获得额外信息</w:t>
       </w:r>
       <w:r>
         <w:rPr>
@@ -2869,7 +3602,21 @@
           <w:b w:val="0"/>
           <w:sz w:val="21"/>
         </w:rPr>
-        <w:t>。AutoGen 则强调多个可对话、可配置、可使用工具的 Agent 共同完成复杂任务，适用于数学、代码、问答、决策等多种应用场景</w:t>
+        <w:t>。该研究在问答、事实验证和交互式决策任务中验证了推理与行动结合的价值，也指出纯链式思考容易出现事实幻觉和错误传播。本文综合审计报告模块借鉴这一思想：审计流程不能只让模型一次性生成报告，而应允许节点根据状态补充证据、查询知识和修正报告。</w:t>
+      </w:r>
+    </w:p>
+    <w:p>
+      <w:pPr>
+        <w:spacing w:before="0" w:after="0" w:line="360" w:lineRule="exact"/>
+        <w:ind w:firstLine="420"/>
+      </w:pPr>
+      <w:r>
+        <w:rPr>
+          <w:rFonts w:ascii="宋体" w:hAnsi="宋体" w:eastAsia="宋体" w:cs="宋体"/>
+          <w:b w:val="0"/>
+          <w:sz w:val="21"/>
+        </w:rPr>
+        <w:t>Wu 等提出的 AutoGen 将 LLM 应用组织为多个可对话、可配置的 Agent，并允许 Agent 结合 LLM、工具和人工输入完成复杂任务</w:t>
       </w:r>
       <w:r>
         <w:rPr>
@@ -2885,7 +3632,7 @@
           <w:b w:val="0"/>
           <w:sz w:val="21"/>
         </w:rPr>
-        <w:t>。这些研究给本文的启发是：复杂任务不应只依赖一次模型调用，而应拆分为多个职责明确的步骤。</w:t>
+        <w:t>。AutoGen 的重点是多 Agent 对话和灵活会话模式，这对本文有启发，但医疗审计场景并不适合完全采用开放式对话。原因在于审计流程需要确定的节点职责、状态字段、事件记录和失败回退路径，否则前端无法解释“流程为什么走到这里”。</w:t>
       </w:r>
     </w:p>
     <w:p>
@@ -2899,7 +3646,7 @@
           <w:b w:val="0"/>
           <w:sz w:val="21"/>
         </w:rPr>
-        <w:t>不过，医疗审计场景中的多 Agent 不能简单理解为多个聊天机器人互相对话。审计流程更强调状态可追溯、节点职责清晰、条件路由明确和失败路径可处理。LangGraph 提供了基于状态图的 Agent 工作流实现方式，能够表达 START、END、节点、边、条件路由、循环和状态持久化</w:t>
+        <w:t>LangGraph 提供了更贴近本文需求的状态图式 Agent 工作流。其官方文档强调，LangGraph 面向长运行、有状态的工作流或 Agent，支持持久化执行、人类参与、记忆、调试可观测和状态迁移</w:t>
       </w:r>
       <w:r>
         <w:rPr>
@@ -2915,7 +3662,7 @@
           <w:b w:val="0"/>
           <w:sz w:val="21"/>
         </w:rPr>
-        <w:t>。相比固定流水线，状态图更适合表达“证据不足回到证据节点”“引用检查失败回到审计节点”“安全审查失败回到报告生成节点”等回环。</w:t>
+        <w:t>。这与本文综合审计报告的需求一致：审计节点可能因为证据不足回到 evidence_agent，可能因为引用检查失败回到 audit_router，也可能因为安全审查失败回到 report_composer。</w:t>
       </w:r>
     </w:p>
     <w:p>
@@ -2929,7 +3676,7 @@
           <w:b w:val="0"/>
           <w:sz w:val="21"/>
         </w:rPr>
-        <w:t>本文采用 LangGraph 的原因正来自上述需求。系统中的 document_quality_agent、timeline_builder、measurement_consistency_agent、risk_agent、knowledge_retrieval_agent、evidence_agent、conflict_agent、compliance_agent、report_composer、citation_checker 和 safety_reviewer 都围绕同一个 AuditGraphState 工作。每个节点只负责一个有限任务，路由节点根据 completed_agents、citation_issues、safety_issues、needs_report_revision 等字段决定下一步。</w:t>
+        <w:t>本文采用 LangGraph 的原因正来自上述需求。系统中的 document_quality_agent、timeline_builder、measurement_consistency_agent、risk_agent、knowledge_retrieval_agent、evidence_agent、conflict_agent、compliance_agent、report_composer、citation_checker 和 safety_reviewer 都围绕同一个 AuditGraphState 工作。每个节点只负责一个有限任务，路由节点根据 completed_agents、citation_issues、safety_issues、needs_report_revision 等字段决定下一步。相比 AutoGen 式的开放会话，本文更强调状态机可控性和审计可追溯性。</w:t>
       </w:r>
     </w:p>
     <w:p>
@@ -3026,7 +3773,7 @@
           <w:b/>
           <w:sz w:val="21"/>
         </w:rPr>
-        <w:t>表2-1 Provider 抽象及当前配置</w:t>
+        <w:t>表2-2 Provider 抽象及当前配置</w:t>
       </w:r>
     </w:p>
     <w:tbl>
@@ -11319,7 +12066,7 @@
           <w:b w:val="0"/>
           <w:sz w:val="21"/>
         </w:rPr>
-        <w:t>[23] Thirunavukarasu A J, Ting D S J, Elangovan K, et al. Large language models in medicine[J]. Nature Medicine, 2023,29:1930-1940.</w:t>
+        <w:t>[23] Thirunavukarasu A J, Ting D S J, Elangovan K, et al. Large language models in medicine[J]. Nature Medicine, 2023,29:1930-1940. DOI:10.1038/s41591-023-02448-8.</w:t>
       </w:r>
     </w:p>
     <w:p>
@@ -11332,7 +12079,7 @@
           <w:b w:val="0"/>
           <w:sz w:val="21"/>
         </w:rPr>
-        <w:t>[24] Wornow M, Xu Y, Thapa R, et al. The shaky foundations of large language models and foundation models for electronic health records[J]. npj Digital Medicine, 2023,6:135.</w:t>
+        <w:t>[24] Wornow M, Xu Y, Thapa R, et al. The shaky foundations of large language models and foundation models for electronic health records[J]. npj Digital Medicine, 2023,6:135. DOI:10.1038/s41746-023-00879-8.</w:t>
       </w:r>
     </w:p>
     <w:p>

</xml_diff>

<commit_message>
docs: use word reference fields for thesis citations
</commit_message>
<xml_diff>
--- a/docs/thesis/drafts/论文正文_程浩然_基于LangGraph的多Agent协作框架在医疗审计场景的设计与实现.docx
+++ b/docs/thesis/drafts/论文正文_程浩然_基于LangGraph的多Agent协作框架在医疗审计场景的设计与实现.docx
@@ -2016,7 +2016,47 @@
           <w:b w:val="0"/>
           <w:sz w:val="21"/>
         </w:rPr>
-        <w:t>[9-13]</w:t>
+        <w:t>[</w:t>
+      </w:r>
+      <w:r>
+        <w:rPr>
+          <w:rFonts w:ascii="Times New Roman" w:hAnsi="Times New Roman" w:eastAsia="Times New Roman" w:cs="Times New Roman"/>
+          <w:b w:val="0"/>
+          <w:sz w:val="21"/>
+        </w:rPr>
+        <w:fldChar w:fldCharType="begin"/>
+        <w:instrText xml:space="preserve">REF ref_009 \h</w:instrText>
+        <w:fldChar w:fldCharType="separate"/>
+        <w:t>9</w:t>
+        <w:fldChar w:fldCharType="end"/>
+      </w:r>
+      <w:r>
+        <w:rPr>
+          <w:rFonts w:ascii="Times New Roman" w:hAnsi="Times New Roman" w:eastAsia="Times New Roman" w:cs="Times New Roman"/>
+          <w:b w:val="0"/>
+          <w:sz w:val="21"/>
+        </w:rPr>
+        <w:t>-</w:t>
+      </w:r>
+      <w:r>
+        <w:rPr>
+          <w:rFonts w:ascii="Times New Roman" w:hAnsi="Times New Roman" w:eastAsia="Times New Roman" w:cs="Times New Roman"/>
+          <w:b w:val="0"/>
+          <w:sz w:val="21"/>
+        </w:rPr>
+        <w:fldChar w:fldCharType="begin"/>
+        <w:instrText xml:space="preserve">REF ref_013 \h</w:instrText>
+        <w:fldChar w:fldCharType="separate"/>
+        <w:t>13</w:t>
+        <w:fldChar w:fldCharType="end"/>
+      </w:r>
+      <w:r>
+        <w:rPr>
+          <w:rFonts w:ascii="Times New Roman" w:hAnsi="Times New Roman" w:eastAsia="Times New Roman" w:cs="Times New Roman"/>
+          <w:b w:val="0"/>
+          <w:sz w:val="21"/>
+        </w:rPr>
+        <w:t>]</w:t>
       </w:r>
       <w:r>
         <w:rPr>
@@ -2046,7 +2086,47 @@
           <w:b w:val="0"/>
           <w:sz w:val="21"/>
         </w:rPr>
-        <w:t>[1-2]</w:t>
+        <w:t>[</w:t>
+      </w:r>
+      <w:r>
+        <w:rPr>
+          <w:rFonts w:ascii="Times New Roman" w:hAnsi="Times New Roman" w:eastAsia="Times New Roman" w:cs="Times New Roman"/>
+          <w:b w:val="0"/>
+          <w:sz w:val="21"/>
+        </w:rPr>
+        <w:fldChar w:fldCharType="begin"/>
+        <w:instrText xml:space="preserve">REF ref_001 \h</w:instrText>
+        <w:fldChar w:fldCharType="separate"/>
+        <w:t>1</w:t>
+        <w:fldChar w:fldCharType="end"/>
+      </w:r>
+      <w:r>
+        <w:rPr>
+          <w:rFonts w:ascii="Times New Roman" w:hAnsi="Times New Roman" w:eastAsia="Times New Roman" w:cs="Times New Roman"/>
+          <w:b w:val="0"/>
+          <w:sz w:val="21"/>
+        </w:rPr>
+        <w:t>-</w:t>
+      </w:r>
+      <w:r>
+        <w:rPr>
+          <w:rFonts w:ascii="Times New Roman" w:hAnsi="Times New Roman" w:eastAsia="Times New Roman" w:cs="Times New Roman"/>
+          <w:b w:val="0"/>
+          <w:sz w:val="21"/>
+        </w:rPr>
+        <w:fldChar w:fldCharType="begin"/>
+        <w:instrText xml:space="preserve">REF ref_002 \h</w:instrText>
+        <w:fldChar w:fldCharType="separate"/>
+        <w:t>2</w:t>
+        <w:fldChar w:fldCharType="end"/>
+      </w:r>
+      <w:r>
+        <w:rPr>
+          <w:rFonts w:ascii="Times New Roman" w:hAnsi="Times New Roman" w:eastAsia="Times New Roman" w:cs="Times New Roman"/>
+          <w:b w:val="0"/>
+          <w:sz w:val="21"/>
+        </w:rPr>
+        <w:t>]</w:t>
       </w:r>
       <w:r>
         <w:rPr>
@@ -2062,7 +2142,27 @@
           <w:b w:val="0"/>
           <w:sz w:val="21"/>
         </w:rPr>
-        <w:t>[3]</w:t>
+        <w:t>[</w:t>
+      </w:r>
+      <w:r>
+        <w:rPr>
+          <w:rFonts w:ascii="Times New Roman" w:hAnsi="Times New Roman" w:eastAsia="Times New Roman" w:cs="Times New Roman"/>
+          <w:b w:val="0"/>
+          <w:sz w:val="21"/>
+        </w:rPr>
+        <w:fldChar w:fldCharType="begin"/>
+        <w:instrText xml:space="preserve">REF ref_003 \h</w:instrText>
+        <w:fldChar w:fldCharType="separate"/>
+        <w:t>3</w:t>
+        <w:fldChar w:fldCharType="end"/>
+      </w:r>
+      <w:r>
+        <w:rPr>
+          <w:rFonts w:ascii="Times New Roman" w:hAnsi="Times New Roman" w:eastAsia="Times New Roman" w:cs="Times New Roman"/>
+          <w:b w:val="0"/>
+          <w:sz w:val="21"/>
+        </w:rPr>
+        <w:t>]</w:t>
       </w:r>
       <w:r>
         <w:rPr>
@@ -2189,7 +2289,47 @@
           <w:b w:val="0"/>
           <w:sz w:val="21"/>
         </w:rPr>
-        <w:t>[9-13]</w:t>
+        <w:t>[</w:t>
+      </w:r>
+      <w:r>
+        <w:rPr>
+          <w:rFonts w:ascii="Times New Roman" w:hAnsi="Times New Roman" w:eastAsia="Times New Roman" w:cs="Times New Roman"/>
+          <w:b w:val="0"/>
+          <w:sz w:val="21"/>
+        </w:rPr>
+        <w:fldChar w:fldCharType="begin"/>
+        <w:instrText xml:space="preserve">REF ref_009 \h</w:instrText>
+        <w:fldChar w:fldCharType="separate"/>
+        <w:t>9</w:t>
+        <w:fldChar w:fldCharType="end"/>
+      </w:r>
+      <w:r>
+        <w:rPr>
+          <w:rFonts w:ascii="Times New Roman" w:hAnsi="Times New Roman" w:eastAsia="Times New Roman" w:cs="Times New Roman"/>
+          <w:b w:val="0"/>
+          <w:sz w:val="21"/>
+        </w:rPr>
+        <w:t>-</w:t>
+      </w:r>
+      <w:r>
+        <w:rPr>
+          <w:rFonts w:ascii="Times New Roman" w:hAnsi="Times New Roman" w:eastAsia="Times New Roman" w:cs="Times New Roman"/>
+          <w:b w:val="0"/>
+          <w:sz w:val="21"/>
+        </w:rPr>
+        <w:fldChar w:fldCharType="begin"/>
+        <w:instrText xml:space="preserve">REF ref_013 \h</w:instrText>
+        <w:fldChar w:fldCharType="separate"/>
+        <w:t>13</w:t>
+        <w:fldChar w:fldCharType="end"/>
+      </w:r>
+      <w:r>
+        <w:rPr>
+          <w:rFonts w:ascii="Times New Roman" w:hAnsi="Times New Roman" w:eastAsia="Times New Roman" w:cs="Times New Roman"/>
+          <w:b w:val="0"/>
+          <w:sz w:val="21"/>
+        </w:rPr>
+        <w:t>]</w:t>
       </w:r>
       <w:r>
         <w:rPr>
@@ -2205,7 +2345,47 @@
           <w:b w:val="0"/>
           <w:sz w:val="21"/>
         </w:rPr>
-        <w:t>[4-8]</w:t>
+        <w:t>[</w:t>
+      </w:r>
+      <w:r>
+        <w:rPr>
+          <w:rFonts w:ascii="Times New Roman" w:hAnsi="Times New Roman" w:eastAsia="Times New Roman" w:cs="Times New Roman"/>
+          <w:b w:val="0"/>
+          <w:sz w:val="21"/>
+        </w:rPr>
+        <w:fldChar w:fldCharType="begin"/>
+        <w:instrText xml:space="preserve">REF ref_004 \h</w:instrText>
+        <w:fldChar w:fldCharType="separate"/>
+        <w:t>4</w:t>
+        <w:fldChar w:fldCharType="end"/>
+      </w:r>
+      <w:r>
+        <w:rPr>
+          <w:rFonts w:ascii="Times New Roman" w:hAnsi="Times New Roman" w:eastAsia="Times New Roman" w:cs="Times New Roman"/>
+          <w:b w:val="0"/>
+          <w:sz w:val="21"/>
+        </w:rPr>
+        <w:t>-</w:t>
+      </w:r>
+      <w:r>
+        <w:rPr>
+          <w:rFonts w:ascii="Times New Roman" w:hAnsi="Times New Roman" w:eastAsia="Times New Roman" w:cs="Times New Roman"/>
+          <w:b w:val="0"/>
+          <w:sz w:val="21"/>
+        </w:rPr>
+        <w:fldChar w:fldCharType="begin"/>
+        <w:instrText xml:space="preserve">REF ref_008 \h</w:instrText>
+        <w:fldChar w:fldCharType="separate"/>
+        <w:t>8</w:t>
+        <w:fldChar w:fldCharType="end"/>
+      </w:r>
+      <w:r>
+        <w:rPr>
+          <w:rFonts w:ascii="Times New Roman" w:hAnsi="Times New Roman" w:eastAsia="Times New Roman" w:cs="Times New Roman"/>
+          <w:b w:val="0"/>
+          <w:sz w:val="21"/>
+        </w:rPr>
+        <w:t>]</w:t>
       </w:r>
       <w:r>
         <w:rPr>
@@ -2235,7 +2415,27 @@
           <w:b w:val="0"/>
           <w:sz w:val="21"/>
         </w:rPr>
-        <w:t>[19]</w:t>
+        <w:t>[</w:t>
+      </w:r>
+      <w:r>
+        <w:rPr>
+          <w:rFonts w:ascii="Times New Roman" w:hAnsi="Times New Roman" w:eastAsia="Times New Roman" w:cs="Times New Roman"/>
+          <w:b w:val="0"/>
+          <w:sz w:val="21"/>
+        </w:rPr>
+        <w:fldChar w:fldCharType="begin"/>
+        <w:instrText xml:space="preserve">REF ref_019 \h</w:instrText>
+        <w:fldChar w:fldCharType="separate"/>
+        <w:t>19</w:t>
+        <w:fldChar w:fldCharType="end"/>
+      </w:r>
+      <w:r>
+        <w:rPr>
+          <w:rFonts w:ascii="Times New Roman" w:hAnsi="Times New Roman" w:eastAsia="Times New Roman" w:cs="Times New Roman"/>
+          <w:b w:val="0"/>
+          <w:sz w:val="21"/>
+        </w:rPr>
+        <w:t>]</w:t>
       </w:r>
       <w:r>
         <w:rPr>
@@ -2251,7 +2451,27 @@
           <w:b w:val="0"/>
           <w:sz w:val="21"/>
         </w:rPr>
-        <w:t>[20]</w:t>
+        <w:t>[</w:t>
+      </w:r>
+      <w:r>
+        <w:rPr>
+          <w:rFonts w:ascii="Times New Roman" w:hAnsi="Times New Roman" w:eastAsia="Times New Roman" w:cs="Times New Roman"/>
+          <w:b w:val="0"/>
+          <w:sz w:val="21"/>
+        </w:rPr>
+        <w:fldChar w:fldCharType="begin"/>
+        <w:instrText xml:space="preserve">REF ref_020 \h</w:instrText>
+        <w:fldChar w:fldCharType="separate"/>
+        <w:t>20</w:t>
+        <w:fldChar w:fldCharType="end"/>
+      </w:r>
+      <w:r>
+        <w:rPr>
+          <w:rFonts w:ascii="Times New Roman" w:hAnsi="Times New Roman" w:eastAsia="Times New Roman" w:cs="Times New Roman"/>
+          <w:b w:val="0"/>
+          <w:sz w:val="21"/>
+        </w:rPr>
+        <w:t>]</w:t>
       </w:r>
       <w:r>
         <w:rPr>
@@ -2267,7 +2487,27 @@
           <w:b w:val="0"/>
           <w:sz w:val="21"/>
         </w:rPr>
-        <w:t>[21]</w:t>
+        <w:t>[</w:t>
+      </w:r>
+      <w:r>
+        <w:rPr>
+          <w:rFonts w:ascii="Times New Roman" w:hAnsi="Times New Roman" w:eastAsia="Times New Roman" w:cs="Times New Roman"/>
+          <w:b w:val="0"/>
+          <w:sz w:val="21"/>
+        </w:rPr>
+        <w:fldChar w:fldCharType="begin"/>
+        <w:instrText xml:space="preserve">REF ref_021 \h</w:instrText>
+        <w:fldChar w:fldCharType="separate"/>
+        <w:t>21</w:t>
+        <w:fldChar w:fldCharType="end"/>
+      </w:r>
+      <w:r>
+        <w:rPr>
+          <w:rFonts w:ascii="Times New Roman" w:hAnsi="Times New Roman" w:eastAsia="Times New Roman" w:cs="Times New Roman"/>
+          <w:b w:val="0"/>
+          <w:sz w:val="21"/>
+        </w:rPr>
+        <w:t>]</w:t>
       </w:r>
       <w:r>
         <w:rPr>
@@ -2297,7 +2537,47 @@
           <w:b w:val="0"/>
           <w:sz w:val="21"/>
         </w:rPr>
-        <w:t>[14-15]</w:t>
+        <w:t>[</w:t>
+      </w:r>
+      <w:r>
+        <w:rPr>
+          <w:rFonts w:ascii="Times New Roman" w:hAnsi="Times New Roman" w:eastAsia="Times New Roman" w:cs="Times New Roman"/>
+          <w:b w:val="0"/>
+          <w:sz w:val="21"/>
+        </w:rPr>
+        <w:fldChar w:fldCharType="begin"/>
+        <w:instrText xml:space="preserve">REF ref_014 \h</w:instrText>
+        <w:fldChar w:fldCharType="separate"/>
+        <w:t>14</w:t>
+        <w:fldChar w:fldCharType="end"/>
+      </w:r>
+      <w:r>
+        <w:rPr>
+          <w:rFonts w:ascii="Times New Roman" w:hAnsi="Times New Roman" w:eastAsia="Times New Roman" w:cs="Times New Roman"/>
+          <w:b w:val="0"/>
+          <w:sz w:val="21"/>
+        </w:rPr>
+        <w:t>-</w:t>
+      </w:r>
+      <w:r>
+        <w:rPr>
+          <w:rFonts w:ascii="Times New Roman" w:hAnsi="Times New Roman" w:eastAsia="Times New Roman" w:cs="Times New Roman"/>
+          <w:b w:val="0"/>
+          <w:sz w:val="21"/>
+        </w:rPr>
+        <w:fldChar w:fldCharType="begin"/>
+        <w:instrText xml:space="preserve">REF ref_015 \h</w:instrText>
+        <w:fldChar w:fldCharType="separate"/>
+        <w:t>15</w:t>
+        <w:fldChar w:fldCharType="end"/>
+      </w:r>
+      <w:r>
+        <w:rPr>
+          <w:rFonts w:ascii="Times New Roman" w:hAnsi="Times New Roman" w:eastAsia="Times New Roman" w:cs="Times New Roman"/>
+          <w:b w:val="0"/>
+          <w:sz w:val="21"/>
+        </w:rPr>
+        <w:t>]</w:t>
       </w:r>
       <w:r>
         <w:rPr>
@@ -2313,7 +2593,47 @@
           <w:b w:val="0"/>
           <w:sz w:val="21"/>
         </w:rPr>
-        <w:t>[16-18]</w:t>
+        <w:t>[</w:t>
+      </w:r>
+      <w:r>
+        <w:rPr>
+          <w:rFonts w:ascii="Times New Roman" w:hAnsi="Times New Roman" w:eastAsia="Times New Roman" w:cs="Times New Roman"/>
+          <w:b w:val="0"/>
+          <w:sz w:val="21"/>
+        </w:rPr>
+        <w:fldChar w:fldCharType="begin"/>
+        <w:instrText xml:space="preserve">REF ref_016 \h</w:instrText>
+        <w:fldChar w:fldCharType="separate"/>
+        <w:t>16</w:t>
+        <w:fldChar w:fldCharType="end"/>
+      </w:r>
+      <w:r>
+        <w:rPr>
+          <w:rFonts w:ascii="Times New Roman" w:hAnsi="Times New Roman" w:eastAsia="Times New Roman" w:cs="Times New Roman"/>
+          <w:b w:val="0"/>
+          <w:sz w:val="21"/>
+        </w:rPr>
+        <w:t>-</w:t>
+      </w:r>
+      <w:r>
+        <w:rPr>
+          <w:rFonts w:ascii="Times New Roman" w:hAnsi="Times New Roman" w:eastAsia="Times New Roman" w:cs="Times New Roman"/>
+          <w:b w:val="0"/>
+          <w:sz w:val="21"/>
+        </w:rPr>
+        <w:fldChar w:fldCharType="begin"/>
+        <w:instrText xml:space="preserve">REF ref_018 \h</w:instrText>
+        <w:fldChar w:fldCharType="separate"/>
+        <w:t>18</w:t>
+        <w:fldChar w:fldCharType="end"/>
+      </w:r>
+      <w:r>
+        <w:rPr>
+          <w:rFonts w:ascii="Times New Roman" w:hAnsi="Times New Roman" w:eastAsia="Times New Roman" w:cs="Times New Roman"/>
+          <w:b w:val="0"/>
+          <w:sz w:val="21"/>
+        </w:rPr>
+        <w:t>]</w:t>
       </w:r>
       <w:r>
         <w:rPr>
@@ -2624,7 +2944,35 @@
                 <w:b w:val="0"/>
                 <w:sz w:val="19"/>
               </w:rPr>
-              <w:t>吴宗友等[4]</w:t>
+              <w:t>吴宗友等</w:t>
+            </w:r>
+            <w:r>
+              <w:rPr>
+                <w:rFonts w:ascii="Times New Roman" w:hAnsi="Times New Roman" w:eastAsia="Times New Roman" w:cs="Times New Roman"/>
+                <w:b w:val="0"/>
+                <w:sz w:val="19"/>
+              </w:rPr>
+              <w:t>[</w:t>
+            </w:r>
+            <w:r>
+              <w:rPr>
+                <w:rFonts w:ascii="Times New Roman" w:hAnsi="Times New Roman" w:eastAsia="Times New Roman" w:cs="Times New Roman"/>
+                <w:b w:val="0"/>
+                <w:sz w:val="19"/>
+              </w:rPr>
+              <w:fldChar w:fldCharType="begin"/>
+              <w:instrText xml:space="preserve">REF ref_004 \h</w:instrText>
+              <w:fldChar w:fldCharType="separate"/>
+              <w:t>4</w:t>
+              <w:fldChar w:fldCharType="end"/>
+            </w:r>
+            <w:r>
+              <w:rPr>
+                <w:rFonts w:ascii="Times New Roman" w:hAnsi="Times New Roman" w:eastAsia="Times New Roman" w:cs="Times New Roman"/>
+                <w:b w:val="0"/>
+                <w:sz w:val="19"/>
+              </w:rPr>
+              <w:t>]</w:t>
             </w:r>
           </w:p>
         </w:tc>
@@ -2686,7 +3034,35 @@
                 <w:b w:val="0"/>
                 <w:sz w:val="19"/>
               </w:rPr>
-              <w:t>韩普等[6]</w:t>
+              <w:t>韩普等</w:t>
+            </w:r>
+            <w:r>
+              <w:rPr>
+                <w:rFonts w:ascii="Times New Roman" w:hAnsi="Times New Roman" w:eastAsia="Times New Roman" w:cs="Times New Roman"/>
+                <w:b w:val="0"/>
+                <w:sz w:val="19"/>
+              </w:rPr>
+              <w:t>[</w:t>
+            </w:r>
+            <w:r>
+              <w:rPr>
+                <w:rFonts w:ascii="Times New Roman" w:hAnsi="Times New Roman" w:eastAsia="Times New Roman" w:cs="Times New Roman"/>
+                <w:b w:val="0"/>
+                <w:sz w:val="19"/>
+              </w:rPr>
+              <w:fldChar w:fldCharType="begin"/>
+              <w:instrText xml:space="preserve">REF ref_006 \h</w:instrText>
+              <w:fldChar w:fldCharType="separate"/>
+              <w:t>6</w:t>
+              <w:fldChar w:fldCharType="end"/>
+            </w:r>
+            <w:r>
+              <w:rPr>
+                <w:rFonts w:ascii="Times New Roman" w:hAnsi="Times New Roman" w:eastAsia="Times New Roman" w:cs="Times New Roman"/>
+                <w:b w:val="0"/>
+                <w:sz w:val="19"/>
+              </w:rPr>
+              <w:t>]</w:t>
             </w:r>
           </w:p>
         </w:tc>
@@ -2748,7 +3124,35 @@
                 <w:b w:val="0"/>
                 <w:sz w:val="19"/>
               </w:rPr>
-              <w:t>崔少国等[7]</w:t>
+              <w:t>崔少国等</w:t>
+            </w:r>
+            <w:r>
+              <w:rPr>
+                <w:rFonts w:ascii="Times New Roman" w:hAnsi="Times New Roman" w:eastAsia="Times New Roman" w:cs="Times New Roman"/>
+                <w:b w:val="0"/>
+                <w:sz w:val="19"/>
+              </w:rPr>
+              <w:t>[</w:t>
+            </w:r>
+            <w:r>
+              <w:rPr>
+                <w:rFonts w:ascii="Times New Roman" w:hAnsi="Times New Roman" w:eastAsia="Times New Roman" w:cs="Times New Roman"/>
+                <w:b w:val="0"/>
+                <w:sz w:val="19"/>
+              </w:rPr>
+              <w:fldChar w:fldCharType="begin"/>
+              <w:instrText xml:space="preserve">REF ref_007 \h</w:instrText>
+              <w:fldChar w:fldCharType="separate"/>
+              <w:t>7</w:t>
+              <w:fldChar w:fldCharType="end"/>
+            </w:r>
+            <w:r>
+              <w:rPr>
+                <w:rFonts w:ascii="Times New Roman" w:hAnsi="Times New Roman" w:eastAsia="Times New Roman" w:cs="Times New Roman"/>
+                <w:b w:val="0"/>
+                <w:sz w:val="19"/>
+              </w:rPr>
+              <w:t>]</w:t>
             </w:r>
           </w:p>
         </w:tc>
@@ -2810,7 +3214,35 @@
                 <w:b w:val="0"/>
                 <w:sz w:val="19"/>
               </w:rPr>
-              <w:t>盖彦蓉等[8]</w:t>
+              <w:t>盖彦蓉等</w:t>
+            </w:r>
+            <w:r>
+              <w:rPr>
+                <w:rFonts w:ascii="Times New Roman" w:hAnsi="Times New Roman" w:eastAsia="Times New Roman" w:cs="Times New Roman"/>
+                <w:b w:val="0"/>
+                <w:sz w:val="19"/>
+              </w:rPr>
+              <w:t>[</w:t>
+            </w:r>
+            <w:r>
+              <w:rPr>
+                <w:rFonts w:ascii="Times New Roman" w:hAnsi="Times New Roman" w:eastAsia="Times New Roman" w:cs="Times New Roman"/>
+                <w:b w:val="0"/>
+                <w:sz w:val="19"/>
+              </w:rPr>
+              <w:fldChar w:fldCharType="begin"/>
+              <w:instrText xml:space="preserve">REF ref_008 \h</w:instrText>
+              <w:fldChar w:fldCharType="separate"/>
+              <w:t>8</w:t>
+              <w:fldChar w:fldCharType="end"/>
+            </w:r>
+            <w:r>
+              <w:rPr>
+                <w:rFonts w:ascii="Times New Roman" w:hAnsi="Times New Roman" w:eastAsia="Times New Roman" w:cs="Times New Roman"/>
+                <w:b w:val="0"/>
+                <w:sz w:val="19"/>
+              </w:rPr>
+              <w:t>]</w:t>
             </w:r>
           </w:p>
         </w:tc>
@@ -2872,7 +3304,35 @@
                 <w:b w:val="0"/>
                 <w:sz w:val="19"/>
               </w:rPr>
-              <w:t>Lewis 等[19]</w:t>
+              <w:t>Lewis 等</w:t>
+            </w:r>
+            <w:r>
+              <w:rPr>
+                <w:rFonts w:ascii="Times New Roman" w:hAnsi="Times New Roman" w:eastAsia="Times New Roman" w:cs="Times New Roman"/>
+                <w:b w:val="0"/>
+                <w:sz w:val="19"/>
+              </w:rPr>
+              <w:t>[</w:t>
+            </w:r>
+            <w:r>
+              <w:rPr>
+                <w:rFonts w:ascii="Times New Roman" w:hAnsi="Times New Roman" w:eastAsia="Times New Roman" w:cs="Times New Roman"/>
+                <w:b w:val="0"/>
+                <w:sz w:val="19"/>
+              </w:rPr>
+              <w:fldChar w:fldCharType="begin"/>
+              <w:instrText xml:space="preserve">REF ref_019 \h</w:instrText>
+              <w:fldChar w:fldCharType="separate"/>
+              <w:t>19</w:t>
+              <w:fldChar w:fldCharType="end"/>
+            </w:r>
+            <w:r>
+              <w:rPr>
+                <w:rFonts w:ascii="Times New Roman" w:hAnsi="Times New Roman" w:eastAsia="Times New Roman" w:cs="Times New Roman"/>
+                <w:b w:val="0"/>
+                <w:sz w:val="19"/>
+              </w:rPr>
+              <w:t>]</w:t>
             </w:r>
           </w:p>
         </w:tc>
@@ -2934,7 +3394,35 @@
                 <w:b w:val="0"/>
                 <w:sz w:val="19"/>
               </w:rPr>
-              <w:t>Yao 等[20]</w:t>
+              <w:t>Yao 等</w:t>
+            </w:r>
+            <w:r>
+              <w:rPr>
+                <w:rFonts w:ascii="Times New Roman" w:hAnsi="Times New Roman" w:eastAsia="Times New Roman" w:cs="Times New Roman"/>
+                <w:b w:val="0"/>
+                <w:sz w:val="19"/>
+              </w:rPr>
+              <w:t>[</w:t>
+            </w:r>
+            <w:r>
+              <w:rPr>
+                <w:rFonts w:ascii="Times New Roman" w:hAnsi="Times New Roman" w:eastAsia="Times New Roman" w:cs="Times New Roman"/>
+                <w:b w:val="0"/>
+                <w:sz w:val="19"/>
+              </w:rPr>
+              <w:fldChar w:fldCharType="begin"/>
+              <w:instrText xml:space="preserve">REF ref_020 \h</w:instrText>
+              <w:fldChar w:fldCharType="separate"/>
+              <w:t>20</w:t>
+              <w:fldChar w:fldCharType="end"/>
+            </w:r>
+            <w:r>
+              <w:rPr>
+                <w:rFonts w:ascii="Times New Roman" w:hAnsi="Times New Roman" w:eastAsia="Times New Roman" w:cs="Times New Roman"/>
+                <w:b w:val="0"/>
+                <w:sz w:val="19"/>
+              </w:rPr>
+              <w:t>]</w:t>
             </w:r>
           </w:p>
         </w:tc>
@@ -2996,7 +3484,35 @@
                 <w:b w:val="0"/>
                 <w:sz w:val="19"/>
               </w:rPr>
-              <w:t>Wu 等[21]</w:t>
+              <w:t>Wu 等</w:t>
+            </w:r>
+            <w:r>
+              <w:rPr>
+                <w:rFonts w:ascii="Times New Roman" w:hAnsi="Times New Roman" w:eastAsia="Times New Roman" w:cs="Times New Roman"/>
+                <w:b w:val="0"/>
+                <w:sz w:val="19"/>
+              </w:rPr>
+              <w:t>[</w:t>
+            </w:r>
+            <w:r>
+              <w:rPr>
+                <w:rFonts w:ascii="Times New Roman" w:hAnsi="Times New Roman" w:eastAsia="Times New Roman" w:cs="Times New Roman"/>
+                <w:b w:val="0"/>
+                <w:sz w:val="19"/>
+              </w:rPr>
+              <w:fldChar w:fldCharType="begin"/>
+              <w:instrText xml:space="preserve">REF ref_021 \h</w:instrText>
+              <w:fldChar w:fldCharType="separate"/>
+              <w:t>21</w:t>
+              <w:fldChar w:fldCharType="end"/>
+            </w:r>
+            <w:r>
+              <w:rPr>
+                <w:rFonts w:ascii="Times New Roman" w:hAnsi="Times New Roman" w:eastAsia="Times New Roman" w:cs="Times New Roman"/>
+                <w:b w:val="0"/>
+                <w:sz w:val="19"/>
+              </w:rPr>
+              <w:t>]</w:t>
             </w:r>
           </w:p>
         </w:tc>
@@ -3058,7 +3574,35 @@
                 <w:b w:val="0"/>
                 <w:sz w:val="19"/>
               </w:rPr>
-              <w:t>LangChain[22]</w:t>
+              <w:t>LangChain</w:t>
+            </w:r>
+            <w:r>
+              <w:rPr>
+                <w:rFonts w:ascii="Times New Roman" w:hAnsi="Times New Roman" w:eastAsia="Times New Roman" w:cs="Times New Roman"/>
+                <w:b w:val="0"/>
+                <w:sz w:val="19"/>
+              </w:rPr>
+              <w:t>[</w:t>
+            </w:r>
+            <w:r>
+              <w:rPr>
+                <w:rFonts w:ascii="Times New Roman" w:hAnsi="Times New Roman" w:eastAsia="Times New Roman" w:cs="Times New Roman"/>
+                <w:b w:val="0"/>
+                <w:sz w:val="19"/>
+              </w:rPr>
+              <w:fldChar w:fldCharType="begin"/>
+              <w:instrText xml:space="preserve">REF ref_022 \h</w:instrText>
+              <w:fldChar w:fldCharType="separate"/>
+              <w:t>22</w:t>
+              <w:fldChar w:fldCharType="end"/>
+            </w:r>
+            <w:r>
+              <w:rPr>
+                <w:rFonts w:ascii="Times New Roman" w:hAnsi="Times New Roman" w:eastAsia="Times New Roman" w:cs="Times New Roman"/>
+                <w:b w:val="0"/>
+                <w:sz w:val="19"/>
+              </w:rPr>
+              <w:t>]</w:t>
             </w:r>
           </w:p>
         </w:tc>
@@ -3138,7 +3682,27 @@
           <w:b w:val="0"/>
           <w:sz w:val="21"/>
         </w:rPr>
-        <w:t>[1]</w:t>
+        <w:t>[</w:t>
+      </w:r>
+      <w:r>
+        <w:rPr>
+          <w:rFonts w:ascii="Times New Roman" w:hAnsi="Times New Roman" w:eastAsia="Times New Roman" w:cs="Times New Roman"/>
+          <w:b w:val="0"/>
+          <w:sz w:val="21"/>
+        </w:rPr>
+        <w:fldChar w:fldCharType="begin"/>
+        <w:instrText xml:space="preserve">REF ref_001 \h</w:instrText>
+        <w:fldChar w:fldCharType="separate"/>
+        <w:t>1</w:t>
+        <w:fldChar w:fldCharType="end"/>
+      </w:r>
+      <w:r>
+        <w:rPr>
+          <w:rFonts w:ascii="Times New Roman" w:hAnsi="Times New Roman" w:eastAsia="Times New Roman" w:cs="Times New Roman"/>
+          <w:b w:val="0"/>
+          <w:sz w:val="21"/>
+        </w:rPr>
+        <w:t>]</w:t>
       </w:r>
       <w:r>
         <w:rPr>
@@ -3154,7 +3718,27 @@
           <w:b w:val="0"/>
           <w:sz w:val="21"/>
         </w:rPr>
-        <w:t>[2]</w:t>
+        <w:t>[</w:t>
+      </w:r>
+      <w:r>
+        <w:rPr>
+          <w:rFonts w:ascii="Times New Roman" w:hAnsi="Times New Roman" w:eastAsia="Times New Roman" w:cs="Times New Roman"/>
+          <w:b w:val="0"/>
+          <w:sz w:val="21"/>
+        </w:rPr>
+        <w:fldChar w:fldCharType="begin"/>
+        <w:instrText xml:space="preserve">REF ref_002 \h</w:instrText>
+        <w:fldChar w:fldCharType="separate"/>
+        <w:t>2</w:t>
+        <w:fldChar w:fldCharType="end"/>
+      </w:r>
+      <w:r>
+        <w:rPr>
+          <w:rFonts w:ascii="Times New Roman" w:hAnsi="Times New Roman" w:eastAsia="Times New Roman" w:cs="Times New Roman"/>
+          <w:b w:val="0"/>
+          <w:sz w:val="21"/>
+        </w:rPr>
+        <w:t>]</w:t>
       </w:r>
       <w:r>
         <w:rPr>
@@ -3170,7 +3754,27 @@
           <w:b w:val="0"/>
           <w:sz w:val="21"/>
         </w:rPr>
-        <w:t>[3]</w:t>
+        <w:t>[</w:t>
+      </w:r>
+      <w:r>
+        <w:rPr>
+          <w:rFonts w:ascii="Times New Roman" w:hAnsi="Times New Roman" w:eastAsia="Times New Roman" w:cs="Times New Roman"/>
+          <w:b w:val="0"/>
+          <w:sz w:val="21"/>
+        </w:rPr>
+        <w:fldChar w:fldCharType="begin"/>
+        <w:instrText xml:space="preserve">REF ref_003 \h</w:instrText>
+        <w:fldChar w:fldCharType="separate"/>
+        <w:t>3</w:t>
+        <w:fldChar w:fldCharType="end"/>
+      </w:r>
+      <w:r>
+        <w:rPr>
+          <w:rFonts w:ascii="Times New Roman" w:hAnsi="Times New Roman" w:eastAsia="Times New Roman" w:cs="Times New Roman"/>
+          <w:b w:val="0"/>
+          <w:sz w:val="21"/>
+        </w:rPr>
+        <w:t>]</w:t>
       </w:r>
       <w:r>
         <w:rPr>
@@ -3200,7 +3804,27 @@
           <w:b w:val="0"/>
           <w:sz w:val="21"/>
         </w:rPr>
-        <w:t>[4]</w:t>
+        <w:t>[</w:t>
+      </w:r>
+      <w:r>
+        <w:rPr>
+          <w:rFonts w:ascii="Times New Roman" w:hAnsi="Times New Roman" w:eastAsia="Times New Roman" w:cs="Times New Roman"/>
+          <w:b w:val="0"/>
+          <w:sz w:val="21"/>
+        </w:rPr>
+        <w:fldChar w:fldCharType="begin"/>
+        <w:instrText xml:space="preserve">REF ref_004 \h</w:instrText>
+        <w:fldChar w:fldCharType="separate"/>
+        <w:t>4</w:t>
+        <w:fldChar w:fldCharType="end"/>
+      </w:r>
+      <w:r>
+        <w:rPr>
+          <w:rFonts w:ascii="Times New Roman" w:hAnsi="Times New Roman" w:eastAsia="Times New Roman" w:cs="Times New Roman"/>
+          <w:b w:val="0"/>
+          <w:sz w:val="21"/>
+        </w:rPr>
+        <w:t>]</w:t>
       </w:r>
       <w:r>
         <w:rPr>
@@ -3230,7 +3854,27 @@
           <w:b w:val="0"/>
           <w:sz w:val="21"/>
         </w:rPr>
-        <w:t>[5]</w:t>
+        <w:t>[</w:t>
+      </w:r>
+      <w:r>
+        <w:rPr>
+          <w:rFonts w:ascii="Times New Roman" w:hAnsi="Times New Roman" w:eastAsia="Times New Roman" w:cs="Times New Roman"/>
+          <w:b w:val="0"/>
+          <w:sz w:val="21"/>
+        </w:rPr>
+        <w:fldChar w:fldCharType="begin"/>
+        <w:instrText xml:space="preserve">REF ref_005 \h</w:instrText>
+        <w:fldChar w:fldCharType="separate"/>
+        <w:t>5</w:t>
+        <w:fldChar w:fldCharType="end"/>
+      </w:r>
+      <w:r>
+        <w:rPr>
+          <w:rFonts w:ascii="Times New Roman" w:hAnsi="Times New Roman" w:eastAsia="Times New Roman" w:cs="Times New Roman"/>
+          <w:b w:val="0"/>
+          <w:sz w:val="21"/>
+        </w:rPr>
+        <w:t>]</w:t>
       </w:r>
       <w:r>
         <w:rPr>
@@ -3246,7 +3890,27 @@
           <w:b w:val="0"/>
           <w:sz w:val="21"/>
         </w:rPr>
-        <w:t>[6]</w:t>
+        <w:t>[</w:t>
+      </w:r>
+      <w:r>
+        <w:rPr>
+          <w:rFonts w:ascii="Times New Roman" w:hAnsi="Times New Roman" w:eastAsia="Times New Roman" w:cs="Times New Roman"/>
+          <w:b w:val="0"/>
+          <w:sz w:val="21"/>
+        </w:rPr>
+        <w:fldChar w:fldCharType="begin"/>
+        <w:instrText xml:space="preserve">REF ref_006 \h</w:instrText>
+        <w:fldChar w:fldCharType="separate"/>
+        <w:t>6</w:t>
+        <w:fldChar w:fldCharType="end"/>
+      </w:r>
+      <w:r>
+        <w:rPr>
+          <w:rFonts w:ascii="Times New Roman" w:hAnsi="Times New Roman" w:eastAsia="Times New Roman" w:cs="Times New Roman"/>
+          <w:b w:val="0"/>
+          <w:sz w:val="21"/>
+        </w:rPr>
+        <w:t>]</w:t>
       </w:r>
       <w:r>
         <w:rPr>
@@ -3262,7 +3926,27 @@
           <w:b w:val="0"/>
           <w:sz w:val="21"/>
         </w:rPr>
-        <w:t>[7]</w:t>
+        <w:t>[</w:t>
+      </w:r>
+      <w:r>
+        <w:rPr>
+          <w:rFonts w:ascii="Times New Roman" w:hAnsi="Times New Roman" w:eastAsia="Times New Roman" w:cs="Times New Roman"/>
+          <w:b w:val="0"/>
+          <w:sz w:val="21"/>
+        </w:rPr>
+        <w:fldChar w:fldCharType="begin"/>
+        <w:instrText xml:space="preserve">REF ref_007 \h</w:instrText>
+        <w:fldChar w:fldCharType="separate"/>
+        <w:t>7</w:t>
+        <w:fldChar w:fldCharType="end"/>
+      </w:r>
+      <w:r>
+        <w:rPr>
+          <w:rFonts w:ascii="Times New Roman" w:hAnsi="Times New Roman" w:eastAsia="Times New Roman" w:cs="Times New Roman"/>
+          <w:b w:val="0"/>
+          <w:sz w:val="21"/>
+        </w:rPr>
+        <w:t>]</w:t>
       </w:r>
       <w:r>
         <w:rPr>
@@ -3306,7 +3990,27 @@
           <w:b w:val="0"/>
           <w:sz w:val="21"/>
         </w:rPr>
-        <w:t>[8]</w:t>
+        <w:t>[</w:t>
+      </w:r>
+      <w:r>
+        <w:rPr>
+          <w:rFonts w:ascii="Times New Roman" w:hAnsi="Times New Roman" w:eastAsia="Times New Roman" w:cs="Times New Roman"/>
+          <w:b w:val="0"/>
+          <w:sz w:val="21"/>
+        </w:rPr>
+        <w:fldChar w:fldCharType="begin"/>
+        <w:instrText xml:space="preserve">REF ref_008 \h</w:instrText>
+        <w:fldChar w:fldCharType="separate"/>
+        <w:t>8</w:t>
+        <w:fldChar w:fldCharType="end"/>
+      </w:r>
+      <w:r>
+        <w:rPr>
+          <w:rFonts w:ascii="Times New Roman" w:hAnsi="Times New Roman" w:eastAsia="Times New Roman" w:cs="Times New Roman"/>
+          <w:b w:val="0"/>
+          <w:sz w:val="21"/>
+        </w:rPr>
+        <w:t>]</w:t>
       </w:r>
       <w:r>
         <w:rPr>
@@ -3350,7 +4054,27 @@
           <w:b w:val="0"/>
           <w:sz w:val="21"/>
         </w:rPr>
-        <w:t>[9]</w:t>
+        <w:t>[</w:t>
+      </w:r>
+      <w:r>
+        <w:rPr>
+          <w:rFonts w:ascii="Times New Roman" w:hAnsi="Times New Roman" w:eastAsia="Times New Roman" w:cs="Times New Roman"/>
+          <w:b w:val="0"/>
+          <w:sz w:val="21"/>
+        </w:rPr>
+        <w:fldChar w:fldCharType="begin"/>
+        <w:instrText xml:space="preserve">REF ref_009 \h</w:instrText>
+        <w:fldChar w:fldCharType="separate"/>
+        <w:t>9</w:t>
+        <w:fldChar w:fldCharType="end"/>
+      </w:r>
+      <w:r>
+        <w:rPr>
+          <w:rFonts w:ascii="Times New Roman" w:hAnsi="Times New Roman" w:eastAsia="Times New Roman" w:cs="Times New Roman"/>
+          <w:b w:val="0"/>
+          <w:sz w:val="21"/>
+        </w:rPr>
+        <w:t>]</w:t>
       </w:r>
       <w:r>
         <w:rPr>
@@ -3366,7 +4090,27 @@
           <w:b w:val="0"/>
           <w:sz w:val="21"/>
         </w:rPr>
-        <w:t>[10]</w:t>
+        <w:t>[</w:t>
+      </w:r>
+      <w:r>
+        <w:rPr>
+          <w:rFonts w:ascii="Times New Roman" w:hAnsi="Times New Roman" w:eastAsia="Times New Roman" w:cs="Times New Roman"/>
+          <w:b w:val="0"/>
+          <w:sz w:val="21"/>
+        </w:rPr>
+        <w:fldChar w:fldCharType="begin"/>
+        <w:instrText xml:space="preserve">REF ref_010 \h</w:instrText>
+        <w:fldChar w:fldCharType="separate"/>
+        <w:t>10</w:t>
+        <w:fldChar w:fldCharType="end"/>
+      </w:r>
+      <w:r>
+        <w:rPr>
+          <w:rFonts w:ascii="Times New Roman" w:hAnsi="Times New Roman" w:eastAsia="Times New Roman" w:cs="Times New Roman"/>
+          <w:b w:val="0"/>
+          <w:sz w:val="21"/>
+        </w:rPr>
+        <w:t>]</w:t>
       </w:r>
       <w:r>
         <w:rPr>
@@ -3382,7 +4126,27 @@
           <w:b w:val="0"/>
           <w:sz w:val="21"/>
         </w:rPr>
-        <w:t>[11]</w:t>
+        <w:t>[</w:t>
+      </w:r>
+      <w:r>
+        <w:rPr>
+          <w:rFonts w:ascii="Times New Roman" w:hAnsi="Times New Roman" w:eastAsia="Times New Roman" w:cs="Times New Roman"/>
+          <w:b w:val="0"/>
+          <w:sz w:val="21"/>
+        </w:rPr>
+        <w:fldChar w:fldCharType="begin"/>
+        <w:instrText xml:space="preserve">REF ref_011 \h</w:instrText>
+        <w:fldChar w:fldCharType="separate"/>
+        <w:t>11</w:t>
+        <w:fldChar w:fldCharType="end"/>
+      </w:r>
+      <w:r>
+        <w:rPr>
+          <w:rFonts w:ascii="Times New Roman" w:hAnsi="Times New Roman" w:eastAsia="Times New Roman" w:cs="Times New Roman"/>
+          <w:b w:val="0"/>
+          <w:sz w:val="21"/>
+        </w:rPr>
+        <w:t>]</w:t>
       </w:r>
       <w:r>
         <w:rPr>
@@ -3412,7 +4176,27 @@
           <w:b w:val="0"/>
           <w:sz w:val="21"/>
         </w:rPr>
-        <w:t>[12]</w:t>
+        <w:t>[</w:t>
+      </w:r>
+      <w:r>
+        <w:rPr>
+          <w:rFonts w:ascii="Times New Roman" w:hAnsi="Times New Roman" w:eastAsia="Times New Roman" w:cs="Times New Roman"/>
+          <w:b w:val="0"/>
+          <w:sz w:val="21"/>
+        </w:rPr>
+        <w:fldChar w:fldCharType="begin"/>
+        <w:instrText xml:space="preserve">REF ref_012 \h</w:instrText>
+        <w:fldChar w:fldCharType="separate"/>
+        <w:t>12</w:t>
+        <w:fldChar w:fldCharType="end"/>
+      </w:r>
+      <w:r>
+        <w:rPr>
+          <w:rFonts w:ascii="Times New Roman" w:hAnsi="Times New Roman" w:eastAsia="Times New Roman" w:cs="Times New Roman"/>
+          <w:b w:val="0"/>
+          <w:sz w:val="21"/>
+        </w:rPr>
+        <w:t>]</w:t>
       </w:r>
       <w:r>
         <w:rPr>
@@ -3428,7 +4212,27 @@
           <w:b w:val="0"/>
           <w:sz w:val="21"/>
         </w:rPr>
-        <w:t>[13]</w:t>
+        <w:t>[</w:t>
+      </w:r>
+      <w:r>
+        <w:rPr>
+          <w:rFonts w:ascii="Times New Roman" w:hAnsi="Times New Roman" w:eastAsia="Times New Roman" w:cs="Times New Roman"/>
+          <w:b w:val="0"/>
+          <w:sz w:val="21"/>
+        </w:rPr>
+        <w:fldChar w:fldCharType="begin"/>
+        <w:instrText xml:space="preserve">REF ref_013 \h</w:instrText>
+        <w:fldChar w:fldCharType="separate"/>
+        <w:t>13</w:t>
+        <w:fldChar w:fldCharType="end"/>
+      </w:r>
+      <w:r>
+        <w:rPr>
+          <w:rFonts w:ascii="Times New Roman" w:hAnsi="Times New Roman" w:eastAsia="Times New Roman" w:cs="Times New Roman"/>
+          <w:b w:val="0"/>
+          <w:sz w:val="21"/>
+        </w:rPr>
+        <w:t>]</w:t>
       </w:r>
       <w:r>
         <w:rPr>
@@ -3458,7 +4262,27 @@
           <w:b w:val="0"/>
           <w:sz w:val="21"/>
         </w:rPr>
-        <w:t>[23]</w:t>
+        <w:t>[</w:t>
+      </w:r>
+      <w:r>
+        <w:rPr>
+          <w:rFonts w:ascii="Times New Roman" w:hAnsi="Times New Roman" w:eastAsia="Times New Roman" w:cs="Times New Roman"/>
+          <w:b w:val="0"/>
+          <w:sz w:val="21"/>
+        </w:rPr>
+        <w:fldChar w:fldCharType="begin"/>
+        <w:instrText xml:space="preserve">REF ref_023 \h</w:instrText>
+        <w:fldChar w:fldCharType="separate"/>
+        <w:t>23</w:t>
+        <w:fldChar w:fldCharType="end"/>
+      </w:r>
+      <w:r>
+        <w:rPr>
+          <w:rFonts w:ascii="Times New Roman" w:hAnsi="Times New Roman" w:eastAsia="Times New Roman" w:cs="Times New Roman"/>
+          <w:b w:val="0"/>
+          <w:sz w:val="21"/>
+        </w:rPr>
+        <w:t>]</w:t>
       </w:r>
       <w:r>
         <w:rPr>
@@ -3474,7 +4298,27 @@
           <w:b w:val="0"/>
           <w:sz w:val="21"/>
         </w:rPr>
-        <w:t>[24]</w:t>
+        <w:t>[</w:t>
+      </w:r>
+      <w:r>
+        <w:rPr>
+          <w:rFonts w:ascii="Times New Roman" w:hAnsi="Times New Roman" w:eastAsia="Times New Roman" w:cs="Times New Roman"/>
+          <w:b w:val="0"/>
+          <w:sz w:val="21"/>
+        </w:rPr>
+        <w:fldChar w:fldCharType="begin"/>
+        <w:instrText xml:space="preserve">REF ref_024 \h</w:instrText>
+        <w:fldChar w:fldCharType="separate"/>
+        <w:t>24</w:t>
+        <w:fldChar w:fldCharType="end"/>
+      </w:r>
+      <w:r>
+        <w:rPr>
+          <w:rFonts w:ascii="Times New Roman" w:hAnsi="Times New Roman" w:eastAsia="Times New Roman" w:cs="Times New Roman"/>
+          <w:b w:val="0"/>
+          <w:sz w:val="21"/>
+        </w:rPr>
+        <w:t>]</w:t>
       </w:r>
       <w:r>
         <w:rPr>
@@ -3504,7 +4348,27 @@
           <w:b w:val="0"/>
           <w:sz w:val="21"/>
         </w:rPr>
-        <w:t>[19]</w:t>
+        <w:t>[</w:t>
+      </w:r>
+      <w:r>
+        <w:rPr>
+          <w:rFonts w:ascii="Times New Roman" w:hAnsi="Times New Roman" w:eastAsia="Times New Roman" w:cs="Times New Roman"/>
+          <w:b w:val="0"/>
+          <w:sz w:val="21"/>
+        </w:rPr>
+        <w:fldChar w:fldCharType="begin"/>
+        <w:instrText xml:space="preserve">REF ref_019 \h</w:instrText>
+        <w:fldChar w:fldCharType="separate"/>
+        <w:t>19</w:t>
+        <w:fldChar w:fldCharType="end"/>
+      </w:r>
+      <w:r>
+        <w:rPr>
+          <w:rFonts w:ascii="Times New Roman" w:hAnsi="Times New Roman" w:eastAsia="Times New Roman" w:cs="Times New Roman"/>
+          <w:b w:val="0"/>
+          <w:sz w:val="21"/>
+        </w:rPr>
+        <w:t>]</w:t>
       </w:r>
       <w:r>
         <w:rPr>
@@ -3534,7 +4398,27 @@
           <w:b w:val="0"/>
           <w:sz w:val="21"/>
         </w:rPr>
-        <w:t>[19]</w:t>
+        <w:t>[</w:t>
+      </w:r>
+      <w:r>
+        <w:rPr>
+          <w:rFonts w:ascii="Times New Roman" w:hAnsi="Times New Roman" w:eastAsia="Times New Roman" w:cs="Times New Roman"/>
+          <w:b w:val="0"/>
+          <w:sz w:val="21"/>
+        </w:rPr>
+        <w:fldChar w:fldCharType="begin"/>
+        <w:instrText xml:space="preserve">REF ref_019 \h</w:instrText>
+        <w:fldChar w:fldCharType="separate"/>
+        <w:t>19</w:t>
+        <w:fldChar w:fldCharType="end"/>
+      </w:r>
+      <w:r>
+        <w:rPr>
+          <w:rFonts w:ascii="Times New Roman" w:hAnsi="Times New Roman" w:eastAsia="Times New Roman" w:cs="Times New Roman"/>
+          <w:b w:val="0"/>
+          <w:sz w:val="21"/>
+        </w:rPr>
+        <w:t>]</w:t>
       </w:r>
       <w:r>
         <w:rPr>
@@ -3550,7 +4434,87 @@
           <w:b w:val="0"/>
           <w:sz w:val="21"/>
         </w:rPr>
-        <w:t>[9-13,23-24]</w:t>
+        <w:t>[</w:t>
+      </w:r>
+      <w:r>
+        <w:rPr>
+          <w:rFonts w:ascii="Times New Roman" w:hAnsi="Times New Roman" w:eastAsia="Times New Roman" w:cs="Times New Roman"/>
+          <w:b w:val="0"/>
+          <w:sz w:val="21"/>
+        </w:rPr>
+        <w:fldChar w:fldCharType="begin"/>
+        <w:instrText xml:space="preserve">REF ref_009 \h</w:instrText>
+        <w:fldChar w:fldCharType="separate"/>
+        <w:t>9</w:t>
+        <w:fldChar w:fldCharType="end"/>
+      </w:r>
+      <w:r>
+        <w:rPr>
+          <w:rFonts w:ascii="Times New Roman" w:hAnsi="Times New Roman" w:eastAsia="Times New Roman" w:cs="Times New Roman"/>
+          <w:b w:val="0"/>
+          <w:sz w:val="21"/>
+        </w:rPr>
+        <w:t>-</w:t>
+      </w:r>
+      <w:r>
+        <w:rPr>
+          <w:rFonts w:ascii="Times New Roman" w:hAnsi="Times New Roman" w:eastAsia="Times New Roman" w:cs="Times New Roman"/>
+          <w:b w:val="0"/>
+          <w:sz w:val="21"/>
+        </w:rPr>
+        <w:fldChar w:fldCharType="begin"/>
+        <w:instrText xml:space="preserve">REF ref_013 \h</w:instrText>
+        <w:fldChar w:fldCharType="separate"/>
+        <w:t>13</w:t>
+        <w:fldChar w:fldCharType="end"/>
+      </w:r>
+      <w:r>
+        <w:rPr>
+          <w:rFonts w:ascii="Times New Roman" w:hAnsi="Times New Roman" w:eastAsia="Times New Roman" w:cs="Times New Roman"/>
+          <w:b w:val="0"/>
+          <w:sz w:val="21"/>
+        </w:rPr>
+        <w:t>,</w:t>
+      </w:r>
+      <w:r>
+        <w:rPr>
+          <w:rFonts w:ascii="Times New Roman" w:hAnsi="Times New Roman" w:eastAsia="Times New Roman" w:cs="Times New Roman"/>
+          <w:b w:val="0"/>
+          <w:sz w:val="21"/>
+        </w:rPr>
+        <w:fldChar w:fldCharType="begin"/>
+        <w:instrText xml:space="preserve">REF ref_023 \h</w:instrText>
+        <w:fldChar w:fldCharType="separate"/>
+        <w:t>23</w:t>
+        <w:fldChar w:fldCharType="end"/>
+      </w:r>
+      <w:r>
+        <w:rPr>
+          <w:rFonts w:ascii="Times New Roman" w:hAnsi="Times New Roman" w:eastAsia="Times New Roman" w:cs="Times New Roman"/>
+          <w:b w:val="0"/>
+          <w:sz w:val="21"/>
+        </w:rPr>
+        <w:t>-</w:t>
+      </w:r>
+      <w:r>
+        <w:rPr>
+          <w:rFonts w:ascii="Times New Roman" w:hAnsi="Times New Roman" w:eastAsia="Times New Roman" w:cs="Times New Roman"/>
+          <w:b w:val="0"/>
+          <w:sz w:val="21"/>
+        </w:rPr>
+        <w:fldChar w:fldCharType="begin"/>
+        <w:instrText xml:space="preserve">REF ref_024 \h</w:instrText>
+        <w:fldChar w:fldCharType="separate"/>
+        <w:t>24</w:t>
+        <w:fldChar w:fldCharType="end"/>
+      </w:r>
+      <w:r>
+        <w:rPr>
+          <w:rFonts w:ascii="Times New Roman" w:hAnsi="Times New Roman" w:eastAsia="Times New Roman" w:cs="Times New Roman"/>
+          <w:b w:val="0"/>
+          <w:sz w:val="21"/>
+        </w:rPr>
+        <w:t>]</w:t>
       </w:r>
       <w:r>
         <w:rPr>
@@ -3594,7 +4558,27 @@
           <w:b w:val="0"/>
           <w:sz w:val="21"/>
         </w:rPr>
-        <w:t>[20]</w:t>
+        <w:t>[</w:t>
+      </w:r>
+      <w:r>
+        <w:rPr>
+          <w:rFonts w:ascii="Times New Roman" w:hAnsi="Times New Roman" w:eastAsia="Times New Roman" w:cs="Times New Roman"/>
+          <w:b w:val="0"/>
+          <w:sz w:val="21"/>
+        </w:rPr>
+        <w:fldChar w:fldCharType="begin"/>
+        <w:instrText xml:space="preserve">REF ref_020 \h</w:instrText>
+        <w:fldChar w:fldCharType="separate"/>
+        <w:t>20</w:t>
+        <w:fldChar w:fldCharType="end"/>
+      </w:r>
+      <w:r>
+        <w:rPr>
+          <w:rFonts w:ascii="Times New Roman" w:hAnsi="Times New Roman" w:eastAsia="Times New Roman" w:cs="Times New Roman"/>
+          <w:b w:val="0"/>
+          <w:sz w:val="21"/>
+        </w:rPr>
+        <w:t>]</w:t>
       </w:r>
       <w:r>
         <w:rPr>
@@ -3624,7 +4608,27 @@
           <w:b w:val="0"/>
           <w:sz w:val="21"/>
         </w:rPr>
-        <w:t>[21]</w:t>
+        <w:t>[</w:t>
+      </w:r>
+      <w:r>
+        <w:rPr>
+          <w:rFonts w:ascii="Times New Roman" w:hAnsi="Times New Roman" w:eastAsia="Times New Roman" w:cs="Times New Roman"/>
+          <w:b w:val="0"/>
+          <w:sz w:val="21"/>
+        </w:rPr>
+        <w:fldChar w:fldCharType="begin"/>
+        <w:instrText xml:space="preserve">REF ref_021 \h</w:instrText>
+        <w:fldChar w:fldCharType="separate"/>
+        <w:t>21</w:t>
+        <w:fldChar w:fldCharType="end"/>
+      </w:r>
+      <w:r>
+        <w:rPr>
+          <w:rFonts w:ascii="Times New Roman" w:hAnsi="Times New Roman" w:eastAsia="Times New Roman" w:cs="Times New Roman"/>
+          <w:b w:val="0"/>
+          <w:sz w:val="21"/>
+        </w:rPr>
+        <w:t>]</w:t>
       </w:r>
       <w:r>
         <w:rPr>
@@ -3654,7 +4658,27 @@
           <w:b w:val="0"/>
           <w:sz w:val="21"/>
         </w:rPr>
-        <w:t>[22]</w:t>
+        <w:t>[</w:t>
+      </w:r>
+      <w:r>
+        <w:rPr>
+          <w:rFonts w:ascii="Times New Roman" w:hAnsi="Times New Roman" w:eastAsia="Times New Roman" w:cs="Times New Roman"/>
+          <w:b w:val="0"/>
+          <w:sz w:val="21"/>
+        </w:rPr>
+        <w:fldChar w:fldCharType="begin"/>
+        <w:instrText xml:space="preserve">REF ref_022 \h</w:instrText>
+        <w:fldChar w:fldCharType="separate"/>
+        <w:t>22</w:t>
+        <w:fldChar w:fldCharType="end"/>
+      </w:r>
+      <w:r>
+        <w:rPr>
+          <w:rFonts w:ascii="Times New Roman" w:hAnsi="Times New Roman" w:eastAsia="Times New Roman" w:cs="Times New Roman"/>
+          <w:b w:val="0"/>
+          <w:sz w:val="21"/>
+        </w:rPr>
+        <w:t>]</w:t>
       </w:r>
       <w:r>
         <w:rPr>
@@ -4126,7 +5150,27 @@
           <w:b w:val="0"/>
           <w:sz w:val="21"/>
         </w:rPr>
-        <w:t>[14]</w:t>
+        <w:t>[</w:t>
+      </w:r>
+      <w:r>
+        <w:rPr>
+          <w:rFonts w:ascii="Times New Roman" w:hAnsi="Times New Roman" w:eastAsia="Times New Roman" w:cs="Times New Roman"/>
+          <w:b w:val="0"/>
+          <w:sz w:val="21"/>
+        </w:rPr>
+        <w:fldChar w:fldCharType="begin"/>
+        <w:instrText xml:space="preserve">REF ref_014 \h</w:instrText>
+        <w:fldChar w:fldCharType="separate"/>
+        <w:t>14</w:t>
+        <w:fldChar w:fldCharType="end"/>
+      </w:r>
+      <w:r>
+        <w:rPr>
+          <w:rFonts w:ascii="Times New Roman" w:hAnsi="Times New Roman" w:eastAsia="Times New Roman" w:cs="Times New Roman"/>
+          <w:b w:val="0"/>
+          <w:sz w:val="21"/>
+        </w:rPr>
+        <w:t>]</w:t>
       </w:r>
       <w:r>
         <w:rPr>
@@ -4253,7 +5297,27 @@
           <w:b w:val="0"/>
           <w:sz w:val="21"/>
         </w:rPr>
-        <w:t>[15]</w:t>
+        <w:t>[</w:t>
+      </w:r>
+      <w:r>
+        <w:rPr>
+          <w:rFonts w:ascii="Times New Roman" w:hAnsi="Times New Roman" w:eastAsia="Times New Roman" w:cs="Times New Roman"/>
+          <w:b w:val="0"/>
+          <w:sz w:val="21"/>
+        </w:rPr>
+        <w:fldChar w:fldCharType="begin"/>
+        <w:instrText xml:space="preserve">REF ref_015 \h</w:instrText>
+        <w:fldChar w:fldCharType="separate"/>
+        <w:t>15</w:t>
+        <w:fldChar w:fldCharType="end"/>
+      </w:r>
+      <w:r>
+        <w:rPr>
+          <w:rFonts w:ascii="Times New Roman" w:hAnsi="Times New Roman" w:eastAsia="Times New Roman" w:cs="Times New Roman"/>
+          <w:b w:val="0"/>
+          <w:sz w:val="21"/>
+        </w:rPr>
+        <w:t>]</w:t>
       </w:r>
       <w:r>
         <w:rPr>
@@ -4297,7 +5361,47 @@
           <w:b w:val="0"/>
           <w:sz w:val="21"/>
         </w:rPr>
-        <w:t>[4-8]</w:t>
+        <w:t>[</w:t>
+      </w:r>
+      <w:r>
+        <w:rPr>
+          <w:rFonts w:ascii="Times New Roman" w:hAnsi="Times New Roman" w:eastAsia="Times New Roman" w:cs="Times New Roman"/>
+          <w:b w:val="0"/>
+          <w:sz w:val="21"/>
+        </w:rPr>
+        <w:fldChar w:fldCharType="begin"/>
+        <w:instrText xml:space="preserve">REF ref_004 \h</w:instrText>
+        <w:fldChar w:fldCharType="separate"/>
+        <w:t>4</w:t>
+        <w:fldChar w:fldCharType="end"/>
+      </w:r>
+      <w:r>
+        <w:rPr>
+          <w:rFonts w:ascii="Times New Roman" w:hAnsi="Times New Roman" w:eastAsia="Times New Roman" w:cs="Times New Roman"/>
+          <w:b w:val="0"/>
+          <w:sz w:val="21"/>
+        </w:rPr>
+        <w:t>-</w:t>
+      </w:r>
+      <w:r>
+        <w:rPr>
+          <w:rFonts w:ascii="Times New Roman" w:hAnsi="Times New Roman" w:eastAsia="Times New Roman" w:cs="Times New Roman"/>
+          <w:b w:val="0"/>
+          <w:sz w:val="21"/>
+        </w:rPr>
+        <w:fldChar w:fldCharType="begin"/>
+        <w:instrText xml:space="preserve">REF ref_008 \h</w:instrText>
+        <w:fldChar w:fldCharType="separate"/>
+        <w:t>8</w:t>
+        <w:fldChar w:fldCharType="end"/>
+      </w:r>
+      <w:r>
+        <w:rPr>
+          <w:rFonts w:ascii="Times New Roman" w:hAnsi="Times New Roman" w:eastAsia="Times New Roman" w:cs="Times New Roman"/>
+          <w:b w:val="0"/>
+          <w:sz w:val="21"/>
+        </w:rPr>
+        <w:t>]</w:t>
       </w:r>
       <w:r>
         <w:rPr>
@@ -4327,7 +5431,47 @@
           <w:b w:val="0"/>
           <w:sz w:val="21"/>
         </w:rPr>
-        <w:t>[8,15]</w:t>
+        <w:t>[</w:t>
+      </w:r>
+      <w:r>
+        <w:rPr>
+          <w:rFonts w:ascii="Times New Roman" w:hAnsi="Times New Roman" w:eastAsia="Times New Roman" w:cs="Times New Roman"/>
+          <w:b w:val="0"/>
+          <w:sz w:val="21"/>
+        </w:rPr>
+        <w:fldChar w:fldCharType="begin"/>
+        <w:instrText xml:space="preserve">REF ref_008 \h</w:instrText>
+        <w:fldChar w:fldCharType="separate"/>
+        <w:t>8</w:t>
+        <w:fldChar w:fldCharType="end"/>
+      </w:r>
+      <w:r>
+        <w:rPr>
+          <w:rFonts w:ascii="Times New Roman" w:hAnsi="Times New Roman" w:eastAsia="Times New Roman" w:cs="Times New Roman"/>
+          <w:b w:val="0"/>
+          <w:sz w:val="21"/>
+        </w:rPr>
+        <w:t>,</w:t>
+      </w:r>
+      <w:r>
+        <w:rPr>
+          <w:rFonts w:ascii="Times New Roman" w:hAnsi="Times New Roman" w:eastAsia="Times New Roman" w:cs="Times New Roman"/>
+          <w:b w:val="0"/>
+          <w:sz w:val="21"/>
+        </w:rPr>
+        <w:fldChar w:fldCharType="begin"/>
+        <w:instrText xml:space="preserve">REF ref_015 \h</w:instrText>
+        <w:fldChar w:fldCharType="separate"/>
+        <w:t>15</w:t>
+        <w:fldChar w:fldCharType="end"/>
+      </w:r>
+      <w:r>
+        <w:rPr>
+          <w:rFonts w:ascii="Times New Roman" w:hAnsi="Times New Roman" w:eastAsia="Times New Roman" w:cs="Times New Roman"/>
+          <w:b w:val="0"/>
+          <w:sz w:val="21"/>
+        </w:rPr>
+        <w:t>]</w:t>
       </w:r>
       <w:r>
         <w:rPr>
@@ -4357,7 +5501,27 @@
           <w:b w:val="0"/>
           <w:sz w:val="21"/>
         </w:rPr>
-        <w:t>[14]</w:t>
+        <w:t>[</w:t>
+      </w:r>
+      <w:r>
+        <w:rPr>
+          <w:rFonts w:ascii="Times New Roman" w:hAnsi="Times New Roman" w:eastAsia="Times New Roman" w:cs="Times New Roman"/>
+          <w:b w:val="0"/>
+          <w:sz w:val="21"/>
+        </w:rPr>
+        <w:fldChar w:fldCharType="begin"/>
+        <w:instrText xml:space="preserve">REF ref_014 \h</w:instrText>
+        <w:fldChar w:fldCharType="separate"/>
+        <w:t>14</w:t>
+        <w:fldChar w:fldCharType="end"/>
+      </w:r>
+      <w:r>
+        <w:rPr>
+          <w:rFonts w:ascii="Times New Roman" w:hAnsi="Times New Roman" w:eastAsia="Times New Roman" w:cs="Times New Roman"/>
+          <w:b w:val="0"/>
+          <w:sz w:val="21"/>
+        </w:rPr>
+        <w:t>]</w:t>
       </w:r>
       <w:r>
         <w:rPr>
@@ -4387,7 +5551,27 @@
           <w:b w:val="0"/>
           <w:sz w:val="21"/>
         </w:rPr>
-        <w:t>[22]</w:t>
+        <w:t>[</w:t>
+      </w:r>
+      <w:r>
+        <w:rPr>
+          <w:rFonts w:ascii="Times New Roman" w:hAnsi="Times New Roman" w:eastAsia="Times New Roman" w:cs="Times New Roman"/>
+          <w:b w:val="0"/>
+          <w:sz w:val="21"/>
+        </w:rPr>
+        <w:fldChar w:fldCharType="begin"/>
+        <w:instrText xml:space="preserve">REF ref_022 \h</w:instrText>
+        <w:fldChar w:fldCharType="separate"/>
+        <w:t>22</w:t>
+        <w:fldChar w:fldCharType="end"/>
+      </w:r>
+      <w:r>
+        <w:rPr>
+          <w:rFonts w:ascii="Times New Roman" w:hAnsi="Times New Roman" w:eastAsia="Times New Roman" w:cs="Times New Roman"/>
+          <w:b w:val="0"/>
+          <w:sz w:val="21"/>
+        </w:rPr>
+        <w:t>]</w:t>
       </w:r>
       <w:r>
         <w:rPr>
@@ -4417,7 +5601,47 @@
           <w:b w:val="0"/>
           <w:sz w:val="21"/>
         </w:rPr>
-        <w:t>[20-22]</w:t>
+        <w:t>[</w:t>
+      </w:r>
+      <w:r>
+        <w:rPr>
+          <w:rFonts w:ascii="Times New Roman" w:hAnsi="Times New Roman" w:eastAsia="Times New Roman" w:cs="Times New Roman"/>
+          <w:b w:val="0"/>
+          <w:sz w:val="21"/>
+        </w:rPr>
+        <w:fldChar w:fldCharType="begin"/>
+        <w:instrText xml:space="preserve">REF ref_020 \h</w:instrText>
+        <w:fldChar w:fldCharType="separate"/>
+        <w:t>20</w:t>
+        <w:fldChar w:fldCharType="end"/>
+      </w:r>
+      <w:r>
+        <w:rPr>
+          <w:rFonts w:ascii="Times New Roman" w:hAnsi="Times New Roman" w:eastAsia="Times New Roman" w:cs="Times New Roman"/>
+          <w:b w:val="0"/>
+          <w:sz w:val="21"/>
+        </w:rPr>
+        <w:t>-</w:t>
+      </w:r>
+      <w:r>
+        <w:rPr>
+          <w:rFonts w:ascii="Times New Roman" w:hAnsi="Times New Roman" w:eastAsia="Times New Roman" w:cs="Times New Roman"/>
+          <w:b w:val="0"/>
+          <w:sz w:val="21"/>
+        </w:rPr>
+        <w:fldChar w:fldCharType="begin"/>
+        <w:instrText xml:space="preserve">REF ref_022 \h</w:instrText>
+        <w:fldChar w:fldCharType="separate"/>
+        <w:t>22</w:t>
+        <w:fldChar w:fldCharType="end"/>
+      </w:r>
+      <w:r>
+        <w:rPr>
+          <w:rFonts w:ascii="Times New Roman" w:hAnsi="Times New Roman" w:eastAsia="Times New Roman" w:cs="Times New Roman"/>
+          <w:b w:val="0"/>
+          <w:sz w:val="21"/>
+        </w:rPr>
+        <w:t>]</w:t>
       </w:r>
       <w:r>
         <w:rPr>
@@ -4447,7 +5671,47 @@
           <w:b w:val="0"/>
           <w:sz w:val="21"/>
         </w:rPr>
-        <w:t>[14-15]</w:t>
+        <w:t>[</w:t>
+      </w:r>
+      <w:r>
+        <w:rPr>
+          <w:rFonts w:ascii="Times New Roman" w:hAnsi="Times New Roman" w:eastAsia="Times New Roman" w:cs="Times New Roman"/>
+          <w:b w:val="0"/>
+          <w:sz w:val="21"/>
+        </w:rPr>
+        <w:fldChar w:fldCharType="begin"/>
+        <w:instrText xml:space="preserve">REF ref_014 \h</w:instrText>
+        <w:fldChar w:fldCharType="separate"/>
+        <w:t>14</w:t>
+        <w:fldChar w:fldCharType="end"/>
+      </w:r>
+      <w:r>
+        <w:rPr>
+          <w:rFonts w:ascii="Times New Roman" w:hAnsi="Times New Roman" w:eastAsia="Times New Roman" w:cs="Times New Roman"/>
+          <w:b w:val="0"/>
+          <w:sz w:val="21"/>
+        </w:rPr>
+        <w:t>-</w:t>
+      </w:r>
+      <w:r>
+        <w:rPr>
+          <w:rFonts w:ascii="Times New Roman" w:hAnsi="Times New Roman" w:eastAsia="Times New Roman" w:cs="Times New Roman"/>
+          <w:b w:val="0"/>
+          <w:sz w:val="21"/>
+        </w:rPr>
+        <w:fldChar w:fldCharType="begin"/>
+        <w:instrText xml:space="preserve">REF ref_015 \h</w:instrText>
+        <w:fldChar w:fldCharType="separate"/>
+        <w:t>15</w:t>
+        <w:fldChar w:fldCharType="end"/>
+      </w:r>
+      <w:r>
+        <w:rPr>
+          <w:rFonts w:ascii="Times New Roman" w:hAnsi="Times New Roman" w:eastAsia="Times New Roman" w:cs="Times New Roman"/>
+          <w:b w:val="0"/>
+          <w:sz w:val="21"/>
+        </w:rPr>
+        <w:t>]</w:t>
       </w:r>
       <w:r>
         <w:rPr>
@@ -11776,11 +13040,29 @@
       </w:pPr>
       <w:r>
         <w:rPr>
+          <w:rFonts w:ascii="Times New Roman" w:hAnsi="Times New Roman" w:eastAsia="Times New Roman" w:cs="Times New Roman"/>
+          <w:b w:val="0"/>
+          <w:sz w:val="21"/>
+        </w:rPr>
+        <w:t>[</w:t>
+      </w:r>
+      <w:bookmarkStart w:id="1001" w:name="ref_001"/>
+      <w:r>
+        <w:rPr>
+          <w:rFonts w:ascii="Times New Roman" w:hAnsi="Times New Roman" w:eastAsia="Times New Roman" w:cs="Times New Roman"/>
+          <w:b w:val="0"/>
+          <w:sz w:val="21"/>
+        </w:rPr>
+        <w:t>1</w:t>
+      </w:r>
+      <w:bookmarkEnd w:id="1001"/>
+      <w:r>
+        <w:rPr>
           <w:rFonts w:ascii="宋体" w:hAnsi="宋体" w:eastAsia="宋体" w:cs="宋体"/>
           <w:b w:val="0"/>
           <w:sz w:val="21"/>
         </w:rPr>
-        <w:t>[1] 国家卫生健康委员会规划与信息司. 全国医院信息化建设标准与规范（试行）[S/OL]. 2018[2026-05-07]. https://www.nhc.gov.cn/ewebeditor/uploadfile/2018/04/20180413162542120.pdf.</w:t>
+        <w:t>] 国家卫生健康委员会规划与信息司. 全国医院信息化建设标准与规范（试行）[S/OL]. 2018[2026-05-07]. https://www.nhc.gov.cn/ewebeditor/uploadfile/2018/04/20180413162542120.pdf.</w:t>
       </w:r>
     </w:p>
     <w:p>
@@ -11789,11 +13071,29 @@
       </w:pPr>
       <w:r>
         <w:rPr>
+          <w:rFonts w:ascii="Times New Roman" w:hAnsi="Times New Roman" w:eastAsia="Times New Roman" w:cs="Times New Roman"/>
+          <w:b w:val="0"/>
+          <w:sz w:val="21"/>
+        </w:rPr>
+        <w:t>[</w:t>
+      </w:r>
+      <w:bookmarkStart w:id="1002" w:name="ref_002"/>
+      <w:r>
+        <w:rPr>
+          <w:rFonts w:ascii="Times New Roman" w:hAnsi="Times New Roman" w:eastAsia="Times New Roman" w:cs="Times New Roman"/>
+          <w:b w:val="0"/>
+          <w:sz w:val="21"/>
+        </w:rPr>
+        <w:t>2</w:t>
+      </w:r>
+      <w:bookmarkEnd w:id="1002"/>
+      <w:r>
+        <w:rPr>
           <w:rFonts w:ascii="宋体" w:hAnsi="宋体" w:eastAsia="宋体" w:cs="宋体"/>
           <w:b w:val="0"/>
           <w:sz w:val="21"/>
         </w:rPr>
-        <w:t>[2] 国家卫生健康委办公厅. 关于印发电子病历系统应用水平分级评价管理办法（试行）及评价标准（试行）的通知: 国卫办医函〔2018〕1079号[Z/OL]. 2018[2026-05-07]. https://www.nhc.gov.cn/yzygj/c100068/201812/b01f63185ef74a41afa30adeb5c58ccf.shtml.</w:t>
+        <w:t>] 国家卫生健康委办公厅. 关于印发电子病历系统应用水平分级评价管理办法（试行）及评价标准（试行）的通知: 国卫办医函〔2018〕1079号[Z/OL]. 2018[2026-05-07]. https://www.nhc.gov.cn/yzygj/c100068/201812/b01f63185ef74a41afa30adeb5c58ccf.shtml.</w:t>
       </w:r>
     </w:p>
     <w:p>
@@ -11802,11 +13102,29 @@
       </w:pPr>
       <w:r>
         <w:rPr>
+          <w:rFonts w:ascii="Times New Roman" w:hAnsi="Times New Roman" w:eastAsia="Times New Roman" w:cs="Times New Roman"/>
+          <w:b w:val="0"/>
+          <w:sz w:val="21"/>
+        </w:rPr>
+        <w:t>[</w:t>
+      </w:r>
+      <w:bookmarkStart w:id="1003" w:name="ref_003"/>
+      <w:r>
+        <w:rPr>
+          <w:rFonts w:ascii="Times New Roman" w:hAnsi="Times New Roman" w:eastAsia="Times New Roman" w:cs="Times New Roman"/>
+          <w:b w:val="0"/>
+          <w:sz w:val="21"/>
+        </w:rPr>
+        <w:t>3</w:t>
+      </w:r>
+      <w:bookmarkEnd w:id="1003"/>
+      <w:r>
+        <w:rPr>
           <w:rFonts w:ascii="宋体" w:hAnsi="宋体" w:eastAsia="宋体" w:cs="宋体"/>
           <w:b w:val="0"/>
           <w:sz w:val="21"/>
         </w:rPr>
-        <w:t>[3] 国家市场监督管理总局, 国家标准化管理委员会. 信息安全技术 个人信息安全规范: GB/T 35273-2020[S]. 北京: 中国标准出版社, 2020.</w:t>
+        <w:t>] 国家市场监督管理总局, 国家标准化管理委员会. 信息安全技术 个人信息安全规范: GB/T 35273-2020[S]. 北京: 中国标准出版社, 2020.</w:t>
       </w:r>
     </w:p>
     <w:p>
@@ -11815,11 +13133,29 @@
       </w:pPr>
       <w:r>
         <w:rPr>
+          <w:rFonts w:ascii="Times New Roman" w:hAnsi="Times New Roman" w:eastAsia="Times New Roman" w:cs="Times New Roman"/>
+          <w:b w:val="0"/>
+          <w:sz w:val="21"/>
+        </w:rPr>
+        <w:t>[</w:t>
+      </w:r>
+      <w:bookmarkStart w:id="1004" w:name="ref_004"/>
+      <w:r>
+        <w:rPr>
+          <w:rFonts w:ascii="Times New Roman" w:hAnsi="Times New Roman" w:eastAsia="Times New Roman" w:cs="Times New Roman"/>
+          <w:b w:val="0"/>
+          <w:sz w:val="21"/>
+        </w:rPr>
+        <w:t>4</w:t>
+      </w:r>
+      <w:bookmarkEnd w:id="1004"/>
+      <w:r>
+        <w:rPr>
           <w:rFonts w:ascii="宋体" w:hAnsi="宋体" w:eastAsia="宋体" w:cs="宋体"/>
           <w:b w:val="0"/>
           <w:sz w:val="21"/>
         </w:rPr>
-        <w:t>[4] 吴宗友, 白昆龙, 杨林蕊, 等. 电子病历文本挖掘研究综述[J]. 计算机研究与发展, 2021,58(3):513-527.</w:t>
+        <w:t>] 吴宗友, 白昆龙, 杨林蕊, 等. 电子病历文本挖掘研究综述[J]. 计算机研究与发展, 2021,58(3):513-527.</w:t>
       </w:r>
     </w:p>
     <w:p>
@@ -11828,11 +13164,29 @@
       </w:pPr>
       <w:r>
         <w:rPr>
+          <w:rFonts w:ascii="Times New Roman" w:hAnsi="Times New Roman" w:eastAsia="Times New Roman" w:cs="Times New Roman"/>
+          <w:b w:val="0"/>
+          <w:sz w:val="21"/>
+        </w:rPr>
+        <w:t>[</w:t>
+      </w:r>
+      <w:bookmarkStart w:id="1005" w:name="ref_005"/>
+      <w:r>
+        <w:rPr>
+          <w:rFonts w:ascii="Times New Roman" w:hAnsi="Times New Roman" w:eastAsia="Times New Roman" w:cs="Times New Roman"/>
+          <w:b w:val="0"/>
+          <w:sz w:val="21"/>
+        </w:rPr>
+        <w:t>5</w:t>
+      </w:r>
+      <w:bookmarkEnd w:id="1005"/>
+      <w:r>
+        <w:rPr>
           <w:rFonts w:ascii="宋体" w:hAnsi="宋体" w:eastAsia="宋体" w:cs="宋体"/>
           <w:b w:val="0"/>
           <w:sz w:val="21"/>
         </w:rPr>
-        <w:t>[5] 杜晋华, 尹浩, 冯嵩. 中文电子病历命名实体识别的研究与进展[J]. 电子学报, 2022,50(12):3030-3053.</w:t>
+        <w:t>] 杜晋华, 尹浩, 冯嵩. 中文电子病历命名实体识别的研究与进展[J]. 电子学报, 2022,50(12):3030-3053.</w:t>
       </w:r>
     </w:p>
     <w:p>
@@ -11841,11 +13195,29 @@
       </w:pPr>
       <w:r>
         <w:rPr>
+          <w:rFonts w:ascii="Times New Roman" w:hAnsi="Times New Roman" w:eastAsia="Times New Roman" w:cs="Times New Roman"/>
+          <w:b w:val="0"/>
+          <w:sz w:val="21"/>
+        </w:rPr>
+        <w:t>[</w:t>
+      </w:r>
+      <w:bookmarkStart w:id="1006" w:name="ref_006"/>
+      <w:r>
+        <w:rPr>
+          <w:rFonts w:ascii="Times New Roman" w:hAnsi="Times New Roman" w:eastAsia="Times New Roman" w:cs="Times New Roman"/>
+          <w:b w:val="0"/>
+          <w:sz w:val="21"/>
+        </w:rPr>
+        <w:t>6</w:t>
+      </w:r>
+      <w:bookmarkEnd w:id="1006"/>
+      <w:r>
+        <w:rPr>
           <w:rFonts w:ascii="宋体" w:hAnsi="宋体" w:eastAsia="宋体" w:cs="宋体"/>
           <w:b w:val="0"/>
           <w:sz w:val="21"/>
         </w:rPr>
-        <w:t>[6] 韩普, 刘亦卓, 李晓艳. 基于深度学习和多特征融合的中文电子病历实体识别研究[J]. 南京大学学报(自然科学), 2019,55(6):942-951.</w:t>
+        <w:t>] 韩普, 刘亦卓, 李晓艳. 基于深度学习和多特征融合的中文电子病历实体识别研究[J]. 南京大学学报(自然科学), 2019,55(6):942-951.</w:t>
       </w:r>
     </w:p>
     <w:p>
@@ -11854,11 +13226,29 @@
       </w:pPr>
       <w:r>
         <w:rPr>
+          <w:rFonts w:ascii="Times New Roman" w:hAnsi="Times New Roman" w:eastAsia="Times New Roman" w:cs="Times New Roman"/>
+          <w:b w:val="0"/>
+          <w:sz w:val="21"/>
+        </w:rPr>
+        <w:t>[</w:t>
+      </w:r>
+      <w:bookmarkStart w:id="1007" w:name="ref_007"/>
+      <w:r>
+        <w:rPr>
+          <w:rFonts w:ascii="Times New Roman" w:hAnsi="Times New Roman" w:eastAsia="Times New Roman" w:cs="Times New Roman"/>
+          <w:b w:val="0"/>
+          <w:sz w:val="21"/>
+        </w:rPr>
+        <w:t>7</w:t>
+      </w:r>
+      <w:bookmarkEnd w:id="1007"/>
+      <w:r>
+        <w:rPr>
           <w:rFonts w:ascii="宋体" w:hAnsi="宋体" w:eastAsia="宋体" w:cs="宋体"/>
           <w:b w:val="0"/>
           <w:sz w:val="21"/>
         </w:rPr>
-        <w:t>[7] 崔少国, 陈俊桦, 李晓虹. 融合语义及边界信息的中文电子病历命名实体识别[J]. 电子科技大学学报, 2022,51(4):565-571.</w:t>
+        <w:t>] 崔少国, 陈俊桦, 李晓虹. 融合语义及边界信息的中文电子病历命名实体识别[J]. 电子科技大学学报, 2022,51(4):565-571.</w:t>
       </w:r>
     </w:p>
     <w:p>
@@ -11867,11 +13257,29 @@
       </w:pPr>
       <w:r>
         <w:rPr>
+          <w:rFonts w:ascii="Times New Roman" w:hAnsi="Times New Roman" w:eastAsia="Times New Roman" w:cs="Times New Roman"/>
+          <w:b w:val="0"/>
+          <w:sz w:val="21"/>
+        </w:rPr>
+        <w:t>[</w:t>
+      </w:r>
+      <w:bookmarkStart w:id="1008" w:name="ref_008"/>
+      <w:r>
+        <w:rPr>
+          <w:rFonts w:ascii="Times New Roman" w:hAnsi="Times New Roman" w:eastAsia="Times New Roman" w:cs="Times New Roman"/>
+          <w:b w:val="0"/>
+          <w:sz w:val="21"/>
+        </w:rPr>
+        <w:t>8</w:t>
+      </w:r>
+      <w:bookmarkEnd w:id="1008"/>
+      <w:r>
+        <w:rPr>
           <w:rFonts w:ascii="宋体" w:hAnsi="宋体" w:eastAsia="宋体" w:cs="宋体"/>
           <w:b w:val="0"/>
           <w:sz w:val="21"/>
         </w:rPr>
-        <w:t>[8] 盖彦蓉, 张云秋, 张慧, 等. 面向知识抽取的真实世界中文电子病历数据质量分析与治理对策研究[J]. 医学信息学杂志, 2025,46(12):47-53.</w:t>
+        <w:t>] 盖彦蓉, 张云秋, 张慧, 等. 面向知识抽取的真实世界中文电子病历数据质量分析与治理对策研究[J]. 医学信息学杂志, 2025,46(12):47-53.</w:t>
       </w:r>
     </w:p>
     <w:p>
@@ -11880,11 +13288,29 @@
       </w:pPr>
       <w:r>
         <w:rPr>
+          <w:rFonts w:ascii="Times New Roman" w:hAnsi="Times New Roman" w:eastAsia="Times New Roman" w:cs="Times New Roman"/>
+          <w:b w:val="0"/>
+          <w:sz w:val="21"/>
+        </w:rPr>
+        <w:t>[</w:t>
+      </w:r>
+      <w:bookmarkStart w:id="1009" w:name="ref_009"/>
+      <w:r>
+        <w:rPr>
+          <w:rFonts w:ascii="Times New Roman" w:hAnsi="Times New Roman" w:eastAsia="Times New Roman" w:cs="Times New Roman"/>
+          <w:b w:val="0"/>
+          <w:sz w:val="21"/>
+        </w:rPr>
+        <w:t>9</w:t>
+      </w:r>
+      <w:bookmarkEnd w:id="1009"/>
+      <w:r>
+        <w:rPr>
           <w:rFonts w:ascii="宋体" w:hAnsi="宋体" w:eastAsia="宋体" w:cs="宋体"/>
           <w:b w:val="0"/>
           <w:sz w:val="21"/>
         </w:rPr>
-        <w:t>[9] 肖仰华, 徐一丹. 大规模生成式语言模型在医疗领域的应用: 机遇与挑战[J]. 医学信息学杂志, 2023,44(9):1-11.</w:t>
+        <w:t>] 肖仰华, 徐一丹. 大规模生成式语言模型在医疗领域的应用: 机遇与挑战[J]. 医学信息学杂志, 2023,44(9):1-11.</w:t>
       </w:r>
     </w:p>
     <w:p>
@@ -11893,11 +13319,29 @@
       </w:pPr>
       <w:r>
         <w:rPr>
+          <w:rFonts w:ascii="Times New Roman" w:hAnsi="Times New Roman" w:eastAsia="Times New Roman" w:cs="Times New Roman"/>
+          <w:b w:val="0"/>
+          <w:sz w:val="21"/>
+        </w:rPr>
+        <w:t>[</w:t>
+      </w:r>
+      <w:bookmarkStart w:id="1010" w:name="ref_010"/>
+      <w:r>
+        <w:rPr>
+          <w:rFonts w:ascii="Times New Roman" w:hAnsi="Times New Roman" w:eastAsia="Times New Roman" w:cs="Times New Roman"/>
+          <w:b w:val="0"/>
+          <w:sz w:val="21"/>
+        </w:rPr>
+        <w:t>10</w:t>
+      </w:r>
+      <w:bookmarkEnd w:id="1010"/>
+      <w:r>
+        <w:rPr>
           <w:rFonts w:ascii="宋体" w:hAnsi="宋体" w:eastAsia="宋体" w:cs="宋体"/>
           <w:b w:val="0"/>
           <w:sz w:val="21"/>
         </w:rPr>
-        <w:t>[10] 康砚澜, 郭倩宇, 张文强, 等. 基于知识增强的医学语言模型: 现状、技术与应用[J]. 医学信息学杂志, 2023,44(9):12-22.</w:t>
+        <w:t>] 康砚澜, 郭倩宇, 张文强, 等. 基于知识增强的医学语言模型: 现状、技术与应用[J]. 医学信息学杂志, 2023,44(9):12-22.</w:t>
       </w:r>
     </w:p>
     <w:p>
@@ -11906,11 +13350,29 @@
       </w:pPr>
       <w:r>
         <w:rPr>
+          <w:rFonts w:ascii="Times New Roman" w:hAnsi="Times New Roman" w:eastAsia="Times New Roman" w:cs="Times New Roman"/>
+          <w:b w:val="0"/>
+          <w:sz w:val="21"/>
+        </w:rPr>
+        <w:t>[</w:t>
+      </w:r>
+      <w:bookmarkStart w:id="1011" w:name="ref_011"/>
+      <w:r>
+        <w:rPr>
+          <w:rFonts w:ascii="Times New Roman" w:hAnsi="Times New Roman" w:eastAsia="Times New Roman" w:cs="Times New Roman"/>
+          <w:b w:val="0"/>
+          <w:sz w:val="21"/>
+        </w:rPr>
+        <w:t>11</w:t>
+      </w:r>
+      <w:bookmarkEnd w:id="1011"/>
+      <w:r>
+        <w:rPr>
           <w:rFonts w:ascii="宋体" w:hAnsi="宋体" w:eastAsia="宋体" w:cs="宋体"/>
           <w:b w:val="0"/>
           <w:sz w:val="21"/>
         </w:rPr>
-        <w:t>[11] 颜见智, 何雨鑫, 骆子烨, 等. 生成式大语言模型在医疗领域的潜在典型应用与面临的挑战[J]. 医学信息学杂志, 2023,44(9):23-31.</w:t>
+        <w:t>] 颜见智, 何雨鑫, 骆子烨, 等. 生成式大语言模型在医疗领域的潜在典型应用与面临的挑战[J]. 医学信息学杂志, 2023,44(9):23-31.</w:t>
       </w:r>
     </w:p>
     <w:p>
@@ -11919,11 +13381,29 @@
       </w:pPr>
       <w:r>
         <w:rPr>
+          <w:rFonts w:ascii="Times New Roman" w:hAnsi="Times New Roman" w:eastAsia="Times New Roman" w:cs="Times New Roman"/>
+          <w:b w:val="0"/>
+          <w:sz w:val="21"/>
+        </w:rPr>
+        <w:t>[</w:t>
+      </w:r>
+      <w:bookmarkStart w:id="1012" w:name="ref_012"/>
+      <w:r>
+        <w:rPr>
+          <w:rFonts w:ascii="Times New Roman" w:hAnsi="Times New Roman" w:eastAsia="Times New Roman" w:cs="Times New Roman"/>
+          <w:b w:val="0"/>
+          <w:sz w:val="21"/>
+        </w:rPr>
+        <w:t>12</w:t>
+      </w:r>
+      <w:bookmarkEnd w:id="1012"/>
+      <w:r>
+        <w:rPr>
           <w:rFonts w:ascii="宋体" w:hAnsi="宋体" w:eastAsia="宋体" w:cs="宋体"/>
           <w:b w:val="0"/>
           <w:sz w:val="21"/>
         </w:rPr>
-        <w:t>[12] 陈晓红, 刘浏, 袁依格, 等. 医疗大模型技术及应用发展研究[J]. 中国工程科学, 2024,26(6):77-88.</w:t>
+        <w:t>] 陈晓红, 刘浏, 袁依格, 等. 医疗大模型技术及应用发展研究[J]. 中国工程科学, 2024,26(6):77-88.</w:t>
       </w:r>
     </w:p>
     <w:p>
@@ -11932,11 +13412,29 @@
       </w:pPr>
       <w:r>
         <w:rPr>
+          <w:rFonts w:ascii="Times New Roman" w:hAnsi="Times New Roman" w:eastAsia="Times New Roman" w:cs="Times New Roman"/>
+          <w:b w:val="0"/>
+          <w:sz w:val="21"/>
+        </w:rPr>
+        <w:t>[</w:t>
+      </w:r>
+      <w:bookmarkStart w:id="1013" w:name="ref_013"/>
+      <w:r>
+        <w:rPr>
+          <w:rFonts w:ascii="Times New Roman" w:hAnsi="Times New Roman" w:eastAsia="Times New Roman" w:cs="Times New Roman"/>
+          <w:b w:val="0"/>
+          <w:sz w:val="21"/>
+        </w:rPr>
+        <w:t>13</w:t>
+      </w:r>
+      <w:bookmarkEnd w:id="1013"/>
+      <w:r>
+        <w:rPr>
           <w:rFonts w:ascii="宋体" w:hAnsi="宋体" w:eastAsia="宋体" w:cs="宋体"/>
           <w:b w:val="0"/>
           <w:sz w:val="21"/>
         </w:rPr>
-        <w:t>[13] 何剑虎, 王德健, 赵志锐, 等. 大语言模型在医疗领域的前沿研究与创新应用[J]. 医学信息学杂志, 2024,45(9):10-18.</w:t>
+        <w:t>] 何剑虎, 王德健, 赵志锐, 等. 大语言模型在医疗领域的前沿研究与创新应用[J]. 医学信息学杂志, 2024,45(9):10-18.</w:t>
       </w:r>
     </w:p>
     <w:p>
@@ -11945,11 +13443,29 @@
       </w:pPr>
       <w:r>
         <w:rPr>
+          <w:rFonts w:ascii="Times New Roman" w:hAnsi="Times New Roman" w:eastAsia="Times New Roman" w:cs="Times New Roman"/>
+          <w:b w:val="0"/>
+          <w:sz w:val="21"/>
+        </w:rPr>
+        <w:t>[</w:t>
+      </w:r>
+      <w:bookmarkStart w:id="1014" w:name="ref_014"/>
+      <w:r>
+        <w:rPr>
+          <w:rFonts w:ascii="Times New Roman" w:hAnsi="Times New Roman" w:eastAsia="Times New Roman" w:cs="Times New Roman"/>
+          <w:b w:val="0"/>
+          <w:sz w:val="21"/>
+        </w:rPr>
+        <w:t>14</w:t>
+      </w:r>
+      <w:bookmarkEnd w:id="1014"/>
+      <w:r>
+        <w:rPr>
           <w:rFonts w:ascii="宋体" w:hAnsi="宋体" w:eastAsia="宋体" w:cs="宋体"/>
           <w:b w:val="0"/>
           <w:sz w:val="21"/>
         </w:rPr>
-        <w:t>[14] 张海藩, 牟永敏. 软件工程导论[M]. 6版. 北京: 清华大学出版社, 2013.</w:t>
+        <w:t>] 张海藩, 牟永敏. 软件工程导论[M]. 6版. 北京: 清华大学出版社, 2013.</w:t>
       </w:r>
     </w:p>
     <w:p>
@@ -11958,11 +13474,29 @@
       </w:pPr>
       <w:r>
         <w:rPr>
+          <w:rFonts w:ascii="Times New Roman" w:hAnsi="Times New Roman" w:eastAsia="Times New Roman" w:cs="Times New Roman"/>
+          <w:b w:val="0"/>
+          <w:sz w:val="21"/>
+        </w:rPr>
+        <w:t>[</w:t>
+      </w:r>
+      <w:bookmarkStart w:id="1015" w:name="ref_015"/>
+      <w:r>
+        <w:rPr>
+          <w:rFonts w:ascii="Times New Roman" w:hAnsi="Times New Roman" w:eastAsia="Times New Roman" w:cs="Times New Roman"/>
+          <w:b w:val="0"/>
+          <w:sz w:val="21"/>
+        </w:rPr>
+        <w:t>15</w:t>
+      </w:r>
+      <w:bookmarkEnd w:id="1015"/>
+      <w:r>
+        <w:rPr>
           <w:rFonts w:ascii="宋体" w:hAnsi="宋体" w:eastAsia="宋体" w:cs="宋体"/>
           <w:b w:val="0"/>
           <w:sz w:val="21"/>
         </w:rPr>
-        <w:t>[15] 王珊, 萨师煊. 数据库系统概论[M]. 5版. 北京: 高等教育出版社, 2014.</w:t>
+        <w:t>] 王珊, 萨师煊. 数据库系统概论[M]. 5版. 北京: 高等教育出版社, 2014.</w:t>
       </w:r>
     </w:p>
     <w:p>
@@ -11971,11 +13505,29 @@
       </w:pPr>
       <w:r>
         <w:rPr>
+          <w:rFonts w:ascii="Times New Roman" w:hAnsi="Times New Roman" w:eastAsia="Times New Roman" w:cs="Times New Roman"/>
+          <w:b w:val="0"/>
+          <w:sz w:val="21"/>
+        </w:rPr>
+        <w:t>[</w:t>
+      </w:r>
+      <w:bookmarkStart w:id="1016" w:name="ref_016"/>
+      <w:r>
+        <w:rPr>
+          <w:rFonts w:ascii="Times New Roman" w:hAnsi="Times New Roman" w:eastAsia="Times New Roman" w:cs="Times New Roman"/>
+          <w:b w:val="0"/>
+          <w:sz w:val="21"/>
+        </w:rPr>
+        <w:t>16</w:t>
+      </w:r>
+      <w:bookmarkEnd w:id="1016"/>
+      <w:r>
+        <w:rPr>
           <w:rFonts w:ascii="宋体" w:hAnsi="宋体" w:eastAsia="宋体" w:cs="宋体"/>
           <w:b w:val="0"/>
           <w:sz w:val="21"/>
         </w:rPr>
-        <w:t>[16] 宗成庆. 统计自然语言处理[M]. 2版. 北京: 清华大学出版社, 2013.</w:t>
+        <w:t>] 宗成庆. 统计自然语言处理[M]. 2版. 北京: 清华大学出版社, 2013.</w:t>
       </w:r>
     </w:p>
     <w:p>
@@ -11984,11 +13536,29 @@
       </w:pPr>
       <w:r>
         <w:rPr>
+          <w:rFonts w:ascii="Times New Roman" w:hAnsi="Times New Roman" w:eastAsia="Times New Roman" w:cs="Times New Roman"/>
+          <w:b w:val="0"/>
+          <w:sz w:val="21"/>
+        </w:rPr>
+        <w:t>[</w:t>
+      </w:r>
+      <w:bookmarkStart w:id="1017" w:name="ref_017"/>
+      <w:r>
+        <w:rPr>
+          <w:rFonts w:ascii="Times New Roman" w:hAnsi="Times New Roman" w:eastAsia="Times New Roman" w:cs="Times New Roman"/>
+          <w:b w:val="0"/>
+          <w:sz w:val="21"/>
+        </w:rPr>
+        <w:t>17</w:t>
+      </w:r>
+      <w:bookmarkEnd w:id="1017"/>
+      <w:r>
+        <w:rPr>
           <w:rFonts w:ascii="宋体" w:hAnsi="宋体" w:eastAsia="宋体" w:cs="宋体"/>
           <w:b w:val="0"/>
           <w:sz w:val="21"/>
         </w:rPr>
-        <w:t>[17] 周志华. 机器学习[M]. 北京: 清华大学出版社, 2016.</w:t>
+        <w:t>] 周志华. 机器学习[M]. 北京: 清华大学出版社, 2016.</w:t>
       </w:r>
     </w:p>
     <w:p>
@@ -11997,11 +13567,29 @@
       </w:pPr>
       <w:r>
         <w:rPr>
+          <w:rFonts w:ascii="Times New Roman" w:hAnsi="Times New Roman" w:eastAsia="Times New Roman" w:cs="Times New Roman"/>
+          <w:b w:val="0"/>
+          <w:sz w:val="21"/>
+        </w:rPr>
+        <w:t>[</w:t>
+      </w:r>
+      <w:bookmarkStart w:id="1018" w:name="ref_018"/>
+      <w:r>
+        <w:rPr>
+          <w:rFonts w:ascii="Times New Roman" w:hAnsi="Times New Roman" w:eastAsia="Times New Roman" w:cs="Times New Roman"/>
+          <w:b w:val="0"/>
+          <w:sz w:val="21"/>
+        </w:rPr>
+        <w:t>18</w:t>
+      </w:r>
+      <w:bookmarkEnd w:id="1018"/>
+      <w:r>
+        <w:rPr>
           <w:rFonts w:ascii="宋体" w:hAnsi="宋体" w:eastAsia="宋体" w:cs="宋体"/>
           <w:b w:val="0"/>
           <w:sz w:val="21"/>
         </w:rPr>
-        <w:t>[18] 邱锡鹏. 神经网络与深度学习[M]. 北京: 机械工业出版社, 2020.</w:t>
+        <w:t>] 邱锡鹏. 神经网络与深度学习[M]. 北京: 机械工业出版社, 2020.</w:t>
       </w:r>
     </w:p>
     <w:p>
@@ -12010,11 +13598,29 @@
       </w:pPr>
       <w:r>
         <w:rPr>
+          <w:rFonts w:ascii="Times New Roman" w:hAnsi="Times New Roman" w:eastAsia="Times New Roman" w:cs="Times New Roman"/>
+          <w:b w:val="0"/>
+          <w:sz w:val="21"/>
+        </w:rPr>
+        <w:t>[</w:t>
+      </w:r>
+      <w:bookmarkStart w:id="1019" w:name="ref_019"/>
+      <w:r>
+        <w:rPr>
+          <w:rFonts w:ascii="Times New Roman" w:hAnsi="Times New Roman" w:eastAsia="Times New Roman" w:cs="Times New Roman"/>
+          <w:b w:val="0"/>
+          <w:sz w:val="21"/>
+        </w:rPr>
+        <w:t>19</w:t>
+      </w:r>
+      <w:bookmarkEnd w:id="1019"/>
+      <w:r>
+        <w:rPr>
           <w:rFonts w:ascii="宋体" w:hAnsi="宋体" w:eastAsia="宋体" w:cs="宋体"/>
           <w:b w:val="0"/>
           <w:sz w:val="21"/>
         </w:rPr>
-        <w:t>[19] Lewis P, Perez E, Piktus A, et al. Retrieval-Augmented Generation for Knowledge-Intensive NLP Tasks[C]//Advances in Neural Information Processing Systems. 2020,33:9459-9474.</w:t>
+        <w:t>] Lewis P, Perez E, Piktus A, et al. Retrieval-Augmented Generation for Knowledge-Intensive NLP Tasks[C]//Advances in Neural Information Processing Systems. 2020,33:9459-9474.</w:t>
       </w:r>
     </w:p>
     <w:p>
@@ -12023,11 +13629,29 @@
       </w:pPr>
       <w:r>
         <w:rPr>
+          <w:rFonts w:ascii="Times New Roman" w:hAnsi="Times New Roman" w:eastAsia="Times New Roman" w:cs="Times New Roman"/>
+          <w:b w:val="0"/>
+          <w:sz w:val="21"/>
+        </w:rPr>
+        <w:t>[</w:t>
+      </w:r>
+      <w:bookmarkStart w:id="1020" w:name="ref_020"/>
+      <w:r>
+        <w:rPr>
+          <w:rFonts w:ascii="Times New Roman" w:hAnsi="Times New Roman" w:eastAsia="Times New Roman" w:cs="Times New Roman"/>
+          <w:b w:val="0"/>
+          <w:sz w:val="21"/>
+        </w:rPr>
+        <w:t>20</w:t>
+      </w:r>
+      <w:bookmarkEnd w:id="1020"/>
+      <w:r>
+        <w:rPr>
           <w:rFonts w:ascii="宋体" w:hAnsi="宋体" w:eastAsia="宋体" w:cs="宋体"/>
           <w:b w:val="0"/>
           <w:sz w:val="21"/>
         </w:rPr>
-        <w:t>[20] Yao S, Zhao J, Yu D, et al. ReAct: Synergizing Reasoning and Acting in Language Models[C]//International Conference on Learning Representations. 2023.</w:t>
+        <w:t>] Yao S, Zhao J, Yu D, et al. ReAct: Synergizing Reasoning and Acting in Language Models[C]//International Conference on Learning Representations. 2023.</w:t>
       </w:r>
     </w:p>
     <w:p>
@@ -12036,11 +13660,29 @@
       </w:pPr>
       <w:r>
         <w:rPr>
+          <w:rFonts w:ascii="Times New Roman" w:hAnsi="Times New Roman" w:eastAsia="Times New Roman" w:cs="Times New Roman"/>
+          <w:b w:val="0"/>
+          <w:sz w:val="21"/>
+        </w:rPr>
+        <w:t>[</w:t>
+      </w:r>
+      <w:bookmarkStart w:id="1021" w:name="ref_021"/>
+      <w:r>
+        <w:rPr>
+          <w:rFonts w:ascii="Times New Roman" w:hAnsi="Times New Roman" w:eastAsia="Times New Roman" w:cs="Times New Roman"/>
+          <w:b w:val="0"/>
+          <w:sz w:val="21"/>
+        </w:rPr>
+        <w:t>21</w:t>
+      </w:r>
+      <w:bookmarkEnd w:id="1021"/>
+      <w:r>
+        <w:rPr>
           <w:rFonts w:ascii="宋体" w:hAnsi="宋体" w:eastAsia="宋体" w:cs="宋体"/>
           <w:b w:val="0"/>
           <w:sz w:val="21"/>
         </w:rPr>
-        <w:t>[21] Wu Q, Bansal G, Zhang J, et al. AutoGen: Enabling Next-Gen LLM Applications via Multi-Agent Conversation[EB/OL]. arXiv:2308.08155, 2023[2026-05-07]. https://arxiv.org/abs/2308.08155.</w:t>
+        <w:t>] Wu Q, Bansal G, Zhang J, et al. AutoGen: Enabling Next-Gen LLM Applications via Multi-Agent Conversation[EB/OL]. arXiv:2308.08155, 2023[2026-05-07]. https://arxiv.org/abs/2308.08155.</w:t>
       </w:r>
     </w:p>
     <w:p>
@@ -12049,11 +13691,29 @@
       </w:pPr>
       <w:r>
         <w:rPr>
+          <w:rFonts w:ascii="Times New Roman" w:hAnsi="Times New Roman" w:eastAsia="Times New Roman" w:cs="Times New Roman"/>
+          <w:b w:val="0"/>
+          <w:sz w:val="21"/>
+        </w:rPr>
+        <w:t>[</w:t>
+      </w:r>
+      <w:bookmarkStart w:id="1022" w:name="ref_022"/>
+      <w:r>
+        <w:rPr>
+          <w:rFonts w:ascii="Times New Roman" w:hAnsi="Times New Roman" w:eastAsia="Times New Roman" w:cs="Times New Roman"/>
+          <w:b w:val="0"/>
+          <w:sz w:val="21"/>
+        </w:rPr>
+        <w:t>22</w:t>
+      </w:r>
+      <w:bookmarkEnd w:id="1022"/>
+      <w:r>
+        <w:rPr>
           <w:rFonts w:ascii="宋体" w:hAnsi="宋体" w:eastAsia="宋体" w:cs="宋体"/>
           <w:b w:val="0"/>
           <w:sz w:val="21"/>
         </w:rPr>
-        <w:t>[22] LangChain. LangGraph overview[EB/OL]. [2026-05-07]. https://docs.langchain.com/oss/python/langgraph/overview.</w:t>
+        <w:t>] LangChain. LangGraph overview[EB/OL]. [2026-05-07]. https://docs.langchain.com/oss/python/langgraph/overview.</w:t>
       </w:r>
     </w:p>
     <w:p>
@@ -12062,11 +13722,29 @@
       </w:pPr>
       <w:r>
         <w:rPr>
+          <w:rFonts w:ascii="Times New Roman" w:hAnsi="Times New Roman" w:eastAsia="Times New Roman" w:cs="Times New Roman"/>
+          <w:b w:val="0"/>
+          <w:sz w:val="21"/>
+        </w:rPr>
+        <w:t>[</w:t>
+      </w:r>
+      <w:bookmarkStart w:id="1023" w:name="ref_023"/>
+      <w:r>
+        <w:rPr>
+          <w:rFonts w:ascii="Times New Roman" w:hAnsi="Times New Roman" w:eastAsia="Times New Roman" w:cs="Times New Roman"/>
+          <w:b w:val="0"/>
+          <w:sz w:val="21"/>
+        </w:rPr>
+        <w:t>23</w:t>
+      </w:r>
+      <w:bookmarkEnd w:id="1023"/>
+      <w:r>
+        <w:rPr>
           <w:rFonts w:ascii="宋体" w:hAnsi="宋体" w:eastAsia="宋体" w:cs="宋体"/>
           <w:b w:val="0"/>
           <w:sz w:val="21"/>
         </w:rPr>
-        <w:t>[23] Thirunavukarasu A J, Ting D S J, Elangovan K, et al. Large language models in medicine[J]. Nature Medicine, 2023,29:1930-1940. DOI:10.1038/s41591-023-02448-8.</w:t>
+        <w:t>] Thirunavukarasu A J, Ting D S J, Elangovan K, et al. Large language models in medicine[J]. Nature Medicine, 2023,29:1930-1940. DOI:10.1038/s41591-023-02448-8.</w:t>
       </w:r>
     </w:p>
     <w:p>
@@ -12075,11 +13753,29 @@
       </w:pPr>
       <w:r>
         <w:rPr>
+          <w:rFonts w:ascii="Times New Roman" w:hAnsi="Times New Roman" w:eastAsia="Times New Roman" w:cs="Times New Roman"/>
+          <w:b w:val="0"/>
+          <w:sz w:val="21"/>
+        </w:rPr>
+        <w:t>[</w:t>
+      </w:r>
+      <w:bookmarkStart w:id="1024" w:name="ref_024"/>
+      <w:r>
+        <w:rPr>
+          <w:rFonts w:ascii="Times New Roman" w:hAnsi="Times New Roman" w:eastAsia="Times New Roman" w:cs="Times New Roman"/>
+          <w:b w:val="0"/>
+          <w:sz w:val="21"/>
+        </w:rPr>
+        <w:t>24</w:t>
+      </w:r>
+      <w:bookmarkEnd w:id="1024"/>
+      <w:r>
+        <w:rPr>
           <w:rFonts w:ascii="宋体" w:hAnsi="宋体" w:eastAsia="宋体" w:cs="宋体"/>
           <w:b w:val="0"/>
           <w:sz w:val="21"/>
         </w:rPr>
-        <w:t>[24] Wornow M, Xu Y, Thapa R, et al. The shaky foundations of large language models and foundation models for electronic health records[J]. npj Digital Medicine, 2023,6:135. DOI:10.1038/s41746-023-00879-8.</w:t>
+        <w:t>] Wornow M, Xu Y, Thapa R, et al. The shaky foundations of large language models and foundation models for electronic health records[J]. npj Digital Medicine, 2023,6:135. DOI:10.1038/s41746-023-00879-8.</w:t>
       </w:r>
     </w:p>
     <w:p>

</xml_diff>

<commit_message>
docs: format thesis citation cross references as superscript
</commit_message>
<xml_diff>
--- a/docs/thesis/drafts/论文正文_程浩然_基于LangGraph的多Agent协作框架在医疗审计场景的设计与实现.docx
+++ b/docs/thesis/drafts/论文正文_程浩然_基于LangGraph的多Agent协作框架在医疗审计场景的设计与实现.docx
@@ -2015,6 +2015,7 @@
           <w:rFonts w:ascii="Times New Roman" w:hAnsi="Times New Roman" w:eastAsia="Times New Roman" w:cs="Times New Roman"/>
           <w:b w:val="0"/>
           <w:sz w:val="21"/>
+          <w:vertAlign w:val="superscript"/>
         </w:rPr>
         <w:t>[</w:t>
       </w:r>
@@ -2023,6 +2024,7 @@
           <w:rFonts w:ascii="Times New Roman" w:hAnsi="Times New Roman" w:eastAsia="Times New Roman" w:cs="Times New Roman"/>
           <w:b w:val="0"/>
           <w:sz w:val="21"/>
+          <w:vertAlign w:val="superscript"/>
         </w:rPr>
         <w:fldChar w:fldCharType="begin"/>
         <w:instrText xml:space="preserve">REF ref_009 \h</w:instrText>
@@ -2035,6 +2037,7 @@
           <w:rFonts w:ascii="Times New Roman" w:hAnsi="Times New Roman" w:eastAsia="Times New Roman" w:cs="Times New Roman"/>
           <w:b w:val="0"/>
           <w:sz w:val="21"/>
+          <w:vertAlign w:val="superscript"/>
         </w:rPr>
         <w:t>-</w:t>
       </w:r>
@@ -2043,6 +2046,7 @@
           <w:rFonts w:ascii="Times New Roman" w:hAnsi="Times New Roman" w:eastAsia="Times New Roman" w:cs="Times New Roman"/>
           <w:b w:val="0"/>
           <w:sz w:val="21"/>
+          <w:vertAlign w:val="superscript"/>
         </w:rPr>
         <w:fldChar w:fldCharType="begin"/>
         <w:instrText xml:space="preserve">REF ref_013 \h</w:instrText>
@@ -2055,6 +2059,7 @@
           <w:rFonts w:ascii="Times New Roman" w:hAnsi="Times New Roman" w:eastAsia="Times New Roman" w:cs="Times New Roman"/>
           <w:b w:val="0"/>
           <w:sz w:val="21"/>
+          <w:vertAlign w:val="superscript"/>
         </w:rPr>
         <w:t>]</w:t>
       </w:r>
@@ -2085,6 +2090,7 @@
           <w:rFonts w:ascii="Times New Roman" w:hAnsi="Times New Roman" w:eastAsia="Times New Roman" w:cs="Times New Roman"/>
           <w:b w:val="0"/>
           <w:sz w:val="21"/>
+          <w:vertAlign w:val="superscript"/>
         </w:rPr>
         <w:t>[</w:t>
       </w:r>
@@ -2093,6 +2099,7 @@
           <w:rFonts w:ascii="Times New Roman" w:hAnsi="Times New Roman" w:eastAsia="Times New Roman" w:cs="Times New Roman"/>
           <w:b w:val="0"/>
           <w:sz w:val="21"/>
+          <w:vertAlign w:val="superscript"/>
         </w:rPr>
         <w:fldChar w:fldCharType="begin"/>
         <w:instrText xml:space="preserve">REF ref_001 \h</w:instrText>
@@ -2105,6 +2112,7 @@
           <w:rFonts w:ascii="Times New Roman" w:hAnsi="Times New Roman" w:eastAsia="Times New Roman" w:cs="Times New Roman"/>
           <w:b w:val="0"/>
           <w:sz w:val="21"/>
+          <w:vertAlign w:val="superscript"/>
         </w:rPr>
         <w:t>-</w:t>
       </w:r>
@@ -2113,6 +2121,7 @@
           <w:rFonts w:ascii="Times New Roman" w:hAnsi="Times New Roman" w:eastAsia="Times New Roman" w:cs="Times New Roman"/>
           <w:b w:val="0"/>
           <w:sz w:val="21"/>
+          <w:vertAlign w:val="superscript"/>
         </w:rPr>
         <w:fldChar w:fldCharType="begin"/>
         <w:instrText xml:space="preserve">REF ref_002 \h</w:instrText>
@@ -2125,6 +2134,7 @@
           <w:rFonts w:ascii="Times New Roman" w:hAnsi="Times New Roman" w:eastAsia="Times New Roman" w:cs="Times New Roman"/>
           <w:b w:val="0"/>
           <w:sz w:val="21"/>
+          <w:vertAlign w:val="superscript"/>
         </w:rPr>
         <w:t>]</w:t>
       </w:r>
@@ -2141,6 +2151,7 @@
           <w:rFonts w:ascii="Times New Roman" w:hAnsi="Times New Roman" w:eastAsia="Times New Roman" w:cs="Times New Roman"/>
           <w:b w:val="0"/>
           <w:sz w:val="21"/>
+          <w:vertAlign w:val="superscript"/>
         </w:rPr>
         <w:t>[</w:t>
       </w:r>
@@ -2149,6 +2160,7 @@
           <w:rFonts w:ascii="Times New Roman" w:hAnsi="Times New Roman" w:eastAsia="Times New Roman" w:cs="Times New Roman"/>
           <w:b w:val="0"/>
           <w:sz w:val="21"/>
+          <w:vertAlign w:val="superscript"/>
         </w:rPr>
         <w:fldChar w:fldCharType="begin"/>
         <w:instrText xml:space="preserve">REF ref_003 \h</w:instrText>
@@ -2161,6 +2173,7 @@
           <w:rFonts w:ascii="Times New Roman" w:hAnsi="Times New Roman" w:eastAsia="Times New Roman" w:cs="Times New Roman"/>
           <w:b w:val="0"/>
           <w:sz w:val="21"/>
+          <w:vertAlign w:val="superscript"/>
         </w:rPr>
         <w:t>]</w:t>
       </w:r>
@@ -2288,6 +2301,7 @@
           <w:rFonts w:ascii="Times New Roman" w:hAnsi="Times New Roman" w:eastAsia="Times New Roman" w:cs="Times New Roman"/>
           <w:b w:val="0"/>
           <w:sz w:val="21"/>
+          <w:vertAlign w:val="superscript"/>
         </w:rPr>
         <w:t>[</w:t>
       </w:r>
@@ -2296,6 +2310,7 @@
           <w:rFonts w:ascii="Times New Roman" w:hAnsi="Times New Roman" w:eastAsia="Times New Roman" w:cs="Times New Roman"/>
           <w:b w:val="0"/>
           <w:sz w:val="21"/>
+          <w:vertAlign w:val="superscript"/>
         </w:rPr>
         <w:fldChar w:fldCharType="begin"/>
         <w:instrText xml:space="preserve">REF ref_009 \h</w:instrText>
@@ -2308,6 +2323,7 @@
           <w:rFonts w:ascii="Times New Roman" w:hAnsi="Times New Roman" w:eastAsia="Times New Roman" w:cs="Times New Roman"/>
           <w:b w:val="0"/>
           <w:sz w:val="21"/>
+          <w:vertAlign w:val="superscript"/>
         </w:rPr>
         <w:t>-</w:t>
       </w:r>
@@ -2316,6 +2332,7 @@
           <w:rFonts w:ascii="Times New Roman" w:hAnsi="Times New Roman" w:eastAsia="Times New Roman" w:cs="Times New Roman"/>
           <w:b w:val="0"/>
           <w:sz w:val="21"/>
+          <w:vertAlign w:val="superscript"/>
         </w:rPr>
         <w:fldChar w:fldCharType="begin"/>
         <w:instrText xml:space="preserve">REF ref_013 \h</w:instrText>
@@ -2328,6 +2345,7 @@
           <w:rFonts w:ascii="Times New Roman" w:hAnsi="Times New Roman" w:eastAsia="Times New Roman" w:cs="Times New Roman"/>
           <w:b w:val="0"/>
           <w:sz w:val="21"/>
+          <w:vertAlign w:val="superscript"/>
         </w:rPr>
         <w:t>]</w:t>
       </w:r>
@@ -2344,6 +2362,7 @@
           <w:rFonts w:ascii="Times New Roman" w:hAnsi="Times New Roman" w:eastAsia="Times New Roman" w:cs="Times New Roman"/>
           <w:b w:val="0"/>
           <w:sz w:val="21"/>
+          <w:vertAlign w:val="superscript"/>
         </w:rPr>
         <w:t>[</w:t>
       </w:r>
@@ -2352,6 +2371,7 @@
           <w:rFonts w:ascii="Times New Roman" w:hAnsi="Times New Roman" w:eastAsia="Times New Roman" w:cs="Times New Roman"/>
           <w:b w:val="0"/>
           <w:sz w:val="21"/>
+          <w:vertAlign w:val="superscript"/>
         </w:rPr>
         <w:fldChar w:fldCharType="begin"/>
         <w:instrText xml:space="preserve">REF ref_004 \h</w:instrText>
@@ -2364,6 +2384,7 @@
           <w:rFonts w:ascii="Times New Roman" w:hAnsi="Times New Roman" w:eastAsia="Times New Roman" w:cs="Times New Roman"/>
           <w:b w:val="0"/>
           <w:sz w:val="21"/>
+          <w:vertAlign w:val="superscript"/>
         </w:rPr>
         <w:t>-</w:t>
       </w:r>
@@ -2372,6 +2393,7 @@
           <w:rFonts w:ascii="Times New Roman" w:hAnsi="Times New Roman" w:eastAsia="Times New Roman" w:cs="Times New Roman"/>
           <w:b w:val="0"/>
           <w:sz w:val="21"/>
+          <w:vertAlign w:val="superscript"/>
         </w:rPr>
         <w:fldChar w:fldCharType="begin"/>
         <w:instrText xml:space="preserve">REF ref_008 \h</w:instrText>
@@ -2384,6 +2406,7 @@
           <w:rFonts w:ascii="Times New Roman" w:hAnsi="Times New Roman" w:eastAsia="Times New Roman" w:cs="Times New Roman"/>
           <w:b w:val="0"/>
           <w:sz w:val="21"/>
+          <w:vertAlign w:val="superscript"/>
         </w:rPr>
         <w:t>]</w:t>
       </w:r>
@@ -2414,6 +2437,7 @@
           <w:rFonts w:ascii="Times New Roman" w:hAnsi="Times New Roman" w:eastAsia="Times New Roman" w:cs="Times New Roman"/>
           <w:b w:val="0"/>
           <w:sz w:val="21"/>
+          <w:vertAlign w:val="superscript"/>
         </w:rPr>
         <w:t>[</w:t>
       </w:r>
@@ -2422,6 +2446,7 @@
           <w:rFonts w:ascii="Times New Roman" w:hAnsi="Times New Roman" w:eastAsia="Times New Roman" w:cs="Times New Roman"/>
           <w:b w:val="0"/>
           <w:sz w:val="21"/>
+          <w:vertAlign w:val="superscript"/>
         </w:rPr>
         <w:fldChar w:fldCharType="begin"/>
         <w:instrText xml:space="preserve">REF ref_019 \h</w:instrText>
@@ -2434,6 +2459,7 @@
           <w:rFonts w:ascii="Times New Roman" w:hAnsi="Times New Roman" w:eastAsia="Times New Roman" w:cs="Times New Roman"/>
           <w:b w:val="0"/>
           <w:sz w:val="21"/>
+          <w:vertAlign w:val="superscript"/>
         </w:rPr>
         <w:t>]</w:t>
       </w:r>
@@ -2450,6 +2476,7 @@
           <w:rFonts w:ascii="Times New Roman" w:hAnsi="Times New Roman" w:eastAsia="Times New Roman" w:cs="Times New Roman"/>
           <w:b w:val="0"/>
           <w:sz w:val="21"/>
+          <w:vertAlign w:val="superscript"/>
         </w:rPr>
         <w:t>[</w:t>
       </w:r>
@@ -2458,6 +2485,7 @@
           <w:rFonts w:ascii="Times New Roman" w:hAnsi="Times New Roman" w:eastAsia="Times New Roman" w:cs="Times New Roman"/>
           <w:b w:val="0"/>
           <w:sz w:val="21"/>
+          <w:vertAlign w:val="superscript"/>
         </w:rPr>
         <w:fldChar w:fldCharType="begin"/>
         <w:instrText xml:space="preserve">REF ref_020 \h</w:instrText>
@@ -2470,6 +2498,7 @@
           <w:rFonts w:ascii="Times New Roman" w:hAnsi="Times New Roman" w:eastAsia="Times New Roman" w:cs="Times New Roman"/>
           <w:b w:val="0"/>
           <w:sz w:val="21"/>
+          <w:vertAlign w:val="superscript"/>
         </w:rPr>
         <w:t>]</w:t>
       </w:r>
@@ -2486,6 +2515,7 @@
           <w:rFonts w:ascii="Times New Roman" w:hAnsi="Times New Roman" w:eastAsia="Times New Roman" w:cs="Times New Roman"/>
           <w:b w:val="0"/>
           <w:sz w:val="21"/>
+          <w:vertAlign w:val="superscript"/>
         </w:rPr>
         <w:t>[</w:t>
       </w:r>
@@ -2494,6 +2524,7 @@
           <w:rFonts w:ascii="Times New Roman" w:hAnsi="Times New Roman" w:eastAsia="Times New Roman" w:cs="Times New Roman"/>
           <w:b w:val="0"/>
           <w:sz w:val="21"/>
+          <w:vertAlign w:val="superscript"/>
         </w:rPr>
         <w:fldChar w:fldCharType="begin"/>
         <w:instrText xml:space="preserve">REF ref_021 \h</w:instrText>
@@ -2506,6 +2537,7 @@
           <w:rFonts w:ascii="Times New Roman" w:hAnsi="Times New Roman" w:eastAsia="Times New Roman" w:cs="Times New Roman"/>
           <w:b w:val="0"/>
           <w:sz w:val="21"/>
+          <w:vertAlign w:val="superscript"/>
         </w:rPr>
         <w:t>]</w:t>
       </w:r>
@@ -2536,6 +2568,7 @@
           <w:rFonts w:ascii="Times New Roman" w:hAnsi="Times New Roman" w:eastAsia="Times New Roman" w:cs="Times New Roman"/>
           <w:b w:val="0"/>
           <w:sz w:val="21"/>
+          <w:vertAlign w:val="superscript"/>
         </w:rPr>
         <w:t>[</w:t>
       </w:r>
@@ -2544,6 +2577,7 @@
           <w:rFonts w:ascii="Times New Roman" w:hAnsi="Times New Roman" w:eastAsia="Times New Roman" w:cs="Times New Roman"/>
           <w:b w:val="0"/>
           <w:sz w:val="21"/>
+          <w:vertAlign w:val="superscript"/>
         </w:rPr>
         <w:fldChar w:fldCharType="begin"/>
         <w:instrText xml:space="preserve">REF ref_014 \h</w:instrText>
@@ -2556,6 +2590,7 @@
           <w:rFonts w:ascii="Times New Roman" w:hAnsi="Times New Roman" w:eastAsia="Times New Roman" w:cs="Times New Roman"/>
           <w:b w:val="0"/>
           <w:sz w:val="21"/>
+          <w:vertAlign w:val="superscript"/>
         </w:rPr>
         <w:t>-</w:t>
       </w:r>
@@ -2564,6 +2599,7 @@
           <w:rFonts w:ascii="Times New Roman" w:hAnsi="Times New Roman" w:eastAsia="Times New Roman" w:cs="Times New Roman"/>
           <w:b w:val="0"/>
           <w:sz w:val="21"/>
+          <w:vertAlign w:val="superscript"/>
         </w:rPr>
         <w:fldChar w:fldCharType="begin"/>
         <w:instrText xml:space="preserve">REF ref_015 \h</w:instrText>
@@ -2576,6 +2612,7 @@
           <w:rFonts w:ascii="Times New Roman" w:hAnsi="Times New Roman" w:eastAsia="Times New Roman" w:cs="Times New Roman"/>
           <w:b w:val="0"/>
           <w:sz w:val="21"/>
+          <w:vertAlign w:val="superscript"/>
         </w:rPr>
         <w:t>]</w:t>
       </w:r>
@@ -2592,6 +2629,7 @@
           <w:rFonts w:ascii="Times New Roman" w:hAnsi="Times New Roman" w:eastAsia="Times New Roman" w:cs="Times New Roman"/>
           <w:b w:val="0"/>
           <w:sz w:val="21"/>
+          <w:vertAlign w:val="superscript"/>
         </w:rPr>
         <w:t>[</w:t>
       </w:r>
@@ -2600,6 +2638,7 @@
           <w:rFonts w:ascii="Times New Roman" w:hAnsi="Times New Roman" w:eastAsia="Times New Roman" w:cs="Times New Roman"/>
           <w:b w:val="0"/>
           <w:sz w:val="21"/>
+          <w:vertAlign w:val="superscript"/>
         </w:rPr>
         <w:fldChar w:fldCharType="begin"/>
         <w:instrText xml:space="preserve">REF ref_016 \h</w:instrText>
@@ -2612,6 +2651,7 @@
           <w:rFonts w:ascii="Times New Roman" w:hAnsi="Times New Roman" w:eastAsia="Times New Roman" w:cs="Times New Roman"/>
           <w:b w:val="0"/>
           <w:sz w:val="21"/>
+          <w:vertAlign w:val="superscript"/>
         </w:rPr>
         <w:t>-</w:t>
       </w:r>
@@ -2620,6 +2660,7 @@
           <w:rFonts w:ascii="Times New Roman" w:hAnsi="Times New Roman" w:eastAsia="Times New Roman" w:cs="Times New Roman"/>
           <w:b w:val="0"/>
           <w:sz w:val="21"/>
+          <w:vertAlign w:val="superscript"/>
         </w:rPr>
         <w:fldChar w:fldCharType="begin"/>
         <w:instrText xml:space="preserve">REF ref_018 \h</w:instrText>
@@ -2632,6 +2673,7 @@
           <w:rFonts w:ascii="Times New Roman" w:hAnsi="Times New Roman" w:eastAsia="Times New Roman" w:cs="Times New Roman"/>
           <w:b w:val="0"/>
           <w:sz w:val="21"/>
+          <w:vertAlign w:val="superscript"/>
         </w:rPr>
         <w:t>]</w:t>
       </w:r>
@@ -2950,7 +2992,8 @@
               <w:rPr>
                 <w:rFonts w:ascii="Times New Roman" w:hAnsi="Times New Roman" w:eastAsia="Times New Roman" w:cs="Times New Roman"/>
                 <w:b w:val="0"/>
-                <w:sz w:val="19"/>
+                <w:sz w:val="21"/>
+                <w:vertAlign w:val="superscript"/>
               </w:rPr>
               <w:t>[</w:t>
             </w:r>
@@ -2958,7 +3001,8 @@
               <w:rPr>
                 <w:rFonts w:ascii="Times New Roman" w:hAnsi="Times New Roman" w:eastAsia="Times New Roman" w:cs="Times New Roman"/>
                 <w:b w:val="0"/>
-                <w:sz w:val="19"/>
+                <w:sz w:val="21"/>
+                <w:vertAlign w:val="superscript"/>
               </w:rPr>
               <w:fldChar w:fldCharType="begin"/>
               <w:instrText xml:space="preserve">REF ref_004 \h</w:instrText>
@@ -2970,7 +3014,8 @@
               <w:rPr>
                 <w:rFonts w:ascii="Times New Roman" w:hAnsi="Times New Roman" w:eastAsia="Times New Roman" w:cs="Times New Roman"/>
                 <w:b w:val="0"/>
-                <w:sz w:val="19"/>
+                <w:sz w:val="21"/>
+                <w:vertAlign w:val="superscript"/>
               </w:rPr>
               <w:t>]</w:t>
             </w:r>
@@ -3040,7 +3085,8 @@
               <w:rPr>
                 <w:rFonts w:ascii="Times New Roman" w:hAnsi="Times New Roman" w:eastAsia="Times New Roman" w:cs="Times New Roman"/>
                 <w:b w:val="0"/>
-                <w:sz w:val="19"/>
+                <w:sz w:val="21"/>
+                <w:vertAlign w:val="superscript"/>
               </w:rPr>
               <w:t>[</w:t>
             </w:r>
@@ -3048,7 +3094,8 @@
               <w:rPr>
                 <w:rFonts w:ascii="Times New Roman" w:hAnsi="Times New Roman" w:eastAsia="Times New Roman" w:cs="Times New Roman"/>
                 <w:b w:val="0"/>
-                <w:sz w:val="19"/>
+                <w:sz w:val="21"/>
+                <w:vertAlign w:val="superscript"/>
               </w:rPr>
               <w:fldChar w:fldCharType="begin"/>
               <w:instrText xml:space="preserve">REF ref_006 \h</w:instrText>
@@ -3060,7 +3107,8 @@
               <w:rPr>
                 <w:rFonts w:ascii="Times New Roman" w:hAnsi="Times New Roman" w:eastAsia="Times New Roman" w:cs="Times New Roman"/>
                 <w:b w:val="0"/>
-                <w:sz w:val="19"/>
+                <w:sz w:val="21"/>
+                <w:vertAlign w:val="superscript"/>
               </w:rPr>
               <w:t>]</w:t>
             </w:r>
@@ -3130,7 +3178,8 @@
               <w:rPr>
                 <w:rFonts w:ascii="Times New Roman" w:hAnsi="Times New Roman" w:eastAsia="Times New Roman" w:cs="Times New Roman"/>
                 <w:b w:val="0"/>
-                <w:sz w:val="19"/>
+                <w:sz w:val="21"/>
+                <w:vertAlign w:val="superscript"/>
               </w:rPr>
               <w:t>[</w:t>
             </w:r>
@@ -3138,7 +3187,8 @@
               <w:rPr>
                 <w:rFonts w:ascii="Times New Roman" w:hAnsi="Times New Roman" w:eastAsia="Times New Roman" w:cs="Times New Roman"/>
                 <w:b w:val="0"/>
-                <w:sz w:val="19"/>
+                <w:sz w:val="21"/>
+                <w:vertAlign w:val="superscript"/>
               </w:rPr>
               <w:fldChar w:fldCharType="begin"/>
               <w:instrText xml:space="preserve">REF ref_007 \h</w:instrText>
@@ -3150,7 +3200,8 @@
               <w:rPr>
                 <w:rFonts w:ascii="Times New Roman" w:hAnsi="Times New Roman" w:eastAsia="Times New Roman" w:cs="Times New Roman"/>
                 <w:b w:val="0"/>
-                <w:sz w:val="19"/>
+                <w:sz w:val="21"/>
+                <w:vertAlign w:val="superscript"/>
               </w:rPr>
               <w:t>]</w:t>
             </w:r>
@@ -3220,7 +3271,8 @@
               <w:rPr>
                 <w:rFonts w:ascii="Times New Roman" w:hAnsi="Times New Roman" w:eastAsia="Times New Roman" w:cs="Times New Roman"/>
                 <w:b w:val="0"/>
-                <w:sz w:val="19"/>
+                <w:sz w:val="21"/>
+                <w:vertAlign w:val="superscript"/>
               </w:rPr>
               <w:t>[</w:t>
             </w:r>
@@ -3228,7 +3280,8 @@
               <w:rPr>
                 <w:rFonts w:ascii="Times New Roman" w:hAnsi="Times New Roman" w:eastAsia="Times New Roman" w:cs="Times New Roman"/>
                 <w:b w:val="0"/>
-                <w:sz w:val="19"/>
+                <w:sz w:val="21"/>
+                <w:vertAlign w:val="superscript"/>
               </w:rPr>
               <w:fldChar w:fldCharType="begin"/>
               <w:instrText xml:space="preserve">REF ref_008 \h</w:instrText>
@@ -3240,7 +3293,8 @@
               <w:rPr>
                 <w:rFonts w:ascii="Times New Roman" w:hAnsi="Times New Roman" w:eastAsia="Times New Roman" w:cs="Times New Roman"/>
                 <w:b w:val="0"/>
-                <w:sz w:val="19"/>
+                <w:sz w:val="21"/>
+                <w:vertAlign w:val="superscript"/>
               </w:rPr>
               <w:t>]</w:t>
             </w:r>
@@ -3310,7 +3364,8 @@
               <w:rPr>
                 <w:rFonts w:ascii="Times New Roman" w:hAnsi="Times New Roman" w:eastAsia="Times New Roman" w:cs="Times New Roman"/>
                 <w:b w:val="0"/>
-                <w:sz w:val="19"/>
+                <w:sz w:val="21"/>
+                <w:vertAlign w:val="superscript"/>
               </w:rPr>
               <w:t>[</w:t>
             </w:r>
@@ -3318,7 +3373,8 @@
               <w:rPr>
                 <w:rFonts w:ascii="Times New Roman" w:hAnsi="Times New Roman" w:eastAsia="Times New Roman" w:cs="Times New Roman"/>
                 <w:b w:val="0"/>
-                <w:sz w:val="19"/>
+                <w:sz w:val="21"/>
+                <w:vertAlign w:val="superscript"/>
               </w:rPr>
               <w:fldChar w:fldCharType="begin"/>
               <w:instrText xml:space="preserve">REF ref_019 \h</w:instrText>
@@ -3330,7 +3386,8 @@
               <w:rPr>
                 <w:rFonts w:ascii="Times New Roman" w:hAnsi="Times New Roman" w:eastAsia="Times New Roman" w:cs="Times New Roman"/>
                 <w:b w:val="0"/>
-                <w:sz w:val="19"/>
+                <w:sz w:val="21"/>
+                <w:vertAlign w:val="superscript"/>
               </w:rPr>
               <w:t>]</w:t>
             </w:r>
@@ -3400,7 +3457,8 @@
               <w:rPr>
                 <w:rFonts w:ascii="Times New Roman" w:hAnsi="Times New Roman" w:eastAsia="Times New Roman" w:cs="Times New Roman"/>
                 <w:b w:val="0"/>
-                <w:sz w:val="19"/>
+                <w:sz w:val="21"/>
+                <w:vertAlign w:val="superscript"/>
               </w:rPr>
               <w:t>[</w:t>
             </w:r>
@@ -3408,7 +3466,8 @@
               <w:rPr>
                 <w:rFonts w:ascii="Times New Roman" w:hAnsi="Times New Roman" w:eastAsia="Times New Roman" w:cs="Times New Roman"/>
                 <w:b w:val="0"/>
-                <w:sz w:val="19"/>
+                <w:sz w:val="21"/>
+                <w:vertAlign w:val="superscript"/>
               </w:rPr>
               <w:fldChar w:fldCharType="begin"/>
               <w:instrText xml:space="preserve">REF ref_020 \h</w:instrText>
@@ -3420,7 +3479,8 @@
               <w:rPr>
                 <w:rFonts w:ascii="Times New Roman" w:hAnsi="Times New Roman" w:eastAsia="Times New Roman" w:cs="Times New Roman"/>
                 <w:b w:val="0"/>
-                <w:sz w:val="19"/>
+                <w:sz w:val="21"/>
+                <w:vertAlign w:val="superscript"/>
               </w:rPr>
               <w:t>]</w:t>
             </w:r>
@@ -3490,7 +3550,8 @@
               <w:rPr>
                 <w:rFonts w:ascii="Times New Roman" w:hAnsi="Times New Roman" w:eastAsia="Times New Roman" w:cs="Times New Roman"/>
                 <w:b w:val="0"/>
-                <w:sz w:val="19"/>
+                <w:sz w:val="21"/>
+                <w:vertAlign w:val="superscript"/>
               </w:rPr>
               <w:t>[</w:t>
             </w:r>
@@ -3498,7 +3559,8 @@
               <w:rPr>
                 <w:rFonts w:ascii="Times New Roman" w:hAnsi="Times New Roman" w:eastAsia="Times New Roman" w:cs="Times New Roman"/>
                 <w:b w:val="0"/>
-                <w:sz w:val="19"/>
+                <w:sz w:val="21"/>
+                <w:vertAlign w:val="superscript"/>
               </w:rPr>
               <w:fldChar w:fldCharType="begin"/>
               <w:instrText xml:space="preserve">REF ref_021 \h</w:instrText>
@@ -3510,7 +3572,8 @@
               <w:rPr>
                 <w:rFonts w:ascii="Times New Roman" w:hAnsi="Times New Roman" w:eastAsia="Times New Roman" w:cs="Times New Roman"/>
                 <w:b w:val="0"/>
-                <w:sz w:val="19"/>
+                <w:sz w:val="21"/>
+                <w:vertAlign w:val="superscript"/>
               </w:rPr>
               <w:t>]</w:t>
             </w:r>
@@ -3580,7 +3643,8 @@
               <w:rPr>
                 <w:rFonts w:ascii="Times New Roman" w:hAnsi="Times New Roman" w:eastAsia="Times New Roman" w:cs="Times New Roman"/>
                 <w:b w:val="0"/>
-                <w:sz w:val="19"/>
+                <w:sz w:val="21"/>
+                <w:vertAlign w:val="superscript"/>
               </w:rPr>
               <w:t>[</w:t>
             </w:r>
@@ -3588,7 +3652,8 @@
               <w:rPr>
                 <w:rFonts w:ascii="Times New Roman" w:hAnsi="Times New Roman" w:eastAsia="Times New Roman" w:cs="Times New Roman"/>
                 <w:b w:val="0"/>
-                <w:sz w:val="19"/>
+                <w:sz w:val="21"/>
+                <w:vertAlign w:val="superscript"/>
               </w:rPr>
               <w:fldChar w:fldCharType="begin"/>
               <w:instrText xml:space="preserve">REF ref_022 \h</w:instrText>
@@ -3600,7 +3665,8 @@
               <w:rPr>
                 <w:rFonts w:ascii="Times New Roman" w:hAnsi="Times New Roman" w:eastAsia="Times New Roman" w:cs="Times New Roman"/>
                 <w:b w:val="0"/>
-                <w:sz w:val="19"/>
+                <w:sz w:val="21"/>
+                <w:vertAlign w:val="superscript"/>
               </w:rPr>
               <w:t>]</w:t>
             </w:r>
@@ -3681,6 +3747,7 @@
           <w:rFonts w:ascii="Times New Roman" w:hAnsi="Times New Roman" w:eastAsia="Times New Roman" w:cs="Times New Roman"/>
           <w:b w:val="0"/>
           <w:sz w:val="21"/>
+          <w:vertAlign w:val="superscript"/>
         </w:rPr>
         <w:t>[</w:t>
       </w:r>
@@ -3689,6 +3756,7 @@
           <w:rFonts w:ascii="Times New Roman" w:hAnsi="Times New Roman" w:eastAsia="Times New Roman" w:cs="Times New Roman"/>
           <w:b w:val="0"/>
           <w:sz w:val="21"/>
+          <w:vertAlign w:val="superscript"/>
         </w:rPr>
         <w:fldChar w:fldCharType="begin"/>
         <w:instrText xml:space="preserve">REF ref_001 \h</w:instrText>
@@ -3701,6 +3769,7 @@
           <w:rFonts w:ascii="Times New Roman" w:hAnsi="Times New Roman" w:eastAsia="Times New Roman" w:cs="Times New Roman"/>
           <w:b w:val="0"/>
           <w:sz w:val="21"/>
+          <w:vertAlign w:val="superscript"/>
         </w:rPr>
         <w:t>]</w:t>
       </w:r>
@@ -3717,6 +3786,7 @@
           <w:rFonts w:ascii="Times New Roman" w:hAnsi="Times New Roman" w:eastAsia="Times New Roman" w:cs="Times New Roman"/>
           <w:b w:val="0"/>
           <w:sz w:val="21"/>
+          <w:vertAlign w:val="superscript"/>
         </w:rPr>
         <w:t>[</w:t>
       </w:r>
@@ -3725,6 +3795,7 @@
           <w:rFonts w:ascii="Times New Roman" w:hAnsi="Times New Roman" w:eastAsia="Times New Roman" w:cs="Times New Roman"/>
           <w:b w:val="0"/>
           <w:sz w:val="21"/>
+          <w:vertAlign w:val="superscript"/>
         </w:rPr>
         <w:fldChar w:fldCharType="begin"/>
         <w:instrText xml:space="preserve">REF ref_002 \h</w:instrText>
@@ -3737,6 +3808,7 @@
           <w:rFonts w:ascii="Times New Roman" w:hAnsi="Times New Roman" w:eastAsia="Times New Roman" w:cs="Times New Roman"/>
           <w:b w:val="0"/>
           <w:sz w:val="21"/>
+          <w:vertAlign w:val="superscript"/>
         </w:rPr>
         <w:t>]</w:t>
       </w:r>
@@ -3753,6 +3825,7 @@
           <w:rFonts w:ascii="Times New Roman" w:hAnsi="Times New Roman" w:eastAsia="Times New Roman" w:cs="Times New Roman"/>
           <w:b w:val="0"/>
           <w:sz w:val="21"/>
+          <w:vertAlign w:val="superscript"/>
         </w:rPr>
         <w:t>[</w:t>
       </w:r>
@@ -3761,6 +3834,7 @@
           <w:rFonts w:ascii="Times New Roman" w:hAnsi="Times New Roman" w:eastAsia="Times New Roman" w:cs="Times New Roman"/>
           <w:b w:val="0"/>
           <w:sz w:val="21"/>
+          <w:vertAlign w:val="superscript"/>
         </w:rPr>
         <w:fldChar w:fldCharType="begin"/>
         <w:instrText xml:space="preserve">REF ref_003 \h</w:instrText>
@@ -3773,6 +3847,7 @@
           <w:rFonts w:ascii="Times New Roman" w:hAnsi="Times New Roman" w:eastAsia="Times New Roman" w:cs="Times New Roman"/>
           <w:b w:val="0"/>
           <w:sz w:val="21"/>
+          <w:vertAlign w:val="superscript"/>
         </w:rPr>
         <w:t>]</w:t>
       </w:r>
@@ -3803,6 +3878,7 @@
           <w:rFonts w:ascii="Times New Roman" w:hAnsi="Times New Roman" w:eastAsia="Times New Roman" w:cs="Times New Roman"/>
           <w:b w:val="0"/>
           <w:sz w:val="21"/>
+          <w:vertAlign w:val="superscript"/>
         </w:rPr>
         <w:t>[</w:t>
       </w:r>
@@ -3811,6 +3887,7 @@
           <w:rFonts w:ascii="Times New Roman" w:hAnsi="Times New Roman" w:eastAsia="Times New Roman" w:cs="Times New Roman"/>
           <w:b w:val="0"/>
           <w:sz w:val="21"/>
+          <w:vertAlign w:val="superscript"/>
         </w:rPr>
         <w:fldChar w:fldCharType="begin"/>
         <w:instrText xml:space="preserve">REF ref_004 \h</w:instrText>
@@ -3823,6 +3900,7 @@
           <w:rFonts w:ascii="Times New Roman" w:hAnsi="Times New Roman" w:eastAsia="Times New Roman" w:cs="Times New Roman"/>
           <w:b w:val="0"/>
           <w:sz w:val="21"/>
+          <w:vertAlign w:val="superscript"/>
         </w:rPr>
         <w:t>]</w:t>
       </w:r>
@@ -3853,6 +3931,7 @@
           <w:rFonts w:ascii="Times New Roman" w:hAnsi="Times New Roman" w:eastAsia="Times New Roman" w:cs="Times New Roman"/>
           <w:b w:val="0"/>
           <w:sz w:val="21"/>
+          <w:vertAlign w:val="superscript"/>
         </w:rPr>
         <w:t>[</w:t>
       </w:r>
@@ -3861,6 +3940,7 @@
           <w:rFonts w:ascii="Times New Roman" w:hAnsi="Times New Roman" w:eastAsia="Times New Roman" w:cs="Times New Roman"/>
           <w:b w:val="0"/>
           <w:sz w:val="21"/>
+          <w:vertAlign w:val="superscript"/>
         </w:rPr>
         <w:fldChar w:fldCharType="begin"/>
         <w:instrText xml:space="preserve">REF ref_005 \h</w:instrText>
@@ -3873,6 +3953,7 @@
           <w:rFonts w:ascii="Times New Roman" w:hAnsi="Times New Roman" w:eastAsia="Times New Roman" w:cs="Times New Roman"/>
           <w:b w:val="0"/>
           <w:sz w:val="21"/>
+          <w:vertAlign w:val="superscript"/>
         </w:rPr>
         <w:t>]</w:t>
       </w:r>
@@ -3889,6 +3970,7 @@
           <w:rFonts w:ascii="Times New Roman" w:hAnsi="Times New Roman" w:eastAsia="Times New Roman" w:cs="Times New Roman"/>
           <w:b w:val="0"/>
           <w:sz w:val="21"/>
+          <w:vertAlign w:val="superscript"/>
         </w:rPr>
         <w:t>[</w:t>
       </w:r>
@@ -3897,6 +3979,7 @@
           <w:rFonts w:ascii="Times New Roman" w:hAnsi="Times New Roman" w:eastAsia="Times New Roman" w:cs="Times New Roman"/>
           <w:b w:val="0"/>
           <w:sz w:val="21"/>
+          <w:vertAlign w:val="superscript"/>
         </w:rPr>
         <w:fldChar w:fldCharType="begin"/>
         <w:instrText xml:space="preserve">REF ref_006 \h</w:instrText>
@@ -3909,6 +3992,7 @@
           <w:rFonts w:ascii="Times New Roman" w:hAnsi="Times New Roman" w:eastAsia="Times New Roman" w:cs="Times New Roman"/>
           <w:b w:val="0"/>
           <w:sz w:val="21"/>
+          <w:vertAlign w:val="superscript"/>
         </w:rPr>
         <w:t>]</w:t>
       </w:r>
@@ -3925,6 +4009,7 @@
           <w:rFonts w:ascii="Times New Roman" w:hAnsi="Times New Roman" w:eastAsia="Times New Roman" w:cs="Times New Roman"/>
           <w:b w:val="0"/>
           <w:sz w:val="21"/>
+          <w:vertAlign w:val="superscript"/>
         </w:rPr>
         <w:t>[</w:t>
       </w:r>
@@ -3933,6 +4018,7 @@
           <w:rFonts w:ascii="Times New Roman" w:hAnsi="Times New Roman" w:eastAsia="Times New Roman" w:cs="Times New Roman"/>
           <w:b w:val="0"/>
           <w:sz w:val="21"/>
+          <w:vertAlign w:val="superscript"/>
         </w:rPr>
         <w:fldChar w:fldCharType="begin"/>
         <w:instrText xml:space="preserve">REF ref_007 \h</w:instrText>
@@ -3945,6 +4031,7 @@
           <w:rFonts w:ascii="Times New Roman" w:hAnsi="Times New Roman" w:eastAsia="Times New Roman" w:cs="Times New Roman"/>
           <w:b w:val="0"/>
           <w:sz w:val="21"/>
+          <w:vertAlign w:val="superscript"/>
         </w:rPr>
         <w:t>]</w:t>
       </w:r>
@@ -3989,6 +4076,7 @@
           <w:rFonts w:ascii="Times New Roman" w:hAnsi="Times New Roman" w:eastAsia="Times New Roman" w:cs="Times New Roman"/>
           <w:b w:val="0"/>
           <w:sz w:val="21"/>
+          <w:vertAlign w:val="superscript"/>
         </w:rPr>
         <w:t>[</w:t>
       </w:r>
@@ -3997,6 +4085,7 @@
           <w:rFonts w:ascii="Times New Roman" w:hAnsi="Times New Roman" w:eastAsia="Times New Roman" w:cs="Times New Roman"/>
           <w:b w:val="0"/>
           <w:sz w:val="21"/>
+          <w:vertAlign w:val="superscript"/>
         </w:rPr>
         <w:fldChar w:fldCharType="begin"/>
         <w:instrText xml:space="preserve">REF ref_008 \h</w:instrText>
@@ -4009,6 +4098,7 @@
           <w:rFonts w:ascii="Times New Roman" w:hAnsi="Times New Roman" w:eastAsia="Times New Roman" w:cs="Times New Roman"/>
           <w:b w:val="0"/>
           <w:sz w:val="21"/>
+          <w:vertAlign w:val="superscript"/>
         </w:rPr>
         <w:t>]</w:t>
       </w:r>
@@ -4053,6 +4143,7 @@
           <w:rFonts w:ascii="Times New Roman" w:hAnsi="Times New Roman" w:eastAsia="Times New Roman" w:cs="Times New Roman"/>
           <w:b w:val="0"/>
           <w:sz w:val="21"/>
+          <w:vertAlign w:val="superscript"/>
         </w:rPr>
         <w:t>[</w:t>
       </w:r>
@@ -4061,6 +4152,7 @@
           <w:rFonts w:ascii="Times New Roman" w:hAnsi="Times New Roman" w:eastAsia="Times New Roman" w:cs="Times New Roman"/>
           <w:b w:val="0"/>
           <w:sz w:val="21"/>
+          <w:vertAlign w:val="superscript"/>
         </w:rPr>
         <w:fldChar w:fldCharType="begin"/>
         <w:instrText xml:space="preserve">REF ref_009 \h</w:instrText>
@@ -4073,6 +4165,7 @@
           <w:rFonts w:ascii="Times New Roman" w:hAnsi="Times New Roman" w:eastAsia="Times New Roman" w:cs="Times New Roman"/>
           <w:b w:val="0"/>
           <w:sz w:val="21"/>
+          <w:vertAlign w:val="superscript"/>
         </w:rPr>
         <w:t>]</w:t>
       </w:r>
@@ -4089,6 +4182,7 @@
           <w:rFonts w:ascii="Times New Roman" w:hAnsi="Times New Roman" w:eastAsia="Times New Roman" w:cs="Times New Roman"/>
           <w:b w:val="0"/>
           <w:sz w:val="21"/>
+          <w:vertAlign w:val="superscript"/>
         </w:rPr>
         <w:t>[</w:t>
       </w:r>
@@ -4097,6 +4191,7 @@
           <w:rFonts w:ascii="Times New Roman" w:hAnsi="Times New Roman" w:eastAsia="Times New Roman" w:cs="Times New Roman"/>
           <w:b w:val="0"/>
           <w:sz w:val="21"/>
+          <w:vertAlign w:val="superscript"/>
         </w:rPr>
         <w:fldChar w:fldCharType="begin"/>
         <w:instrText xml:space="preserve">REF ref_010 \h</w:instrText>
@@ -4109,6 +4204,7 @@
           <w:rFonts w:ascii="Times New Roman" w:hAnsi="Times New Roman" w:eastAsia="Times New Roman" w:cs="Times New Roman"/>
           <w:b w:val="0"/>
           <w:sz w:val="21"/>
+          <w:vertAlign w:val="superscript"/>
         </w:rPr>
         <w:t>]</w:t>
       </w:r>
@@ -4125,6 +4221,7 @@
           <w:rFonts w:ascii="Times New Roman" w:hAnsi="Times New Roman" w:eastAsia="Times New Roman" w:cs="Times New Roman"/>
           <w:b w:val="0"/>
           <w:sz w:val="21"/>
+          <w:vertAlign w:val="superscript"/>
         </w:rPr>
         <w:t>[</w:t>
       </w:r>
@@ -4133,6 +4230,7 @@
           <w:rFonts w:ascii="Times New Roman" w:hAnsi="Times New Roman" w:eastAsia="Times New Roman" w:cs="Times New Roman"/>
           <w:b w:val="0"/>
           <w:sz w:val="21"/>
+          <w:vertAlign w:val="superscript"/>
         </w:rPr>
         <w:fldChar w:fldCharType="begin"/>
         <w:instrText xml:space="preserve">REF ref_011 \h</w:instrText>
@@ -4145,6 +4243,7 @@
           <w:rFonts w:ascii="Times New Roman" w:hAnsi="Times New Roman" w:eastAsia="Times New Roman" w:cs="Times New Roman"/>
           <w:b w:val="0"/>
           <w:sz w:val="21"/>
+          <w:vertAlign w:val="superscript"/>
         </w:rPr>
         <w:t>]</w:t>
       </w:r>
@@ -4175,6 +4274,7 @@
           <w:rFonts w:ascii="Times New Roman" w:hAnsi="Times New Roman" w:eastAsia="Times New Roman" w:cs="Times New Roman"/>
           <w:b w:val="0"/>
           <w:sz w:val="21"/>
+          <w:vertAlign w:val="superscript"/>
         </w:rPr>
         <w:t>[</w:t>
       </w:r>
@@ -4183,6 +4283,7 @@
           <w:rFonts w:ascii="Times New Roman" w:hAnsi="Times New Roman" w:eastAsia="Times New Roman" w:cs="Times New Roman"/>
           <w:b w:val="0"/>
           <w:sz w:val="21"/>
+          <w:vertAlign w:val="superscript"/>
         </w:rPr>
         <w:fldChar w:fldCharType="begin"/>
         <w:instrText xml:space="preserve">REF ref_012 \h</w:instrText>
@@ -4195,6 +4296,7 @@
           <w:rFonts w:ascii="Times New Roman" w:hAnsi="Times New Roman" w:eastAsia="Times New Roman" w:cs="Times New Roman"/>
           <w:b w:val="0"/>
           <w:sz w:val="21"/>
+          <w:vertAlign w:val="superscript"/>
         </w:rPr>
         <w:t>]</w:t>
       </w:r>
@@ -4211,6 +4313,7 @@
           <w:rFonts w:ascii="Times New Roman" w:hAnsi="Times New Roman" w:eastAsia="Times New Roman" w:cs="Times New Roman"/>
           <w:b w:val="0"/>
           <w:sz w:val="21"/>
+          <w:vertAlign w:val="superscript"/>
         </w:rPr>
         <w:t>[</w:t>
       </w:r>
@@ -4219,6 +4322,7 @@
           <w:rFonts w:ascii="Times New Roman" w:hAnsi="Times New Roman" w:eastAsia="Times New Roman" w:cs="Times New Roman"/>
           <w:b w:val="0"/>
           <w:sz w:val="21"/>
+          <w:vertAlign w:val="superscript"/>
         </w:rPr>
         <w:fldChar w:fldCharType="begin"/>
         <w:instrText xml:space="preserve">REF ref_013 \h</w:instrText>
@@ -4231,6 +4335,7 @@
           <w:rFonts w:ascii="Times New Roman" w:hAnsi="Times New Roman" w:eastAsia="Times New Roman" w:cs="Times New Roman"/>
           <w:b w:val="0"/>
           <w:sz w:val="21"/>
+          <w:vertAlign w:val="superscript"/>
         </w:rPr>
         <w:t>]</w:t>
       </w:r>
@@ -4261,6 +4366,7 @@
           <w:rFonts w:ascii="Times New Roman" w:hAnsi="Times New Roman" w:eastAsia="Times New Roman" w:cs="Times New Roman"/>
           <w:b w:val="0"/>
           <w:sz w:val="21"/>
+          <w:vertAlign w:val="superscript"/>
         </w:rPr>
         <w:t>[</w:t>
       </w:r>
@@ -4269,6 +4375,7 @@
           <w:rFonts w:ascii="Times New Roman" w:hAnsi="Times New Roman" w:eastAsia="Times New Roman" w:cs="Times New Roman"/>
           <w:b w:val="0"/>
           <w:sz w:val="21"/>
+          <w:vertAlign w:val="superscript"/>
         </w:rPr>
         <w:fldChar w:fldCharType="begin"/>
         <w:instrText xml:space="preserve">REF ref_023 \h</w:instrText>
@@ -4281,6 +4388,7 @@
           <w:rFonts w:ascii="Times New Roman" w:hAnsi="Times New Roman" w:eastAsia="Times New Roman" w:cs="Times New Roman"/>
           <w:b w:val="0"/>
           <w:sz w:val="21"/>
+          <w:vertAlign w:val="superscript"/>
         </w:rPr>
         <w:t>]</w:t>
       </w:r>
@@ -4297,6 +4405,7 @@
           <w:rFonts w:ascii="Times New Roman" w:hAnsi="Times New Roman" w:eastAsia="Times New Roman" w:cs="Times New Roman"/>
           <w:b w:val="0"/>
           <w:sz w:val="21"/>
+          <w:vertAlign w:val="superscript"/>
         </w:rPr>
         <w:t>[</w:t>
       </w:r>
@@ -4305,6 +4414,7 @@
           <w:rFonts w:ascii="Times New Roman" w:hAnsi="Times New Roman" w:eastAsia="Times New Roman" w:cs="Times New Roman"/>
           <w:b w:val="0"/>
           <w:sz w:val="21"/>
+          <w:vertAlign w:val="superscript"/>
         </w:rPr>
         <w:fldChar w:fldCharType="begin"/>
         <w:instrText xml:space="preserve">REF ref_024 \h</w:instrText>
@@ -4317,6 +4427,7 @@
           <w:rFonts w:ascii="Times New Roman" w:hAnsi="Times New Roman" w:eastAsia="Times New Roman" w:cs="Times New Roman"/>
           <w:b w:val="0"/>
           <w:sz w:val="21"/>
+          <w:vertAlign w:val="superscript"/>
         </w:rPr>
         <w:t>]</w:t>
       </w:r>
@@ -4347,6 +4458,7 @@
           <w:rFonts w:ascii="Times New Roman" w:hAnsi="Times New Roman" w:eastAsia="Times New Roman" w:cs="Times New Roman"/>
           <w:b w:val="0"/>
           <w:sz w:val="21"/>
+          <w:vertAlign w:val="superscript"/>
         </w:rPr>
         <w:t>[</w:t>
       </w:r>
@@ -4355,6 +4467,7 @@
           <w:rFonts w:ascii="Times New Roman" w:hAnsi="Times New Roman" w:eastAsia="Times New Roman" w:cs="Times New Roman"/>
           <w:b w:val="0"/>
           <w:sz w:val="21"/>
+          <w:vertAlign w:val="superscript"/>
         </w:rPr>
         <w:fldChar w:fldCharType="begin"/>
         <w:instrText xml:space="preserve">REF ref_019 \h</w:instrText>
@@ -4367,6 +4480,7 @@
           <w:rFonts w:ascii="Times New Roman" w:hAnsi="Times New Roman" w:eastAsia="Times New Roman" w:cs="Times New Roman"/>
           <w:b w:val="0"/>
           <w:sz w:val="21"/>
+          <w:vertAlign w:val="superscript"/>
         </w:rPr>
         <w:t>]</w:t>
       </w:r>
@@ -4397,6 +4511,7 @@
           <w:rFonts w:ascii="Times New Roman" w:hAnsi="Times New Roman" w:eastAsia="Times New Roman" w:cs="Times New Roman"/>
           <w:b w:val="0"/>
           <w:sz w:val="21"/>
+          <w:vertAlign w:val="superscript"/>
         </w:rPr>
         <w:t>[</w:t>
       </w:r>
@@ -4405,6 +4520,7 @@
           <w:rFonts w:ascii="Times New Roman" w:hAnsi="Times New Roman" w:eastAsia="Times New Roman" w:cs="Times New Roman"/>
           <w:b w:val="0"/>
           <w:sz w:val="21"/>
+          <w:vertAlign w:val="superscript"/>
         </w:rPr>
         <w:fldChar w:fldCharType="begin"/>
         <w:instrText xml:space="preserve">REF ref_019 \h</w:instrText>
@@ -4417,6 +4533,7 @@
           <w:rFonts w:ascii="Times New Roman" w:hAnsi="Times New Roman" w:eastAsia="Times New Roman" w:cs="Times New Roman"/>
           <w:b w:val="0"/>
           <w:sz w:val="21"/>
+          <w:vertAlign w:val="superscript"/>
         </w:rPr>
         <w:t>]</w:t>
       </w:r>
@@ -4433,6 +4550,7 @@
           <w:rFonts w:ascii="Times New Roman" w:hAnsi="Times New Roman" w:eastAsia="Times New Roman" w:cs="Times New Roman"/>
           <w:b w:val="0"/>
           <w:sz w:val="21"/>
+          <w:vertAlign w:val="superscript"/>
         </w:rPr>
         <w:t>[</w:t>
       </w:r>
@@ -4441,6 +4559,7 @@
           <w:rFonts w:ascii="Times New Roman" w:hAnsi="Times New Roman" w:eastAsia="Times New Roman" w:cs="Times New Roman"/>
           <w:b w:val="0"/>
           <w:sz w:val="21"/>
+          <w:vertAlign w:val="superscript"/>
         </w:rPr>
         <w:fldChar w:fldCharType="begin"/>
         <w:instrText xml:space="preserve">REF ref_009 \h</w:instrText>
@@ -4453,6 +4572,7 @@
           <w:rFonts w:ascii="Times New Roman" w:hAnsi="Times New Roman" w:eastAsia="Times New Roman" w:cs="Times New Roman"/>
           <w:b w:val="0"/>
           <w:sz w:val="21"/>
+          <w:vertAlign w:val="superscript"/>
         </w:rPr>
         <w:t>-</w:t>
       </w:r>
@@ -4461,6 +4581,7 @@
           <w:rFonts w:ascii="Times New Roman" w:hAnsi="Times New Roman" w:eastAsia="Times New Roman" w:cs="Times New Roman"/>
           <w:b w:val="0"/>
           <w:sz w:val="21"/>
+          <w:vertAlign w:val="superscript"/>
         </w:rPr>
         <w:fldChar w:fldCharType="begin"/>
         <w:instrText xml:space="preserve">REF ref_013 \h</w:instrText>
@@ -4473,6 +4594,7 @@
           <w:rFonts w:ascii="Times New Roman" w:hAnsi="Times New Roman" w:eastAsia="Times New Roman" w:cs="Times New Roman"/>
           <w:b w:val="0"/>
           <w:sz w:val="21"/>
+          <w:vertAlign w:val="superscript"/>
         </w:rPr>
         <w:t>,</w:t>
       </w:r>
@@ -4481,6 +4603,7 @@
           <w:rFonts w:ascii="Times New Roman" w:hAnsi="Times New Roman" w:eastAsia="Times New Roman" w:cs="Times New Roman"/>
           <w:b w:val="0"/>
           <w:sz w:val="21"/>
+          <w:vertAlign w:val="superscript"/>
         </w:rPr>
         <w:fldChar w:fldCharType="begin"/>
         <w:instrText xml:space="preserve">REF ref_023 \h</w:instrText>
@@ -4493,6 +4616,7 @@
           <w:rFonts w:ascii="Times New Roman" w:hAnsi="Times New Roman" w:eastAsia="Times New Roman" w:cs="Times New Roman"/>
           <w:b w:val="0"/>
           <w:sz w:val="21"/>
+          <w:vertAlign w:val="superscript"/>
         </w:rPr>
         <w:t>-</w:t>
       </w:r>
@@ -4501,6 +4625,7 @@
           <w:rFonts w:ascii="Times New Roman" w:hAnsi="Times New Roman" w:eastAsia="Times New Roman" w:cs="Times New Roman"/>
           <w:b w:val="0"/>
           <w:sz w:val="21"/>
+          <w:vertAlign w:val="superscript"/>
         </w:rPr>
         <w:fldChar w:fldCharType="begin"/>
         <w:instrText xml:space="preserve">REF ref_024 \h</w:instrText>
@@ -4513,6 +4638,7 @@
           <w:rFonts w:ascii="Times New Roman" w:hAnsi="Times New Roman" w:eastAsia="Times New Roman" w:cs="Times New Roman"/>
           <w:b w:val="0"/>
           <w:sz w:val="21"/>
+          <w:vertAlign w:val="superscript"/>
         </w:rPr>
         <w:t>]</w:t>
       </w:r>
@@ -4557,6 +4683,7 @@
           <w:rFonts w:ascii="Times New Roman" w:hAnsi="Times New Roman" w:eastAsia="Times New Roman" w:cs="Times New Roman"/>
           <w:b w:val="0"/>
           <w:sz w:val="21"/>
+          <w:vertAlign w:val="superscript"/>
         </w:rPr>
         <w:t>[</w:t>
       </w:r>
@@ -4565,6 +4692,7 @@
           <w:rFonts w:ascii="Times New Roman" w:hAnsi="Times New Roman" w:eastAsia="Times New Roman" w:cs="Times New Roman"/>
           <w:b w:val="0"/>
           <w:sz w:val="21"/>
+          <w:vertAlign w:val="superscript"/>
         </w:rPr>
         <w:fldChar w:fldCharType="begin"/>
         <w:instrText xml:space="preserve">REF ref_020 \h</w:instrText>
@@ -4577,6 +4705,7 @@
           <w:rFonts w:ascii="Times New Roman" w:hAnsi="Times New Roman" w:eastAsia="Times New Roman" w:cs="Times New Roman"/>
           <w:b w:val="0"/>
           <w:sz w:val="21"/>
+          <w:vertAlign w:val="superscript"/>
         </w:rPr>
         <w:t>]</w:t>
       </w:r>
@@ -4607,6 +4736,7 @@
           <w:rFonts w:ascii="Times New Roman" w:hAnsi="Times New Roman" w:eastAsia="Times New Roman" w:cs="Times New Roman"/>
           <w:b w:val="0"/>
           <w:sz w:val="21"/>
+          <w:vertAlign w:val="superscript"/>
         </w:rPr>
         <w:t>[</w:t>
       </w:r>
@@ -4615,6 +4745,7 @@
           <w:rFonts w:ascii="Times New Roman" w:hAnsi="Times New Roman" w:eastAsia="Times New Roman" w:cs="Times New Roman"/>
           <w:b w:val="0"/>
           <w:sz w:val="21"/>
+          <w:vertAlign w:val="superscript"/>
         </w:rPr>
         <w:fldChar w:fldCharType="begin"/>
         <w:instrText xml:space="preserve">REF ref_021 \h</w:instrText>
@@ -4627,6 +4758,7 @@
           <w:rFonts w:ascii="Times New Roman" w:hAnsi="Times New Roman" w:eastAsia="Times New Roman" w:cs="Times New Roman"/>
           <w:b w:val="0"/>
           <w:sz w:val="21"/>
+          <w:vertAlign w:val="superscript"/>
         </w:rPr>
         <w:t>]</w:t>
       </w:r>
@@ -4657,6 +4789,7 @@
           <w:rFonts w:ascii="Times New Roman" w:hAnsi="Times New Roman" w:eastAsia="Times New Roman" w:cs="Times New Roman"/>
           <w:b w:val="0"/>
           <w:sz w:val="21"/>
+          <w:vertAlign w:val="superscript"/>
         </w:rPr>
         <w:t>[</w:t>
       </w:r>
@@ -4665,6 +4798,7 @@
           <w:rFonts w:ascii="Times New Roman" w:hAnsi="Times New Roman" w:eastAsia="Times New Roman" w:cs="Times New Roman"/>
           <w:b w:val="0"/>
           <w:sz w:val="21"/>
+          <w:vertAlign w:val="superscript"/>
         </w:rPr>
         <w:fldChar w:fldCharType="begin"/>
         <w:instrText xml:space="preserve">REF ref_022 \h</w:instrText>
@@ -4677,6 +4811,7 @@
           <w:rFonts w:ascii="Times New Roman" w:hAnsi="Times New Roman" w:eastAsia="Times New Roman" w:cs="Times New Roman"/>
           <w:b w:val="0"/>
           <w:sz w:val="21"/>
+          <w:vertAlign w:val="superscript"/>
         </w:rPr>
         <w:t>]</w:t>
       </w:r>
@@ -5149,6 +5284,7 @@
           <w:rFonts w:ascii="Times New Roman" w:hAnsi="Times New Roman" w:eastAsia="Times New Roman" w:cs="Times New Roman"/>
           <w:b w:val="0"/>
           <w:sz w:val="21"/>
+          <w:vertAlign w:val="superscript"/>
         </w:rPr>
         <w:t>[</w:t>
       </w:r>
@@ -5157,6 +5293,7 @@
           <w:rFonts w:ascii="Times New Roman" w:hAnsi="Times New Roman" w:eastAsia="Times New Roman" w:cs="Times New Roman"/>
           <w:b w:val="0"/>
           <w:sz w:val="21"/>
+          <w:vertAlign w:val="superscript"/>
         </w:rPr>
         <w:fldChar w:fldCharType="begin"/>
         <w:instrText xml:space="preserve">REF ref_014 \h</w:instrText>
@@ -5169,6 +5306,7 @@
           <w:rFonts w:ascii="Times New Roman" w:hAnsi="Times New Roman" w:eastAsia="Times New Roman" w:cs="Times New Roman"/>
           <w:b w:val="0"/>
           <w:sz w:val="21"/>
+          <w:vertAlign w:val="superscript"/>
         </w:rPr>
         <w:t>]</w:t>
       </w:r>
@@ -5296,6 +5434,7 @@
           <w:rFonts w:ascii="Times New Roman" w:hAnsi="Times New Roman" w:eastAsia="Times New Roman" w:cs="Times New Roman"/>
           <w:b w:val="0"/>
           <w:sz w:val="21"/>
+          <w:vertAlign w:val="superscript"/>
         </w:rPr>
         <w:t>[</w:t>
       </w:r>
@@ -5304,6 +5443,7 @@
           <w:rFonts w:ascii="Times New Roman" w:hAnsi="Times New Roman" w:eastAsia="Times New Roman" w:cs="Times New Roman"/>
           <w:b w:val="0"/>
           <w:sz w:val="21"/>
+          <w:vertAlign w:val="superscript"/>
         </w:rPr>
         <w:fldChar w:fldCharType="begin"/>
         <w:instrText xml:space="preserve">REF ref_015 \h</w:instrText>
@@ -5316,6 +5456,7 @@
           <w:rFonts w:ascii="Times New Roman" w:hAnsi="Times New Roman" w:eastAsia="Times New Roman" w:cs="Times New Roman"/>
           <w:b w:val="0"/>
           <w:sz w:val="21"/>
+          <w:vertAlign w:val="superscript"/>
         </w:rPr>
         <w:t>]</w:t>
       </w:r>
@@ -5360,6 +5501,7 @@
           <w:rFonts w:ascii="Times New Roman" w:hAnsi="Times New Roman" w:eastAsia="Times New Roman" w:cs="Times New Roman"/>
           <w:b w:val="0"/>
           <w:sz w:val="21"/>
+          <w:vertAlign w:val="superscript"/>
         </w:rPr>
         <w:t>[</w:t>
       </w:r>
@@ -5368,6 +5510,7 @@
           <w:rFonts w:ascii="Times New Roman" w:hAnsi="Times New Roman" w:eastAsia="Times New Roman" w:cs="Times New Roman"/>
           <w:b w:val="0"/>
           <w:sz w:val="21"/>
+          <w:vertAlign w:val="superscript"/>
         </w:rPr>
         <w:fldChar w:fldCharType="begin"/>
         <w:instrText xml:space="preserve">REF ref_004 \h</w:instrText>
@@ -5380,6 +5523,7 @@
           <w:rFonts w:ascii="Times New Roman" w:hAnsi="Times New Roman" w:eastAsia="Times New Roman" w:cs="Times New Roman"/>
           <w:b w:val="0"/>
           <w:sz w:val="21"/>
+          <w:vertAlign w:val="superscript"/>
         </w:rPr>
         <w:t>-</w:t>
       </w:r>
@@ -5388,6 +5532,7 @@
           <w:rFonts w:ascii="Times New Roman" w:hAnsi="Times New Roman" w:eastAsia="Times New Roman" w:cs="Times New Roman"/>
           <w:b w:val="0"/>
           <w:sz w:val="21"/>
+          <w:vertAlign w:val="superscript"/>
         </w:rPr>
         <w:fldChar w:fldCharType="begin"/>
         <w:instrText xml:space="preserve">REF ref_008 \h</w:instrText>
@@ -5400,6 +5545,7 @@
           <w:rFonts w:ascii="Times New Roman" w:hAnsi="Times New Roman" w:eastAsia="Times New Roman" w:cs="Times New Roman"/>
           <w:b w:val="0"/>
           <w:sz w:val="21"/>
+          <w:vertAlign w:val="superscript"/>
         </w:rPr>
         <w:t>]</w:t>
       </w:r>
@@ -5430,6 +5576,7 @@
           <w:rFonts w:ascii="Times New Roman" w:hAnsi="Times New Roman" w:eastAsia="Times New Roman" w:cs="Times New Roman"/>
           <w:b w:val="0"/>
           <w:sz w:val="21"/>
+          <w:vertAlign w:val="superscript"/>
         </w:rPr>
         <w:t>[</w:t>
       </w:r>
@@ -5438,6 +5585,7 @@
           <w:rFonts w:ascii="Times New Roman" w:hAnsi="Times New Roman" w:eastAsia="Times New Roman" w:cs="Times New Roman"/>
           <w:b w:val="0"/>
           <w:sz w:val="21"/>
+          <w:vertAlign w:val="superscript"/>
         </w:rPr>
         <w:fldChar w:fldCharType="begin"/>
         <w:instrText xml:space="preserve">REF ref_008 \h</w:instrText>
@@ -5450,6 +5598,7 @@
           <w:rFonts w:ascii="Times New Roman" w:hAnsi="Times New Roman" w:eastAsia="Times New Roman" w:cs="Times New Roman"/>
           <w:b w:val="0"/>
           <w:sz w:val="21"/>
+          <w:vertAlign w:val="superscript"/>
         </w:rPr>
         <w:t>,</w:t>
       </w:r>
@@ -5458,6 +5607,7 @@
           <w:rFonts w:ascii="Times New Roman" w:hAnsi="Times New Roman" w:eastAsia="Times New Roman" w:cs="Times New Roman"/>
           <w:b w:val="0"/>
           <w:sz w:val="21"/>
+          <w:vertAlign w:val="superscript"/>
         </w:rPr>
         <w:fldChar w:fldCharType="begin"/>
         <w:instrText xml:space="preserve">REF ref_015 \h</w:instrText>
@@ -5470,6 +5620,7 @@
           <w:rFonts w:ascii="Times New Roman" w:hAnsi="Times New Roman" w:eastAsia="Times New Roman" w:cs="Times New Roman"/>
           <w:b w:val="0"/>
           <w:sz w:val="21"/>
+          <w:vertAlign w:val="superscript"/>
         </w:rPr>
         <w:t>]</w:t>
       </w:r>
@@ -5500,6 +5651,7 @@
           <w:rFonts w:ascii="Times New Roman" w:hAnsi="Times New Roman" w:eastAsia="Times New Roman" w:cs="Times New Roman"/>
           <w:b w:val="0"/>
           <w:sz w:val="21"/>
+          <w:vertAlign w:val="superscript"/>
         </w:rPr>
         <w:t>[</w:t>
       </w:r>
@@ -5508,6 +5660,7 @@
           <w:rFonts w:ascii="Times New Roman" w:hAnsi="Times New Roman" w:eastAsia="Times New Roman" w:cs="Times New Roman"/>
           <w:b w:val="0"/>
           <w:sz w:val="21"/>
+          <w:vertAlign w:val="superscript"/>
         </w:rPr>
         <w:fldChar w:fldCharType="begin"/>
         <w:instrText xml:space="preserve">REF ref_014 \h</w:instrText>
@@ -5520,6 +5673,7 @@
           <w:rFonts w:ascii="Times New Roman" w:hAnsi="Times New Roman" w:eastAsia="Times New Roman" w:cs="Times New Roman"/>
           <w:b w:val="0"/>
           <w:sz w:val="21"/>
+          <w:vertAlign w:val="superscript"/>
         </w:rPr>
         <w:t>]</w:t>
       </w:r>
@@ -5550,6 +5704,7 @@
           <w:rFonts w:ascii="Times New Roman" w:hAnsi="Times New Roman" w:eastAsia="Times New Roman" w:cs="Times New Roman"/>
           <w:b w:val="0"/>
           <w:sz w:val="21"/>
+          <w:vertAlign w:val="superscript"/>
         </w:rPr>
         <w:t>[</w:t>
       </w:r>
@@ -5558,6 +5713,7 @@
           <w:rFonts w:ascii="Times New Roman" w:hAnsi="Times New Roman" w:eastAsia="Times New Roman" w:cs="Times New Roman"/>
           <w:b w:val="0"/>
           <w:sz w:val="21"/>
+          <w:vertAlign w:val="superscript"/>
         </w:rPr>
         <w:fldChar w:fldCharType="begin"/>
         <w:instrText xml:space="preserve">REF ref_022 \h</w:instrText>
@@ -5570,6 +5726,7 @@
           <w:rFonts w:ascii="Times New Roman" w:hAnsi="Times New Roman" w:eastAsia="Times New Roman" w:cs="Times New Roman"/>
           <w:b w:val="0"/>
           <w:sz w:val="21"/>
+          <w:vertAlign w:val="superscript"/>
         </w:rPr>
         <w:t>]</w:t>
       </w:r>
@@ -5600,6 +5757,7 @@
           <w:rFonts w:ascii="Times New Roman" w:hAnsi="Times New Roman" w:eastAsia="Times New Roman" w:cs="Times New Roman"/>
           <w:b w:val="0"/>
           <w:sz w:val="21"/>
+          <w:vertAlign w:val="superscript"/>
         </w:rPr>
         <w:t>[</w:t>
       </w:r>
@@ -5608,6 +5766,7 @@
           <w:rFonts w:ascii="Times New Roman" w:hAnsi="Times New Roman" w:eastAsia="Times New Roman" w:cs="Times New Roman"/>
           <w:b w:val="0"/>
           <w:sz w:val="21"/>
+          <w:vertAlign w:val="superscript"/>
         </w:rPr>
         <w:fldChar w:fldCharType="begin"/>
         <w:instrText xml:space="preserve">REF ref_020 \h</w:instrText>
@@ -5620,6 +5779,7 @@
           <w:rFonts w:ascii="Times New Roman" w:hAnsi="Times New Roman" w:eastAsia="Times New Roman" w:cs="Times New Roman"/>
           <w:b w:val="0"/>
           <w:sz w:val="21"/>
+          <w:vertAlign w:val="superscript"/>
         </w:rPr>
         <w:t>-</w:t>
       </w:r>
@@ -5628,6 +5788,7 @@
           <w:rFonts w:ascii="Times New Roman" w:hAnsi="Times New Roman" w:eastAsia="Times New Roman" w:cs="Times New Roman"/>
           <w:b w:val="0"/>
           <w:sz w:val="21"/>
+          <w:vertAlign w:val="superscript"/>
         </w:rPr>
         <w:fldChar w:fldCharType="begin"/>
         <w:instrText xml:space="preserve">REF ref_022 \h</w:instrText>
@@ -5640,6 +5801,7 @@
           <w:rFonts w:ascii="Times New Roman" w:hAnsi="Times New Roman" w:eastAsia="Times New Roman" w:cs="Times New Roman"/>
           <w:b w:val="0"/>
           <w:sz w:val="21"/>
+          <w:vertAlign w:val="superscript"/>
         </w:rPr>
         <w:t>]</w:t>
       </w:r>
@@ -5670,6 +5832,7 @@
           <w:rFonts w:ascii="Times New Roman" w:hAnsi="Times New Roman" w:eastAsia="Times New Roman" w:cs="Times New Roman"/>
           <w:b w:val="0"/>
           <w:sz w:val="21"/>
+          <w:vertAlign w:val="superscript"/>
         </w:rPr>
         <w:t>[</w:t>
       </w:r>
@@ -5678,6 +5841,7 @@
           <w:rFonts w:ascii="Times New Roman" w:hAnsi="Times New Roman" w:eastAsia="Times New Roman" w:cs="Times New Roman"/>
           <w:b w:val="0"/>
           <w:sz w:val="21"/>
+          <w:vertAlign w:val="superscript"/>
         </w:rPr>
         <w:fldChar w:fldCharType="begin"/>
         <w:instrText xml:space="preserve">REF ref_014 \h</w:instrText>
@@ -5690,6 +5854,7 @@
           <w:rFonts w:ascii="Times New Roman" w:hAnsi="Times New Roman" w:eastAsia="Times New Roman" w:cs="Times New Roman"/>
           <w:b w:val="0"/>
           <w:sz w:val="21"/>
+          <w:vertAlign w:val="superscript"/>
         </w:rPr>
         <w:t>-</w:t>
       </w:r>
@@ -5698,6 +5863,7 @@
           <w:rFonts w:ascii="Times New Roman" w:hAnsi="Times New Roman" w:eastAsia="Times New Roman" w:cs="Times New Roman"/>
           <w:b w:val="0"/>
           <w:sz w:val="21"/>
+          <w:vertAlign w:val="superscript"/>
         </w:rPr>
         <w:fldChar w:fldCharType="begin"/>
         <w:instrText xml:space="preserve">REF ref_015 \h</w:instrText>
@@ -5710,6 +5876,7 @@
           <w:rFonts w:ascii="Times New Roman" w:hAnsi="Times New Roman" w:eastAsia="Times New Roman" w:cs="Times New Roman"/>
           <w:b w:val="0"/>
           <w:sz w:val="21"/>
+          <w:vertAlign w:val="superscript"/>
         </w:rPr>
         <w:t>]</w:t>
       </w:r>

</xml_diff>

<commit_message>
docs: stabilize thesis cover layout
</commit_message>
<xml_diff>
--- a/docs/thesis/drafts/论文正文_程浩然_基于LangGraph的多Agent协作框架在医疗审计场景的设计与实现.docx
+++ b/docs/thesis/drafts/论文正文_程浩然_基于LangGraph的多Agent协作框架在医疗审计场景的设计与实现.docx
@@ -57,226 +57,429 @@
     <w:p/>
     <w:p/>
     <w:p/>
-    <w:p>
-      <w:pPr>
-        <w:ind w:firstLine="1800"/>
-      </w:pPr>
-      <w:r>
-        <w:rPr>
-          <w:rFonts w:ascii="宋体" w:hAnsi="宋体" w:eastAsia="宋体" w:cs="宋体"/>
-          <w:b/>
-          <w:sz w:val="28"/>
-        </w:rPr>
-        <w:t>题    目：</w:t>
-      </w:r>
-      <w:r>
-        <w:rPr>
-          <w:rFonts w:ascii="宋体" w:hAnsi="宋体" w:eastAsia="宋体" w:cs="宋体"/>
-          <w:b w:val="0"/>
-          <w:sz w:val="28"/>
-          <w:u w:val="single"/>
-        </w:rPr>
-        <w:t>基于 LangGraph 的多 Agent 协作框架在医疗审计</w:t>
-      </w:r>
-    </w:p>
-    <w:p>
-      <w:pPr>
-        <w:ind w:firstLine="1800"/>
-      </w:pPr>
-      <w:r>
-        <w:rPr>
-          <w:rFonts w:ascii="宋体" w:hAnsi="宋体" w:eastAsia="宋体" w:cs="宋体"/>
-          <w:b/>
-          <w:sz w:val="28"/>
-        </w:rPr>
-      </w:r>
-      <w:r>
-        <w:rPr>
-          <w:rFonts w:ascii="宋体" w:hAnsi="宋体" w:eastAsia="宋体" w:cs="宋体"/>
-          <w:b w:val="0"/>
-          <w:sz w:val="28"/>
-          <w:u w:val="single"/>
-        </w:rPr>
-        <w:t xml:space="preserve">场景的设计与实现                            </w:t>
-      </w:r>
-    </w:p>
-    <w:p>
-      <w:pPr>
-        <w:ind w:firstLine="1800"/>
-      </w:pPr>
-    </w:p>
-    <w:p>
-      <w:pPr>
-        <w:ind w:firstLine="1800"/>
-      </w:pPr>
-    </w:p>
-    <w:p>
-      <w:pPr>
-        <w:ind w:firstLine="1800"/>
-      </w:pPr>
-      <w:r>
-        <w:rPr>
-          <w:rFonts w:ascii="宋体" w:hAnsi="宋体" w:eastAsia="宋体" w:cs="宋体"/>
-          <w:b/>
-          <w:sz w:val="28"/>
-        </w:rPr>
-        <w:t>学    院：</w:t>
-      </w:r>
-      <w:r>
-        <w:rPr>
-          <w:rFonts w:ascii="宋体" w:hAnsi="宋体" w:eastAsia="宋体" w:cs="宋体"/>
-          <w:b w:val="0"/>
-          <w:sz w:val="28"/>
-          <w:u w:val="single"/>
-        </w:rPr>
-        <w:t xml:space="preserve">计算机学院                       </w:t>
-      </w:r>
-    </w:p>
-    <w:p>
-      <w:pPr>
-        <w:ind w:firstLine="1800"/>
-      </w:pPr>
-    </w:p>
-    <w:p>
-      <w:pPr>
-        <w:ind w:firstLine="1800"/>
-      </w:pPr>
-    </w:p>
-    <w:p>
-      <w:pPr>
-        <w:ind w:firstLine="1800"/>
-      </w:pPr>
-      <w:r>
-        <w:rPr>
-          <w:rFonts w:ascii="宋体" w:hAnsi="宋体" w:eastAsia="宋体" w:cs="宋体"/>
-          <w:b/>
-          <w:sz w:val="28"/>
-        </w:rPr>
-        <w:t>专    业：</w:t>
-      </w:r>
-      <w:r>
-        <w:rPr>
-          <w:rFonts w:ascii="宋体" w:hAnsi="宋体" w:eastAsia="宋体" w:cs="宋体"/>
-          <w:b w:val="0"/>
-          <w:sz w:val="28"/>
-          <w:u w:val="single"/>
-        </w:rPr>
-        <w:t xml:space="preserve">计算机科学与技术                    </w:t>
-      </w:r>
-    </w:p>
-    <w:p>
-      <w:pPr>
-        <w:ind w:firstLine="1800"/>
-      </w:pPr>
-    </w:p>
-    <w:p>
-      <w:pPr>
-        <w:ind w:firstLine="1800"/>
-      </w:pPr>
-    </w:p>
-    <w:p>
-      <w:pPr>
-        <w:ind w:firstLine="1800"/>
-      </w:pPr>
-      <w:r>
-        <w:rPr>
-          <w:rFonts w:ascii="宋体" w:hAnsi="宋体" w:eastAsia="宋体" w:cs="宋体"/>
-          <w:b/>
-          <w:sz w:val="28"/>
-        </w:rPr>
-        <w:t>学生姓名：</w:t>
-      </w:r>
-      <w:r>
-        <w:rPr>
-          <w:rFonts w:ascii="宋体" w:hAnsi="宋体" w:eastAsia="宋体" w:cs="宋体"/>
-          <w:b w:val="0"/>
-          <w:sz w:val="28"/>
-          <w:u w:val="single"/>
-        </w:rPr>
-        <w:t xml:space="preserve">程浩然       </w:t>
-      </w:r>
-      <w:r>
-        <w:rPr>
-          <w:rFonts w:ascii="宋体" w:hAnsi="宋体" w:eastAsia="宋体" w:cs="宋体"/>
-          <w:b/>
-          <w:sz w:val="28"/>
-        </w:rPr>
-        <w:t xml:space="preserve">   班级/学号</w:t>
-      </w:r>
-      <w:r>
-        <w:rPr>
-          <w:rFonts w:ascii="宋体" w:hAnsi="宋体" w:eastAsia="宋体" w:cs="宋体"/>
-          <w:b w:val="0"/>
-          <w:sz w:val="28"/>
-          <w:u w:val="single"/>
-        </w:rPr>
-        <w:t xml:space="preserve">  计科2401-本/2024070013   </w:t>
-      </w:r>
-    </w:p>
-    <w:p>
-      <w:pPr>
-        <w:ind w:firstLine="1800"/>
-      </w:pPr>
-    </w:p>
-    <w:p>
-      <w:pPr>
-        <w:ind w:firstLine="1800"/>
-      </w:pPr>
-    </w:p>
-    <w:p>
-      <w:pPr>
-        <w:ind w:firstLine="1800"/>
-      </w:pPr>
-      <w:r>
-        <w:rPr>
-          <w:rFonts w:ascii="宋体" w:hAnsi="宋体" w:eastAsia="宋体" w:cs="宋体"/>
-          <w:b/>
-          <w:sz w:val="28"/>
-        </w:rPr>
-        <w:t>指导老师/督导老师：</w:t>
-      </w:r>
-      <w:r>
-        <w:rPr>
-          <w:rFonts w:ascii="宋体" w:hAnsi="宋体" w:eastAsia="宋体" w:cs="宋体"/>
-          <w:b w:val="0"/>
-          <w:sz w:val="28"/>
-          <w:u w:val="single"/>
-        </w:rPr>
-        <w:t xml:space="preserve">乔文豹                   </w:t>
-      </w:r>
-    </w:p>
-    <w:p>
-      <w:pPr>
-        <w:ind w:firstLine="1800"/>
-      </w:pPr>
-    </w:p>
-    <w:p>
-      <w:pPr>
-        <w:ind w:firstLine="1800"/>
-      </w:pPr>
-    </w:p>
-    <w:p>
-      <w:pPr>
-        <w:ind w:firstLine="1800"/>
-      </w:pPr>
-      <w:r>
-        <w:rPr>
-          <w:rFonts w:ascii="宋体" w:hAnsi="宋体" w:eastAsia="宋体" w:cs="宋体"/>
-          <w:b/>
-          <w:sz w:val="28"/>
-        </w:rPr>
-        <w:t>起止时间：</w:t>
-      </w:r>
-      <w:r>
-        <w:rPr>
-          <w:rFonts w:ascii="宋体" w:hAnsi="宋体" w:eastAsia="宋体" w:cs="宋体"/>
-          <w:b w:val="0"/>
-          <w:sz w:val="28"/>
-          <w:u w:val="single"/>
-        </w:rPr>
-        <w:t xml:space="preserve">2026年2月23日至2026年5月22日       </w:t>
-      </w:r>
-    </w:p>
+    <w:p/>
+    <w:tbl>
+      <w:tblPr>
+        <w:tblW w:type="auto" w:w="0"/>
+        <w:jc w:val="center"/>
+        <w:tblLayout w:type="fixed"/>
+        <w:tblLook w:firstColumn="1" w:firstRow="1" w:lastColumn="0" w:lastRow="0" w:noHBand="0" w:noVBand="1" w:val="04A0"/>
+        <w:tblBorders>
+          <w:top w:val="nil" w:sz="0" w:space="0" w:color="FFFFFF"/>
+          <w:left w:val="nil" w:sz="0" w:space="0" w:color="FFFFFF"/>
+          <w:bottom w:val="nil" w:sz="0" w:space="0" w:color="FFFFFF"/>
+          <w:right w:val="nil" w:sz="0" w:space="0" w:color="FFFFFF"/>
+          <w:insideH w:val="nil" w:sz="0" w:space="0" w:color="FFFFFF"/>
+          <w:insideV w:val="nil" w:sz="0" w:space="0" w:color="FFFFFF"/>
+        </w:tblBorders>
+      </w:tblPr>
+      <w:tblGrid>
+        <w:gridCol w:w="2268"/>
+        <w:gridCol w:w="2268"/>
+        <w:gridCol w:w="2268"/>
+        <w:gridCol w:w="2268"/>
+      </w:tblGrid>
+      <w:tr>
+        <w:tc>
+          <w:tcPr>
+            <w:tcW w:type="dxa" w:w="1701"/>
+            <w:vAlign w:val="center"/>
+            <w:tcMar>
+              <w:top w:w="0" w:type="dxa"/>
+              <w:left w:w="40" w:type="dxa"/>
+              <w:bottom w:w="0" w:type="dxa"/>
+              <w:right w:w="40" w:type="dxa"/>
+            </w:tcMar>
+          </w:tcPr>
+          <w:p>
+            <w:pPr>
+              <w:spacing w:before="0" w:after="0" w:line="360" w:lineRule="exact"/>
+            </w:pPr>
+            <w:r>
+              <w:rPr>
+                <w:rFonts w:ascii="宋体" w:hAnsi="宋体" w:eastAsia="宋体" w:cs="宋体"/>
+                <w:b/>
+                <w:sz w:val="28"/>
+                <w:u w:val="none"/>
+              </w:rPr>
+              <w:t>题    目：</w:t>
+            </w:r>
+          </w:p>
+        </w:tc>
+        <w:tc>
+          <w:tcPr>
+            <w:tcW w:type="dxa" w:w="6917"/>
+            <w:gridSpan w:val="3"/>
+            <w:vAlign w:val="center"/>
+            <w:tcMar>
+              <w:top w:w="0" w:type="dxa"/>
+              <w:left w:w="40" w:type="dxa"/>
+              <w:bottom w:w="0" w:type="dxa"/>
+              <w:right w:w="40" w:type="dxa"/>
+            </w:tcMar>
+          </w:tcPr>
+          <w:p>
+            <w:pPr>
+              <w:spacing w:before="0" w:after="0" w:line="360" w:lineRule="exact"/>
+            </w:pPr>
+            <w:r>
+              <w:rPr>
+                <w:rFonts w:ascii="宋体" w:hAnsi="宋体" w:eastAsia="宋体" w:cs="宋体"/>
+                <w:b w:val="0"/>
+                <w:sz w:val="28"/>
+                <w:u w:val="single"/>
+              </w:rPr>
+              <w:t>基于 LangGraph 的多 Agent 协作框架在医疗审计</w:t>
+            </w:r>
+          </w:p>
+          <w:p>
+            <w:pPr>
+              <w:spacing w:before="0" w:after="0" w:line="360" w:lineRule="exact"/>
+            </w:pPr>
+            <w:r>
+              <w:rPr>
+                <w:rFonts w:ascii="宋体" w:hAnsi="宋体" w:eastAsia="宋体" w:cs="宋体"/>
+                <w:b w:val="0"/>
+                <w:sz w:val="28"/>
+                <w:u w:val="single"/>
+              </w:rPr>
+              <w:t>场景的设计与实现</w:t>
+            </w:r>
+          </w:p>
+        </w:tc>
+      </w:tr>
+      <w:tr>
+        <w:tc>
+          <w:tcPr>
+            <w:tcW w:type="dxa" w:w="1701"/>
+            <w:vAlign w:val="center"/>
+            <w:tcMar>
+              <w:top w:w="0" w:type="dxa"/>
+              <w:left w:w="40" w:type="dxa"/>
+              <w:bottom w:w="0" w:type="dxa"/>
+              <w:right w:w="40" w:type="dxa"/>
+            </w:tcMar>
+          </w:tcPr>
+          <w:p>
+            <w:pPr>
+              <w:spacing w:before="0" w:after="0" w:line="360" w:lineRule="exact"/>
+            </w:pPr>
+            <w:r>
+              <w:rPr>
+                <w:rFonts w:ascii="宋体" w:hAnsi="宋体" w:eastAsia="宋体" w:cs="宋体"/>
+                <w:b/>
+                <w:sz w:val="28"/>
+                <w:u w:val="none"/>
+              </w:rPr>
+              <w:t>学    院：</w:t>
+            </w:r>
+          </w:p>
+        </w:tc>
+        <w:tc>
+          <w:tcPr>
+            <w:tcW w:type="dxa" w:w="6917"/>
+            <w:gridSpan w:val="3"/>
+            <w:vAlign w:val="center"/>
+            <w:tcMar>
+              <w:top w:w="0" w:type="dxa"/>
+              <w:left w:w="40" w:type="dxa"/>
+              <w:bottom w:w="0" w:type="dxa"/>
+              <w:right w:w="40" w:type="dxa"/>
+            </w:tcMar>
+          </w:tcPr>
+          <w:p>
+            <w:pPr>
+              <w:spacing w:before="0" w:after="0" w:line="360" w:lineRule="exact"/>
+            </w:pPr>
+            <w:r>
+              <w:rPr>
+                <w:rFonts w:ascii="宋体" w:hAnsi="宋体" w:eastAsia="宋体" w:cs="宋体"/>
+                <w:b w:val="0"/>
+                <w:sz w:val="28"/>
+                <w:u w:val="single"/>
+              </w:rPr>
+              <w:t>计算机学院</w:t>
+            </w:r>
+          </w:p>
+        </w:tc>
+      </w:tr>
+      <w:tr>
+        <w:tc>
+          <w:tcPr>
+            <w:tcW w:type="dxa" w:w="1701"/>
+            <w:vAlign w:val="center"/>
+            <w:tcMar>
+              <w:top w:w="0" w:type="dxa"/>
+              <w:left w:w="40" w:type="dxa"/>
+              <w:bottom w:w="0" w:type="dxa"/>
+              <w:right w:w="40" w:type="dxa"/>
+            </w:tcMar>
+          </w:tcPr>
+          <w:p>
+            <w:pPr>
+              <w:spacing w:before="0" w:after="0" w:line="360" w:lineRule="exact"/>
+            </w:pPr>
+            <w:r>
+              <w:rPr>
+                <w:rFonts w:ascii="宋体" w:hAnsi="宋体" w:eastAsia="宋体" w:cs="宋体"/>
+                <w:b/>
+                <w:sz w:val="28"/>
+                <w:u w:val="none"/>
+              </w:rPr>
+              <w:t>专    业：</w:t>
+            </w:r>
+          </w:p>
+        </w:tc>
+        <w:tc>
+          <w:tcPr>
+            <w:tcW w:type="dxa" w:w="6917"/>
+            <w:gridSpan w:val="3"/>
+            <w:vAlign w:val="center"/>
+            <w:tcMar>
+              <w:top w:w="0" w:type="dxa"/>
+              <w:left w:w="40" w:type="dxa"/>
+              <w:bottom w:w="0" w:type="dxa"/>
+              <w:right w:w="40" w:type="dxa"/>
+            </w:tcMar>
+          </w:tcPr>
+          <w:p>
+            <w:pPr>
+              <w:spacing w:before="0" w:after="0" w:line="360" w:lineRule="exact"/>
+            </w:pPr>
+            <w:r>
+              <w:rPr>
+                <w:rFonts w:ascii="宋体" w:hAnsi="宋体" w:eastAsia="宋体" w:cs="宋体"/>
+                <w:b w:val="0"/>
+                <w:sz w:val="28"/>
+                <w:u w:val="single"/>
+              </w:rPr>
+              <w:t>计算机科学与技术</w:t>
+            </w:r>
+          </w:p>
+        </w:tc>
+      </w:tr>
+      <w:tr>
+        <w:tc>
+          <w:tcPr>
+            <w:tcW w:type="dxa" w:w="1701"/>
+            <w:vAlign w:val="center"/>
+            <w:tcMar>
+              <w:top w:w="0" w:type="dxa"/>
+              <w:left w:w="40" w:type="dxa"/>
+              <w:bottom w:w="0" w:type="dxa"/>
+              <w:right w:w="40" w:type="dxa"/>
+            </w:tcMar>
+          </w:tcPr>
+          <w:p>
+            <w:pPr>
+              <w:spacing w:before="0" w:after="0" w:line="360" w:lineRule="exact"/>
+            </w:pPr>
+            <w:r>
+              <w:rPr>
+                <w:rFonts w:ascii="宋体" w:hAnsi="宋体" w:eastAsia="宋体" w:cs="宋体"/>
+                <w:b/>
+                <w:sz w:val="28"/>
+                <w:u w:val="none"/>
+              </w:rPr>
+              <w:t>学生姓名：</w:t>
+            </w:r>
+          </w:p>
+        </w:tc>
+        <w:tc>
+          <w:tcPr>
+            <w:tcW w:type="dxa" w:w="6917"/>
+            <w:gridSpan w:val="3"/>
+            <w:vAlign w:val="center"/>
+            <w:tcMar>
+              <w:top w:w="0" w:type="dxa"/>
+              <w:left w:w="40" w:type="dxa"/>
+              <w:bottom w:w="0" w:type="dxa"/>
+              <w:right w:w="40" w:type="dxa"/>
+            </w:tcMar>
+          </w:tcPr>
+          <w:p>
+            <w:pPr>
+              <w:spacing w:before="0" w:after="0" w:line="360" w:lineRule="exact"/>
+            </w:pPr>
+            <w:r>
+              <w:rPr>
+                <w:rFonts w:ascii="宋体" w:hAnsi="宋体" w:eastAsia="宋体" w:cs="宋体"/>
+                <w:b w:val="0"/>
+                <w:sz w:val="28"/>
+                <w:u w:val="single"/>
+              </w:rPr>
+              <w:t>程浩然</w:t>
+            </w:r>
+          </w:p>
+        </w:tc>
+      </w:tr>
+      <w:tr>
+        <w:tc>
+          <w:tcPr>
+            <w:tcW w:type="dxa" w:w="1701"/>
+            <w:vAlign w:val="center"/>
+            <w:tcMar>
+              <w:top w:w="0" w:type="dxa"/>
+              <w:left w:w="40" w:type="dxa"/>
+              <w:bottom w:w="0" w:type="dxa"/>
+              <w:right w:w="40" w:type="dxa"/>
+            </w:tcMar>
+          </w:tcPr>
+          <w:p>
+            <w:pPr>
+              <w:spacing w:before="0" w:after="0" w:line="360" w:lineRule="exact"/>
+            </w:pPr>
+            <w:r>
+              <w:rPr>
+                <w:rFonts w:ascii="宋体" w:hAnsi="宋体" w:eastAsia="宋体" w:cs="宋体"/>
+                <w:b/>
+                <w:sz w:val="28"/>
+                <w:u w:val="none"/>
+              </w:rPr>
+              <w:t>班级/学号：</w:t>
+            </w:r>
+          </w:p>
+        </w:tc>
+        <w:tc>
+          <w:tcPr>
+            <w:tcW w:type="dxa" w:w="6917"/>
+            <w:gridSpan w:val="3"/>
+            <w:vAlign w:val="center"/>
+            <w:tcMar>
+              <w:top w:w="0" w:type="dxa"/>
+              <w:left w:w="40" w:type="dxa"/>
+              <w:bottom w:w="0" w:type="dxa"/>
+              <w:right w:w="40" w:type="dxa"/>
+            </w:tcMar>
+          </w:tcPr>
+          <w:p>
+            <w:pPr>
+              <w:spacing w:before="0" w:after="0" w:line="360" w:lineRule="exact"/>
+            </w:pPr>
+            <w:r>
+              <w:rPr>
+                <w:rFonts w:ascii="宋体" w:hAnsi="宋体" w:eastAsia="宋体" w:cs="宋体"/>
+                <w:b w:val="0"/>
+                <w:sz w:val="28"/>
+                <w:u w:val="single"/>
+              </w:rPr>
+              <w:t>计科2401-本/2024070013</w:t>
+            </w:r>
+          </w:p>
+        </w:tc>
+      </w:tr>
+      <w:tr>
+        <w:tc>
+          <w:tcPr>
+            <w:tcW w:type="dxa" w:w="2948"/>
+            <w:gridSpan w:val="2"/>
+            <w:vAlign w:val="center"/>
+            <w:tcMar>
+              <w:top w:w="0" w:type="dxa"/>
+              <w:left w:w="40" w:type="dxa"/>
+              <w:bottom w:w="0" w:type="dxa"/>
+              <w:right w:w="40" w:type="dxa"/>
+            </w:tcMar>
+          </w:tcPr>
+          <w:p>
+            <w:pPr>
+              <w:spacing w:before="0" w:after="0" w:line="360" w:lineRule="exact"/>
+            </w:pPr>
+            <w:r>
+              <w:rPr>
+                <w:rFonts w:ascii="宋体" w:hAnsi="宋体" w:eastAsia="宋体" w:cs="宋体"/>
+                <w:b/>
+                <w:sz w:val="28"/>
+                <w:u w:val="none"/>
+              </w:rPr>
+              <w:t>指导老师/督导老师：</w:t>
+            </w:r>
+          </w:p>
+        </w:tc>
+        <w:tc>
+          <w:tcPr>
+            <w:tcW w:type="dxa" w:w="5670"/>
+            <w:gridSpan w:val="2"/>
+            <w:vAlign w:val="center"/>
+            <w:tcMar>
+              <w:top w:w="0" w:type="dxa"/>
+              <w:left w:w="40" w:type="dxa"/>
+              <w:bottom w:w="0" w:type="dxa"/>
+              <w:right w:w="40" w:type="dxa"/>
+            </w:tcMar>
+          </w:tcPr>
+          <w:p>
+            <w:pPr>
+              <w:spacing w:before="0" w:after="0" w:line="360" w:lineRule="exact"/>
+            </w:pPr>
+            <w:r>
+              <w:rPr>
+                <w:rFonts w:ascii="宋体" w:hAnsi="宋体" w:eastAsia="宋体" w:cs="宋体"/>
+                <w:b w:val="0"/>
+                <w:sz w:val="28"/>
+                <w:u w:val="single"/>
+              </w:rPr>
+              <w:t>乔文豹</w:t>
+            </w:r>
+          </w:p>
+        </w:tc>
+      </w:tr>
+      <w:tr>
+        <w:tc>
+          <w:tcPr>
+            <w:tcW w:type="dxa" w:w="1701"/>
+            <w:vAlign w:val="center"/>
+            <w:tcMar>
+              <w:top w:w="0" w:type="dxa"/>
+              <w:left w:w="40" w:type="dxa"/>
+              <w:bottom w:w="0" w:type="dxa"/>
+              <w:right w:w="40" w:type="dxa"/>
+            </w:tcMar>
+          </w:tcPr>
+          <w:p>
+            <w:pPr>
+              <w:spacing w:before="0" w:after="0" w:line="360" w:lineRule="exact"/>
+            </w:pPr>
+            <w:r>
+              <w:rPr>
+                <w:rFonts w:ascii="宋体" w:hAnsi="宋体" w:eastAsia="宋体" w:cs="宋体"/>
+                <w:b/>
+                <w:sz w:val="28"/>
+                <w:u w:val="none"/>
+              </w:rPr>
+              <w:t>起止时间：</w:t>
+            </w:r>
+          </w:p>
+        </w:tc>
+        <w:tc>
+          <w:tcPr>
+            <w:tcW w:type="dxa" w:w="6917"/>
+            <w:gridSpan w:val="3"/>
+            <w:vAlign w:val="center"/>
+            <w:tcMar>
+              <w:top w:w="0" w:type="dxa"/>
+              <w:left w:w="40" w:type="dxa"/>
+              <w:bottom w:w="0" w:type="dxa"/>
+              <w:right w:w="40" w:type="dxa"/>
+            </w:tcMar>
+          </w:tcPr>
+          <w:p>
+            <w:pPr>
+              <w:spacing w:before="0" w:after="0" w:line="360" w:lineRule="exact"/>
+            </w:pPr>
+            <w:r>
+              <w:rPr>
+                <w:rFonts w:ascii="宋体" w:hAnsi="宋体" w:eastAsia="宋体" w:cs="宋体"/>
+                <w:b w:val="0"/>
+                <w:sz w:val="28"/>
+                <w:u w:val="single"/>
+              </w:rPr>
+              <w:t>2026年2月23日至2026年5月22日</w:t>
+            </w:r>
+          </w:p>
+        </w:tc>
+      </w:tr>
+    </w:tbl>
     <w:p>
       <w:pPr>
         <w:sectPr>

</xml_diff>

<commit_message>
docs: expand thesis literature grounding
</commit_message>
<xml_diff>
--- a/docs/thesis/drafts/论文正文_程浩然_基于LangGraph的多Agent协作框架在医疗审计场景的设计与实现.docx
+++ b/docs/thesis/drafts/论文正文_程浩然_基于LangGraph的多Agent协作框架在医疗审计场景的设计与实现.docx
@@ -954,7 +954,7 @@
                 <w:b/>
                 <w:sz w:val="22"/>
               </w:rPr>
-              <w:t>5</w:t>
+              <w:t>6</w:t>
             </w:r>
           </w:p>
         </w:tc>
@@ -999,7 +999,7 @@
                 <w:b w:val="0"/>
                 <w:sz w:val="21"/>
               </w:rPr>
-              <w:t>6</w:t>
+              <w:t>7</w:t>
             </w:r>
           </w:p>
         </w:tc>
@@ -1044,7 +1044,7 @@
                 <w:b w:val="0"/>
                 <w:sz w:val="21"/>
               </w:rPr>
-              <w:t>6</w:t>
+              <w:t>8</w:t>
             </w:r>
           </w:p>
         </w:tc>
@@ -1089,7 +1089,7 @@
                 <w:b w:val="0"/>
                 <w:sz w:val="21"/>
               </w:rPr>
-              <w:t>7</w:t>
+              <w:t>9</w:t>
             </w:r>
           </w:p>
         </w:tc>
@@ -1134,7 +1134,7 @@
                 <w:b w:val="0"/>
                 <w:sz w:val="21"/>
               </w:rPr>
-              <w:t>8</w:t>
+              <w:t>11</w:t>
             </w:r>
           </w:p>
         </w:tc>
@@ -1179,7 +1179,7 @@
                 <w:b w:val="0"/>
                 <w:sz w:val="21"/>
               </w:rPr>
-              <w:t>9</w:t>
+              <w:t>12</w:t>
             </w:r>
           </w:p>
         </w:tc>
@@ -1224,7 +1224,7 @@
                 <w:b/>
                 <w:sz w:val="22"/>
               </w:rPr>
-              <w:t>12</w:t>
+              <w:t>14</w:t>
             </w:r>
           </w:p>
         </w:tc>
@@ -1269,7 +1269,7 @@
                 <w:b w:val="0"/>
                 <w:sz w:val="21"/>
               </w:rPr>
-              <w:t>12</w:t>
+              <w:t>14</w:t>
             </w:r>
           </w:p>
         </w:tc>
@@ -1314,7 +1314,7 @@
                 <w:b w:val="0"/>
                 <w:sz w:val="21"/>
               </w:rPr>
-              <w:t>13</w:t>
+              <w:t>15</w:t>
             </w:r>
           </w:p>
         </w:tc>
@@ -1359,7 +1359,7 @@
                 <w:b w:val="0"/>
                 <w:sz w:val="21"/>
               </w:rPr>
-              <w:t>13</w:t>
+              <w:t>15</w:t>
             </w:r>
           </w:p>
         </w:tc>
@@ -1404,7 +1404,7 @@
                 <w:b w:val="0"/>
                 <w:sz w:val="21"/>
               </w:rPr>
-              <w:t>14</w:t>
+              <w:t>16</w:t>
             </w:r>
           </w:p>
         </w:tc>
@@ -1449,7 +1449,7 @@
                 <w:b w:val="0"/>
                 <w:sz w:val="21"/>
               </w:rPr>
-              <w:t>16</w:t>
+              <w:t>18</w:t>
             </w:r>
           </w:p>
         </w:tc>
@@ -1494,7 +1494,7 @@
                 <w:b w:val="0"/>
                 <w:sz w:val="21"/>
               </w:rPr>
-              <w:t>18</w:t>
+              <w:t>20</w:t>
             </w:r>
           </w:p>
         </w:tc>
@@ -1539,7 +1539,7 @@
                 <w:b/>
                 <w:sz w:val="22"/>
               </w:rPr>
-              <w:t>21</w:t>
+              <w:t>23</w:t>
             </w:r>
           </w:p>
         </w:tc>
@@ -1584,7 +1584,7 @@
                 <w:b w:val="0"/>
                 <w:sz w:val="21"/>
               </w:rPr>
-              <w:t>21</w:t>
+              <w:t>23</w:t>
             </w:r>
           </w:p>
         </w:tc>
@@ -1629,7 +1629,7 @@
                 <w:b w:val="0"/>
                 <w:sz w:val="21"/>
               </w:rPr>
-              <w:t>21</w:t>
+              <w:t>23</w:t>
             </w:r>
           </w:p>
         </w:tc>
@@ -1674,7 +1674,7 @@
                 <w:b w:val="0"/>
                 <w:sz w:val="21"/>
               </w:rPr>
-              <w:t>22</w:t>
+              <w:t>24</w:t>
             </w:r>
           </w:p>
         </w:tc>
@@ -1719,7 +1719,7 @@
                 <w:b w:val="0"/>
                 <w:sz w:val="21"/>
               </w:rPr>
-              <w:t>24</w:t>
+              <w:t>26</w:t>
             </w:r>
           </w:p>
         </w:tc>
@@ -1764,7 +1764,7 @@
                 <w:b w:val="0"/>
                 <w:sz w:val="21"/>
               </w:rPr>
-              <w:t>25</w:t>
+              <w:t>27</w:t>
             </w:r>
           </w:p>
         </w:tc>
@@ -1809,7 +1809,7 @@
                 <w:b/>
                 <w:sz w:val="22"/>
               </w:rPr>
-              <w:t>28</w:t>
+              <w:t>30</w:t>
             </w:r>
           </w:p>
         </w:tc>
@@ -1854,7 +1854,7 @@
                 <w:b w:val="0"/>
                 <w:sz w:val="21"/>
               </w:rPr>
-              <w:t>28</w:t>
+              <w:t>30</w:t>
             </w:r>
           </w:p>
         </w:tc>
@@ -1899,7 +1899,7 @@
                 <w:b w:val="0"/>
                 <w:sz w:val="21"/>
               </w:rPr>
-              <w:t>29</w:t>
+              <w:t>31</w:t>
             </w:r>
           </w:p>
         </w:tc>
@@ -1944,7 +1944,7 @@
                 <w:b w:val="0"/>
                 <w:sz w:val="21"/>
               </w:rPr>
-              <w:t>31</w:t>
+              <w:t>33</w:t>
             </w:r>
           </w:p>
         </w:tc>
@@ -1989,7 +1989,7 @@
                 <w:b w:val="0"/>
                 <w:sz w:val="21"/>
               </w:rPr>
-              <w:t>34</w:t>
+              <w:t>36</w:t>
             </w:r>
           </w:p>
         </w:tc>
@@ -2034,7 +2034,7 @@
                 <w:b/>
                 <w:sz w:val="22"/>
               </w:rPr>
-              <w:t>36</w:t>
+              <w:t>38</w:t>
             </w:r>
           </w:p>
         </w:tc>
@@ -2079,7 +2079,7 @@
                 <w:b/>
                 <w:sz w:val="22"/>
               </w:rPr>
-              <w:t>37</w:t>
+              <w:t>39</w:t>
             </w:r>
           </w:p>
         </w:tc>
@@ -2124,7 +2124,7 @@
                 <w:b/>
                 <w:sz w:val="22"/>
               </w:rPr>
-              <w:t>39</w:t>
+              <w:t>41</w:t>
             </w:r>
           </w:p>
         </w:tc>
@@ -2387,6 +2387,226 @@
           <w:sz w:val="21"/>
         </w:rPr>
         <w:t>。因此，本课题并不把系统实现目标设定为替代医生诊断，而是定位为医疗资料整理和医疗审计辅助：通过工程化方式把原始资料转化为结构化数据，再使用状态机式多 Agent 协作框架完成质量检查、风险提示、证据补全和报告输出。</w:t>
+      </w:r>
+    </w:p>
+    <w:p>
+      <w:pPr>
+        <w:spacing w:before="0" w:after="0" w:line="360" w:lineRule="exact"/>
+        <w:ind w:firstLine="420"/>
+      </w:pPr>
+      <w:r>
+        <w:rPr>
+          <w:rFonts w:ascii="宋体" w:hAnsi="宋体" w:eastAsia="宋体" w:cs="宋体"/>
+          <w:b w:val="0"/>
+          <w:sz w:val="21"/>
+        </w:rPr>
+        <w:t>从国家卫生健康信息化建设要求看，医疗信息系统不仅要保存业务数据，还需要在数据标准、业务闭环、质量控制和安全管理方面形成制度化支撑</w:t>
+      </w:r>
+      <w:r>
+        <w:rPr>
+          <w:rFonts w:ascii="Times New Roman" w:hAnsi="Times New Roman" w:eastAsia="Times New Roman" w:cs="Times New Roman"/>
+          <w:b w:val="0"/>
+          <w:sz w:val="21"/>
+          <w:vertAlign w:val="superscript"/>
+        </w:rPr>
+        <w:t>[</w:t>
+      </w:r>
+      <w:r>
+        <w:rPr>
+          <w:rFonts w:ascii="Times New Roman" w:hAnsi="Times New Roman" w:eastAsia="Times New Roman" w:cs="Times New Roman"/>
+          <w:b w:val="0"/>
+          <w:sz w:val="21"/>
+          <w:vertAlign w:val="superscript"/>
+        </w:rPr>
+        <w:fldChar w:fldCharType="begin"/>
+        <w:instrText xml:space="preserve">REF ref_001 \h</w:instrText>
+        <w:fldChar w:fldCharType="separate"/>
+        <w:t>1</w:t>
+        <w:fldChar w:fldCharType="end"/>
+      </w:r>
+      <w:r>
+        <w:rPr>
+          <w:rFonts w:ascii="Times New Roman" w:hAnsi="Times New Roman" w:eastAsia="Times New Roman" w:cs="Times New Roman"/>
+          <w:b w:val="0"/>
+          <w:sz w:val="21"/>
+          <w:vertAlign w:val="superscript"/>
+        </w:rPr>
+        <w:t>]</w:t>
+      </w:r>
+      <w:r>
+        <w:rPr>
+          <w:rFonts w:ascii="宋体" w:hAnsi="宋体" w:eastAsia="宋体" w:cs="宋体"/>
+          <w:b w:val="0"/>
+          <w:sz w:val="21"/>
+        </w:rPr>
+        <w:t>。电子病历应用水平评价也把结构化记录、数据共享、闭环管理和过程留痕作为衡量医院信息化水平的重要维度</w:t>
+      </w:r>
+      <w:r>
+        <w:rPr>
+          <w:rFonts w:ascii="Times New Roman" w:hAnsi="Times New Roman" w:eastAsia="Times New Roman" w:cs="Times New Roman"/>
+          <w:b w:val="0"/>
+          <w:sz w:val="21"/>
+          <w:vertAlign w:val="superscript"/>
+        </w:rPr>
+        <w:t>[</w:t>
+      </w:r>
+      <w:r>
+        <w:rPr>
+          <w:rFonts w:ascii="Times New Roman" w:hAnsi="Times New Roman" w:eastAsia="Times New Roman" w:cs="Times New Roman"/>
+          <w:b w:val="0"/>
+          <w:sz w:val="21"/>
+          <w:vertAlign w:val="superscript"/>
+        </w:rPr>
+        <w:fldChar w:fldCharType="begin"/>
+        <w:instrText xml:space="preserve">REF ref_002 \h</w:instrText>
+        <w:fldChar w:fldCharType="separate"/>
+        <w:t>2</w:t>
+        <w:fldChar w:fldCharType="end"/>
+      </w:r>
+      <w:r>
+        <w:rPr>
+          <w:rFonts w:ascii="Times New Roman" w:hAnsi="Times New Roman" w:eastAsia="Times New Roman" w:cs="Times New Roman"/>
+          <w:b w:val="0"/>
+          <w:sz w:val="21"/>
+          <w:vertAlign w:val="superscript"/>
+        </w:rPr>
+        <w:t>]</w:t>
+      </w:r>
+      <w:r>
+        <w:rPr>
+          <w:rFonts w:ascii="宋体" w:hAnsi="宋体" w:eastAsia="宋体" w:cs="宋体"/>
+          <w:b w:val="0"/>
+          <w:sz w:val="21"/>
+        </w:rPr>
+        <w:t>。虽然本文系统面向个人健康资料而非医院核心业务系统，但其资料处理链路仍然需要借鉴这些要求：原始文件不能丢失，OCR 和标准化结果不能互相覆盖，指标和报告之间应建立可追踪关系。</w:t>
+      </w:r>
+    </w:p>
+    <w:p>
+      <w:pPr>
+        <w:spacing w:before="0" w:after="0" w:line="360" w:lineRule="exact"/>
+        <w:ind w:firstLine="420"/>
+      </w:pPr>
+      <w:r>
+        <w:rPr>
+          <w:rFonts w:ascii="宋体" w:hAnsi="宋体" w:eastAsia="宋体" w:cs="宋体"/>
+          <w:b w:val="0"/>
+          <w:sz w:val="21"/>
+        </w:rPr>
+        <w:t>个人健康资料中包含大量敏感个人信息和健康相关信息。GB/T 35273-2020 对个人信息处理活动中的目的明确、最小必要、访问控制、安全审计和个人敏感信息保护提出了规范性要求</w:t>
+      </w:r>
+      <w:r>
+        <w:rPr>
+          <w:rFonts w:ascii="Times New Roman" w:hAnsi="Times New Roman" w:eastAsia="Times New Roman" w:cs="Times New Roman"/>
+          <w:b w:val="0"/>
+          <w:sz w:val="21"/>
+          <w:vertAlign w:val="superscript"/>
+        </w:rPr>
+        <w:t>[</w:t>
+      </w:r>
+      <w:r>
+        <w:rPr>
+          <w:rFonts w:ascii="Times New Roman" w:hAnsi="Times New Roman" w:eastAsia="Times New Roman" w:cs="Times New Roman"/>
+          <w:b w:val="0"/>
+          <w:sz w:val="21"/>
+          <w:vertAlign w:val="superscript"/>
+        </w:rPr>
+        <w:fldChar w:fldCharType="begin"/>
+        <w:instrText xml:space="preserve">REF ref_003 \h</w:instrText>
+        <w:fldChar w:fldCharType="separate"/>
+        <w:t>3</w:t>
+        <w:fldChar w:fldCharType="end"/>
+      </w:r>
+      <w:r>
+        <w:rPr>
+          <w:rFonts w:ascii="Times New Roman" w:hAnsi="Times New Roman" w:eastAsia="Times New Roman" w:cs="Times New Roman"/>
+          <w:b w:val="0"/>
+          <w:sz w:val="21"/>
+          <w:vertAlign w:val="superscript"/>
+        </w:rPr>
+        <w:t>]</w:t>
+      </w:r>
+      <w:r>
+        <w:rPr>
+          <w:rFonts w:ascii="宋体" w:hAnsi="宋体" w:eastAsia="宋体" w:cs="宋体"/>
+          <w:b w:val="0"/>
+          <w:sz w:val="21"/>
+        </w:rPr>
+        <w:t>。因此，本文系统在设计时没有把所有文档直接送入不可控的外部接口，而是通过 Provider 抽象隔离外部服务，并在 provider_events、task_events 和 audit_report_events 中记录调用状态。这样的设计有助于后续部署时进一步加入脱敏、权限控制和审计日志导出。</w:t>
+      </w:r>
+    </w:p>
+    <w:p>
+      <w:pPr>
+        <w:spacing w:before="0" w:after="0" w:line="360" w:lineRule="exact"/>
+        <w:ind w:firstLine="420"/>
+      </w:pPr>
+      <w:r>
+        <w:rPr>
+          <w:rFonts w:ascii="宋体" w:hAnsi="宋体" w:eastAsia="宋体" w:cs="宋体"/>
+          <w:b w:val="0"/>
+          <w:sz w:val="21"/>
+        </w:rPr>
+        <w:t>从毕业设计选题角度看，医疗资料审计辅助系统比普通健康问答系统更适合工程实现。普通问答系统的重点是回答质量，而审计辅助系统的重点是资料是否完整、指标是否异常、结论是否有来源、报告是否越界。前者容易变成大模型提示词演示，后者需要数据库建模、任务队列、状态机编排、证据绑定和前端可视化共同支撑。本文选择后者，是为了让课题能够体现计算机专业毕业设计中“需求分析、系统设计、详细实现、测试验证”的完整过程</w:t>
+      </w:r>
+      <w:r>
+        <w:rPr>
+          <w:rFonts w:ascii="Times New Roman" w:hAnsi="Times New Roman" w:eastAsia="Times New Roman" w:cs="Times New Roman"/>
+          <w:b w:val="0"/>
+          <w:sz w:val="21"/>
+          <w:vertAlign w:val="superscript"/>
+        </w:rPr>
+        <w:t>[</w:t>
+      </w:r>
+      <w:r>
+        <w:rPr>
+          <w:rFonts w:ascii="Times New Roman" w:hAnsi="Times New Roman" w:eastAsia="Times New Roman" w:cs="Times New Roman"/>
+          <w:b w:val="0"/>
+          <w:sz w:val="21"/>
+          <w:vertAlign w:val="superscript"/>
+        </w:rPr>
+        <w:fldChar w:fldCharType="begin"/>
+        <w:instrText xml:space="preserve">REF ref_014 \h</w:instrText>
+        <w:fldChar w:fldCharType="separate"/>
+        <w:t>14</w:t>
+        <w:fldChar w:fldCharType="end"/>
+      </w:r>
+      <w:r>
+        <w:rPr>
+          <w:rFonts w:ascii="Times New Roman" w:hAnsi="Times New Roman" w:eastAsia="Times New Roman" w:cs="Times New Roman"/>
+          <w:b w:val="0"/>
+          <w:sz w:val="21"/>
+          <w:vertAlign w:val="superscript"/>
+        </w:rPr>
+        <w:t>-</w:t>
+      </w:r>
+      <w:r>
+        <w:rPr>
+          <w:rFonts w:ascii="Times New Roman" w:hAnsi="Times New Roman" w:eastAsia="Times New Roman" w:cs="Times New Roman"/>
+          <w:b w:val="0"/>
+          <w:sz w:val="21"/>
+          <w:vertAlign w:val="superscript"/>
+        </w:rPr>
+        <w:fldChar w:fldCharType="begin"/>
+        <w:instrText xml:space="preserve">REF ref_015 \h</w:instrText>
+        <w:fldChar w:fldCharType="separate"/>
+        <w:t>15</w:t>
+        <w:fldChar w:fldCharType="end"/>
+      </w:r>
+      <w:r>
+        <w:rPr>
+          <w:rFonts w:ascii="Times New Roman" w:hAnsi="Times New Roman" w:eastAsia="Times New Roman" w:cs="Times New Roman"/>
+          <w:b w:val="0"/>
+          <w:sz w:val="21"/>
+          <w:vertAlign w:val="superscript"/>
+        </w:rPr>
+        <w:t>]</w:t>
+      </w:r>
+      <w:r>
+        <w:rPr>
+          <w:rFonts w:ascii="宋体" w:hAnsi="宋体" w:eastAsia="宋体" w:cs="宋体"/>
+          <w:b w:val="0"/>
+          <w:sz w:val="21"/>
+        </w:rPr>
+        <w:t>。</w:t>
       </w:r>
     </w:p>
     <w:p>
@@ -2633,6 +2853,243 @@
           <w:b w:val="0"/>
           <w:sz w:val="21"/>
         </w:rPr>
+        <w:t>国内电子病历文本挖掘研究较早关注非结构化病历文本如何转化为可计算知识。吴宗友等将电子病历文本挖掘任务概括为数据清洗、数据集成、命名实体识别、关系抽取、信息检索和临床问答等环节</w:t>
+      </w:r>
+      <w:r>
+        <w:rPr>
+          <w:rFonts w:ascii="Times New Roman" w:hAnsi="Times New Roman" w:eastAsia="Times New Roman" w:cs="Times New Roman"/>
+          <w:b w:val="0"/>
+          <w:sz w:val="21"/>
+          <w:vertAlign w:val="superscript"/>
+        </w:rPr>
+        <w:t>[</w:t>
+      </w:r>
+      <w:r>
+        <w:rPr>
+          <w:rFonts w:ascii="Times New Roman" w:hAnsi="Times New Roman" w:eastAsia="Times New Roman" w:cs="Times New Roman"/>
+          <w:b w:val="0"/>
+          <w:sz w:val="21"/>
+          <w:vertAlign w:val="superscript"/>
+        </w:rPr>
+        <w:fldChar w:fldCharType="begin"/>
+        <w:instrText xml:space="preserve">REF ref_004 \h</w:instrText>
+        <w:fldChar w:fldCharType="separate"/>
+        <w:t>4</w:t>
+        <w:fldChar w:fldCharType="end"/>
+      </w:r>
+      <w:r>
+        <w:rPr>
+          <w:rFonts w:ascii="Times New Roman" w:hAnsi="Times New Roman" w:eastAsia="Times New Roman" w:cs="Times New Roman"/>
+          <w:b w:val="0"/>
+          <w:sz w:val="21"/>
+          <w:vertAlign w:val="superscript"/>
+        </w:rPr>
+        <w:t>]</w:t>
+      </w:r>
+      <w:r>
+        <w:rPr>
+          <w:rFonts w:ascii="宋体" w:hAnsi="宋体" w:eastAsia="宋体" w:cs="宋体"/>
+          <w:b w:val="0"/>
+          <w:sz w:val="21"/>
+        </w:rPr>
+        <w:t>。杜晋华等进一步围绕中文电子病历命名实体识别总结疾病、症状、检查、药物和身体部位等实体类型，并指出中文病历文本存在术语密集、表达不规范、标注语料不足等问题</w:t>
+      </w:r>
+      <w:r>
+        <w:rPr>
+          <w:rFonts w:ascii="Times New Roman" w:hAnsi="Times New Roman" w:eastAsia="Times New Roman" w:cs="Times New Roman"/>
+          <w:b w:val="0"/>
+          <w:sz w:val="21"/>
+          <w:vertAlign w:val="superscript"/>
+        </w:rPr>
+        <w:t>[</w:t>
+      </w:r>
+      <w:r>
+        <w:rPr>
+          <w:rFonts w:ascii="Times New Roman" w:hAnsi="Times New Roman" w:eastAsia="Times New Roman" w:cs="Times New Roman"/>
+          <w:b w:val="0"/>
+          <w:sz w:val="21"/>
+          <w:vertAlign w:val="superscript"/>
+        </w:rPr>
+        <w:fldChar w:fldCharType="begin"/>
+        <w:instrText xml:space="preserve">REF ref_005 \h</w:instrText>
+        <w:fldChar w:fldCharType="separate"/>
+        <w:t>5</w:t>
+        <w:fldChar w:fldCharType="end"/>
+      </w:r>
+      <w:r>
+        <w:rPr>
+          <w:rFonts w:ascii="Times New Roman" w:hAnsi="Times New Roman" w:eastAsia="Times New Roman" w:cs="Times New Roman"/>
+          <w:b w:val="0"/>
+          <w:sz w:val="21"/>
+          <w:vertAlign w:val="superscript"/>
+        </w:rPr>
+        <w:t>]</w:t>
+      </w:r>
+      <w:r>
+        <w:rPr>
+          <w:rFonts w:ascii="宋体" w:hAnsi="宋体" w:eastAsia="宋体" w:cs="宋体"/>
+          <w:b w:val="0"/>
+          <w:sz w:val="21"/>
+        </w:rPr>
+        <w:t>。这些研究说明，医疗文本处理需要先处理文本质量和结构化问题，不能直接跳到报告生成。</w:t>
+      </w:r>
+    </w:p>
+    <w:p>
+      <w:pPr>
+        <w:spacing w:before="0" w:after="0" w:line="360" w:lineRule="exact"/>
+        <w:ind w:firstLine="420"/>
+      </w:pPr>
+      <w:r>
+        <w:rPr>
+          <w:rFonts w:ascii="宋体" w:hAnsi="宋体" w:eastAsia="宋体" w:cs="宋体"/>
+          <w:b w:val="0"/>
+          <w:sz w:val="21"/>
+        </w:rPr>
+        <w:t>在具体模型方法方面，韩普等提出融合外部语义特征、深度学习模型和 CRF 输出的中文电子病历实体识别方法</w:t>
+      </w:r>
+      <w:r>
+        <w:rPr>
+          <w:rFonts w:ascii="Times New Roman" w:hAnsi="Times New Roman" w:eastAsia="Times New Roman" w:cs="Times New Roman"/>
+          <w:b w:val="0"/>
+          <w:sz w:val="21"/>
+          <w:vertAlign w:val="superscript"/>
+        </w:rPr>
+        <w:t>[</w:t>
+      </w:r>
+      <w:r>
+        <w:rPr>
+          <w:rFonts w:ascii="Times New Roman" w:hAnsi="Times New Roman" w:eastAsia="Times New Roman" w:cs="Times New Roman"/>
+          <w:b w:val="0"/>
+          <w:sz w:val="21"/>
+          <w:vertAlign w:val="superscript"/>
+        </w:rPr>
+        <w:fldChar w:fldCharType="begin"/>
+        <w:instrText xml:space="preserve">REF ref_006 \h</w:instrText>
+        <w:fldChar w:fldCharType="separate"/>
+        <w:t>6</w:t>
+        <w:fldChar w:fldCharType="end"/>
+      </w:r>
+      <w:r>
+        <w:rPr>
+          <w:rFonts w:ascii="Times New Roman" w:hAnsi="Times New Roman" w:eastAsia="Times New Roman" w:cs="Times New Roman"/>
+          <w:b w:val="0"/>
+          <w:sz w:val="21"/>
+          <w:vertAlign w:val="superscript"/>
+        </w:rPr>
+        <w:t>]</w:t>
+      </w:r>
+      <w:r>
+        <w:rPr>
+          <w:rFonts w:ascii="宋体" w:hAnsi="宋体" w:eastAsia="宋体" w:cs="宋体"/>
+          <w:b w:val="0"/>
+          <w:sz w:val="21"/>
+        </w:rPr>
+        <w:t>，崔少国等则从汉字图像、五笔编码、医学词典和 Lattice 结构等角度补充语义与边界信息</w:t>
+      </w:r>
+      <w:r>
+        <w:rPr>
+          <w:rFonts w:ascii="Times New Roman" w:hAnsi="Times New Roman" w:eastAsia="Times New Roman" w:cs="Times New Roman"/>
+          <w:b w:val="0"/>
+          <w:sz w:val="21"/>
+          <w:vertAlign w:val="superscript"/>
+        </w:rPr>
+        <w:t>[</w:t>
+      </w:r>
+      <w:r>
+        <w:rPr>
+          <w:rFonts w:ascii="Times New Roman" w:hAnsi="Times New Roman" w:eastAsia="Times New Roman" w:cs="Times New Roman"/>
+          <w:b w:val="0"/>
+          <w:sz w:val="21"/>
+          <w:vertAlign w:val="superscript"/>
+        </w:rPr>
+        <w:fldChar w:fldCharType="begin"/>
+        <w:instrText xml:space="preserve">REF ref_007 \h</w:instrText>
+        <w:fldChar w:fldCharType="separate"/>
+        <w:t>7</w:t>
+        <w:fldChar w:fldCharType="end"/>
+      </w:r>
+      <w:r>
+        <w:rPr>
+          <w:rFonts w:ascii="Times New Roman" w:hAnsi="Times New Roman" w:eastAsia="Times New Roman" w:cs="Times New Roman"/>
+          <w:b w:val="0"/>
+          <w:sz w:val="21"/>
+          <w:vertAlign w:val="superscript"/>
+        </w:rPr>
+        <w:t>]</w:t>
+      </w:r>
+      <w:r>
+        <w:rPr>
+          <w:rFonts w:ascii="宋体" w:hAnsi="宋体" w:eastAsia="宋体" w:cs="宋体"/>
+          <w:b w:val="0"/>
+          <w:sz w:val="21"/>
+        </w:rPr>
+        <w:t>。这些工作重点提升实体识别精度，而本文重点不在训练新的 NER 模型，而是在工程系统中保留原文、版本、指标和证据关系。二者并不冲突：专门模型可以作为未来 Provider 或标准化组件接入，本文当前实现先解决数据链路和审计可追溯问题。</w:t>
+      </w:r>
+    </w:p>
+    <w:p>
+      <w:pPr>
+        <w:spacing w:before="0" w:after="0" w:line="360" w:lineRule="exact"/>
+        <w:ind w:firstLine="420"/>
+      </w:pPr>
+      <w:r>
+        <w:rPr>
+          <w:rFonts w:ascii="宋体" w:hAnsi="宋体" w:eastAsia="宋体" w:cs="宋体"/>
+          <w:b w:val="0"/>
+          <w:sz w:val="21"/>
+        </w:rPr>
+        <w:t>真实世界数据治理研究对本文也有直接启发。盖彦蓉等指出，真实世界中文电子病历的数据质量、术语差异、数据稀疏和治理流程会影响知识抽取效果</w:t>
+      </w:r>
+      <w:r>
+        <w:rPr>
+          <w:rFonts w:ascii="Times New Roman" w:hAnsi="Times New Roman" w:eastAsia="Times New Roman" w:cs="Times New Roman"/>
+          <w:b w:val="0"/>
+          <w:sz w:val="21"/>
+          <w:vertAlign w:val="superscript"/>
+        </w:rPr>
+        <w:t>[</w:t>
+      </w:r>
+      <w:r>
+        <w:rPr>
+          <w:rFonts w:ascii="Times New Roman" w:hAnsi="Times New Roman" w:eastAsia="Times New Roman" w:cs="Times New Roman"/>
+          <w:b w:val="0"/>
+          <w:sz w:val="21"/>
+          <w:vertAlign w:val="superscript"/>
+        </w:rPr>
+        <w:fldChar w:fldCharType="begin"/>
+        <w:instrText xml:space="preserve">REF ref_008 \h</w:instrText>
+        <w:fldChar w:fldCharType="separate"/>
+        <w:t>8</w:t>
+        <w:fldChar w:fldCharType="end"/>
+      </w:r>
+      <w:r>
+        <w:rPr>
+          <w:rFonts w:ascii="Times New Roman" w:hAnsi="Times New Roman" w:eastAsia="Times New Roman" w:cs="Times New Roman"/>
+          <w:b w:val="0"/>
+          <w:sz w:val="21"/>
+          <w:vertAlign w:val="superscript"/>
+        </w:rPr>
+        <w:t>]</w:t>
+      </w:r>
+      <w:r>
+        <w:rPr>
+          <w:rFonts w:ascii="宋体" w:hAnsi="宋体" w:eastAsia="宋体" w:cs="宋体"/>
+          <w:b w:val="0"/>
+          <w:sz w:val="21"/>
+        </w:rPr>
+        <w:t>。本文面对的个人体检报告、化验单和病历摘要同样存在模板差异、单位差异和叙事表述差异。因此，系统设计中将 OCR 原文、normalized_payload、document_versions、measurements 和 audit_report_events 分开保存，使后续即使标准化规则或模型发生变化，也能回到当时的数据版本解释报告结果。</w:t>
+      </w:r>
+    </w:p>
+    <w:p>
+      <w:pPr>
+        <w:spacing w:before="0" w:after="0" w:line="360" w:lineRule="exact"/>
+        <w:ind w:firstLine="420"/>
+      </w:pPr>
+      <w:r>
+        <w:rPr>
+          <w:rFonts w:ascii="宋体" w:hAnsi="宋体" w:eastAsia="宋体" w:cs="宋体"/>
+          <w:b w:val="0"/>
+          <w:sz w:val="21"/>
+        </w:rPr>
         <w:t>在工程架构方向，检索增强生成、推理与工具调用结合、多 Agent 协作成为提升生成式系统可控性的常用方式。RAG 通过外部知识或业务数据补充模型上下文，降低脱离事实回答的概率</w:t>
       </w:r>
       <w:r>
@@ -2751,6 +3208,290 @@
           <w:sz w:val="21"/>
         </w:rPr>
         <w:t>。这些工作为本文拆分审计节点、保存中间状态和设计回环复核提供了参考。</w:t>
+      </w:r>
+    </w:p>
+    <w:p>
+      <w:pPr>
+        <w:spacing w:before="0" w:after="0" w:line="360" w:lineRule="exact"/>
+        <w:ind w:firstLine="420"/>
+      </w:pPr>
+      <w:r>
+        <w:rPr>
+          <w:rFonts w:ascii="宋体" w:hAnsi="宋体" w:eastAsia="宋体" w:cs="宋体"/>
+          <w:b w:val="0"/>
+          <w:sz w:val="21"/>
+        </w:rPr>
+        <w:t>国外研究中，RAG、ReAct 和多 Agent 框架更多从通用自然语言处理和复杂任务求解角度提出方法。Lewis 等的 RAG 工作强调将参数化模型和可检索外部记忆结合，以提高知识密集型任务的事实性和可更新性</w:t>
+      </w:r>
+      <w:r>
+        <w:rPr>
+          <w:rFonts w:ascii="Times New Roman" w:hAnsi="Times New Roman" w:eastAsia="Times New Roman" w:cs="Times New Roman"/>
+          <w:b w:val="0"/>
+          <w:sz w:val="21"/>
+          <w:vertAlign w:val="superscript"/>
+        </w:rPr>
+        <w:t>[</w:t>
+      </w:r>
+      <w:r>
+        <w:rPr>
+          <w:rFonts w:ascii="Times New Roman" w:hAnsi="Times New Roman" w:eastAsia="Times New Roman" w:cs="Times New Roman"/>
+          <w:b w:val="0"/>
+          <w:sz w:val="21"/>
+          <w:vertAlign w:val="superscript"/>
+        </w:rPr>
+        <w:fldChar w:fldCharType="begin"/>
+        <w:instrText xml:space="preserve">REF ref_019 \h</w:instrText>
+        <w:fldChar w:fldCharType="separate"/>
+        <w:t>19</w:t>
+        <w:fldChar w:fldCharType="end"/>
+      </w:r>
+      <w:r>
+        <w:rPr>
+          <w:rFonts w:ascii="Times New Roman" w:hAnsi="Times New Roman" w:eastAsia="Times New Roman" w:cs="Times New Roman"/>
+          <w:b w:val="0"/>
+          <w:sz w:val="21"/>
+          <w:vertAlign w:val="superscript"/>
+        </w:rPr>
+        <w:t>]</w:t>
+      </w:r>
+      <w:r>
+        <w:rPr>
+          <w:rFonts w:ascii="宋体" w:hAnsi="宋体" w:eastAsia="宋体" w:cs="宋体"/>
+          <w:b w:val="0"/>
+          <w:sz w:val="21"/>
+        </w:rPr>
+        <w:t>；Yao 等提出的 ReAct 将推理和行动交替组织，使模型能够利用外部工具或环境反馈修正任务过程</w:t>
+      </w:r>
+      <w:r>
+        <w:rPr>
+          <w:rFonts w:ascii="Times New Roman" w:hAnsi="Times New Roman" w:eastAsia="Times New Roman" w:cs="Times New Roman"/>
+          <w:b w:val="0"/>
+          <w:sz w:val="21"/>
+          <w:vertAlign w:val="superscript"/>
+        </w:rPr>
+        <w:t>[</w:t>
+      </w:r>
+      <w:r>
+        <w:rPr>
+          <w:rFonts w:ascii="Times New Roman" w:hAnsi="Times New Roman" w:eastAsia="Times New Roman" w:cs="Times New Roman"/>
+          <w:b w:val="0"/>
+          <w:sz w:val="21"/>
+          <w:vertAlign w:val="superscript"/>
+        </w:rPr>
+        <w:fldChar w:fldCharType="begin"/>
+        <w:instrText xml:space="preserve">REF ref_020 \h</w:instrText>
+        <w:fldChar w:fldCharType="separate"/>
+        <w:t>20</w:t>
+        <w:fldChar w:fldCharType="end"/>
+      </w:r>
+      <w:r>
+        <w:rPr>
+          <w:rFonts w:ascii="Times New Roman" w:hAnsi="Times New Roman" w:eastAsia="Times New Roman" w:cs="Times New Roman"/>
+          <w:b w:val="0"/>
+          <w:sz w:val="21"/>
+          <w:vertAlign w:val="superscript"/>
+        </w:rPr>
+        <w:t>]</w:t>
+      </w:r>
+      <w:r>
+        <w:rPr>
+          <w:rFonts w:ascii="宋体" w:hAnsi="宋体" w:eastAsia="宋体" w:cs="宋体"/>
+          <w:b w:val="0"/>
+          <w:sz w:val="21"/>
+        </w:rPr>
+        <w:t>；Wu 等提出的 AutoGen 强调多个可配置 Agent 之间的会话协同</w:t>
+      </w:r>
+      <w:r>
+        <w:rPr>
+          <w:rFonts w:ascii="Times New Roman" w:hAnsi="Times New Roman" w:eastAsia="Times New Roman" w:cs="Times New Roman"/>
+          <w:b w:val="0"/>
+          <w:sz w:val="21"/>
+          <w:vertAlign w:val="superscript"/>
+        </w:rPr>
+        <w:t>[</w:t>
+      </w:r>
+      <w:r>
+        <w:rPr>
+          <w:rFonts w:ascii="Times New Roman" w:hAnsi="Times New Roman" w:eastAsia="Times New Roman" w:cs="Times New Roman"/>
+          <w:b w:val="0"/>
+          <w:sz w:val="21"/>
+          <w:vertAlign w:val="superscript"/>
+        </w:rPr>
+        <w:fldChar w:fldCharType="begin"/>
+        <w:instrText xml:space="preserve">REF ref_021 \h</w:instrText>
+        <w:fldChar w:fldCharType="separate"/>
+        <w:t>21</w:t>
+        <w:fldChar w:fldCharType="end"/>
+      </w:r>
+      <w:r>
+        <w:rPr>
+          <w:rFonts w:ascii="Times New Roman" w:hAnsi="Times New Roman" w:eastAsia="Times New Roman" w:cs="Times New Roman"/>
+          <w:b w:val="0"/>
+          <w:sz w:val="21"/>
+          <w:vertAlign w:val="superscript"/>
+        </w:rPr>
+        <w:t>]</w:t>
+      </w:r>
+      <w:r>
+        <w:rPr>
+          <w:rFonts w:ascii="宋体" w:hAnsi="宋体" w:eastAsia="宋体" w:cs="宋体"/>
+          <w:b w:val="0"/>
+          <w:sz w:val="21"/>
+        </w:rPr>
+        <w:t>。这些方法给本文的启示是：医疗资料审计不应把模型输出当作唯一结果，而应把检索、工具调用、证据绑定和审查节点纳入流程。</w:t>
+      </w:r>
+    </w:p>
+    <w:p>
+      <w:pPr>
+        <w:spacing w:before="0" w:after="0" w:line="360" w:lineRule="exact"/>
+        <w:ind w:firstLine="420"/>
+      </w:pPr>
+      <w:r>
+        <w:rPr>
+          <w:rFonts w:ascii="宋体" w:hAnsi="宋体" w:eastAsia="宋体" w:cs="宋体"/>
+          <w:b w:val="0"/>
+          <w:sz w:val="21"/>
+        </w:rPr>
+        <w:t>在医疗大模型方向，国内外研究均强调机遇与风险并存。国内文献从医疗服务、医学研究、医学教育、知识增强和基础模型体系等角度梳理了生成式大模型的应用空间，也反复指出准确性、可解释性、隐私保护、伦理和结果可控性等问题</w:t>
+      </w:r>
+      <w:r>
+        <w:rPr>
+          <w:rFonts w:ascii="Times New Roman" w:hAnsi="Times New Roman" w:eastAsia="Times New Roman" w:cs="Times New Roman"/>
+          <w:b w:val="0"/>
+          <w:sz w:val="21"/>
+          <w:vertAlign w:val="superscript"/>
+        </w:rPr>
+        <w:t>[</w:t>
+      </w:r>
+      <w:r>
+        <w:rPr>
+          <w:rFonts w:ascii="Times New Roman" w:hAnsi="Times New Roman" w:eastAsia="Times New Roman" w:cs="Times New Roman"/>
+          <w:b w:val="0"/>
+          <w:sz w:val="21"/>
+          <w:vertAlign w:val="superscript"/>
+        </w:rPr>
+        <w:fldChar w:fldCharType="begin"/>
+        <w:instrText xml:space="preserve">REF ref_009 \h</w:instrText>
+        <w:fldChar w:fldCharType="separate"/>
+        <w:t>9</w:t>
+        <w:fldChar w:fldCharType="end"/>
+      </w:r>
+      <w:r>
+        <w:rPr>
+          <w:rFonts w:ascii="Times New Roman" w:hAnsi="Times New Roman" w:eastAsia="Times New Roman" w:cs="Times New Roman"/>
+          <w:b w:val="0"/>
+          <w:sz w:val="21"/>
+          <w:vertAlign w:val="superscript"/>
+        </w:rPr>
+        <w:t>-</w:t>
+      </w:r>
+      <w:r>
+        <w:rPr>
+          <w:rFonts w:ascii="Times New Roman" w:hAnsi="Times New Roman" w:eastAsia="Times New Roman" w:cs="Times New Roman"/>
+          <w:b w:val="0"/>
+          <w:sz w:val="21"/>
+          <w:vertAlign w:val="superscript"/>
+        </w:rPr>
+        <w:fldChar w:fldCharType="begin"/>
+        <w:instrText xml:space="preserve">REF ref_013 \h</w:instrText>
+        <w:fldChar w:fldCharType="separate"/>
+        <w:t>13</w:t>
+        <w:fldChar w:fldCharType="end"/>
+      </w:r>
+      <w:r>
+        <w:rPr>
+          <w:rFonts w:ascii="Times New Roman" w:hAnsi="Times New Roman" w:eastAsia="Times New Roman" w:cs="Times New Roman"/>
+          <w:b w:val="0"/>
+          <w:sz w:val="21"/>
+          <w:vertAlign w:val="superscript"/>
+        </w:rPr>
+        <w:t>]</w:t>
+      </w:r>
+      <w:r>
+        <w:rPr>
+          <w:rFonts w:ascii="宋体" w:hAnsi="宋体" w:eastAsia="宋体" w:cs="宋体"/>
+          <w:b w:val="0"/>
+          <w:sz w:val="21"/>
+        </w:rPr>
+        <w:t>。Thirunavukarasu 等从国际视角讨论 LLM 在医学中的潜力与风险</w:t>
+      </w:r>
+      <w:r>
+        <w:rPr>
+          <w:rFonts w:ascii="Times New Roman" w:hAnsi="Times New Roman" w:eastAsia="Times New Roman" w:cs="Times New Roman"/>
+          <w:b w:val="0"/>
+          <w:sz w:val="21"/>
+          <w:vertAlign w:val="superscript"/>
+        </w:rPr>
+        <w:t>[</w:t>
+      </w:r>
+      <w:r>
+        <w:rPr>
+          <w:rFonts w:ascii="Times New Roman" w:hAnsi="Times New Roman" w:eastAsia="Times New Roman" w:cs="Times New Roman"/>
+          <w:b w:val="0"/>
+          <w:sz w:val="21"/>
+          <w:vertAlign w:val="superscript"/>
+        </w:rPr>
+        <w:fldChar w:fldCharType="begin"/>
+        <w:instrText xml:space="preserve">REF ref_023 \h</w:instrText>
+        <w:fldChar w:fldCharType="separate"/>
+        <w:t>23</w:t>
+        <w:fldChar w:fldCharType="end"/>
+      </w:r>
+      <w:r>
+        <w:rPr>
+          <w:rFonts w:ascii="Times New Roman" w:hAnsi="Times New Roman" w:eastAsia="Times New Roman" w:cs="Times New Roman"/>
+          <w:b w:val="0"/>
+          <w:sz w:val="21"/>
+          <w:vertAlign w:val="superscript"/>
+        </w:rPr>
+        <w:t>]</w:t>
+      </w:r>
+      <w:r>
+        <w:rPr>
+          <w:rFonts w:ascii="宋体" w:hAnsi="宋体" w:eastAsia="宋体" w:cs="宋体"/>
+          <w:b w:val="0"/>
+          <w:sz w:val="21"/>
+        </w:rPr>
+        <w:t>，Wornow 等则特别提醒 EHR 数据的异质性、缺失性和编码差异会削弱模型在真实医疗系统中的可靠性</w:t>
+      </w:r>
+      <w:r>
+        <w:rPr>
+          <w:rFonts w:ascii="Times New Roman" w:hAnsi="Times New Roman" w:eastAsia="Times New Roman" w:cs="Times New Roman"/>
+          <w:b w:val="0"/>
+          <w:sz w:val="21"/>
+          <w:vertAlign w:val="superscript"/>
+        </w:rPr>
+        <w:t>[</w:t>
+      </w:r>
+      <w:r>
+        <w:rPr>
+          <w:rFonts w:ascii="Times New Roman" w:hAnsi="Times New Roman" w:eastAsia="Times New Roman" w:cs="Times New Roman"/>
+          <w:b w:val="0"/>
+          <w:sz w:val="21"/>
+          <w:vertAlign w:val="superscript"/>
+        </w:rPr>
+        <w:fldChar w:fldCharType="begin"/>
+        <w:instrText xml:space="preserve">REF ref_024 \h</w:instrText>
+        <w:fldChar w:fldCharType="separate"/>
+        <w:t>24</w:t>
+        <w:fldChar w:fldCharType="end"/>
+      </w:r>
+      <w:r>
+        <w:rPr>
+          <w:rFonts w:ascii="Times New Roman" w:hAnsi="Times New Roman" w:eastAsia="Times New Roman" w:cs="Times New Roman"/>
+          <w:b w:val="0"/>
+          <w:sz w:val="21"/>
+          <w:vertAlign w:val="superscript"/>
+        </w:rPr>
+        <w:t>]</w:t>
+      </w:r>
+      <w:r>
+        <w:rPr>
+          <w:rFonts w:ascii="宋体" w:hAnsi="宋体" w:eastAsia="宋体" w:cs="宋体"/>
+          <w:b w:val="0"/>
+          <w:sz w:val="21"/>
+        </w:rPr>
+        <w:t>。这也是本文把系统定位为“审计辅助”而不是“诊断系统”的主要原因。</w:t>
       </w:r>
     </w:p>
     <w:p>
@@ -4074,6 +4815,134 @@
           <w:b w:val="0"/>
           <w:sz w:val="21"/>
         </w:rPr>
+        <w:t>标准化工作的第一层是格式标准化，即把不同医院、体检机构或实验室给出的 PDF、图片、文本报告统一进入文件表和 OCR 表；第二层是语义标准化，即把“空腹血糖”“葡萄糖”“GLU”等可能指向同一指标的表达映射到统一字段；第三层是过程标准化，即记录每一次 OCR、标准化和报告生成的版本关系。国家医院信息化建设标准和电子病历应用水平评价虽然面向医院系统，但其中关于数据质量、业务闭环和过程留痕的要求，对个人健康资料管理系统同样具有借鉴意义</w:t>
+      </w:r>
+      <w:r>
+        <w:rPr>
+          <w:rFonts w:ascii="Times New Roman" w:hAnsi="Times New Roman" w:eastAsia="Times New Roman" w:cs="Times New Roman"/>
+          <w:b w:val="0"/>
+          <w:sz w:val="21"/>
+          <w:vertAlign w:val="superscript"/>
+        </w:rPr>
+        <w:t>[</w:t>
+      </w:r>
+      <w:r>
+        <w:rPr>
+          <w:rFonts w:ascii="Times New Roman" w:hAnsi="Times New Roman" w:eastAsia="Times New Roman" w:cs="Times New Roman"/>
+          <w:b w:val="0"/>
+          <w:sz w:val="21"/>
+          <w:vertAlign w:val="superscript"/>
+        </w:rPr>
+        <w:fldChar w:fldCharType="begin"/>
+        <w:instrText xml:space="preserve">REF ref_001 \h</w:instrText>
+        <w:fldChar w:fldCharType="separate"/>
+        <w:t>1</w:t>
+        <w:fldChar w:fldCharType="end"/>
+      </w:r>
+      <w:r>
+        <w:rPr>
+          <w:rFonts w:ascii="Times New Roman" w:hAnsi="Times New Roman" w:eastAsia="Times New Roman" w:cs="Times New Roman"/>
+          <w:b w:val="0"/>
+          <w:sz w:val="21"/>
+          <w:vertAlign w:val="superscript"/>
+        </w:rPr>
+        <w:t>-</w:t>
+      </w:r>
+      <w:r>
+        <w:rPr>
+          <w:rFonts w:ascii="Times New Roman" w:hAnsi="Times New Roman" w:eastAsia="Times New Roman" w:cs="Times New Roman"/>
+          <w:b w:val="0"/>
+          <w:sz w:val="21"/>
+          <w:vertAlign w:val="superscript"/>
+        </w:rPr>
+        <w:fldChar w:fldCharType="begin"/>
+        <w:instrText xml:space="preserve">REF ref_002 \h</w:instrText>
+        <w:fldChar w:fldCharType="separate"/>
+        <w:t>2</w:t>
+        <w:fldChar w:fldCharType="end"/>
+      </w:r>
+      <w:r>
+        <w:rPr>
+          <w:rFonts w:ascii="Times New Roman" w:hAnsi="Times New Roman" w:eastAsia="Times New Roman" w:cs="Times New Roman"/>
+          <w:b w:val="0"/>
+          <w:sz w:val="21"/>
+          <w:vertAlign w:val="superscript"/>
+        </w:rPr>
+        <w:t>]</w:t>
+      </w:r>
+      <w:r>
+        <w:rPr>
+          <w:rFonts w:ascii="宋体" w:hAnsi="宋体" w:eastAsia="宋体" w:cs="宋体"/>
+          <w:b w:val="0"/>
+          <w:sz w:val="21"/>
+        </w:rPr>
+        <w:t>。</w:t>
+      </w:r>
+    </w:p>
+    <w:p>
+      <w:pPr>
+        <w:spacing w:before="0" w:after="0" w:line="360" w:lineRule="exact"/>
+        <w:ind w:firstLine="420"/>
+      </w:pPr>
+      <w:r>
+        <w:rPr>
+          <w:rFonts w:ascii="宋体" w:hAnsi="宋体" w:eastAsia="宋体" w:cs="宋体"/>
+          <w:b w:val="0"/>
+          <w:sz w:val="21"/>
+        </w:rPr>
+        <w:t>从隐私和安全角度看，医疗资料中的姓名、年龄、检查编号、报告日期、检查结果和病史描述都可能构成敏感个人信息。个人信息安全规范强调处理个人信息应遵循目的明确、最小必要和安全保障原则</w:t>
+      </w:r>
+      <w:r>
+        <w:rPr>
+          <w:rFonts w:ascii="Times New Roman" w:hAnsi="Times New Roman" w:eastAsia="Times New Roman" w:cs="Times New Roman"/>
+          <w:b w:val="0"/>
+          <w:sz w:val="21"/>
+          <w:vertAlign w:val="superscript"/>
+        </w:rPr>
+        <w:t>[</w:t>
+      </w:r>
+      <w:r>
+        <w:rPr>
+          <w:rFonts w:ascii="Times New Roman" w:hAnsi="Times New Roman" w:eastAsia="Times New Roman" w:cs="Times New Roman"/>
+          <w:b w:val="0"/>
+          <w:sz w:val="21"/>
+          <w:vertAlign w:val="superscript"/>
+        </w:rPr>
+        <w:fldChar w:fldCharType="begin"/>
+        <w:instrText xml:space="preserve">REF ref_003 \h</w:instrText>
+        <w:fldChar w:fldCharType="separate"/>
+        <w:t>3</w:t>
+        <w:fldChar w:fldCharType="end"/>
+      </w:r>
+      <w:r>
+        <w:rPr>
+          <w:rFonts w:ascii="Times New Roman" w:hAnsi="Times New Roman" w:eastAsia="Times New Roman" w:cs="Times New Roman"/>
+          <w:b w:val="0"/>
+          <w:sz w:val="21"/>
+          <w:vertAlign w:val="superscript"/>
+        </w:rPr>
+        <w:t>]</w:t>
+      </w:r>
+      <w:r>
+        <w:rPr>
+          <w:rFonts w:ascii="宋体" w:hAnsi="宋体" w:eastAsia="宋体" w:cs="宋体"/>
+          <w:b w:val="0"/>
+          <w:sz w:val="21"/>
+        </w:rPr>
+        <w:t>。因此，本文系统在本地毕业设计阶段虽然以 Mock 数据为主，但数据模型仍按真实系统思路保留 user_id 隔离、任务事件、Provider 调用事件和审计事件。这样做不是为了增加复杂度，而是为了让系统具备后续上线时扩展权限控制、脱敏和日志审计的基础。</w:t>
+      </w:r>
+    </w:p>
+    <w:p>
+      <w:pPr>
+        <w:spacing w:before="0" w:after="0" w:line="360" w:lineRule="exact"/>
+        <w:ind w:firstLine="420"/>
+      </w:pPr>
+      <w:r>
+        <w:rPr>
+          <w:rFonts w:ascii="宋体" w:hAnsi="宋体" w:eastAsia="宋体" w:cs="宋体"/>
+          <w:b w:val="0"/>
+          <w:sz w:val="21"/>
+        </w:rPr>
         <w:t>吴宗友等在《电子病历文本挖掘研究综述》中将电子病历文本挖掘整理为数据清洗、数据集成、命名实体识别、关系抽取、信息检索和临床问答等任务，并指出电子病历文本包含大量非结构化信息，需要通过文本挖掘转化为可利用知识</w:t>
       </w:r>
       <w:r>
@@ -4258,6 +5127,81 @@
           <w:b w:val="0"/>
           <w:sz w:val="21"/>
         </w:rPr>
+        <w:t>上述 NER 研究通常以标注数据集和实体边界识别为重点，适合解决疾病、症状、检查和药物等实体抽取问题</w:t>
+      </w:r>
+      <w:r>
+        <w:rPr>
+          <w:rFonts w:ascii="Times New Roman" w:hAnsi="Times New Roman" w:eastAsia="Times New Roman" w:cs="Times New Roman"/>
+          <w:b w:val="0"/>
+          <w:sz w:val="21"/>
+          <w:vertAlign w:val="superscript"/>
+        </w:rPr>
+        <w:t>[</w:t>
+      </w:r>
+      <w:r>
+        <w:rPr>
+          <w:rFonts w:ascii="Times New Roman" w:hAnsi="Times New Roman" w:eastAsia="Times New Roman" w:cs="Times New Roman"/>
+          <w:b w:val="0"/>
+          <w:sz w:val="21"/>
+          <w:vertAlign w:val="superscript"/>
+        </w:rPr>
+        <w:fldChar w:fldCharType="begin"/>
+        <w:instrText xml:space="preserve">REF ref_005 \h</w:instrText>
+        <w:fldChar w:fldCharType="separate"/>
+        <w:t>5</w:t>
+        <w:fldChar w:fldCharType="end"/>
+      </w:r>
+      <w:r>
+        <w:rPr>
+          <w:rFonts w:ascii="Times New Roman" w:hAnsi="Times New Roman" w:eastAsia="Times New Roman" w:cs="Times New Roman"/>
+          <w:b w:val="0"/>
+          <w:sz w:val="21"/>
+          <w:vertAlign w:val="superscript"/>
+        </w:rPr>
+        <w:t>-</w:t>
+      </w:r>
+      <w:r>
+        <w:rPr>
+          <w:rFonts w:ascii="Times New Roman" w:hAnsi="Times New Roman" w:eastAsia="Times New Roman" w:cs="Times New Roman"/>
+          <w:b w:val="0"/>
+          <w:sz w:val="21"/>
+          <w:vertAlign w:val="superscript"/>
+        </w:rPr>
+        <w:fldChar w:fldCharType="begin"/>
+        <w:instrText xml:space="preserve">REF ref_007 \h</w:instrText>
+        <w:fldChar w:fldCharType="separate"/>
+        <w:t>7</w:t>
+        <w:fldChar w:fldCharType="end"/>
+      </w:r>
+      <w:r>
+        <w:rPr>
+          <w:rFonts w:ascii="Times New Roman" w:hAnsi="Times New Roman" w:eastAsia="Times New Roman" w:cs="Times New Roman"/>
+          <w:b w:val="0"/>
+          <w:sz w:val="21"/>
+          <w:vertAlign w:val="superscript"/>
+        </w:rPr>
+        <w:t>]</w:t>
+      </w:r>
+      <w:r>
+        <w:rPr>
+          <w:rFonts w:ascii="宋体" w:hAnsi="宋体" w:eastAsia="宋体" w:cs="宋体"/>
+          <w:b w:val="0"/>
+          <w:sz w:val="21"/>
+        </w:rPr>
+        <w:t>。本文的输入材料则包含体检总检、检验报告、影像结论和病历摘要，其结构不完全等同于医院电子病历。体检报告中的数值指标需要支持趋势比较，影像结论中的自然语言需要保留原文依据，病历摘要中的既往史和用药信息需要作为叙事事实参与审计。由此可见，本文更接近“工程化标准化与证据管理”问题，而不是单纯的实体识别模型问题。</w:t>
+      </w:r>
+    </w:p>
+    <w:p>
+      <w:pPr>
+        <w:spacing w:before="0" w:after="0" w:line="360" w:lineRule="exact"/>
+        <w:ind w:firstLine="420"/>
+      </w:pPr>
+      <w:r>
+        <w:rPr>
+          <w:rFonts w:ascii="宋体" w:hAnsi="宋体" w:eastAsia="宋体" w:cs="宋体"/>
+          <w:b w:val="0"/>
+          <w:sz w:val="21"/>
+        </w:rPr>
         <w:t>上述研究说明，中文医疗文本处理不是简单提示词可以完全解决的问题。专门 NER 模型强调实体边界、领域词典和训练语料，但本文面对的是个人体检报告、化验单、影像结论和病历摘要混杂的演示数据，难点不只在实体识别精度，还包括报告模板差异、指标单位差异、文档版本留痕和最终审计证据绑定。因此，本文没有把医疗资料处理简化为单个 NER 模型，而是采用“原始文件、OCR 结果、当前文档投影、文档版本、结构化指标”五层数据结构。</w:t>
       </w:r>
     </w:p>
@@ -4562,6 +5506,81 @@
           <w:b w:val="0"/>
           <w:sz w:val="21"/>
         </w:rPr>
+        <w:t>将上述研究映射到本文系统，可以发现医疗大模型的价值主要体现在三个环节。第一是 OCR 后的文本理解和标准化，模型可以辅助识别报告日期、文档类型、叙事事实和常见指标；第二是知识解释，模型可以把异常指标和医学知识来源组织成用户可读的审计说明；第三是报告生成，模型可以把多个审计节点的结构化输出整合为完整报告。但是，每个环节都必须有结构化约束、证据绑定和安全审查，否则生成式能力越强，越容易产生看似合理但无法追溯的结论</w:t>
+      </w:r>
+      <w:r>
+        <w:rPr>
+          <w:rFonts w:ascii="Times New Roman" w:hAnsi="Times New Roman" w:eastAsia="Times New Roman" w:cs="Times New Roman"/>
+          <w:b w:val="0"/>
+          <w:sz w:val="21"/>
+          <w:vertAlign w:val="superscript"/>
+        </w:rPr>
+        <w:t>[</w:t>
+      </w:r>
+      <w:r>
+        <w:rPr>
+          <w:rFonts w:ascii="Times New Roman" w:hAnsi="Times New Roman" w:eastAsia="Times New Roman" w:cs="Times New Roman"/>
+          <w:b w:val="0"/>
+          <w:sz w:val="21"/>
+          <w:vertAlign w:val="superscript"/>
+        </w:rPr>
+        <w:fldChar w:fldCharType="begin"/>
+        <w:instrText xml:space="preserve">REF ref_009 \h</w:instrText>
+        <w:fldChar w:fldCharType="separate"/>
+        <w:t>9</w:t>
+        <w:fldChar w:fldCharType="end"/>
+      </w:r>
+      <w:r>
+        <w:rPr>
+          <w:rFonts w:ascii="Times New Roman" w:hAnsi="Times New Roman" w:eastAsia="Times New Roman" w:cs="Times New Roman"/>
+          <w:b w:val="0"/>
+          <w:sz w:val="21"/>
+          <w:vertAlign w:val="superscript"/>
+        </w:rPr>
+        <w:t>-</w:t>
+      </w:r>
+      <w:r>
+        <w:rPr>
+          <w:rFonts w:ascii="Times New Roman" w:hAnsi="Times New Roman" w:eastAsia="Times New Roman" w:cs="Times New Roman"/>
+          <w:b w:val="0"/>
+          <w:sz w:val="21"/>
+          <w:vertAlign w:val="superscript"/>
+        </w:rPr>
+        <w:fldChar w:fldCharType="begin"/>
+        <w:instrText xml:space="preserve">REF ref_013 \h</w:instrText>
+        <w:fldChar w:fldCharType="separate"/>
+        <w:t>13</w:t>
+        <w:fldChar w:fldCharType="end"/>
+      </w:r>
+      <w:r>
+        <w:rPr>
+          <w:rFonts w:ascii="Times New Roman" w:hAnsi="Times New Roman" w:eastAsia="Times New Roman" w:cs="Times New Roman"/>
+          <w:b w:val="0"/>
+          <w:sz w:val="21"/>
+          <w:vertAlign w:val="superscript"/>
+        </w:rPr>
+        <w:t>]</w:t>
+      </w:r>
+      <w:r>
+        <w:rPr>
+          <w:rFonts w:ascii="宋体" w:hAnsi="宋体" w:eastAsia="宋体" w:cs="宋体"/>
+          <w:b w:val="0"/>
+          <w:sz w:val="21"/>
+        </w:rPr>
+        <w:t>。</w:t>
+      </w:r>
+    </w:p>
+    <w:p>
+      <w:pPr>
+        <w:spacing w:before="0" w:after="0" w:line="360" w:lineRule="exact"/>
+        <w:ind w:firstLine="420"/>
+      </w:pPr>
+      <w:r>
+        <w:rPr>
+          <w:rFonts w:ascii="宋体" w:hAnsi="宋体" w:eastAsia="宋体" w:cs="宋体"/>
+          <w:b w:val="0"/>
+          <w:sz w:val="21"/>
+        </w:rPr>
         <w:t>国际研究也给出类似提醒。Thirunavukarasu 等在 Nature Medicine 发表的综述指出，LLM 在医学问答、临床文档和医学教育等场景中具有潜力，但临床使用仍需重视偏差、可解释性、安全性和监管问题</w:t>
       </w:r>
       <w:r>
@@ -4654,6 +5673,59 @@
           <w:b w:val="0"/>
           <w:sz w:val="21"/>
         </w:rPr>
+        <w:t>EHR 和个人体检资料之间虽然来源不同，但都具有异质性和上下文依赖性。Wornow 等关于 EHR 基础模型的讨论提醒本文不能把单次模型输出视为可靠事实</w:t>
+      </w:r>
+      <w:r>
+        <w:rPr>
+          <w:rFonts w:ascii="Times New Roman" w:hAnsi="Times New Roman" w:eastAsia="Times New Roman" w:cs="Times New Roman"/>
+          <w:b w:val="0"/>
+          <w:sz w:val="21"/>
+          <w:vertAlign w:val="superscript"/>
+        </w:rPr>
+        <w:t>[</w:t>
+      </w:r>
+      <w:r>
+        <w:rPr>
+          <w:rFonts w:ascii="Times New Roman" w:hAnsi="Times New Roman" w:eastAsia="Times New Roman" w:cs="Times New Roman"/>
+          <w:b w:val="0"/>
+          <w:sz w:val="21"/>
+          <w:vertAlign w:val="superscript"/>
+        </w:rPr>
+        <w:fldChar w:fldCharType="begin"/>
+        <w:instrText xml:space="preserve">REF ref_024 \h</w:instrText>
+        <w:fldChar w:fldCharType="separate"/>
+        <w:t>24</w:t>
+        <w:fldChar w:fldCharType="end"/>
+      </w:r>
+      <w:r>
+        <w:rPr>
+          <w:rFonts w:ascii="Times New Roman" w:hAnsi="Times New Roman" w:eastAsia="Times New Roman" w:cs="Times New Roman"/>
+          <w:b w:val="0"/>
+          <w:sz w:val="21"/>
+          <w:vertAlign w:val="superscript"/>
+        </w:rPr>
+        <w:t>]</w:t>
+      </w:r>
+      <w:r>
+        <w:rPr>
+          <w:rFonts w:ascii="宋体" w:hAnsi="宋体" w:eastAsia="宋体" w:cs="宋体"/>
+          <w:b w:val="0"/>
+          <w:sz w:val="21"/>
+        </w:rPr>
+        <w:t>。例如，血糖、肝功能、炎症指标等数值是否异常，既取决于指标值，也取决于单位、参考范围、报告日期和上下文；影像结论是否需要关注，也需要结合原文描述和报告类型。因此，本文采用 RAG 知识检索、结构化指标、原文证据和安全审查共同约束模型输出。</w:t>
+      </w:r>
+    </w:p>
+    <w:p>
+      <w:pPr>
+        <w:spacing w:before="0" w:after="0" w:line="360" w:lineRule="exact"/>
+        <w:ind w:firstLine="420"/>
+      </w:pPr>
+      <w:r>
+        <w:rPr>
+          <w:rFonts w:ascii="宋体" w:hAnsi="宋体" w:eastAsia="宋体" w:cs="宋体"/>
+          <w:b w:val="0"/>
+          <w:sz w:val="21"/>
+        </w:rPr>
         <w:t>知识增强是降低生成式系统脱离事实的重要方向。Lewis 等提出 Retrieval-Augmented Generation，将参数化 seq2seq 模型与非参数化检索记忆结合，生成前先从外部文档索引中检索相关内容，并指出这种方式有助于提供来源、更新知识和缓解纯参数模型的事实性问题</w:t>
       </w:r>
       <w:r>
@@ -4707,6 +5779,59 @@
           <w:b w:val="0"/>
           <w:sz w:val="21"/>
         </w:rPr>
+        <w:t>知识增强医学语言模型研究也指出，医学知识图谱、多模态数据和外部知识库能够提升模型的专业性与可信性</w:t>
+      </w:r>
+      <w:r>
+        <w:rPr>
+          <w:rFonts w:ascii="Times New Roman" w:hAnsi="Times New Roman" w:eastAsia="Times New Roman" w:cs="Times New Roman"/>
+          <w:b w:val="0"/>
+          <w:sz w:val="21"/>
+          <w:vertAlign w:val="superscript"/>
+        </w:rPr>
+        <w:t>[</w:t>
+      </w:r>
+      <w:r>
+        <w:rPr>
+          <w:rFonts w:ascii="Times New Roman" w:hAnsi="Times New Roman" w:eastAsia="Times New Roman" w:cs="Times New Roman"/>
+          <w:b w:val="0"/>
+          <w:sz w:val="21"/>
+          <w:vertAlign w:val="superscript"/>
+        </w:rPr>
+        <w:fldChar w:fldCharType="begin"/>
+        <w:instrText xml:space="preserve">REF ref_010 \h</w:instrText>
+        <w:fldChar w:fldCharType="separate"/>
+        <w:t>10</w:t>
+        <w:fldChar w:fldCharType="end"/>
+      </w:r>
+      <w:r>
+        <w:rPr>
+          <w:rFonts w:ascii="Times New Roman" w:hAnsi="Times New Roman" w:eastAsia="Times New Roman" w:cs="Times New Roman"/>
+          <w:b w:val="0"/>
+          <w:sz w:val="21"/>
+          <w:vertAlign w:val="superscript"/>
+        </w:rPr>
+        <w:t>]</w:t>
+      </w:r>
+      <w:r>
+        <w:rPr>
+          <w:rFonts w:ascii="宋体" w:hAnsi="宋体" w:eastAsia="宋体" w:cs="宋体"/>
+          <w:b w:val="0"/>
+          <w:sz w:val="21"/>
+        </w:rPr>
+        <w:t>。本文没有构建完整医学知识图谱，而是采用更适合毕业设计规模的轻量知识块方案：将医学审计知识和公开医学手册摘要整理为 knowledge_chunks，并在综合审计报告中由 knowledge_retrieval_agent 按异常指标和风险点检索。该设计比完全依赖模型参数更容易解释，也便于在论文中展示知识来源、命中片段和最终报告之间的关系。</w:t>
+      </w:r>
+    </w:p>
+    <w:p>
+      <w:pPr>
+        <w:spacing w:before="0" w:after="0" w:line="360" w:lineRule="exact"/>
+        <w:ind w:firstLine="420"/>
+      </w:pPr>
+      <w:r>
+        <w:rPr>
+          <w:rFonts w:ascii="宋体" w:hAnsi="宋体" w:eastAsia="宋体" w:cs="宋体"/>
+          <w:b w:val="0"/>
+          <w:sz w:val="21"/>
+        </w:rPr>
         <w:t>在当前实现中，RAG 并不是独立的聊天功能，而是服务于综合审计报告状态机。系统内置医学审计知识块和默沙东医学手册摘要知识块，通过 knowledge_retrieval_agent 根据风险点和异常指标构造查询，使用确定性的词法排序召回相关知识，再将 knowledge_context 写入 AuditGraphState。最终报告中的 rag_summary、knowledge_sources 和 knowledge_chunk 类型证据，用于展示知识命中情况和来源。该设计对应 Lewis 等提出的“检索外部知识再生成”的思想</w:t>
       </w:r>
       <w:r>
@@ -5038,7 +6163,644 @@
           <w:b w:val="0"/>
           <w:sz w:val="21"/>
         </w:rPr>
+        <w:t>从方法选择上看，RAG、ReAct、AutoGen 和 LangGraph 关注的问题并不相同。RAG 解决“回答时能否利用外部知识”的问题</w:t>
+      </w:r>
+      <w:r>
+        <w:rPr>
+          <w:rFonts w:ascii="Times New Roman" w:hAnsi="Times New Roman" w:eastAsia="Times New Roman" w:cs="Times New Roman"/>
+          <w:b w:val="0"/>
+          <w:sz w:val="21"/>
+          <w:vertAlign w:val="superscript"/>
+        </w:rPr>
+        <w:t>[</w:t>
+      </w:r>
+      <w:r>
+        <w:rPr>
+          <w:rFonts w:ascii="Times New Roman" w:hAnsi="Times New Roman" w:eastAsia="Times New Roman" w:cs="Times New Roman"/>
+          <w:b w:val="0"/>
+          <w:sz w:val="21"/>
+          <w:vertAlign w:val="superscript"/>
+        </w:rPr>
+        <w:fldChar w:fldCharType="begin"/>
+        <w:instrText xml:space="preserve">REF ref_019 \h</w:instrText>
+        <w:fldChar w:fldCharType="separate"/>
+        <w:t>19</w:t>
+        <w:fldChar w:fldCharType="end"/>
+      </w:r>
+      <w:r>
+        <w:rPr>
+          <w:rFonts w:ascii="Times New Roman" w:hAnsi="Times New Roman" w:eastAsia="Times New Roman" w:cs="Times New Roman"/>
+          <w:b w:val="0"/>
+          <w:sz w:val="21"/>
+          <w:vertAlign w:val="superscript"/>
+        </w:rPr>
+        <w:t>]</w:t>
+      </w:r>
+      <w:r>
+        <w:rPr>
+          <w:rFonts w:ascii="宋体" w:hAnsi="宋体" w:eastAsia="宋体" w:cs="宋体"/>
+          <w:b w:val="0"/>
+          <w:sz w:val="21"/>
+        </w:rPr>
+        <w:t>，ReAct 解决“模型能否交替推理和行动”的问题</w:t>
+      </w:r>
+      <w:r>
+        <w:rPr>
+          <w:rFonts w:ascii="Times New Roman" w:hAnsi="Times New Roman" w:eastAsia="Times New Roman" w:cs="Times New Roman"/>
+          <w:b w:val="0"/>
+          <w:sz w:val="21"/>
+          <w:vertAlign w:val="superscript"/>
+        </w:rPr>
+        <w:t>[</w:t>
+      </w:r>
+      <w:r>
+        <w:rPr>
+          <w:rFonts w:ascii="Times New Roman" w:hAnsi="Times New Roman" w:eastAsia="Times New Roman" w:cs="Times New Roman"/>
+          <w:b w:val="0"/>
+          <w:sz w:val="21"/>
+          <w:vertAlign w:val="superscript"/>
+        </w:rPr>
+        <w:fldChar w:fldCharType="begin"/>
+        <w:instrText xml:space="preserve">REF ref_020 \h</w:instrText>
+        <w:fldChar w:fldCharType="separate"/>
+        <w:t>20</w:t>
+        <w:fldChar w:fldCharType="end"/>
+      </w:r>
+      <w:r>
+        <w:rPr>
+          <w:rFonts w:ascii="Times New Roman" w:hAnsi="Times New Roman" w:eastAsia="Times New Roman" w:cs="Times New Roman"/>
+          <w:b w:val="0"/>
+          <w:sz w:val="21"/>
+          <w:vertAlign w:val="superscript"/>
+        </w:rPr>
+        <w:t>]</w:t>
+      </w:r>
+      <w:r>
+        <w:rPr>
+          <w:rFonts w:ascii="宋体" w:hAnsi="宋体" w:eastAsia="宋体" w:cs="宋体"/>
+          <w:b w:val="0"/>
+          <w:sz w:val="21"/>
+        </w:rPr>
+        <w:t>，AutoGen 解决“多个 Agent 如何通过会话协作”的问题</w:t>
+      </w:r>
+      <w:r>
+        <w:rPr>
+          <w:rFonts w:ascii="Times New Roman" w:hAnsi="Times New Roman" w:eastAsia="Times New Roman" w:cs="Times New Roman"/>
+          <w:b w:val="0"/>
+          <w:sz w:val="21"/>
+          <w:vertAlign w:val="superscript"/>
+        </w:rPr>
+        <w:t>[</w:t>
+      </w:r>
+      <w:r>
+        <w:rPr>
+          <w:rFonts w:ascii="Times New Roman" w:hAnsi="Times New Roman" w:eastAsia="Times New Roman" w:cs="Times New Roman"/>
+          <w:b w:val="0"/>
+          <w:sz w:val="21"/>
+          <w:vertAlign w:val="superscript"/>
+        </w:rPr>
+        <w:fldChar w:fldCharType="begin"/>
+        <w:instrText xml:space="preserve">REF ref_021 \h</w:instrText>
+        <w:fldChar w:fldCharType="separate"/>
+        <w:t>21</w:t>
+        <w:fldChar w:fldCharType="end"/>
+      </w:r>
+      <w:r>
+        <w:rPr>
+          <w:rFonts w:ascii="Times New Roman" w:hAnsi="Times New Roman" w:eastAsia="Times New Roman" w:cs="Times New Roman"/>
+          <w:b w:val="0"/>
+          <w:sz w:val="21"/>
+          <w:vertAlign w:val="superscript"/>
+        </w:rPr>
+        <w:t>]</w:t>
+      </w:r>
+      <w:r>
+        <w:rPr>
+          <w:rFonts w:ascii="宋体" w:hAnsi="宋体" w:eastAsia="宋体" w:cs="宋体"/>
+          <w:b w:val="0"/>
+          <w:sz w:val="21"/>
+        </w:rPr>
+        <w:t>，LangGraph 则更强调长运行、有状态、可持久化和可观测的工作流</w:t>
+      </w:r>
+      <w:r>
+        <w:rPr>
+          <w:rFonts w:ascii="Times New Roman" w:hAnsi="Times New Roman" w:eastAsia="Times New Roman" w:cs="Times New Roman"/>
+          <w:b w:val="0"/>
+          <w:sz w:val="21"/>
+          <w:vertAlign w:val="superscript"/>
+        </w:rPr>
+        <w:t>[</w:t>
+      </w:r>
+      <w:r>
+        <w:rPr>
+          <w:rFonts w:ascii="Times New Roman" w:hAnsi="Times New Roman" w:eastAsia="Times New Roman" w:cs="Times New Roman"/>
+          <w:b w:val="0"/>
+          <w:sz w:val="21"/>
+          <w:vertAlign w:val="superscript"/>
+        </w:rPr>
+        <w:fldChar w:fldCharType="begin"/>
+        <w:instrText xml:space="preserve">REF ref_022 \h</w:instrText>
+        <w:fldChar w:fldCharType="separate"/>
+        <w:t>22</w:t>
+        <w:fldChar w:fldCharType="end"/>
+      </w:r>
+      <w:r>
+        <w:rPr>
+          <w:rFonts w:ascii="Times New Roman" w:hAnsi="Times New Roman" w:eastAsia="Times New Roman" w:cs="Times New Roman"/>
+          <w:b w:val="0"/>
+          <w:sz w:val="21"/>
+          <w:vertAlign w:val="superscript"/>
+        </w:rPr>
+        <w:t>]</w:t>
+      </w:r>
+      <w:r>
+        <w:rPr>
+          <w:rFonts w:ascii="宋体" w:hAnsi="宋体" w:eastAsia="宋体" w:cs="宋体"/>
+          <w:b w:val="0"/>
+          <w:sz w:val="21"/>
+        </w:rPr>
+        <w:t>。本文选择 LangGraph 作为综合审计报告主流程，并不是否定其他方法，而是因为医疗审计需要保存状态、事件、证据和回退路径。</w:t>
+      </w:r>
+    </w:p>
+    <w:p>
+      <w:r>
+        <w:br w:type="page"/>
+      </w:r>
+    </w:p>
+    <w:p>
+      <w:pPr>
+        <w:spacing w:before="0" w:after="60" w:line="360" w:lineRule="exact"/>
+        <w:jc w:val="center"/>
+      </w:pPr>
+      <w:r>
+        <w:rPr>
+          <w:rFonts w:ascii="宋体" w:hAnsi="宋体" w:eastAsia="宋体" w:cs="宋体"/>
+          <w:b/>
+          <w:sz w:val="21"/>
+        </w:rPr>
+        <w:t>表2-2 Agent 工作流相关方法对比</w:t>
+      </w:r>
+    </w:p>
+    <w:tbl>
+      <w:tblPr>
+        <w:tblStyle w:val="TableGrid"/>
+        <w:tblW w:type="auto" w:w="0"/>
+        <w:jc w:val="center"/>
+        <w:tblLayout w:type="autofit"/>
+        <w:tblLook w:firstColumn="1" w:firstRow="1" w:lastColumn="0" w:lastRow="0" w:noHBand="0" w:noVBand="1" w:val="04A0"/>
+      </w:tblPr>
+      <w:tblGrid>
+        <w:gridCol w:w="2197"/>
+        <w:gridCol w:w="2197"/>
+        <w:gridCol w:w="2197"/>
+        <w:gridCol w:w="2197"/>
+      </w:tblGrid>
+      <w:tr>
+        <w:tc>
+          <w:tcPr>
+            <w:tcW w:type="dxa" w:w="2197"/>
+            <w:vAlign w:val="center"/>
+            <w:shd w:fill="FFFFFF"/>
+          </w:tcPr>
+          <w:p>
+            <w:pPr>
+              <w:spacing w:before="0" w:after="0" w:line="360" w:lineRule="exact"/>
+              <w:jc w:val="center"/>
+            </w:pPr>
+            <w:r/>
+            <w:r>
+              <w:rPr>
+                <w:rFonts w:ascii="宋体" w:hAnsi="宋体" w:eastAsia="宋体" w:cs="宋体"/>
+                <w:b/>
+                <w:sz w:val="19"/>
+              </w:rPr>
+              <w:t>方法</w:t>
+            </w:r>
+          </w:p>
+        </w:tc>
+        <w:tc>
+          <w:tcPr>
+            <w:tcW w:type="dxa" w:w="2197"/>
+            <w:vAlign w:val="center"/>
+            <w:shd w:fill="FFFFFF"/>
+          </w:tcPr>
+          <w:p>
+            <w:pPr>
+              <w:spacing w:before="0" w:after="0" w:line="360" w:lineRule="exact"/>
+              <w:jc w:val="center"/>
+            </w:pPr>
+            <w:r/>
+            <w:r>
+              <w:rPr>
+                <w:rFonts w:ascii="宋体" w:hAnsi="宋体" w:eastAsia="宋体" w:cs="宋体"/>
+                <w:b/>
+                <w:sz w:val="19"/>
+              </w:rPr>
+              <w:t>核心思想</w:t>
+            </w:r>
+          </w:p>
+        </w:tc>
+        <w:tc>
+          <w:tcPr>
+            <w:tcW w:type="dxa" w:w="2197"/>
+            <w:vAlign w:val="center"/>
+            <w:shd w:fill="FFFFFF"/>
+          </w:tcPr>
+          <w:p>
+            <w:pPr>
+              <w:spacing w:before="0" w:after="0" w:line="360" w:lineRule="exact"/>
+              <w:jc w:val="center"/>
+            </w:pPr>
+            <w:r/>
+            <w:r>
+              <w:rPr>
+                <w:rFonts w:ascii="宋体" w:hAnsi="宋体" w:eastAsia="宋体" w:cs="宋体"/>
+                <w:b/>
+                <w:sz w:val="19"/>
+              </w:rPr>
+              <w:t>适用特点</w:t>
+            </w:r>
+          </w:p>
+        </w:tc>
+        <w:tc>
+          <w:tcPr>
+            <w:tcW w:type="dxa" w:w="2197"/>
+            <w:vAlign w:val="center"/>
+            <w:shd w:fill="FFFFFF"/>
+          </w:tcPr>
+          <w:p>
+            <w:pPr>
+              <w:spacing w:before="0" w:after="0" w:line="360" w:lineRule="exact"/>
+              <w:jc w:val="center"/>
+            </w:pPr>
+            <w:r/>
+            <w:r>
+              <w:rPr>
+                <w:rFonts w:ascii="宋体" w:hAnsi="宋体" w:eastAsia="宋体" w:cs="宋体"/>
+                <w:b/>
+                <w:sz w:val="19"/>
+              </w:rPr>
+              <w:t>本文采用方式</w:t>
+            </w:r>
+          </w:p>
+        </w:tc>
+      </w:tr>
+      <w:tr>
+        <w:tc>
+          <w:tcPr>
+            <w:tcW w:type="dxa" w:w="2197"/>
+            <w:vAlign w:val="center"/>
+          </w:tcPr>
+          <w:p>
+            <w:pPr>
+              <w:spacing w:before="0" w:after="0" w:line="360" w:lineRule="exact"/>
+            </w:pPr>
+            <w:r/>
+            <w:r>
+              <w:rPr>
+                <w:rFonts w:ascii="宋体" w:hAnsi="宋体" w:eastAsia="宋体" w:cs="宋体"/>
+                <w:b w:val="0"/>
+                <w:sz w:val="19"/>
+              </w:rPr>
+              <w:t>RAG</w:t>
+            </w:r>
+          </w:p>
+        </w:tc>
+        <w:tc>
+          <w:tcPr>
+            <w:tcW w:type="dxa" w:w="2197"/>
+            <w:vAlign w:val="center"/>
+          </w:tcPr>
+          <w:p>
+            <w:pPr>
+              <w:spacing w:before="0" w:after="0" w:line="360" w:lineRule="exact"/>
+            </w:pPr>
+            <w:r/>
+            <w:r>
+              <w:rPr>
+                <w:rFonts w:ascii="宋体" w:hAnsi="宋体" w:eastAsia="宋体" w:cs="宋体"/>
+                <w:b w:val="0"/>
+                <w:sz w:val="19"/>
+              </w:rPr>
+              <w:t>外部知识检索与生成结合</w:t>
+            </w:r>
+          </w:p>
+        </w:tc>
+        <w:tc>
+          <w:tcPr>
+            <w:tcW w:type="dxa" w:w="2197"/>
+            <w:vAlign w:val="center"/>
+          </w:tcPr>
+          <w:p>
+            <w:pPr>
+              <w:spacing w:before="0" w:after="0" w:line="360" w:lineRule="exact"/>
+            </w:pPr>
+            <w:r/>
+            <w:r>
+              <w:rPr>
+                <w:rFonts w:ascii="宋体" w:hAnsi="宋体" w:eastAsia="宋体" w:cs="宋体"/>
+                <w:b w:val="0"/>
+                <w:sz w:val="19"/>
+              </w:rPr>
+              <w:t>可提供知识来源，缓解纯参数模型事实性不足</w:t>
+            </w:r>
+          </w:p>
+        </w:tc>
+        <w:tc>
+          <w:tcPr>
+            <w:tcW w:type="dxa" w:w="2197"/>
+            <w:vAlign w:val="center"/>
+          </w:tcPr>
+          <w:p>
+            <w:pPr>
+              <w:spacing w:before="0" w:after="0" w:line="360" w:lineRule="exact"/>
+            </w:pPr>
+            <w:r/>
+            <w:r>
+              <w:rPr>
+                <w:rFonts w:ascii="宋体" w:hAnsi="宋体" w:eastAsia="宋体" w:cs="宋体"/>
+                <w:b w:val="0"/>
+                <w:sz w:val="19"/>
+              </w:rPr>
+              <w:t>用于 knowledge_retrieval_agent 和报告知识来源展示</w:t>
+            </w:r>
+          </w:p>
+        </w:tc>
+      </w:tr>
+      <w:tr>
+        <w:tc>
+          <w:tcPr>
+            <w:tcW w:type="dxa" w:w="2197"/>
+            <w:vAlign w:val="center"/>
+          </w:tcPr>
+          <w:p>
+            <w:pPr>
+              <w:spacing w:before="0" w:after="0" w:line="360" w:lineRule="exact"/>
+            </w:pPr>
+            <w:r/>
+            <w:r>
+              <w:rPr>
+                <w:rFonts w:ascii="宋体" w:hAnsi="宋体" w:eastAsia="宋体" w:cs="宋体"/>
+                <w:b w:val="0"/>
+                <w:sz w:val="19"/>
+              </w:rPr>
+              <w:t>ReAct</w:t>
+            </w:r>
+          </w:p>
+        </w:tc>
+        <w:tc>
+          <w:tcPr>
+            <w:tcW w:type="dxa" w:w="2197"/>
+            <w:vAlign w:val="center"/>
+          </w:tcPr>
+          <w:p>
+            <w:pPr>
+              <w:spacing w:before="0" w:after="0" w:line="360" w:lineRule="exact"/>
+            </w:pPr>
+            <w:r/>
+            <w:r>
+              <w:rPr>
+                <w:rFonts w:ascii="宋体" w:hAnsi="宋体" w:eastAsia="宋体" w:cs="宋体"/>
+                <w:b w:val="0"/>
+                <w:sz w:val="19"/>
+              </w:rPr>
+              <w:t>推理轨迹与外部行动交替</w:t>
+            </w:r>
+          </w:p>
+        </w:tc>
+        <w:tc>
+          <w:tcPr>
+            <w:tcW w:type="dxa" w:w="2197"/>
+            <w:vAlign w:val="center"/>
+          </w:tcPr>
+          <w:p>
+            <w:pPr>
+              <w:spacing w:before="0" w:after="0" w:line="360" w:lineRule="exact"/>
+            </w:pPr>
+            <w:r/>
+            <w:r>
+              <w:rPr>
+                <w:rFonts w:ascii="宋体" w:hAnsi="宋体" w:eastAsia="宋体" w:cs="宋体"/>
+                <w:b w:val="0"/>
+                <w:sz w:val="19"/>
+              </w:rPr>
+              <w:t>适合需要查询、工具调用和环境反馈的任务</w:t>
+            </w:r>
+          </w:p>
+        </w:tc>
+        <w:tc>
+          <w:tcPr>
+            <w:tcW w:type="dxa" w:w="2197"/>
+            <w:vAlign w:val="center"/>
+          </w:tcPr>
+          <w:p>
+            <w:pPr>
+              <w:spacing w:before="0" w:after="0" w:line="360" w:lineRule="exact"/>
+            </w:pPr>
+            <w:r/>
+            <w:r>
+              <w:rPr>
+                <w:rFonts w:ascii="宋体" w:hAnsi="宋体" w:eastAsia="宋体" w:cs="宋体"/>
+                <w:b w:val="0"/>
+                <w:sz w:val="19"/>
+              </w:rPr>
+              <w:t>用于理解审计节点需要先查询、再生成、再复核的流程思想</w:t>
+            </w:r>
+          </w:p>
+        </w:tc>
+      </w:tr>
+      <w:tr>
+        <w:tc>
+          <w:tcPr>
+            <w:tcW w:type="dxa" w:w="2197"/>
+            <w:vAlign w:val="center"/>
+          </w:tcPr>
+          <w:p>
+            <w:pPr>
+              <w:spacing w:before="0" w:after="0" w:line="360" w:lineRule="exact"/>
+            </w:pPr>
+            <w:r/>
+            <w:r>
+              <w:rPr>
+                <w:rFonts w:ascii="宋体" w:hAnsi="宋体" w:eastAsia="宋体" w:cs="宋体"/>
+                <w:b w:val="0"/>
+                <w:sz w:val="19"/>
+              </w:rPr>
+              <w:t>AutoGen</w:t>
+            </w:r>
+          </w:p>
+        </w:tc>
+        <w:tc>
+          <w:tcPr>
+            <w:tcW w:type="dxa" w:w="2197"/>
+            <w:vAlign w:val="center"/>
+          </w:tcPr>
+          <w:p>
+            <w:pPr>
+              <w:spacing w:before="0" w:after="0" w:line="360" w:lineRule="exact"/>
+            </w:pPr>
+            <w:r/>
+            <w:r>
+              <w:rPr>
+                <w:rFonts w:ascii="宋体" w:hAnsi="宋体" w:eastAsia="宋体" w:cs="宋体"/>
+                <w:b w:val="0"/>
+                <w:sz w:val="19"/>
+              </w:rPr>
+              <w:t>多 Agent 会话协作</w:t>
+            </w:r>
+          </w:p>
+        </w:tc>
+        <w:tc>
+          <w:tcPr>
+            <w:tcW w:type="dxa" w:w="2197"/>
+            <w:vAlign w:val="center"/>
+          </w:tcPr>
+          <w:p>
+            <w:pPr>
+              <w:spacing w:before="0" w:after="0" w:line="360" w:lineRule="exact"/>
+            </w:pPr>
+            <w:r/>
+            <w:r>
+              <w:rPr>
+                <w:rFonts w:ascii="宋体" w:hAnsi="宋体" w:eastAsia="宋体" w:cs="宋体"/>
+                <w:b w:val="0"/>
+                <w:sz w:val="19"/>
+              </w:rPr>
+              <w:t>适合开放式复杂任务和多角色对话</w:t>
+            </w:r>
+          </w:p>
+        </w:tc>
+        <w:tc>
+          <w:tcPr>
+            <w:tcW w:type="dxa" w:w="2197"/>
+            <w:vAlign w:val="center"/>
+          </w:tcPr>
+          <w:p>
+            <w:pPr>
+              <w:spacing w:before="0" w:after="0" w:line="360" w:lineRule="exact"/>
+            </w:pPr>
+            <w:r/>
+            <w:r>
+              <w:rPr>
+                <w:rFonts w:ascii="宋体" w:hAnsi="宋体" w:eastAsia="宋体" w:cs="宋体"/>
+                <w:b w:val="0"/>
+                <w:sz w:val="19"/>
+              </w:rPr>
+              <w:t>借鉴职责拆分思想，但不采用完全开放对话</w:t>
+            </w:r>
+          </w:p>
+        </w:tc>
+      </w:tr>
+      <w:tr>
+        <w:tc>
+          <w:tcPr>
+            <w:tcW w:type="dxa" w:w="2197"/>
+            <w:vAlign w:val="center"/>
+          </w:tcPr>
+          <w:p>
+            <w:pPr>
+              <w:spacing w:before="0" w:after="0" w:line="360" w:lineRule="exact"/>
+            </w:pPr>
+            <w:r/>
+            <w:r>
+              <w:rPr>
+                <w:rFonts w:ascii="宋体" w:hAnsi="宋体" w:eastAsia="宋体" w:cs="宋体"/>
+                <w:b w:val="0"/>
+                <w:sz w:val="19"/>
+              </w:rPr>
+              <w:t>LangGraph</w:t>
+            </w:r>
+          </w:p>
+        </w:tc>
+        <w:tc>
+          <w:tcPr>
+            <w:tcW w:type="dxa" w:w="2197"/>
+            <w:vAlign w:val="center"/>
+          </w:tcPr>
+          <w:p>
+            <w:pPr>
+              <w:spacing w:before="0" w:after="0" w:line="360" w:lineRule="exact"/>
+            </w:pPr>
+            <w:r/>
+            <w:r>
+              <w:rPr>
+                <w:rFonts w:ascii="宋体" w:hAnsi="宋体" w:eastAsia="宋体" w:cs="宋体"/>
+                <w:b w:val="0"/>
+                <w:sz w:val="19"/>
+              </w:rPr>
+              <w:t>状态图、条件边和持久化工作流</w:t>
+            </w:r>
+          </w:p>
+        </w:tc>
+        <w:tc>
+          <w:tcPr>
+            <w:tcW w:type="dxa" w:w="2197"/>
+            <w:vAlign w:val="center"/>
+          </w:tcPr>
+          <w:p>
+            <w:pPr>
+              <w:spacing w:before="0" w:after="0" w:line="360" w:lineRule="exact"/>
+            </w:pPr>
+            <w:r/>
+            <w:r>
+              <w:rPr>
+                <w:rFonts w:ascii="宋体" w:hAnsi="宋体" w:eastAsia="宋体" w:cs="宋体"/>
+                <w:b w:val="0"/>
+                <w:sz w:val="19"/>
+              </w:rPr>
+              <w:t>适合长运行、有状态、可回环、可观察的 Agent 流程</w:t>
+            </w:r>
+          </w:p>
+        </w:tc>
+        <w:tc>
+          <w:tcPr>
+            <w:tcW w:type="dxa" w:w="2197"/>
+            <w:vAlign w:val="center"/>
+          </w:tcPr>
+          <w:p>
+            <w:pPr>
+              <w:spacing w:before="0" w:after="0" w:line="360" w:lineRule="exact"/>
+            </w:pPr>
+            <w:r/>
+            <w:r>
+              <w:rPr>
+                <w:rFonts w:ascii="宋体" w:hAnsi="宋体" w:eastAsia="宋体" w:cs="宋体"/>
+                <w:b w:val="0"/>
+                <w:sz w:val="19"/>
+              </w:rPr>
+              <w:t>作为综合审计报告核心编排方式</w:t>
+            </w:r>
+          </w:p>
+        </w:tc>
+      </w:tr>
+    </w:tbl>
+    <w:p/>
+    <w:p>
+      <w:pPr>
+        <w:spacing w:before="0" w:after="0" w:line="360" w:lineRule="exact"/>
+        <w:ind w:firstLine="420"/>
+      </w:pPr>
+      <w:r>
+        <w:rPr>
+          <w:rFonts w:ascii="宋体" w:hAnsi="宋体" w:eastAsia="宋体" w:cs="宋体"/>
+          <w:b w:val="0"/>
+          <w:sz w:val="21"/>
+        </w:rPr>
         <w:t>本文采用 LangGraph 的原因正来自上述需求。系统中的 document_quality_agent、timeline_builder、measurement_consistency_agent、risk_agent、knowledge_retrieval_agent、evidence_agent、conflict_agent、compliance_agent、report_composer、citation_checker 和 safety_reviewer 都围绕同一个 AuditGraphState 工作。每个节点只负责一个有限任务，路由节点根据 completed_agents、citation_issues、safety_issues、needs_report_revision 等字段决定下一步。相比 AutoGen 式的开放会话，本文更强调状态机可控性和审计可追溯性。</w:t>
+      </w:r>
+    </w:p>
+    <w:p>
+      <w:pPr>
+        <w:spacing w:before="0" w:after="0" w:line="360" w:lineRule="exact"/>
+        <w:ind w:firstLine="420"/>
+      </w:pPr>
+      <w:r>
+        <w:rPr>
+          <w:rFonts w:ascii="宋体" w:hAnsi="宋体" w:eastAsia="宋体" w:cs="宋体"/>
+          <w:b w:val="0"/>
+          <w:sz w:val="21"/>
+        </w:rPr>
+        <w:t>这种设计使“多 Agent”具有可解释的工程含义。本文中的 Agent 不是随机对话角色，而是能够在状态图中定位的处理节点；每个节点的输入来自 GraphState，输出写回 GraphState，执行过程写入 audit_report_events。前端展示的节点高亮、边流转和 visit_count 都来自后端真实事件。这样，论文中关于多 Agent 协作的描述能够对应数据库表、后端代码和页面截图，而不是停留在概念层面。</w:t>
       </w:r>
     </w:p>
     <w:p>
@@ -5135,7 +6897,7 @@
           <w:b/>
           <w:sz w:val="21"/>
         </w:rPr>
-        <w:t>表2-2 Provider 抽象及当前配置</w:t>
+        <w:t>表2-3 Provider 抽象及当前配置</w:t>
       </w:r>
     </w:p>
     <w:tbl>

</xml_diff>

<commit_message>
docs: save selected thesis draft before formatting
</commit_message>
<xml_diff>
--- a/docs/thesis/drafts/论文正文_程浩然_基于LangGraph的多Agent协作框架在医疗审计场景的设计与实现.docx
+++ b/docs/thesis/drafts/论文正文_程浩然_基于LangGraph的多Agent协作框架在医疗审计场景的设计与实现.docx
@@ -954,7 +954,7 @@
                 <w:b/>
                 <w:sz w:val="22"/>
               </w:rPr>
-              <w:t>6</w:t>
+              <w:t>5</w:t>
             </w:r>
           </w:p>
         </w:tc>
@@ -999,7 +999,7 @@
                 <w:b w:val="0"/>
                 <w:sz w:val="21"/>
               </w:rPr>
-              <w:t>7</w:t>
+              <w:t>6</w:t>
             </w:r>
           </w:p>
         </w:tc>
@@ -1044,7 +1044,7 @@
                 <w:b w:val="0"/>
                 <w:sz w:val="21"/>
               </w:rPr>
-              <w:t>8</w:t>
+              <w:t>6</w:t>
             </w:r>
           </w:p>
         </w:tc>
@@ -1089,7 +1089,7 @@
                 <w:b w:val="0"/>
                 <w:sz w:val="21"/>
               </w:rPr>
-              <w:t>9</w:t>
+              <w:t>7</w:t>
             </w:r>
           </w:p>
         </w:tc>
@@ -1134,7 +1134,7 @@
                 <w:b w:val="0"/>
                 <w:sz w:val="21"/>
               </w:rPr>
-              <w:t>11</w:t>
+              <w:t>8</w:t>
             </w:r>
           </w:p>
         </w:tc>
@@ -1179,7 +1179,7 @@
                 <w:b w:val="0"/>
                 <w:sz w:val="21"/>
               </w:rPr>
-              <w:t>12</w:t>
+              <w:t>9</w:t>
             </w:r>
           </w:p>
         </w:tc>
@@ -1224,7 +1224,7 @@
                 <w:b/>
                 <w:sz w:val="22"/>
               </w:rPr>
-              <w:t>14</w:t>
+              <w:t>12</w:t>
             </w:r>
           </w:p>
         </w:tc>
@@ -1269,7 +1269,7 @@
                 <w:b w:val="0"/>
                 <w:sz w:val="21"/>
               </w:rPr>
-              <w:t>14</w:t>
+              <w:t>12</w:t>
             </w:r>
           </w:p>
         </w:tc>
@@ -1314,7 +1314,7 @@
                 <w:b w:val="0"/>
                 <w:sz w:val="21"/>
               </w:rPr>
-              <w:t>15</w:t>
+              <w:t>13</w:t>
             </w:r>
           </w:p>
         </w:tc>
@@ -1359,7 +1359,7 @@
                 <w:b w:val="0"/>
                 <w:sz w:val="21"/>
               </w:rPr>
-              <w:t>15</w:t>
+              <w:t>13</w:t>
             </w:r>
           </w:p>
         </w:tc>
@@ -1404,7 +1404,7 @@
                 <w:b w:val="0"/>
                 <w:sz w:val="21"/>
               </w:rPr>
-              <w:t>16</w:t>
+              <w:t>14</w:t>
             </w:r>
           </w:p>
         </w:tc>
@@ -1449,7 +1449,7 @@
                 <w:b w:val="0"/>
                 <w:sz w:val="21"/>
               </w:rPr>
-              <w:t>18</w:t>
+              <w:t>16</w:t>
             </w:r>
           </w:p>
         </w:tc>
@@ -1494,7 +1494,7 @@
                 <w:b w:val="0"/>
                 <w:sz w:val="21"/>
               </w:rPr>
-              <w:t>20</w:t>
+              <w:t>18</w:t>
             </w:r>
           </w:p>
         </w:tc>
@@ -1539,7 +1539,7 @@
                 <w:b/>
                 <w:sz w:val="22"/>
               </w:rPr>
-              <w:t>23</w:t>
+              <w:t>21</w:t>
             </w:r>
           </w:p>
         </w:tc>
@@ -1584,7 +1584,7 @@
                 <w:b w:val="0"/>
                 <w:sz w:val="21"/>
               </w:rPr>
-              <w:t>23</w:t>
+              <w:t>21</w:t>
             </w:r>
           </w:p>
         </w:tc>
@@ -1629,7 +1629,7 @@
                 <w:b w:val="0"/>
                 <w:sz w:val="21"/>
               </w:rPr>
-              <w:t>23</w:t>
+              <w:t>21</w:t>
             </w:r>
           </w:p>
         </w:tc>
@@ -1674,7 +1674,7 @@
                 <w:b w:val="0"/>
                 <w:sz w:val="21"/>
               </w:rPr>
-              <w:t>24</w:t>
+              <w:t>22</w:t>
             </w:r>
           </w:p>
         </w:tc>
@@ -1719,7 +1719,7 @@
                 <w:b w:val="0"/>
                 <w:sz w:val="21"/>
               </w:rPr>
-              <w:t>26</w:t>
+              <w:t>24</w:t>
             </w:r>
           </w:p>
         </w:tc>
@@ -1764,7 +1764,7 @@
                 <w:b w:val="0"/>
                 <w:sz w:val="21"/>
               </w:rPr>
-              <w:t>27</w:t>
+              <w:t>25</w:t>
             </w:r>
           </w:p>
         </w:tc>
@@ -1809,7 +1809,7 @@
                 <w:b/>
                 <w:sz w:val="22"/>
               </w:rPr>
-              <w:t>30</w:t>
+              <w:t>28</w:t>
             </w:r>
           </w:p>
         </w:tc>
@@ -1854,7 +1854,7 @@
                 <w:b w:val="0"/>
                 <w:sz w:val="21"/>
               </w:rPr>
-              <w:t>30</w:t>
+              <w:t>28</w:t>
             </w:r>
           </w:p>
         </w:tc>
@@ -1899,7 +1899,7 @@
                 <w:b w:val="0"/>
                 <w:sz w:val="21"/>
               </w:rPr>
-              <w:t>31</w:t>
+              <w:t>29</w:t>
             </w:r>
           </w:p>
         </w:tc>
@@ -1944,7 +1944,7 @@
                 <w:b w:val="0"/>
                 <w:sz w:val="21"/>
               </w:rPr>
-              <w:t>33</w:t>
+              <w:t>31</w:t>
             </w:r>
           </w:p>
         </w:tc>
@@ -1989,7 +1989,7 @@
                 <w:b w:val="0"/>
                 <w:sz w:val="21"/>
               </w:rPr>
-              <w:t>36</w:t>
+              <w:t>34</w:t>
             </w:r>
           </w:p>
         </w:tc>
@@ -2034,7 +2034,7 @@
                 <w:b/>
                 <w:sz w:val="22"/>
               </w:rPr>
-              <w:t>38</w:t>
+              <w:t>36</w:t>
             </w:r>
           </w:p>
         </w:tc>
@@ -2079,7 +2079,7 @@
                 <w:b/>
                 <w:sz w:val="22"/>
               </w:rPr>
-              <w:t>39</w:t>
+              <w:t>37</w:t>
             </w:r>
           </w:p>
         </w:tc>
@@ -2124,7 +2124,7 @@
                 <w:b/>
                 <w:sz w:val="22"/>
               </w:rPr>
-              <w:t>41</w:t>
+              <w:t>39</w:t>
             </w:r>
           </w:p>
         </w:tc>
@@ -2387,226 +2387,6 @@
           <w:sz w:val="21"/>
         </w:rPr>
         <w:t>。因此，本课题并不把系统实现目标设定为替代医生诊断，而是定位为医疗资料整理和医疗审计辅助：通过工程化方式把原始资料转化为结构化数据，再使用状态机式多 Agent 协作框架完成质量检查、风险提示、证据补全和报告输出。</w:t>
-      </w:r>
-    </w:p>
-    <w:p>
-      <w:pPr>
-        <w:spacing w:before="0" w:after="0" w:line="360" w:lineRule="exact"/>
-        <w:ind w:firstLine="420"/>
-      </w:pPr>
-      <w:r>
-        <w:rPr>
-          <w:rFonts w:ascii="宋体" w:hAnsi="宋体" w:eastAsia="宋体" w:cs="宋体"/>
-          <w:b w:val="0"/>
-          <w:sz w:val="21"/>
-        </w:rPr>
-        <w:t>从国家卫生健康信息化建设要求看，医疗信息系统不仅要保存业务数据，还需要在数据标准、业务闭环、质量控制和安全管理方面形成制度化支撑</w:t>
-      </w:r>
-      <w:r>
-        <w:rPr>
-          <w:rFonts w:ascii="Times New Roman" w:hAnsi="Times New Roman" w:eastAsia="Times New Roman" w:cs="Times New Roman"/>
-          <w:b w:val="0"/>
-          <w:sz w:val="21"/>
-          <w:vertAlign w:val="superscript"/>
-        </w:rPr>
-        <w:t>[</w:t>
-      </w:r>
-      <w:r>
-        <w:rPr>
-          <w:rFonts w:ascii="Times New Roman" w:hAnsi="Times New Roman" w:eastAsia="Times New Roman" w:cs="Times New Roman"/>
-          <w:b w:val="0"/>
-          <w:sz w:val="21"/>
-          <w:vertAlign w:val="superscript"/>
-        </w:rPr>
-        <w:fldChar w:fldCharType="begin"/>
-        <w:instrText xml:space="preserve">REF ref_001 \h</w:instrText>
-        <w:fldChar w:fldCharType="separate"/>
-        <w:t>1</w:t>
-        <w:fldChar w:fldCharType="end"/>
-      </w:r>
-      <w:r>
-        <w:rPr>
-          <w:rFonts w:ascii="Times New Roman" w:hAnsi="Times New Roman" w:eastAsia="Times New Roman" w:cs="Times New Roman"/>
-          <w:b w:val="0"/>
-          <w:sz w:val="21"/>
-          <w:vertAlign w:val="superscript"/>
-        </w:rPr>
-        <w:t>]</w:t>
-      </w:r>
-      <w:r>
-        <w:rPr>
-          <w:rFonts w:ascii="宋体" w:hAnsi="宋体" w:eastAsia="宋体" w:cs="宋体"/>
-          <w:b w:val="0"/>
-          <w:sz w:val="21"/>
-        </w:rPr>
-        <w:t>。电子病历应用水平评价也把结构化记录、数据共享、闭环管理和过程留痕作为衡量医院信息化水平的重要维度</w:t>
-      </w:r>
-      <w:r>
-        <w:rPr>
-          <w:rFonts w:ascii="Times New Roman" w:hAnsi="Times New Roman" w:eastAsia="Times New Roman" w:cs="Times New Roman"/>
-          <w:b w:val="0"/>
-          <w:sz w:val="21"/>
-          <w:vertAlign w:val="superscript"/>
-        </w:rPr>
-        <w:t>[</w:t>
-      </w:r>
-      <w:r>
-        <w:rPr>
-          <w:rFonts w:ascii="Times New Roman" w:hAnsi="Times New Roman" w:eastAsia="Times New Roman" w:cs="Times New Roman"/>
-          <w:b w:val="0"/>
-          <w:sz w:val="21"/>
-          <w:vertAlign w:val="superscript"/>
-        </w:rPr>
-        <w:fldChar w:fldCharType="begin"/>
-        <w:instrText xml:space="preserve">REF ref_002 \h</w:instrText>
-        <w:fldChar w:fldCharType="separate"/>
-        <w:t>2</w:t>
-        <w:fldChar w:fldCharType="end"/>
-      </w:r>
-      <w:r>
-        <w:rPr>
-          <w:rFonts w:ascii="Times New Roman" w:hAnsi="Times New Roman" w:eastAsia="Times New Roman" w:cs="Times New Roman"/>
-          <w:b w:val="0"/>
-          <w:sz w:val="21"/>
-          <w:vertAlign w:val="superscript"/>
-        </w:rPr>
-        <w:t>]</w:t>
-      </w:r>
-      <w:r>
-        <w:rPr>
-          <w:rFonts w:ascii="宋体" w:hAnsi="宋体" w:eastAsia="宋体" w:cs="宋体"/>
-          <w:b w:val="0"/>
-          <w:sz w:val="21"/>
-        </w:rPr>
-        <w:t>。虽然本文系统面向个人健康资料而非医院核心业务系统，但其资料处理链路仍然需要借鉴这些要求：原始文件不能丢失，OCR 和标准化结果不能互相覆盖，指标和报告之间应建立可追踪关系。</w:t>
-      </w:r>
-    </w:p>
-    <w:p>
-      <w:pPr>
-        <w:spacing w:before="0" w:after="0" w:line="360" w:lineRule="exact"/>
-        <w:ind w:firstLine="420"/>
-      </w:pPr>
-      <w:r>
-        <w:rPr>
-          <w:rFonts w:ascii="宋体" w:hAnsi="宋体" w:eastAsia="宋体" w:cs="宋体"/>
-          <w:b w:val="0"/>
-          <w:sz w:val="21"/>
-        </w:rPr>
-        <w:t>个人健康资料中包含大量敏感个人信息和健康相关信息。GB/T 35273-2020 对个人信息处理活动中的目的明确、最小必要、访问控制、安全审计和个人敏感信息保护提出了规范性要求</w:t>
-      </w:r>
-      <w:r>
-        <w:rPr>
-          <w:rFonts w:ascii="Times New Roman" w:hAnsi="Times New Roman" w:eastAsia="Times New Roman" w:cs="Times New Roman"/>
-          <w:b w:val="0"/>
-          <w:sz w:val="21"/>
-          <w:vertAlign w:val="superscript"/>
-        </w:rPr>
-        <w:t>[</w:t>
-      </w:r>
-      <w:r>
-        <w:rPr>
-          <w:rFonts w:ascii="Times New Roman" w:hAnsi="Times New Roman" w:eastAsia="Times New Roman" w:cs="Times New Roman"/>
-          <w:b w:val="0"/>
-          <w:sz w:val="21"/>
-          <w:vertAlign w:val="superscript"/>
-        </w:rPr>
-        <w:fldChar w:fldCharType="begin"/>
-        <w:instrText xml:space="preserve">REF ref_003 \h</w:instrText>
-        <w:fldChar w:fldCharType="separate"/>
-        <w:t>3</w:t>
-        <w:fldChar w:fldCharType="end"/>
-      </w:r>
-      <w:r>
-        <w:rPr>
-          <w:rFonts w:ascii="Times New Roman" w:hAnsi="Times New Roman" w:eastAsia="Times New Roman" w:cs="Times New Roman"/>
-          <w:b w:val="0"/>
-          <w:sz w:val="21"/>
-          <w:vertAlign w:val="superscript"/>
-        </w:rPr>
-        <w:t>]</w:t>
-      </w:r>
-      <w:r>
-        <w:rPr>
-          <w:rFonts w:ascii="宋体" w:hAnsi="宋体" w:eastAsia="宋体" w:cs="宋体"/>
-          <w:b w:val="0"/>
-          <w:sz w:val="21"/>
-        </w:rPr>
-        <w:t>。因此，本文系统在设计时没有把所有文档直接送入不可控的外部接口，而是通过 Provider 抽象隔离外部服务，并在 provider_events、task_events 和 audit_report_events 中记录调用状态。这样的设计有助于后续部署时进一步加入脱敏、权限控制和审计日志导出。</w:t>
-      </w:r>
-    </w:p>
-    <w:p>
-      <w:pPr>
-        <w:spacing w:before="0" w:after="0" w:line="360" w:lineRule="exact"/>
-        <w:ind w:firstLine="420"/>
-      </w:pPr>
-      <w:r>
-        <w:rPr>
-          <w:rFonts w:ascii="宋体" w:hAnsi="宋体" w:eastAsia="宋体" w:cs="宋体"/>
-          <w:b w:val="0"/>
-          <w:sz w:val="21"/>
-        </w:rPr>
-        <w:t>从毕业设计选题角度看，医疗资料审计辅助系统比普通健康问答系统更适合工程实现。普通问答系统的重点是回答质量，而审计辅助系统的重点是资料是否完整、指标是否异常、结论是否有来源、报告是否越界。前者容易变成大模型提示词演示，后者需要数据库建模、任务队列、状态机编排、证据绑定和前端可视化共同支撑。本文选择后者，是为了让课题能够体现计算机专业毕业设计中“需求分析、系统设计、详细实现、测试验证”的完整过程</w:t>
-      </w:r>
-      <w:r>
-        <w:rPr>
-          <w:rFonts w:ascii="Times New Roman" w:hAnsi="Times New Roman" w:eastAsia="Times New Roman" w:cs="Times New Roman"/>
-          <w:b w:val="0"/>
-          <w:sz w:val="21"/>
-          <w:vertAlign w:val="superscript"/>
-        </w:rPr>
-        <w:t>[</w:t>
-      </w:r>
-      <w:r>
-        <w:rPr>
-          <w:rFonts w:ascii="Times New Roman" w:hAnsi="Times New Roman" w:eastAsia="Times New Roman" w:cs="Times New Roman"/>
-          <w:b w:val="0"/>
-          <w:sz w:val="21"/>
-          <w:vertAlign w:val="superscript"/>
-        </w:rPr>
-        <w:fldChar w:fldCharType="begin"/>
-        <w:instrText xml:space="preserve">REF ref_014 \h</w:instrText>
-        <w:fldChar w:fldCharType="separate"/>
-        <w:t>14</w:t>
-        <w:fldChar w:fldCharType="end"/>
-      </w:r>
-      <w:r>
-        <w:rPr>
-          <w:rFonts w:ascii="Times New Roman" w:hAnsi="Times New Roman" w:eastAsia="Times New Roman" w:cs="Times New Roman"/>
-          <w:b w:val="0"/>
-          <w:sz w:val="21"/>
-          <w:vertAlign w:val="superscript"/>
-        </w:rPr>
-        <w:t>-</w:t>
-      </w:r>
-      <w:r>
-        <w:rPr>
-          <w:rFonts w:ascii="Times New Roman" w:hAnsi="Times New Roman" w:eastAsia="Times New Roman" w:cs="Times New Roman"/>
-          <w:b w:val="0"/>
-          <w:sz w:val="21"/>
-          <w:vertAlign w:val="superscript"/>
-        </w:rPr>
-        <w:fldChar w:fldCharType="begin"/>
-        <w:instrText xml:space="preserve">REF ref_015 \h</w:instrText>
-        <w:fldChar w:fldCharType="separate"/>
-        <w:t>15</w:t>
-        <w:fldChar w:fldCharType="end"/>
-      </w:r>
-      <w:r>
-        <w:rPr>
-          <w:rFonts w:ascii="Times New Roman" w:hAnsi="Times New Roman" w:eastAsia="Times New Roman" w:cs="Times New Roman"/>
-          <w:b w:val="0"/>
-          <w:sz w:val="21"/>
-          <w:vertAlign w:val="superscript"/>
-        </w:rPr>
-        <w:t>]</w:t>
-      </w:r>
-      <w:r>
-        <w:rPr>
-          <w:rFonts w:ascii="宋体" w:hAnsi="宋体" w:eastAsia="宋体" w:cs="宋体"/>
-          <w:b w:val="0"/>
-          <w:sz w:val="21"/>
-        </w:rPr>
-        <w:t>。</w:t>
       </w:r>
     </w:p>
     <w:p>
@@ -2853,243 +2633,6 @@
           <w:b w:val="0"/>
           <w:sz w:val="21"/>
         </w:rPr>
-        <w:t>国内电子病历文本挖掘研究较早关注非结构化病历文本如何转化为可计算知识。吴宗友等将电子病历文本挖掘任务概括为数据清洗、数据集成、命名实体识别、关系抽取、信息检索和临床问答等环节</w:t>
-      </w:r>
-      <w:r>
-        <w:rPr>
-          <w:rFonts w:ascii="Times New Roman" w:hAnsi="Times New Roman" w:eastAsia="Times New Roman" w:cs="Times New Roman"/>
-          <w:b w:val="0"/>
-          <w:sz w:val="21"/>
-          <w:vertAlign w:val="superscript"/>
-        </w:rPr>
-        <w:t>[</w:t>
-      </w:r>
-      <w:r>
-        <w:rPr>
-          <w:rFonts w:ascii="Times New Roman" w:hAnsi="Times New Roman" w:eastAsia="Times New Roman" w:cs="Times New Roman"/>
-          <w:b w:val="0"/>
-          <w:sz w:val="21"/>
-          <w:vertAlign w:val="superscript"/>
-        </w:rPr>
-        <w:fldChar w:fldCharType="begin"/>
-        <w:instrText xml:space="preserve">REF ref_004 \h</w:instrText>
-        <w:fldChar w:fldCharType="separate"/>
-        <w:t>4</w:t>
-        <w:fldChar w:fldCharType="end"/>
-      </w:r>
-      <w:r>
-        <w:rPr>
-          <w:rFonts w:ascii="Times New Roman" w:hAnsi="Times New Roman" w:eastAsia="Times New Roman" w:cs="Times New Roman"/>
-          <w:b w:val="0"/>
-          <w:sz w:val="21"/>
-          <w:vertAlign w:val="superscript"/>
-        </w:rPr>
-        <w:t>]</w:t>
-      </w:r>
-      <w:r>
-        <w:rPr>
-          <w:rFonts w:ascii="宋体" w:hAnsi="宋体" w:eastAsia="宋体" w:cs="宋体"/>
-          <w:b w:val="0"/>
-          <w:sz w:val="21"/>
-        </w:rPr>
-        <w:t>。杜晋华等进一步围绕中文电子病历命名实体识别总结疾病、症状、检查、药物和身体部位等实体类型，并指出中文病历文本存在术语密集、表达不规范、标注语料不足等问题</w:t>
-      </w:r>
-      <w:r>
-        <w:rPr>
-          <w:rFonts w:ascii="Times New Roman" w:hAnsi="Times New Roman" w:eastAsia="Times New Roman" w:cs="Times New Roman"/>
-          <w:b w:val="0"/>
-          <w:sz w:val="21"/>
-          <w:vertAlign w:val="superscript"/>
-        </w:rPr>
-        <w:t>[</w:t>
-      </w:r>
-      <w:r>
-        <w:rPr>
-          <w:rFonts w:ascii="Times New Roman" w:hAnsi="Times New Roman" w:eastAsia="Times New Roman" w:cs="Times New Roman"/>
-          <w:b w:val="0"/>
-          <w:sz w:val="21"/>
-          <w:vertAlign w:val="superscript"/>
-        </w:rPr>
-        <w:fldChar w:fldCharType="begin"/>
-        <w:instrText xml:space="preserve">REF ref_005 \h</w:instrText>
-        <w:fldChar w:fldCharType="separate"/>
-        <w:t>5</w:t>
-        <w:fldChar w:fldCharType="end"/>
-      </w:r>
-      <w:r>
-        <w:rPr>
-          <w:rFonts w:ascii="Times New Roman" w:hAnsi="Times New Roman" w:eastAsia="Times New Roman" w:cs="Times New Roman"/>
-          <w:b w:val="0"/>
-          <w:sz w:val="21"/>
-          <w:vertAlign w:val="superscript"/>
-        </w:rPr>
-        <w:t>]</w:t>
-      </w:r>
-      <w:r>
-        <w:rPr>
-          <w:rFonts w:ascii="宋体" w:hAnsi="宋体" w:eastAsia="宋体" w:cs="宋体"/>
-          <w:b w:val="0"/>
-          <w:sz w:val="21"/>
-        </w:rPr>
-        <w:t>。这些研究说明，医疗文本处理需要先处理文本质量和结构化问题，不能直接跳到报告生成。</w:t>
-      </w:r>
-    </w:p>
-    <w:p>
-      <w:pPr>
-        <w:spacing w:before="0" w:after="0" w:line="360" w:lineRule="exact"/>
-        <w:ind w:firstLine="420"/>
-      </w:pPr>
-      <w:r>
-        <w:rPr>
-          <w:rFonts w:ascii="宋体" w:hAnsi="宋体" w:eastAsia="宋体" w:cs="宋体"/>
-          <w:b w:val="0"/>
-          <w:sz w:val="21"/>
-        </w:rPr>
-        <w:t>在具体模型方法方面，韩普等提出融合外部语义特征、深度学习模型和 CRF 输出的中文电子病历实体识别方法</w:t>
-      </w:r>
-      <w:r>
-        <w:rPr>
-          <w:rFonts w:ascii="Times New Roman" w:hAnsi="Times New Roman" w:eastAsia="Times New Roman" w:cs="Times New Roman"/>
-          <w:b w:val="0"/>
-          <w:sz w:val="21"/>
-          <w:vertAlign w:val="superscript"/>
-        </w:rPr>
-        <w:t>[</w:t>
-      </w:r>
-      <w:r>
-        <w:rPr>
-          <w:rFonts w:ascii="Times New Roman" w:hAnsi="Times New Roman" w:eastAsia="Times New Roman" w:cs="Times New Roman"/>
-          <w:b w:val="0"/>
-          <w:sz w:val="21"/>
-          <w:vertAlign w:val="superscript"/>
-        </w:rPr>
-        <w:fldChar w:fldCharType="begin"/>
-        <w:instrText xml:space="preserve">REF ref_006 \h</w:instrText>
-        <w:fldChar w:fldCharType="separate"/>
-        <w:t>6</w:t>
-        <w:fldChar w:fldCharType="end"/>
-      </w:r>
-      <w:r>
-        <w:rPr>
-          <w:rFonts w:ascii="Times New Roman" w:hAnsi="Times New Roman" w:eastAsia="Times New Roman" w:cs="Times New Roman"/>
-          <w:b w:val="0"/>
-          <w:sz w:val="21"/>
-          <w:vertAlign w:val="superscript"/>
-        </w:rPr>
-        <w:t>]</w:t>
-      </w:r>
-      <w:r>
-        <w:rPr>
-          <w:rFonts w:ascii="宋体" w:hAnsi="宋体" w:eastAsia="宋体" w:cs="宋体"/>
-          <w:b w:val="0"/>
-          <w:sz w:val="21"/>
-        </w:rPr>
-        <w:t>，崔少国等则从汉字图像、五笔编码、医学词典和 Lattice 结构等角度补充语义与边界信息</w:t>
-      </w:r>
-      <w:r>
-        <w:rPr>
-          <w:rFonts w:ascii="Times New Roman" w:hAnsi="Times New Roman" w:eastAsia="Times New Roman" w:cs="Times New Roman"/>
-          <w:b w:val="0"/>
-          <w:sz w:val="21"/>
-          <w:vertAlign w:val="superscript"/>
-        </w:rPr>
-        <w:t>[</w:t>
-      </w:r>
-      <w:r>
-        <w:rPr>
-          <w:rFonts w:ascii="Times New Roman" w:hAnsi="Times New Roman" w:eastAsia="Times New Roman" w:cs="Times New Roman"/>
-          <w:b w:val="0"/>
-          <w:sz w:val="21"/>
-          <w:vertAlign w:val="superscript"/>
-        </w:rPr>
-        <w:fldChar w:fldCharType="begin"/>
-        <w:instrText xml:space="preserve">REF ref_007 \h</w:instrText>
-        <w:fldChar w:fldCharType="separate"/>
-        <w:t>7</w:t>
-        <w:fldChar w:fldCharType="end"/>
-      </w:r>
-      <w:r>
-        <w:rPr>
-          <w:rFonts w:ascii="Times New Roman" w:hAnsi="Times New Roman" w:eastAsia="Times New Roman" w:cs="Times New Roman"/>
-          <w:b w:val="0"/>
-          <w:sz w:val="21"/>
-          <w:vertAlign w:val="superscript"/>
-        </w:rPr>
-        <w:t>]</w:t>
-      </w:r>
-      <w:r>
-        <w:rPr>
-          <w:rFonts w:ascii="宋体" w:hAnsi="宋体" w:eastAsia="宋体" w:cs="宋体"/>
-          <w:b w:val="0"/>
-          <w:sz w:val="21"/>
-        </w:rPr>
-        <w:t>。这些工作重点提升实体识别精度，而本文重点不在训练新的 NER 模型，而是在工程系统中保留原文、版本、指标和证据关系。二者并不冲突：专门模型可以作为未来 Provider 或标准化组件接入，本文当前实现先解决数据链路和审计可追溯问题。</w:t>
-      </w:r>
-    </w:p>
-    <w:p>
-      <w:pPr>
-        <w:spacing w:before="0" w:after="0" w:line="360" w:lineRule="exact"/>
-        <w:ind w:firstLine="420"/>
-      </w:pPr>
-      <w:r>
-        <w:rPr>
-          <w:rFonts w:ascii="宋体" w:hAnsi="宋体" w:eastAsia="宋体" w:cs="宋体"/>
-          <w:b w:val="0"/>
-          <w:sz w:val="21"/>
-        </w:rPr>
-        <w:t>真实世界数据治理研究对本文也有直接启发。盖彦蓉等指出，真实世界中文电子病历的数据质量、术语差异、数据稀疏和治理流程会影响知识抽取效果</w:t>
-      </w:r>
-      <w:r>
-        <w:rPr>
-          <w:rFonts w:ascii="Times New Roman" w:hAnsi="Times New Roman" w:eastAsia="Times New Roman" w:cs="Times New Roman"/>
-          <w:b w:val="0"/>
-          <w:sz w:val="21"/>
-          <w:vertAlign w:val="superscript"/>
-        </w:rPr>
-        <w:t>[</w:t>
-      </w:r>
-      <w:r>
-        <w:rPr>
-          <w:rFonts w:ascii="Times New Roman" w:hAnsi="Times New Roman" w:eastAsia="Times New Roman" w:cs="Times New Roman"/>
-          <w:b w:val="0"/>
-          <w:sz w:val="21"/>
-          <w:vertAlign w:val="superscript"/>
-        </w:rPr>
-        <w:fldChar w:fldCharType="begin"/>
-        <w:instrText xml:space="preserve">REF ref_008 \h</w:instrText>
-        <w:fldChar w:fldCharType="separate"/>
-        <w:t>8</w:t>
-        <w:fldChar w:fldCharType="end"/>
-      </w:r>
-      <w:r>
-        <w:rPr>
-          <w:rFonts w:ascii="Times New Roman" w:hAnsi="Times New Roman" w:eastAsia="Times New Roman" w:cs="Times New Roman"/>
-          <w:b w:val="0"/>
-          <w:sz w:val="21"/>
-          <w:vertAlign w:val="superscript"/>
-        </w:rPr>
-        <w:t>]</w:t>
-      </w:r>
-      <w:r>
-        <w:rPr>
-          <w:rFonts w:ascii="宋体" w:hAnsi="宋体" w:eastAsia="宋体" w:cs="宋体"/>
-          <w:b w:val="0"/>
-          <w:sz w:val="21"/>
-        </w:rPr>
-        <w:t>。本文面对的个人体检报告、化验单和病历摘要同样存在模板差异、单位差异和叙事表述差异。因此，系统设计中将 OCR 原文、normalized_payload、document_versions、measurements 和 audit_report_events 分开保存，使后续即使标准化规则或模型发生变化，也能回到当时的数据版本解释报告结果。</w:t>
-      </w:r>
-    </w:p>
-    <w:p>
-      <w:pPr>
-        <w:spacing w:before="0" w:after="0" w:line="360" w:lineRule="exact"/>
-        <w:ind w:firstLine="420"/>
-      </w:pPr>
-      <w:r>
-        <w:rPr>
-          <w:rFonts w:ascii="宋体" w:hAnsi="宋体" w:eastAsia="宋体" w:cs="宋体"/>
-          <w:b w:val="0"/>
-          <w:sz w:val="21"/>
-        </w:rPr>
         <w:t>在工程架构方向，检索增强生成、推理与工具调用结合、多 Agent 协作成为提升生成式系统可控性的常用方式。RAG 通过外部知识或业务数据补充模型上下文，降低脱离事实回答的概率</w:t>
       </w:r>
       <w:r>
@@ -3208,290 +2751,6 @@
           <w:sz w:val="21"/>
         </w:rPr>
         <w:t>。这些工作为本文拆分审计节点、保存中间状态和设计回环复核提供了参考。</w:t>
-      </w:r>
-    </w:p>
-    <w:p>
-      <w:pPr>
-        <w:spacing w:before="0" w:after="0" w:line="360" w:lineRule="exact"/>
-        <w:ind w:firstLine="420"/>
-      </w:pPr>
-      <w:r>
-        <w:rPr>
-          <w:rFonts w:ascii="宋体" w:hAnsi="宋体" w:eastAsia="宋体" w:cs="宋体"/>
-          <w:b w:val="0"/>
-          <w:sz w:val="21"/>
-        </w:rPr>
-        <w:t>国外研究中，RAG、ReAct 和多 Agent 框架更多从通用自然语言处理和复杂任务求解角度提出方法。Lewis 等的 RAG 工作强调将参数化模型和可检索外部记忆结合，以提高知识密集型任务的事实性和可更新性</w:t>
-      </w:r>
-      <w:r>
-        <w:rPr>
-          <w:rFonts w:ascii="Times New Roman" w:hAnsi="Times New Roman" w:eastAsia="Times New Roman" w:cs="Times New Roman"/>
-          <w:b w:val="0"/>
-          <w:sz w:val="21"/>
-          <w:vertAlign w:val="superscript"/>
-        </w:rPr>
-        <w:t>[</w:t>
-      </w:r>
-      <w:r>
-        <w:rPr>
-          <w:rFonts w:ascii="Times New Roman" w:hAnsi="Times New Roman" w:eastAsia="Times New Roman" w:cs="Times New Roman"/>
-          <w:b w:val="0"/>
-          <w:sz w:val="21"/>
-          <w:vertAlign w:val="superscript"/>
-        </w:rPr>
-        <w:fldChar w:fldCharType="begin"/>
-        <w:instrText xml:space="preserve">REF ref_019 \h</w:instrText>
-        <w:fldChar w:fldCharType="separate"/>
-        <w:t>19</w:t>
-        <w:fldChar w:fldCharType="end"/>
-      </w:r>
-      <w:r>
-        <w:rPr>
-          <w:rFonts w:ascii="Times New Roman" w:hAnsi="Times New Roman" w:eastAsia="Times New Roman" w:cs="Times New Roman"/>
-          <w:b w:val="0"/>
-          <w:sz w:val="21"/>
-          <w:vertAlign w:val="superscript"/>
-        </w:rPr>
-        <w:t>]</w:t>
-      </w:r>
-      <w:r>
-        <w:rPr>
-          <w:rFonts w:ascii="宋体" w:hAnsi="宋体" w:eastAsia="宋体" w:cs="宋体"/>
-          <w:b w:val="0"/>
-          <w:sz w:val="21"/>
-        </w:rPr>
-        <w:t>；Yao 等提出的 ReAct 将推理和行动交替组织，使模型能够利用外部工具或环境反馈修正任务过程</w:t>
-      </w:r>
-      <w:r>
-        <w:rPr>
-          <w:rFonts w:ascii="Times New Roman" w:hAnsi="Times New Roman" w:eastAsia="Times New Roman" w:cs="Times New Roman"/>
-          <w:b w:val="0"/>
-          <w:sz w:val="21"/>
-          <w:vertAlign w:val="superscript"/>
-        </w:rPr>
-        <w:t>[</w:t>
-      </w:r>
-      <w:r>
-        <w:rPr>
-          <w:rFonts w:ascii="Times New Roman" w:hAnsi="Times New Roman" w:eastAsia="Times New Roman" w:cs="Times New Roman"/>
-          <w:b w:val="0"/>
-          <w:sz w:val="21"/>
-          <w:vertAlign w:val="superscript"/>
-        </w:rPr>
-        <w:fldChar w:fldCharType="begin"/>
-        <w:instrText xml:space="preserve">REF ref_020 \h</w:instrText>
-        <w:fldChar w:fldCharType="separate"/>
-        <w:t>20</w:t>
-        <w:fldChar w:fldCharType="end"/>
-      </w:r>
-      <w:r>
-        <w:rPr>
-          <w:rFonts w:ascii="Times New Roman" w:hAnsi="Times New Roman" w:eastAsia="Times New Roman" w:cs="Times New Roman"/>
-          <w:b w:val="0"/>
-          <w:sz w:val="21"/>
-          <w:vertAlign w:val="superscript"/>
-        </w:rPr>
-        <w:t>]</w:t>
-      </w:r>
-      <w:r>
-        <w:rPr>
-          <w:rFonts w:ascii="宋体" w:hAnsi="宋体" w:eastAsia="宋体" w:cs="宋体"/>
-          <w:b w:val="0"/>
-          <w:sz w:val="21"/>
-        </w:rPr>
-        <w:t>；Wu 等提出的 AutoGen 强调多个可配置 Agent 之间的会话协同</w:t>
-      </w:r>
-      <w:r>
-        <w:rPr>
-          <w:rFonts w:ascii="Times New Roman" w:hAnsi="Times New Roman" w:eastAsia="Times New Roman" w:cs="Times New Roman"/>
-          <w:b w:val="0"/>
-          <w:sz w:val="21"/>
-          <w:vertAlign w:val="superscript"/>
-        </w:rPr>
-        <w:t>[</w:t>
-      </w:r>
-      <w:r>
-        <w:rPr>
-          <w:rFonts w:ascii="Times New Roman" w:hAnsi="Times New Roman" w:eastAsia="Times New Roman" w:cs="Times New Roman"/>
-          <w:b w:val="0"/>
-          <w:sz w:val="21"/>
-          <w:vertAlign w:val="superscript"/>
-        </w:rPr>
-        <w:fldChar w:fldCharType="begin"/>
-        <w:instrText xml:space="preserve">REF ref_021 \h</w:instrText>
-        <w:fldChar w:fldCharType="separate"/>
-        <w:t>21</w:t>
-        <w:fldChar w:fldCharType="end"/>
-      </w:r>
-      <w:r>
-        <w:rPr>
-          <w:rFonts w:ascii="Times New Roman" w:hAnsi="Times New Roman" w:eastAsia="Times New Roman" w:cs="Times New Roman"/>
-          <w:b w:val="0"/>
-          <w:sz w:val="21"/>
-          <w:vertAlign w:val="superscript"/>
-        </w:rPr>
-        <w:t>]</w:t>
-      </w:r>
-      <w:r>
-        <w:rPr>
-          <w:rFonts w:ascii="宋体" w:hAnsi="宋体" w:eastAsia="宋体" w:cs="宋体"/>
-          <w:b w:val="0"/>
-          <w:sz w:val="21"/>
-        </w:rPr>
-        <w:t>。这些方法给本文的启示是：医疗资料审计不应把模型输出当作唯一结果，而应把检索、工具调用、证据绑定和审查节点纳入流程。</w:t>
-      </w:r>
-    </w:p>
-    <w:p>
-      <w:pPr>
-        <w:spacing w:before="0" w:after="0" w:line="360" w:lineRule="exact"/>
-        <w:ind w:firstLine="420"/>
-      </w:pPr>
-      <w:r>
-        <w:rPr>
-          <w:rFonts w:ascii="宋体" w:hAnsi="宋体" w:eastAsia="宋体" w:cs="宋体"/>
-          <w:b w:val="0"/>
-          <w:sz w:val="21"/>
-        </w:rPr>
-        <w:t>在医疗大模型方向，国内外研究均强调机遇与风险并存。国内文献从医疗服务、医学研究、医学教育、知识增强和基础模型体系等角度梳理了生成式大模型的应用空间，也反复指出准确性、可解释性、隐私保护、伦理和结果可控性等问题</w:t>
-      </w:r>
-      <w:r>
-        <w:rPr>
-          <w:rFonts w:ascii="Times New Roman" w:hAnsi="Times New Roman" w:eastAsia="Times New Roman" w:cs="Times New Roman"/>
-          <w:b w:val="0"/>
-          <w:sz w:val="21"/>
-          <w:vertAlign w:val="superscript"/>
-        </w:rPr>
-        <w:t>[</w:t>
-      </w:r>
-      <w:r>
-        <w:rPr>
-          <w:rFonts w:ascii="Times New Roman" w:hAnsi="Times New Roman" w:eastAsia="Times New Roman" w:cs="Times New Roman"/>
-          <w:b w:val="0"/>
-          <w:sz w:val="21"/>
-          <w:vertAlign w:val="superscript"/>
-        </w:rPr>
-        <w:fldChar w:fldCharType="begin"/>
-        <w:instrText xml:space="preserve">REF ref_009 \h</w:instrText>
-        <w:fldChar w:fldCharType="separate"/>
-        <w:t>9</w:t>
-        <w:fldChar w:fldCharType="end"/>
-      </w:r>
-      <w:r>
-        <w:rPr>
-          <w:rFonts w:ascii="Times New Roman" w:hAnsi="Times New Roman" w:eastAsia="Times New Roman" w:cs="Times New Roman"/>
-          <w:b w:val="0"/>
-          <w:sz w:val="21"/>
-          <w:vertAlign w:val="superscript"/>
-        </w:rPr>
-        <w:t>-</w:t>
-      </w:r>
-      <w:r>
-        <w:rPr>
-          <w:rFonts w:ascii="Times New Roman" w:hAnsi="Times New Roman" w:eastAsia="Times New Roman" w:cs="Times New Roman"/>
-          <w:b w:val="0"/>
-          <w:sz w:val="21"/>
-          <w:vertAlign w:val="superscript"/>
-        </w:rPr>
-        <w:fldChar w:fldCharType="begin"/>
-        <w:instrText xml:space="preserve">REF ref_013 \h</w:instrText>
-        <w:fldChar w:fldCharType="separate"/>
-        <w:t>13</w:t>
-        <w:fldChar w:fldCharType="end"/>
-      </w:r>
-      <w:r>
-        <w:rPr>
-          <w:rFonts w:ascii="Times New Roman" w:hAnsi="Times New Roman" w:eastAsia="Times New Roman" w:cs="Times New Roman"/>
-          <w:b w:val="0"/>
-          <w:sz w:val="21"/>
-          <w:vertAlign w:val="superscript"/>
-        </w:rPr>
-        <w:t>]</w:t>
-      </w:r>
-      <w:r>
-        <w:rPr>
-          <w:rFonts w:ascii="宋体" w:hAnsi="宋体" w:eastAsia="宋体" w:cs="宋体"/>
-          <w:b w:val="0"/>
-          <w:sz w:val="21"/>
-        </w:rPr>
-        <w:t>。Thirunavukarasu 等从国际视角讨论 LLM 在医学中的潜力与风险</w:t>
-      </w:r>
-      <w:r>
-        <w:rPr>
-          <w:rFonts w:ascii="Times New Roman" w:hAnsi="Times New Roman" w:eastAsia="Times New Roman" w:cs="Times New Roman"/>
-          <w:b w:val="0"/>
-          <w:sz w:val="21"/>
-          <w:vertAlign w:val="superscript"/>
-        </w:rPr>
-        <w:t>[</w:t>
-      </w:r>
-      <w:r>
-        <w:rPr>
-          <w:rFonts w:ascii="Times New Roman" w:hAnsi="Times New Roman" w:eastAsia="Times New Roman" w:cs="Times New Roman"/>
-          <w:b w:val="0"/>
-          <w:sz w:val="21"/>
-          <w:vertAlign w:val="superscript"/>
-        </w:rPr>
-        <w:fldChar w:fldCharType="begin"/>
-        <w:instrText xml:space="preserve">REF ref_023 \h</w:instrText>
-        <w:fldChar w:fldCharType="separate"/>
-        <w:t>23</w:t>
-        <w:fldChar w:fldCharType="end"/>
-      </w:r>
-      <w:r>
-        <w:rPr>
-          <w:rFonts w:ascii="Times New Roman" w:hAnsi="Times New Roman" w:eastAsia="Times New Roman" w:cs="Times New Roman"/>
-          <w:b w:val="0"/>
-          <w:sz w:val="21"/>
-          <w:vertAlign w:val="superscript"/>
-        </w:rPr>
-        <w:t>]</w:t>
-      </w:r>
-      <w:r>
-        <w:rPr>
-          <w:rFonts w:ascii="宋体" w:hAnsi="宋体" w:eastAsia="宋体" w:cs="宋体"/>
-          <w:b w:val="0"/>
-          <w:sz w:val="21"/>
-        </w:rPr>
-        <w:t>，Wornow 等则特别提醒 EHR 数据的异质性、缺失性和编码差异会削弱模型在真实医疗系统中的可靠性</w:t>
-      </w:r>
-      <w:r>
-        <w:rPr>
-          <w:rFonts w:ascii="Times New Roman" w:hAnsi="Times New Roman" w:eastAsia="Times New Roman" w:cs="Times New Roman"/>
-          <w:b w:val="0"/>
-          <w:sz w:val="21"/>
-          <w:vertAlign w:val="superscript"/>
-        </w:rPr>
-        <w:t>[</w:t>
-      </w:r>
-      <w:r>
-        <w:rPr>
-          <w:rFonts w:ascii="Times New Roman" w:hAnsi="Times New Roman" w:eastAsia="Times New Roman" w:cs="Times New Roman"/>
-          <w:b w:val="0"/>
-          <w:sz w:val="21"/>
-          <w:vertAlign w:val="superscript"/>
-        </w:rPr>
-        <w:fldChar w:fldCharType="begin"/>
-        <w:instrText xml:space="preserve">REF ref_024 \h</w:instrText>
-        <w:fldChar w:fldCharType="separate"/>
-        <w:t>24</w:t>
-        <w:fldChar w:fldCharType="end"/>
-      </w:r>
-      <w:r>
-        <w:rPr>
-          <w:rFonts w:ascii="Times New Roman" w:hAnsi="Times New Roman" w:eastAsia="Times New Roman" w:cs="Times New Roman"/>
-          <w:b w:val="0"/>
-          <w:sz w:val="21"/>
-          <w:vertAlign w:val="superscript"/>
-        </w:rPr>
-        <w:t>]</w:t>
-      </w:r>
-      <w:r>
-        <w:rPr>
-          <w:rFonts w:ascii="宋体" w:hAnsi="宋体" w:eastAsia="宋体" w:cs="宋体"/>
-          <w:b w:val="0"/>
-          <w:sz w:val="21"/>
-        </w:rPr>
-        <w:t>。这也是本文把系统定位为“审计辅助”而不是“诊断系统”的主要原因。</w:t>
       </w:r>
     </w:p>
     <w:p>
@@ -4815,134 +4074,6 @@
           <w:b w:val="0"/>
           <w:sz w:val="21"/>
         </w:rPr>
-        <w:t>标准化工作的第一层是格式标准化，即把不同医院、体检机构或实验室给出的 PDF、图片、文本报告统一进入文件表和 OCR 表；第二层是语义标准化，即把“空腹血糖”“葡萄糖”“GLU”等可能指向同一指标的表达映射到统一字段；第三层是过程标准化，即记录每一次 OCR、标准化和报告生成的版本关系。国家医院信息化建设标准和电子病历应用水平评价虽然面向医院系统，但其中关于数据质量、业务闭环和过程留痕的要求，对个人健康资料管理系统同样具有借鉴意义</w:t>
-      </w:r>
-      <w:r>
-        <w:rPr>
-          <w:rFonts w:ascii="Times New Roman" w:hAnsi="Times New Roman" w:eastAsia="Times New Roman" w:cs="Times New Roman"/>
-          <w:b w:val="0"/>
-          <w:sz w:val="21"/>
-          <w:vertAlign w:val="superscript"/>
-        </w:rPr>
-        <w:t>[</w:t>
-      </w:r>
-      <w:r>
-        <w:rPr>
-          <w:rFonts w:ascii="Times New Roman" w:hAnsi="Times New Roman" w:eastAsia="Times New Roman" w:cs="Times New Roman"/>
-          <w:b w:val="0"/>
-          <w:sz w:val="21"/>
-          <w:vertAlign w:val="superscript"/>
-        </w:rPr>
-        <w:fldChar w:fldCharType="begin"/>
-        <w:instrText xml:space="preserve">REF ref_001 \h</w:instrText>
-        <w:fldChar w:fldCharType="separate"/>
-        <w:t>1</w:t>
-        <w:fldChar w:fldCharType="end"/>
-      </w:r>
-      <w:r>
-        <w:rPr>
-          <w:rFonts w:ascii="Times New Roman" w:hAnsi="Times New Roman" w:eastAsia="Times New Roman" w:cs="Times New Roman"/>
-          <w:b w:val="0"/>
-          <w:sz w:val="21"/>
-          <w:vertAlign w:val="superscript"/>
-        </w:rPr>
-        <w:t>-</w:t>
-      </w:r>
-      <w:r>
-        <w:rPr>
-          <w:rFonts w:ascii="Times New Roman" w:hAnsi="Times New Roman" w:eastAsia="Times New Roman" w:cs="Times New Roman"/>
-          <w:b w:val="0"/>
-          <w:sz w:val="21"/>
-          <w:vertAlign w:val="superscript"/>
-        </w:rPr>
-        <w:fldChar w:fldCharType="begin"/>
-        <w:instrText xml:space="preserve">REF ref_002 \h</w:instrText>
-        <w:fldChar w:fldCharType="separate"/>
-        <w:t>2</w:t>
-        <w:fldChar w:fldCharType="end"/>
-      </w:r>
-      <w:r>
-        <w:rPr>
-          <w:rFonts w:ascii="Times New Roman" w:hAnsi="Times New Roman" w:eastAsia="Times New Roman" w:cs="Times New Roman"/>
-          <w:b w:val="0"/>
-          <w:sz w:val="21"/>
-          <w:vertAlign w:val="superscript"/>
-        </w:rPr>
-        <w:t>]</w:t>
-      </w:r>
-      <w:r>
-        <w:rPr>
-          <w:rFonts w:ascii="宋体" w:hAnsi="宋体" w:eastAsia="宋体" w:cs="宋体"/>
-          <w:b w:val="0"/>
-          <w:sz w:val="21"/>
-        </w:rPr>
-        <w:t>。</w:t>
-      </w:r>
-    </w:p>
-    <w:p>
-      <w:pPr>
-        <w:spacing w:before="0" w:after="0" w:line="360" w:lineRule="exact"/>
-        <w:ind w:firstLine="420"/>
-      </w:pPr>
-      <w:r>
-        <w:rPr>
-          <w:rFonts w:ascii="宋体" w:hAnsi="宋体" w:eastAsia="宋体" w:cs="宋体"/>
-          <w:b w:val="0"/>
-          <w:sz w:val="21"/>
-        </w:rPr>
-        <w:t>从隐私和安全角度看，医疗资料中的姓名、年龄、检查编号、报告日期、检查结果和病史描述都可能构成敏感个人信息。个人信息安全规范强调处理个人信息应遵循目的明确、最小必要和安全保障原则</w:t>
-      </w:r>
-      <w:r>
-        <w:rPr>
-          <w:rFonts w:ascii="Times New Roman" w:hAnsi="Times New Roman" w:eastAsia="Times New Roman" w:cs="Times New Roman"/>
-          <w:b w:val="0"/>
-          <w:sz w:val="21"/>
-          <w:vertAlign w:val="superscript"/>
-        </w:rPr>
-        <w:t>[</w:t>
-      </w:r>
-      <w:r>
-        <w:rPr>
-          <w:rFonts w:ascii="Times New Roman" w:hAnsi="Times New Roman" w:eastAsia="Times New Roman" w:cs="Times New Roman"/>
-          <w:b w:val="0"/>
-          <w:sz w:val="21"/>
-          <w:vertAlign w:val="superscript"/>
-        </w:rPr>
-        <w:fldChar w:fldCharType="begin"/>
-        <w:instrText xml:space="preserve">REF ref_003 \h</w:instrText>
-        <w:fldChar w:fldCharType="separate"/>
-        <w:t>3</w:t>
-        <w:fldChar w:fldCharType="end"/>
-      </w:r>
-      <w:r>
-        <w:rPr>
-          <w:rFonts w:ascii="Times New Roman" w:hAnsi="Times New Roman" w:eastAsia="Times New Roman" w:cs="Times New Roman"/>
-          <w:b w:val="0"/>
-          <w:sz w:val="21"/>
-          <w:vertAlign w:val="superscript"/>
-        </w:rPr>
-        <w:t>]</w:t>
-      </w:r>
-      <w:r>
-        <w:rPr>
-          <w:rFonts w:ascii="宋体" w:hAnsi="宋体" w:eastAsia="宋体" w:cs="宋体"/>
-          <w:b w:val="0"/>
-          <w:sz w:val="21"/>
-        </w:rPr>
-        <w:t>。因此，本文系统在本地毕业设计阶段虽然以 Mock 数据为主，但数据模型仍按真实系统思路保留 user_id 隔离、任务事件、Provider 调用事件和审计事件。这样做不是为了增加复杂度，而是为了让系统具备后续上线时扩展权限控制、脱敏和日志审计的基础。</w:t>
-      </w:r>
-    </w:p>
-    <w:p>
-      <w:pPr>
-        <w:spacing w:before="0" w:after="0" w:line="360" w:lineRule="exact"/>
-        <w:ind w:firstLine="420"/>
-      </w:pPr>
-      <w:r>
-        <w:rPr>
-          <w:rFonts w:ascii="宋体" w:hAnsi="宋体" w:eastAsia="宋体" w:cs="宋体"/>
-          <w:b w:val="0"/>
-          <w:sz w:val="21"/>
-        </w:rPr>
         <w:t>吴宗友等在《电子病历文本挖掘研究综述》中将电子病历文本挖掘整理为数据清洗、数据集成、命名实体识别、关系抽取、信息检索和临床问答等任务，并指出电子病历文本包含大量非结构化信息，需要通过文本挖掘转化为可利用知识</w:t>
       </w:r>
       <w:r>
@@ -5127,81 +4258,6 @@
           <w:b w:val="0"/>
           <w:sz w:val="21"/>
         </w:rPr>
-        <w:t>上述 NER 研究通常以标注数据集和实体边界识别为重点，适合解决疾病、症状、检查和药物等实体抽取问题</w:t>
-      </w:r>
-      <w:r>
-        <w:rPr>
-          <w:rFonts w:ascii="Times New Roman" w:hAnsi="Times New Roman" w:eastAsia="Times New Roman" w:cs="Times New Roman"/>
-          <w:b w:val="0"/>
-          <w:sz w:val="21"/>
-          <w:vertAlign w:val="superscript"/>
-        </w:rPr>
-        <w:t>[</w:t>
-      </w:r>
-      <w:r>
-        <w:rPr>
-          <w:rFonts w:ascii="Times New Roman" w:hAnsi="Times New Roman" w:eastAsia="Times New Roman" w:cs="Times New Roman"/>
-          <w:b w:val="0"/>
-          <w:sz w:val="21"/>
-          <w:vertAlign w:val="superscript"/>
-        </w:rPr>
-        <w:fldChar w:fldCharType="begin"/>
-        <w:instrText xml:space="preserve">REF ref_005 \h</w:instrText>
-        <w:fldChar w:fldCharType="separate"/>
-        <w:t>5</w:t>
-        <w:fldChar w:fldCharType="end"/>
-      </w:r>
-      <w:r>
-        <w:rPr>
-          <w:rFonts w:ascii="Times New Roman" w:hAnsi="Times New Roman" w:eastAsia="Times New Roman" w:cs="Times New Roman"/>
-          <w:b w:val="0"/>
-          <w:sz w:val="21"/>
-          <w:vertAlign w:val="superscript"/>
-        </w:rPr>
-        <w:t>-</w:t>
-      </w:r>
-      <w:r>
-        <w:rPr>
-          <w:rFonts w:ascii="Times New Roman" w:hAnsi="Times New Roman" w:eastAsia="Times New Roman" w:cs="Times New Roman"/>
-          <w:b w:val="0"/>
-          <w:sz w:val="21"/>
-          <w:vertAlign w:val="superscript"/>
-        </w:rPr>
-        <w:fldChar w:fldCharType="begin"/>
-        <w:instrText xml:space="preserve">REF ref_007 \h</w:instrText>
-        <w:fldChar w:fldCharType="separate"/>
-        <w:t>7</w:t>
-        <w:fldChar w:fldCharType="end"/>
-      </w:r>
-      <w:r>
-        <w:rPr>
-          <w:rFonts w:ascii="Times New Roman" w:hAnsi="Times New Roman" w:eastAsia="Times New Roman" w:cs="Times New Roman"/>
-          <w:b w:val="0"/>
-          <w:sz w:val="21"/>
-          <w:vertAlign w:val="superscript"/>
-        </w:rPr>
-        <w:t>]</w:t>
-      </w:r>
-      <w:r>
-        <w:rPr>
-          <w:rFonts w:ascii="宋体" w:hAnsi="宋体" w:eastAsia="宋体" w:cs="宋体"/>
-          <w:b w:val="0"/>
-          <w:sz w:val="21"/>
-        </w:rPr>
-        <w:t>。本文的输入材料则包含体检总检、检验报告、影像结论和病历摘要，其结构不完全等同于医院电子病历。体检报告中的数值指标需要支持趋势比较，影像结论中的自然语言需要保留原文依据，病历摘要中的既往史和用药信息需要作为叙事事实参与审计。由此可见，本文更接近“工程化标准化与证据管理”问题，而不是单纯的实体识别模型问题。</w:t>
-      </w:r>
-    </w:p>
-    <w:p>
-      <w:pPr>
-        <w:spacing w:before="0" w:after="0" w:line="360" w:lineRule="exact"/>
-        <w:ind w:firstLine="420"/>
-      </w:pPr>
-      <w:r>
-        <w:rPr>
-          <w:rFonts w:ascii="宋体" w:hAnsi="宋体" w:eastAsia="宋体" w:cs="宋体"/>
-          <w:b w:val="0"/>
-          <w:sz w:val="21"/>
-        </w:rPr>
         <w:t>上述研究说明，中文医疗文本处理不是简单提示词可以完全解决的问题。专门 NER 模型强调实体边界、领域词典和训练语料，但本文面对的是个人体检报告、化验单、影像结论和病历摘要混杂的演示数据，难点不只在实体识别精度，还包括报告模板差异、指标单位差异、文档版本留痕和最终审计证据绑定。因此，本文没有把医疗资料处理简化为单个 NER 模型，而是采用“原始文件、OCR 结果、当前文档投影、文档版本、结构化指标”五层数据结构。</w:t>
       </w:r>
     </w:p>
@@ -5506,7 +4562,191 @@
           <w:b w:val="0"/>
           <w:sz w:val="21"/>
         </w:rPr>
-        <w:t>将上述研究映射到本文系统，可以发现医疗大模型的价值主要体现在三个环节。第一是 OCR 后的文本理解和标准化，模型可以辅助识别报告日期、文档类型、叙事事实和常见指标；第二是知识解释，模型可以把异常指标和医学知识来源组织成用户可读的审计说明；第三是报告生成，模型可以把多个审计节点的结构化输出整合为完整报告。但是，每个环节都必须有结构化约束、证据绑定和安全审查，否则生成式能力越强，越容易产生看似合理但无法追溯的结论</w:t>
+        <w:t>国际研究也给出类似提醒。Thirunavukarasu 等在 Nature Medicine 发表的综述指出，LLM 在医学问答、临床文档和医学教育等场景中具有潜力，但临床使用仍需重视偏差、可解释性、安全性和监管问题</w:t>
+      </w:r>
+      <w:r>
+        <w:rPr>
+          <w:rFonts w:ascii="Times New Roman" w:hAnsi="Times New Roman" w:eastAsia="Times New Roman" w:cs="Times New Roman"/>
+          <w:b w:val="0"/>
+          <w:sz w:val="21"/>
+          <w:vertAlign w:val="superscript"/>
+        </w:rPr>
+        <w:t>[</w:t>
+      </w:r>
+      <w:r>
+        <w:rPr>
+          <w:rFonts w:ascii="Times New Roman" w:hAnsi="Times New Roman" w:eastAsia="Times New Roman" w:cs="Times New Roman"/>
+          <w:b w:val="0"/>
+          <w:sz w:val="21"/>
+          <w:vertAlign w:val="superscript"/>
+        </w:rPr>
+        <w:fldChar w:fldCharType="begin"/>
+        <w:instrText xml:space="preserve">REF ref_023 \h</w:instrText>
+        <w:fldChar w:fldCharType="separate"/>
+        <w:t>23</w:t>
+        <w:fldChar w:fldCharType="end"/>
+      </w:r>
+      <w:r>
+        <w:rPr>
+          <w:rFonts w:ascii="Times New Roman" w:hAnsi="Times New Roman" w:eastAsia="Times New Roman" w:cs="Times New Roman"/>
+          <w:b w:val="0"/>
+          <w:sz w:val="21"/>
+          <w:vertAlign w:val="superscript"/>
+        </w:rPr>
+        <w:t>]</w:t>
+      </w:r>
+      <w:r>
+        <w:rPr>
+          <w:rFonts w:ascii="宋体" w:hAnsi="宋体" w:eastAsia="宋体" w:cs="宋体"/>
+          <w:b w:val="0"/>
+          <w:sz w:val="21"/>
+        </w:rPr>
+        <w:t>。Wornow 等在 npj Digital Medicine 中讨论面向电子健康记录的 LLM 和基础模型，强调 EHR 数据具有异质性、缺失性和编码差异，许多模型评估任务并不能充分说明其对真实医疗系统的有效性</w:t>
+      </w:r>
+      <w:r>
+        <w:rPr>
+          <w:rFonts w:ascii="Times New Roman" w:hAnsi="Times New Roman" w:eastAsia="Times New Roman" w:cs="Times New Roman"/>
+          <w:b w:val="0"/>
+          <w:sz w:val="21"/>
+          <w:vertAlign w:val="superscript"/>
+        </w:rPr>
+        <w:t>[</w:t>
+      </w:r>
+      <w:r>
+        <w:rPr>
+          <w:rFonts w:ascii="Times New Roman" w:hAnsi="Times New Roman" w:eastAsia="Times New Roman" w:cs="Times New Roman"/>
+          <w:b w:val="0"/>
+          <w:sz w:val="21"/>
+          <w:vertAlign w:val="superscript"/>
+        </w:rPr>
+        <w:fldChar w:fldCharType="begin"/>
+        <w:instrText xml:space="preserve">REF ref_024 \h</w:instrText>
+        <w:fldChar w:fldCharType="separate"/>
+        <w:t>24</w:t>
+        <w:fldChar w:fldCharType="end"/>
+      </w:r>
+      <w:r>
+        <w:rPr>
+          <w:rFonts w:ascii="Times New Roman" w:hAnsi="Times New Roman" w:eastAsia="Times New Roman" w:cs="Times New Roman"/>
+          <w:b w:val="0"/>
+          <w:sz w:val="21"/>
+          <w:vertAlign w:val="superscript"/>
+        </w:rPr>
+        <w:t>]</w:t>
+      </w:r>
+      <w:r>
+        <w:rPr>
+          <w:rFonts w:ascii="宋体" w:hAnsi="宋体" w:eastAsia="宋体" w:cs="宋体"/>
+          <w:b w:val="0"/>
+          <w:sz w:val="21"/>
+        </w:rPr>
+        <w:t>。因此，本文系统只把大模型用于标准化、智能洞察和报告生成增强，不把生成结果直接等同于诊断结论。</w:t>
+      </w:r>
+    </w:p>
+    <w:p>
+      <w:pPr>
+        <w:spacing w:before="0" w:after="0" w:line="360" w:lineRule="exact"/>
+        <w:ind w:firstLine="420"/>
+      </w:pPr>
+      <w:r>
+        <w:rPr>
+          <w:rFonts w:ascii="宋体" w:hAnsi="宋体" w:eastAsia="宋体" w:cs="宋体"/>
+          <w:b w:val="0"/>
+          <w:sz w:val="21"/>
+        </w:rPr>
+        <w:t>知识增强是降低生成式系统脱离事实的重要方向。Lewis 等提出 Retrieval-Augmented Generation，将参数化 seq2seq 模型与非参数化检索记忆结合，生成前先从外部文档索引中检索相关内容，并指出这种方式有助于提供来源、更新知识和缓解纯参数模型的事实性问题</w:t>
+      </w:r>
+      <w:r>
+        <w:rPr>
+          <w:rFonts w:ascii="Times New Roman" w:hAnsi="Times New Roman" w:eastAsia="Times New Roman" w:cs="Times New Roman"/>
+          <w:b w:val="0"/>
+          <w:sz w:val="21"/>
+          <w:vertAlign w:val="superscript"/>
+        </w:rPr>
+        <w:t>[</w:t>
+      </w:r>
+      <w:r>
+        <w:rPr>
+          <w:rFonts w:ascii="Times New Roman" w:hAnsi="Times New Roman" w:eastAsia="Times New Roman" w:cs="Times New Roman"/>
+          <w:b w:val="0"/>
+          <w:sz w:val="21"/>
+          <w:vertAlign w:val="superscript"/>
+        </w:rPr>
+        <w:fldChar w:fldCharType="begin"/>
+        <w:instrText xml:space="preserve">REF ref_019 \h</w:instrText>
+        <w:fldChar w:fldCharType="separate"/>
+        <w:t>19</w:t>
+        <w:fldChar w:fldCharType="end"/>
+      </w:r>
+      <w:r>
+        <w:rPr>
+          <w:rFonts w:ascii="Times New Roman" w:hAnsi="Times New Roman" w:eastAsia="Times New Roman" w:cs="Times New Roman"/>
+          <w:b w:val="0"/>
+          <w:sz w:val="21"/>
+          <w:vertAlign w:val="superscript"/>
+        </w:rPr>
+        <w:t>]</w:t>
+      </w:r>
+      <w:r>
+        <w:rPr>
+          <w:rFonts w:ascii="宋体" w:hAnsi="宋体" w:eastAsia="宋体" w:cs="宋体"/>
+          <w:b w:val="0"/>
+          <w:sz w:val="21"/>
+        </w:rPr>
+        <w:t>。对于医疗资料审计来说，RAG 的价值不只是让回答更丰富，而是让报告能够附带知识来源、命中片段和审计依据，从而降低“凭空解释”的风险。</w:t>
+      </w:r>
+    </w:p>
+    <w:p>
+      <w:pPr>
+        <w:spacing w:before="0" w:after="0" w:line="360" w:lineRule="exact"/>
+        <w:ind w:firstLine="420"/>
+      </w:pPr>
+      <w:r>
+        <w:rPr>
+          <w:rFonts w:ascii="宋体" w:hAnsi="宋体" w:eastAsia="宋体" w:cs="宋体"/>
+          <w:b w:val="0"/>
+          <w:sz w:val="21"/>
+        </w:rPr>
+        <w:t>在当前实现中，RAG 并不是独立的聊天功能，而是服务于综合审计报告状态机。系统内置医学审计知识块和默沙东医学手册摘要知识块，通过 knowledge_retrieval_agent 根据风险点和异常指标构造查询，使用确定性的词法排序召回相关知识，再将 knowledge_context 写入 AuditGraphState。最终报告中的 rag_summary、knowledge_sources 和 knowledge_chunk 类型证据，用于展示知识命中情况和来源。该设计对应 Lewis 等提出的“检索外部知识再生成”的思想</w:t>
+      </w:r>
+      <w:r>
+        <w:rPr>
+          <w:rFonts w:ascii="Times New Roman" w:hAnsi="Times New Roman" w:eastAsia="Times New Roman" w:cs="Times New Roman"/>
+          <w:b w:val="0"/>
+          <w:sz w:val="21"/>
+          <w:vertAlign w:val="superscript"/>
+        </w:rPr>
+        <w:t>[</w:t>
+      </w:r>
+      <w:r>
+        <w:rPr>
+          <w:rFonts w:ascii="Times New Roman" w:hAnsi="Times New Roman" w:eastAsia="Times New Roman" w:cs="Times New Roman"/>
+          <w:b w:val="0"/>
+          <w:sz w:val="21"/>
+          <w:vertAlign w:val="superscript"/>
+        </w:rPr>
+        <w:fldChar w:fldCharType="begin"/>
+        <w:instrText xml:space="preserve">REF ref_019 \h</w:instrText>
+        <w:fldChar w:fldCharType="separate"/>
+        <w:t>19</w:t>
+        <w:fldChar w:fldCharType="end"/>
+      </w:r>
+      <w:r>
+        <w:rPr>
+          <w:rFonts w:ascii="Times New Roman" w:hAnsi="Times New Roman" w:eastAsia="Times New Roman" w:cs="Times New Roman"/>
+          <w:b w:val="0"/>
+          <w:sz w:val="21"/>
+          <w:vertAlign w:val="superscript"/>
+        </w:rPr>
+        <w:t>]</w:t>
+      </w:r>
+      <w:r>
+        <w:rPr>
+          <w:rFonts w:ascii="宋体" w:hAnsi="宋体" w:eastAsia="宋体" w:cs="宋体"/>
+          <w:b w:val="0"/>
+          <w:sz w:val="21"/>
+        </w:rPr>
+        <w:t>，也回应了医疗大模型研究中对事实性、可追溯性和责任边界的要求</w:t>
       </w:r>
       <w:r>
         <w:rPr>
@@ -5559,38 +4799,7 @@
           <w:sz w:val="21"/>
           <w:vertAlign w:val="superscript"/>
         </w:rPr>
-        <w:t>]</w:t>
-      </w:r>
-      <w:r>
-        <w:rPr>
-          <w:rFonts w:ascii="宋体" w:hAnsi="宋体" w:eastAsia="宋体" w:cs="宋体"/>
-          <w:b w:val="0"/>
-          <w:sz w:val="21"/>
-        </w:rPr>
-        <w:t>。</w:t>
-      </w:r>
-    </w:p>
-    <w:p>
-      <w:pPr>
-        <w:spacing w:before="0" w:after="0" w:line="360" w:lineRule="exact"/>
-        <w:ind w:firstLine="420"/>
-      </w:pPr>
-      <w:r>
-        <w:rPr>
-          <w:rFonts w:ascii="宋体" w:hAnsi="宋体" w:eastAsia="宋体" w:cs="宋体"/>
-          <w:b w:val="0"/>
-          <w:sz w:val="21"/>
-        </w:rPr>
-        <w:t>国际研究也给出类似提醒。Thirunavukarasu 等在 Nature Medicine 发表的综述指出，LLM 在医学问答、临床文档和医学教育等场景中具有潜力，但临床使用仍需重视偏差、可解释性、安全性和监管问题</w:t>
-      </w:r>
-      <w:r>
-        <w:rPr>
-          <w:rFonts w:ascii="Times New Roman" w:hAnsi="Times New Roman" w:eastAsia="Times New Roman" w:cs="Times New Roman"/>
-          <w:b w:val="0"/>
-          <w:sz w:val="21"/>
-          <w:vertAlign w:val="superscript"/>
-        </w:rPr>
-        <w:t>[</w:t>
+        <w:t>,</w:t>
       </w:r>
       <w:r>
         <w:rPr>
@@ -5612,24 +4821,7 @@
           <w:sz w:val="21"/>
           <w:vertAlign w:val="superscript"/>
         </w:rPr>
-        <w:t>]</w:t>
-      </w:r>
-      <w:r>
-        <w:rPr>
-          <w:rFonts w:ascii="宋体" w:hAnsi="宋体" w:eastAsia="宋体" w:cs="宋体"/>
-          <w:b w:val="0"/>
-          <w:sz w:val="21"/>
-        </w:rPr>
-        <w:t>。Wornow 等在 npj Digital Medicine 中讨论面向电子健康记录的 LLM 和基础模型，强调 EHR 数据具有异质性、缺失性和编码差异，许多模型评估任务并不能充分说明其对真实医疗系统的有效性</w:t>
-      </w:r>
-      <w:r>
-        <w:rPr>
-          <w:rFonts w:ascii="Times New Roman" w:hAnsi="Times New Roman" w:eastAsia="Times New Roman" w:cs="Times New Roman"/>
-          <w:b w:val="0"/>
-          <w:sz w:val="21"/>
-          <w:vertAlign w:val="superscript"/>
-        </w:rPr>
-        <w:t>[</w:t>
+        <w:t>-</w:t>
       </w:r>
       <w:r>
         <w:rPr>
@@ -5659,323 +4851,6 @@
           <w:b w:val="0"/>
           <w:sz w:val="21"/>
         </w:rPr>
-        <w:t>。因此，本文系统只把大模型用于标准化、智能洞察和报告生成增强，不把生成结果直接等同于诊断结论。</w:t>
-      </w:r>
-    </w:p>
-    <w:p>
-      <w:pPr>
-        <w:spacing w:before="0" w:after="0" w:line="360" w:lineRule="exact"/>
-        <w:ind w:firstLine="420"/>
-      </w:pPr>
-      <w:r>
-        <w:rPr>
-          <w:rFonts w:ascii="宋体" w:hAnsi="宋体" w:eastAsia="宋体" w:cs="宋体"/>
-          <w:b w:val="0"/>
-          <w:sz w:val="21"/>
-        </w:rPr>
-        <w:t>EHR 和个人体检资料之间虽然来源不同，但都具有异质性和上下文依赖性。Wornow 等关于 EHR 基础模型的讨论提醒本文不能把单次模型输出视为可靠事实</w:t>
-      </w:r>
-      <w:r>
-        <w:rPr>
-          <w:rFonts w:ascii="Times New Roman" w:hAnsi="Times New Roman" w:eastAsia="Times New Roman" w:cs="Times New Roman"/>
-          <w:b w:val="0"/>
-          <w:sz w:val="21"/>
-          <w:vertAlign w:val="superscript"/>
-        </w:rPr>
-        <w:t>[</w:t>
-      </w:r>
-      <w:r>
-        <w:rPr>
-          <w:rFonts w:ascii="Times New Roman" w:hAnsi="Times New Roman" w:eastAsia="Times New Roman" w:cs="Times New Roman"/>
-          <w:b w:val="0"/>
-          <w:sz w:val="21"/>
-          <w:vertAlign w:val="superscript"/>
-        </w:rPr>
-        <w:fldChar w:fldCharType="begin"/>
-        <w:instrText xml:space="preserve">REF ref_024 \h</w:instrText>
-        <w:fldChar w:fldCharType="separate"/>
-        <w:t>24</w:t>
-        <w:fldChar w:fldCharType="end"/>
-      </w:r>
-      <w:r>
-        <w:rPr>
-          <w:rFonts w:ascii="Times New Roman" w:hAnsi="Times New Roman" w:eastAsia="Times New Roman" w:cs="Times New Roman"/>
-          <w:b w:val="0"/>
-          <w:sz w:val="21"/>
-          <w:vertAlign w:val="superscript"/>
-        </w:rPr>
-        <w:t>]</w:t>
-      </w:r>
-      <w:r>
-        <w:rPr>
-          <w:rFonts w:ascii="宋体" w:hAnsi="宋体" w:eastAsia="宋体" w:cs="宋体"/>
-          <w:b w:val="0"/>
-          <w:sz w:val="21"/>
-        </w:rPr>
-        <w:t>。例如，血糖、肝功能、炎症指标等数值是否异常，既取决于指标值，也取决于单位、参考范围、报告日期和上下文；影像结论是否需要关注，也需要结合原文描述和报告类型。因此，本文采用 RAG 知识检索、结构化指标、原文证据和安全审查共同约束模型输出。</w:t>
-      </w:r>
-    </w:p>
-    <w:p>
-      <w:pPr>
-        <w:spacing w:before="0" w:after="0" w:line="360" w:lineRule="exact"/>
-        <w:ind w:firstLine="420"/>
-      </w:pPr>
-      <w:r>
-        <w:rPr>
-          <w:rFonts w:ascii="宋体" w:hAnsi="宋体" w:eastAsia="宋体" w:cs="宋体"/>
-          <w:b w:val="0"/>
-          <w:sz w:val="21"/>
-        </w:rPr>
-        <w:t>知识增强是降低生成式系统脱离事实的重要方向。Lewis 等提出 Retrieval-Augmented Generation，将参数化 seq2seq 模型与非参数化检索记忆结合，生成前先从外部文档索引中检索相关内容，并指出这种方式有助于提供来源、更新知识和缓解纯参数模型的事实性问题</w:t>
-      </w:r>
-      <w:r>
-        <w:rPr>
-          <w:rFonts w:ascii="Times New Roman" w:hAnsi="Times New Roman" w:eastAsia="Times New Roman" w:cs="Times New Roman"/>
-          <w:b w:val="0"/>
-          <w:sz w:val="21"/>
-          <w:vertAlign w:val="superscript"/>
-        </w:rPr>
-        <w:t>[</w:t>
-      </w:r>
-      <w:r>
-        <w:rPr>
-          <w:rFonts w:ascii="Times New Roman" w:hAnsi="Times New Roman" w:eastAsia="Times New Roman" w:cs="Times New Roman"/>
-          <w:b w:val="0"/>
-          <w:sz w:val="21"/>
-          <w:vertAlign w:val="superscript"/>
-        </w:rPr>
-        <w:fldChar w:fldCharType="begin"/>
-        <w:instrText xml:space="preserve">REF ref_019 \h</w:instrText>
-        <w:fldChar w:fldCharType="separate"/>
-        <w:t>19</w:t>
-        <w:fldChar w:fldCharType="end"/>
-      </w:r>
-      <w:r>
-        <w:rPr>
-          <w:rFonts w:ascii="Times New Roman" w:hAnsi="Times New Roman" w:eastAsia="Times New Roman" w:cs="Times New Roman"/>
-          <w:b w:val="0"/>
-          <w:sz w:val="21"/>
-          <w:vertAlign w:val="superscript"/>
-        </w:rPr>
-        <w:t>]</w:t>
-      </w:r>
-      <w:r>
-        <w:rPr>
-          <w:rFonts w:ascii="宋体" w:hAnsi="宋体" w:eastAsia="宋体" w:cs="宋体"/>
-          <w:b w:val="0"/>
-          <w:sz w:val="21"/>
-        </w:rPr>
-        <w:t>。对于医疗资料审计来说，RAG 的价值不只是让回答更丰富，而是让报告能够附带知识来源、命中片段和审计依据，从而降低“凭空解释”的风险。</w:t>
-      </w:r>
-    </w:p>
-    <w:p>
-      <w:pPr>
-        <w:spacing w:before="0" w:after="0" w:line="360" w:lineRule="exact"/>
-        <w:ind w:firstLine="420"/>
-      </w:pPr>
-      <w:r>
-        <w:rPr>
-          <w:rFonts w:ascii="宋体" w:hAnsi="宋体" w:eastAsia="宋体" w:cs="宋体"/>
-          <w:b w:val="0"/>
-          <w:sz w:val="21"/>
-        </w:rPr>
-        <w:t>知识增强医学语言模型研究也指出，医学知识图谱、多模态数据和外部知识库能够提升模型的专业性与可信性</w:t>
-      </w:r>
-      <w:r>
-        <w:rPr>
-          <w:rFonts w:ascii="Times New Roman" w:hAnsi="Times New Roman" w:eastAsia="Times New Roman" w:cs="Times New Roman"/>
-          <w:b w:val="0"/>
-          <w:sz w:val="21"/>
-          <w:vertAlign w:val="superscript"/>
-        </w:rPr>
-        <w:t>[</w:t>
-      </w:r>
-      <w:r>
-        <w:rPr>
-          <w:rFonts w:ascii="Times New Roman" w:hAnsi="Times New Roman" w:eastAsia="Times New Roman" w:cs="Times New Roman"/>
-          <w:b w:val="0"/>
-          <w:sz w:val="21"/>
-          <w:vertAlign w:val="superscript"/>
-        </w:rPr>
-        <w:fldChar w:fldCharType="begin"/>
-        <w:instrText xml:space="preserve">REF ref_010 \h</w:instrText>
-        <w:fldChar w:fldCharType="separate"/>
-        <w:t>10</w:t>
-        <w:fldChar w:fldCharType="end"/>
-      </w:r>
-      <w:r>
-        <w:rPr>
-          <w:rFonts w:ascii="Times New Roman" w:hAnsi="Times New Roman" w:eastAsia="Times New Roman" w:cs="Times New Roman"/>
-          <w:b w:val="0"/>
-          <w:sz w:val="21"/>
-          <w:vertAlign w:val="superscript"/>
-        </w:rPr>
-        <w:t>]</w:t>
-      </w:r>
-      <w:r>
-        <w:rPr>
-          <w:rFonts w:ascii="宋体" w:hAnsi="宋体" w:eastAsia="宋体" w:cs="宋体"/>
-          <w:b w:val="0"/>
-          <w:sz w:val="21"/>
-        </w:rPr>
-        <w:t>。本文没有构建完整医学知识图谱，而是采用更适合毕业设计规模的轻量知识块方案：将医学审计知识和公开医学手册摘要整理为 knowledge_chunks，并在综合审计报告中由 knowledge_retrieval_agent 按异常指标和风险点检索。该设计比完全依赖模型参数更容易解释，也便于在论文中展示知识来源、命中片段和最终报告之间的关系。</w:t>
-      </w:r>
-    </w:p>
-    <w:p>
-      <w:pPr>
-        <w:spacing w:before="0" w:after="0" w:line="360" w:lineRule="exact"/>
-        <w:ind w:firstLine="420"/>
-      </w:pPr>
-      <w:r>
-        <w:rPr>
-          <w:rFonts w:ascii="宋体" w:hAnsi="宋体" w:eastAsia="宋体" w:cs="宋体"/>
-          <w:b w:val="0"/>
-          <w:sz w:val="21"/>
-        </w:rPr>
-        <w:t>在当前实现中，RAG 并不是独立的聊天功能，而是服务于综合审计报告状态机。系统内置医学审计知识块和默沙东医学手册摘要知识块，通过 knowledge_retrieval_agent 根据风险点和异常指标构造查询，使用确定性的词法排序召回相关知识，再将 knowledge_context 写入 AuditGraphState。最终报告中的 rag_summary、knowledge_sources 和 knowledge_chunk 类型证据，用于展示知识命中情况和来源。该设计对应 Lewis 等提出的“检索外部知识再生成”的思想</w:t>
-      </w:r>
-      <w:r>
-        <w:rPr>
-          <w:rFonts w:ascii="Times New Roman" w:hAnsi="Times New Roman" w:eastAsia="Times New Roman" w:cs="Times New Roman"/>
-          <w:b w:val="0"/>
-          <w:sz w:val="21"/>
-          <w:vertAlign w:val="superscript"/>
-        </w:rPr>
-        <w:t>[</w:t>
-      </w:r>
-      <w:r>
-        <w:rPr>
-          <w:rFonts w:ascii="Times New Roman" w:hAnsi="Times New Roman" w:eastAsia="Times New Roman" w:cs="Times New Roman"/>
-          <w:b w:val="0"/>
-          <w:sz w:val="21"/>
-          <w:vertAlign w:val="superscript"/>
-        </w:rPr>
-        <w:fldChar w:fldCharType="begin"/>
-        <w:instrText xml:space="preserve">REF ref_019 \h</w:instrText>
-        <w:fldChar w:fldCharType="separate"/>
-        <w:t>19</w:t>
-        <w:fldChar w:fldCharType="end"/>
-      </w:r>
-      <w:r>
-        <w:rPr>
-          <w:rFonts w:ascii="Times New Roman" w:hAnsi="Times New Roman" w:eastAsia="Times New Roman" w:cs="Times New Roman"/>
-          <w:b w:val="0"/>
-          <w:sz w:val="21"/>
-          <w:vertAlign w:val="superscript"/>
-        </w:rPr>
-        <w:t>]</w:t>
-      </w:r>
-      <w:r>
-        <w:rPr>
-          <w:rFonts w:ascii="宋体" w:hAnsi="宋体" w:eastAsia="宋体" w:cs="宋体"/>
-          <w:b w:val="0"/>
-          <w:sz w:val="21"/>
-        </w:rPr>
-        <w:t>，也回应了医疗大模型研究中对事实性、可追溯性和责任边界的要求</w:t>
-      </w:r>
-      <w:r>
-        <w:rPr>
-          <w:rFonts w:ascii="Times New Roman" w:hAnsi="Times New Roman" w:eastAsia="Times New Roman" w:cs="Times New Roman"/>
-          <w:b w:val="0"/>
-          <w:sz w:val="21"/>
-          <w:vertAlign w:val="superscript"/>
-        </w:rPr>
-        <w:t>[</w:t>
-      </w:r>
-      <w:r>
-        <w:rPr>
-          <w:rFonts w:ascii="Times New Roman" w:hAnsi="Times New Roman" w:eastAsia="Times New Roman" w:cs="Times New Roman"/>
-          <w:b w:val="0"/>
-          <w:sz w:val="21"/>
-          <w:vertAlign w:val="superscript"/>
-        </w:rPr>
-        <w:fldChar w:fldCharType="begin"/>
-        <w:instrText xml:space="preserve">REF ref_009 \h</w:instrText>
-        <w:fldChar w:fldCharType="separate"/>
-        <w:t>9</w:t>
-        <w:fldChar w:fldCharType="end"/>
-      </w:r>
-      <w:r>
-        <w:rPr>
-          <w:rFonts w:ascii="Times New Roman" w:hAnsi="Times New Roman" w:eastAsia="Times New Roman" w:cs="Times New Roman"/>
-          <w:b w:val="0"/>
-          <w:sz w:val="21"/>
-          <w:vertAlign w:val="superscript"/>
-        </w:rPr>
-        <w:t>-</w:t>
-      </w:r>
-      <w:r>
-        <w:rPr>
-          <w:rFonts w:ascii="Times New Roman" w:hAnsi="Times New Roman" w:eastAsia="Times New Roman" w:cs="Times New Roman"/>
-          <w:b w:val="0"/>
-          <w:sz w:val="21"/>
-          <w:vertAlign w:val="superscript"/>
-        </w:rPr>
-        <w:fldChar w:fldCharType="begin"/>
-        <w:instrText xml:space="preserve">REF ref_013 \h</w:instrText>
-        <w:fldChar w:fldCharType="separate"/>
-        <w:t>13</w:t>
-        <w:fldChar w:fldCharType="end"/>
-      </w:r>
-      <w:r>
-        <w:rPr>
-          <w:rFonts w:ascii="Times New Roman" w:hAnsi="Times New Roman" w:eastAsia="Times New Roman" w:cs="Times New Roman"/>
-          <w:b w:val="0"/>
-          <w:sz w:val="21"/>
-          <w:vertAlign w:val="superscript"/>
-        </w:rPr>
-        <w:t>,</w:t>
-      </w:r>
-      <w:r>
-        <w:rPr>
-          <w:rFonts w:ascii="Times New Roman" w:hAnsi="Times New Roman" w:eastAsia="Times New Roman" w:cs="Times New Roman"/>
-          <w:b w:val="0"/>
-          <w:sz w:val="21"/>
-          <w:vertAlign w:val="superscript"/>
-        </w:rPr>
-        <w:fldChar w:fldCharType="begin"/>
-        <w:instrText xml:space="preserve">REF ref_023 \h</w:instrText>
-        <w:fldChar w:fldCharType="separate"/>
-        <w:t>23</w:t>
-        <w:fldChar w:fldCharType="end"/>
-      </w:r>
-      <w:r>
-        <w:rPr>
-          <w:rFonts w:ascii="Times New Roman" w:hAnsi="Times New Roman" w:eastAsia="Times New Roman" w:cs="Times New Roman"/>
-          <w:b w:val="0"/>
-          <w:sz w:val="21"/>
-          <w:vertAlign w:val="superscript"/>
-        </w:rPr>
-        <w:t>-</w:t>
-      </w:r>
-      <w:r>
-        <w:rPr>
-          <w:rFonts w:ascii="Times New Roman" w:hAnsi="Times New Roman" w:eastAsia="Times New Roman" w:cs="Times New Roman"/>
-          <w:b w:val="0"/>
-          <w:sz w:val="21"/>
-          <w:vertAlign w:val="superscript"/>
-        </w:rPr>
-        <w:fldChar w:fldCharType="begin"/>
-        <w:instrText xml:space="preserve">REF ref_024 \h</w:instrText>
-        <w:fldChar w:fldCharType="separate"/>
-        <w:t>24</w:t>
-        <w:fldChar w:fldCharType="end"/>
-      </w:r>
-      <w:r>
-        <w:rPr>
-          <w:rFonts w:ascii="Times New Roman" w:hAnsi="Times New Roman" w:eastAsia="Times New Roman" w:cs="Times New Roman"/>
-          <w:b w:val="0"/>
-          <w:sz w:val="21"/>
-          <w:vertAlign w:val="superscript"/>
-        </w:rPr>
-        <w:t>]</w:t>
-      </w:r>
-      <w:r>
-        <w:rPr>
-          <w:rFonts w:ascii="宋体" w:hAnsi="宋体" w:eastAsia="宋体" w:cs="宋体"/>
-          <w:b w:val="0"/>
-          <w:sz w:val="21"/>
-        </w:rPr>
         <w:t>。</w:t>
       </w:r>
     </w:p>
@@ -6163,644 +5038,7 @@
           <w:b w:val="0"/>
           <w:sz w:val="21"/>
         </w:rPr>
-        <w:t>从方法选择上看，RAG、ReAct、AutoGen 和 LangGraph 关注的问题并不相同。RAG 解决“回答时能否利用外部知识”的问题</w:t>
-      </w:r>
-      <w:r>
-        <w:rPr>
-          <w:rFonts w:ascii="Times New Roman" w:hAnsi="Times New Roman" w:eastAsia="Times New Roman" w:cs="Times New Roman"/>
-          <w:b w:val="0"/>
-          <w:sz w:val="21"/>
-          <w:vertAlign w:val="superscript"/>
-        </w:rPr>
-        <w:t>[</w:t>
-      </w:r>
-      <w:r>
-        <w:rPr>
-          <w:rFonts w:ascii="Times New Roman" w:hAnsi="Times New Roman" w:eastAsia="Times New Roman" w:cs="Times New Roman"/>
-          <w:b w:val="0"/>
-          <w:sz w:val="21"/>
-          <w:vertAlign w:val="superscript"/>
-        </w:rPr>
-        <w:fldChar w:fldCharType="begin"/>
-        <w:instrText xml:space="preserve">REF ref_019 \h</w:instrText>
-        <w:fldChar w:fldCharType="separate"/>
-        <w:t>19</w:t>
-        <w:fldChar w:fldCharType="end"/>
-      </w:r>
-      <w:r>
-        <w:rPr>
-          <w:rFonts w:ascii="Times New Roman" w:hAnsi="Times New Roman" w:eastAsia="Times New Roman" w:cs="Times New Roman"/>
-          <w:b w:val="0"/>
-          <w:sz w:val="21"/>
-          <w:vertAlign w:val="superscript"/>
-        </w:rPr>
-        <w:t>]</w:t>
-      </w:r>
-      <w:r>
-        <w:rPr>
-          <w:rFonts w:ascii="宋体" w:hAnsi="宋体" w:eastAsia="宋体" w:cs="宋体"/>
-          <w:b w:val="0"/>
-          <w:sz w:val="21"/>
-        </w:rPr>
-        <w:t>，ReAct 解决“模型能否交替推理和行动”的问题</w:t>
-      </w:r>
-      <w:r>
-        <w:rPr>
-          <w:rFonts w:ascii="Times New Roman" w:hAnsi="Times New Roman" w:eastAsia="Times New Roman" w:cs="Times New Roman"/>
-          <w:b w:val="0"/>
-          <w:sz w:val="21"/>
-          <w:vertAlign w:val="superscript"/>
-        </w:rPr>
-        <w:t>[</w:t>
-      </w:r>
-      <w:r>
-        <w:rPr>
-          <w:rFonts w:ascii="Times New Roman" w:hAnsi="Times New Roman" w:eastAsia="Times New Roman" w:cs="Times New Roman"/>
-          <w:b w:val="0"/>
-          <w:sz w:val="21"/>
-          <w:vertAlign w:val="superscript"/>
-        </w:rPr>
-        <w:fldChar w:fldCharType="begin"/>
-        <w:instrText xml:space="preserve">REF ref_020 \h</w:instrText>
-        <w:fldChar w:fldCharType="separate"/>
-        <w:t>20</w:t>
-        <w:fldChar w:fldCharType="end"/>
-      </w:r>
-      <w:r>
-        <w:rPr>
-          <w:rFonts w:ascii="Times New Roman" w:hAnsi="Times New Roman" w:eastAsia="Times New Roman" w:cs="Times New Roman"/>
-          <w:b w:val="0"/>
-          <w:sz w:val="21"/>
-          <w:vertAlign w:val="superscript"/>
-        </w:rPr>
-        <w:t>]</w:t>
-      </w:r>
-      <w:r>
-        <w:rPr>
-          <w:rFonts w:ascii="宋体" w:hAnsi="宋体" w:eastAsia="宋体" w:cs="宋体"/>
-          <w:b w:val="0"/>
-          <w:sz w:val="21"/>
-        </w:rPr>
-        <w:t>，AutoGen 解决“多个 Agent 如何通过会话协作”的问题</w:t>
-      </w:r>
-      <w:r>
-        <w:rPr>
-          <w:rFonts w:ascii="Times New Roman" w:hAnsi="Times New Roman" w:eastAsia="Times New Roman" w:cs="Times New Roman"/>
-          <w:b w:val="0"/>
-          <w:sz w:val="21"/>
-          <w:vertAlign w:val="superscript"/>
-        </w:rPr>
-        <w:t>[</w:t>
-      </w:r>
-      <w:r>
-        <w:rPr>
-          <w:rFonts w:ascii="Times New Roman" w:hAnsi="Times New Roman" w:eastAsia="Times New Roman" w:cs="Times New Roman"/>
-          <w:b w:val="0"/>
-          <w:sz w:val="21"/>
-          <w:vertAlign w:val="superscript"/>
-        </w:rPr>
-        <w:fldChar w:fldCharType="begin"/>
-        <w:instrText xml:space="preserve">REF ref_021 \h</w:instrText>
-        <w:fldChar w:fldCharType="separate"/>
-        <w:t>21</w:t>
-        <w:fldChar w:fldCharType="end"/>
-      </w:r>
-      <w:r>
-        <w:rPr>
-          <w:rFonts w:ascii="Times New Roman" w:hAnsi="Times New Roman" w:eastAsia="Times New Roman" w:cs="Times New Roman"/>
-          <w:b w:val="0"/>
-          <w:sz w:val="21"/>
-          <w:vertAlign w:val="superscript"/>
-        </w:rPr>
-        <w:t>]</w:t>
-      </w:r>
-      <w:r>
-        <w:rPr>
-          <w:rFonts w:ascii="宋体" w:hAnsi="宋体" w:eastAsia="宋体" w:cs="宋体"/>
-          <w:b w:val="0"/>
-          <w:sz w:val="21"/>
-        </w:rPr>
-        <w:t>，LangGraph 则更强调长运行、有状态、可持久化和可观测的工作流</w:t>
-      </w:r>
-      <w:r>
-        <w:rPr>
-          <w:rFonts w:ascii="Times New Roman" w:hAnsi="Times New Roman" w:eastAsia="Times New Roman" w:cs="Times New Roman"/>
-          <w:b w:val="0"/>
-          <w:sz w:val="21"/>
-          <w:vertAlign w:val="superscript"/>
-        </w:rPr>
-        <w:t>[</w:t>
-      </w:r>
-      <w:r>
-        <w:rPr>
-          <w:rFonts w:ascii="Times New Roman" w:hAnsi="Times New Roman" w:eastAsia="Times New Roman" w:cs="Times New Roman"/>
-          <w:b w:val="0"/>
-          <w:sz w:val="21"/>
-          <w:vertAlign w:val="superscript"/>
-        </w:rPr>
-        <w:fldChar w:fldCharType="begin"/>
-        <w:instrText xml:space="preserve">REF ref_022 \h</w:instrText>
-        <w:fldChar w:fldCharType="separate"/>
-        <w:t>22</w:t>
-        <w:fldChar w:fldCharType="end"/>
-      </w:r>
-      <w:r>
-        <w:rPr>
-          <w:rFonts w:ascii="Times New Roman" w:hAnsi="Times New Roman" w:eastAsia="Times New Roman" w:cs="Times New Roman"/>
-          <w:b w:val="0"/>
-          <w:sz w:val="21"/>
-          <w:vertAlign w:val="superscript"/>
-        </w:rPr>
-        <w:t>]</w:t>
-      </w:r>
-      <w:r>
-        <w:rPr>
-          <w:rFonts w:ascii="宋体" w:hAnsi="宋体" w:eastAsia="宋体" w:cs="宋体"/>
-          <w:b w:val="0"/>
-          <w:sz w:val="21"/>
-        </w:rPr>
-        <w:t>。本文选择 LangGraph 作为综合审计报告主流程，并不是否定其他方法，而是因为医疗审计需要保存状态、事件、证据和回退路径。</w:t>
-      </w:r>
-    </w:p>
-    <w:p>
-      <w:r>
-        <w:br w:type="page"/>
-      </w:r>
-    </w:p>
-    <w:p>
-      <w:pPr>
-        <w:spacing w:before="0" w:after="60" w:line="360" w:lineRule="exact"/>
-        <w:jc w:val="center"/>
-      </w:pPr>
-      <w:r>
-        <w:rPr>
-          <w:rFonts w:ascii="宋体" w:hAnsi="宋体" w:eastAsia="宋体" w:cs="宋体"/>
-          <w:b/>
-          <w:sz w:val="21"/>
-        </w:rPr>
-        <w:t>表2-2 Agent 工作流相关方法对比</w:t>
-      </w:r>
-    </w:p>
-    <w:tbl>
-      <w:tblPr>
-        <w:tblStyle w:val="TableGrid"/>
-        <w:tblW w:type="auto" w:w="0"/>
-        <w:jc w:val="center"/>
-        <w:tblLayout w:type="autofit"/>
-        <w:tblLook w:firstColumn="1" w:firstRow="1" w:lastColumn="0" w:lastRow="0" w:noHBand="0" w:noVBand="1" w:val="04A0"/>
-      </w:tblPr>
-      <w:tblGrid>
-        <w:gridCol w:w="2197"/>
-        <w:gridCol w:w="2197"/>
-        <w:gridCol w:w="2197"/>
-        <w:gridCol w:w="2197"/>
-      </w:tblGrid>
-      <w:tr>
-        <w:tc>
-          <w:tcPr>
-            <w:tcW w:type="dxa" w:w="2197"/>
-            <w:vAlign w:val="center"/>
-            <w:shd w:fill="FFFFFF"/>
-          </w:tcPr>
-          <w:p>
-            <w:pPr>
-              <w:spacing w:before="0" w:after="0" w:line="360" w:lineRule="exact"/>
-              <w:jc w:val="center"/>
-            </w:pPr>
-            <w:r/>
-            <w:r>
-              <w:rPr>
-                <w:rFonts w:ascii="宋体" w:hAnsi="宋体" w:eastAsia="宋体" w:cs="宋体"/>
-                <w:b/>
-                <w:sz w:val="19"/>
-              </w:rPr>
-              <w:t>方法</w:t>
-            </w:r>
-          </w:p>
-        </w:tc>
-        <w:tc>
-          <w:tcPr>
-            <w:tcW w:type="dxa" w:w="2197"/>
-            <w:vAlign w:val="center"/>
-            <w:shd w:fill="FFFFFF"/>
-          </w:tcPr>
-          <w:p>
-            <w:pPr>
-              <w:spacing w:before="0" w:after="0" w:line="360" w:lineRule="exact"/>
-              <w:jc w:val="center"/>
-            </w:pPr>
-            <w:r/>
-            <w:r>
-              <w:rPr>
-                <w:rFonts w:ascii="宋体" w:hAnsi="宋体" w:eastAsia="宋体" w:cs="宋体"/>
-                <w:b/>
-                <w:sz w:val="19"/>
-              </w:rPr>
-              <w:t>核心思想</w:t>
-            </w:r>
-          </w:p>
-        </w:tc>
-        <w:tc>
-          <w:tcPr>
-            <w:tcW w:type="dxa" w:w="2197"/>
-            <w:vAlign w:val="center"/>
-            <w:shd w:fill="FFFFFF"/>
-          </w:tcPr>
-          <w:p>
-            <w:pPr>
-              <w:spacing w:before="0" w:after="0" w:line="360" w:lineRule="exact"/>
-              <w:jc w:val="center"/>
-            </w:pPr>
-            <w:r/>
-            <w:r>
-              <w:rPr>
-                <w:rFonts w:ascii="宋体" w:hAnsi="宋体" w:eastAsia="宋体" w:cs="宋体"/>
-                <w:b/>
-                <w:sz w:val="19"/>
-              </w:rPr>
-              <w:t>适用特点</w:t>
-            </w:r>
-          </w:p>
-        </w:tc>
-        <w:tc>
-          <w:tcPr>
-            <w:tcW w:type="dxa" w:w="2197"/>
-            <w:vAlign w:val="center"/>
-            <w:shd w:fill="FFFFFF"/>
-          </w:tcPr>
-          <w:p>
-            <w:pPr>
-              <w:spacing w:before="0" w:after="0" w:line="360" w:lineRule="exact"/>
-              <w:jc w:val="center"/>
-            </w:pPr>
-            <w:r/>
-            <w:r>
-              <w:rPr>
-                <w:rFonts w:ascii="宋体" w:hAnsi="宋体" w:eastAsia="宋体" w:cs="宋体"/>
-                <w:b/>
-                <w:sz w:val="19"/>
-              </w:rPr>
-              <w:t>本文采用方式</w:t>
-            </w:r>
-          </w:p>
-        </w:tc>
-      </w:tr>
-      <w:tr>
-        <w:tc>
-          <w:tcPr>
-            <w:tcW w:type="dxa" w:w="2197"/>
-            <w:vAlign w:val="center"/>
-          </w:tcPr>
-          <w:p>
-            <w:pPr>
-              <w:spacing w:before="0" w:after="0" w:line="360" w:lineRule="exact"/>
-            </w:pPr>
-            <w:r/>
-            <w:r>
-              <w:rPr>
-                <w:rFonts w:ascii="宋体" w:hAnsi="宋体" w:eastAsia="宋体" w:cs="宋体"/>
-                <w:b w:val="0"/>
-                <w:sz w:val="19"/>
-              </w:rPr>
-              <w:t>RAG</w:t>
-            </w:r>
-          </w:p>
-        </w:tc>
-        <w:tc>
-          <w:tcPr>
-            <w:tcW w:type="dxa" w:w="2197"/>
-            <w:vAlign w:val="center"/>
-          </w:tcPr>
-          <w:p>
-            <w:pPr>
-              <w:spacing w:before="0" w:after="0" w:line="360" w:lineRule="exact"/>
-            </w:pPr>
-            <w:r/>
-            <w:r>
-              <w:rPr>
-                <w:rFonts w:ascii="宋体" w:hAnsi="宋体" w:eastAsia="宋体" w:cs="宋体"/>
-                <w:b w:val="0"/>
-                <w:sz w:val="19"/>
-              </w:rPr>
-              <w:t>外部知识检索与生成结合</w:t>
-            </w:r>
-          </w:p>
-        </w:tc>
-        <w:tc>
-          <w:tcPr>
-            <w:tcW w:type="dxa" w:w="2197"/>
-            <w:vAlign w:val="center"/>
-          </w:tcPr>
-          <w:p>
-            <w:pPr>
-              <w:spacing w:before="0" w:after="0" w:line="360" w:lineRule="exact"/>
-            </w:pPr>
-            <w:r/>
-            <w:r>
-              <w:rPr>
-                <w:rFonts w:ascii="宋体" w:hAnsi="宋体" w:eastAsia="宋体" w:cs="宋体"/>
-                <w:b w:val="0"/>
-                <w:sz w:val="19"/>
-              </w:rPr>
-              <w:t>可提供知识来源，缓解纯参数模型事实性不足</w:t>
-            </w:r>
-          </w:p>
-        </w:tc>
-        <w:tc>
-          <w:tcPr>
-            <w:tcW w:type="dxa" w:w="2197"/>
-            <w:vAlign w:val="center"/>
-          </w:tcPr>
-          <w:p>
-            <w:pPr>
-              <w:spacing w:before="0" w:after="0" w:line="360" w:lineRule="exact"/>
-            </w:pPr>
-            <w:r/>
-            <w:r>
-              <w:rPr>
-                <w:rFonts w:ascii="宋体" w:hAnsi="宋体" w:eastAsia="宋体" w:cs="宋体"/>
-                <w:b w:val="0"/>
-                <w:sz w:val="19"/>
-              </w:rPr>
-              <w:t>用于 knowledge_retrieval_agent 和报告知识来源展示</w:t>
-            </w:r>
-          </w:p>
-        </w:tc>
-      </w:tr>
-      <w:tr>
-        <w:tc>
-          <w:tcPr>
-            <w:tcW w:type="dxa" w:w="2197"/>
-            <w:vAlign w:val="center"/>
-          </w:tcPr>
-          <w:p>
-            <w:pPr>
-              <w:spacing w:before="0" w:after="0" w:line="360" w:lineRule="exact"/>
-            </w:pPr>
-            <w:r/>
-            <w:r>
-              <w:rPr>
-                <w:rFonts w:ascii="宋体" w:hAnsi="宋体" w:eastAsia="宋体" w:cs="宋体"/>
-                <w:b w:val="0"/>
-                <w:sz w:val="19"/>
-              </w:rPr>
-              <w:t>ReAct</w:t>
-            </w:r>
-          </w:p>
-        </w:tc>
-        <w:tc>
-          <w:tcPr>
-            <w:tcW w:type="dxa" w:w="2197"/>
-            <w:vAlign w:val="center"/>
-          </w:tcPr>
-          <w:p>
-            <w:pPr>
-              <w:spacing w:before="0" w:after="0" w:line="360" w:lineRule="exact"/>
-            </w:pPr>
-            <w:r/>
-            <w:r>
-              <w:rPr>
-                <w:rFonts w:ascii="宋体" w:hAnsi="宋体" w:eastAsia="宋体" w:cs="宋体"/>
-                <w:b w:val="0"/>
-                <w:sz w:val="19"/>
-              </w:rPr>
-              <w:t>推理轨迹与外部行动交替</w:t>
-            </w:r>
-          </w:p>
-        </w:tc>
-        <w:tc>
-          <w:tcPr>
-            <w:tcW w:type="dxa" w:w="2197"/>
-            <w:vAlign w:val="center"/>
-          </w:tcPr>
-          <w:p>
-            <w:pPr>
-              <w:spacing w:before="0" w:after="0" w:line="360" w:lineRule="exact"/>
-            </w:pPr>
-            <w:r/>
-            <w:r>
-              <w:rPr>
-                <w:rFonts w:ascii="宋体" w:hAnsi="宋体" w:eastAsia="宋体" w:cs="宋体"/>
-                <w:b w:val="0"/>
-                <w:sz w:val="19"/>
-              </w:rPr>
-              <w:t>适合需要查询、工具调用和环境反馈的任务</w:t>
-            </w:r>
-          </w:p>
-        </w:tc>
-        <w:tc>
-          <w:tcPr>
-            <w:tcW w:type="dxa" w:w="2197"/>
-            <w:vAlign w:val="center"/>
-          </w:tcPr>
-          <w:p>
-            <w:pPr>
-              <w:spacing w:before="0" w:after="0" w:line="360" w:lineRule="exact"/>
-            </w:pPr>
-            <w:r/>
-            <w:r>
-              <w:rPr>
-                <w:rFonts w:ascii="宋体" w:hAnsi="宋体" w:eastAsia="宋体" w:cs="宋体"/>
-                <w:b w:val="0"/>
-                <w:sz w:val="19"/>
-              </w:rPr>
-              <w:t>用于理解审计节点需要先查询、再生成、再复核的流程思想</w:t>
-            </w:r>
-          </w:p>
-        </w:tc>
-      </w:tr>
-      <w:tr>
-        <w:tc>
-          <w:tcPr>
-            <w:tcW w:type="dxa" w:w="2197"/>
-            <w:vAlign w:val="center"/>
-          </w:tcPr>
-          <w:p>
-            <w:pPr>
-              <w:spacing w:before="0" w:after="0" w:line="360" w:lineRule="exact"/>
-            </w:pPr>
-            <w:r/>
-            <w:r>
-              <w:rPr>
-                <w:rFonts w:ascii="宋体" w:hAnsi="宋体" w:eastAsia="宋体" w:cs="宋体"/>
-                <w:b w:val="0"/>
-                <w:sz w:val="19"/>
-              </w:rPr>
-              <w:t>AutoGen</w:t>
-            </w:r>
-          </w:p>
-        </w:tc>
-        <w:tc>
-          <w:tcPr>
-            <w:tcW w:type="dxa" w:w="2197"/>
-            <w:vAlign w:val="center"/>
-          </w:tcPr>
-          <w:p>
-            <w:pPr>
-              <w:spacing w:before="0" w:after="0" w:line="360" w:lineRule="exact"/>
-            </w:pPr>
-            <w:r/>
-            <w:r>
-              <w:rPr>
-                <w:rFonts w:ascii="宋体" w:hAnsi="宋体" w:eastAsia="宋体" w:cs="宋体"/>
-                <w:b w:val="0"/>
-                <w:sz w:val="19"/>
-              </w:rPr>
-              <w:t>多 Agent 会话协作</w:t>
-            </w:r>
-          </w:p>
-        </w:tc>
-        <w:tc>
-          <w:tcPr>
-            <w:tcW w:type="dxa" w:w="2197"/>
-            <w:vAlign w:val="center"/>
-          </w:tcPr>
-          <w:p>
-            <w:pPr>
-              <w:spacing w:before="0" w:after="0" w:line="360" w:lineRule="exact"/>
-            </w:pPr>
-            <w:r/>
-            <w:r>
-              <w:rPr>
-                <w:rFonts w:ascii="宋体" w:hAnsi="宋体" w:eastAsia="宋体" w:cs="宋体"/>
-                <w:b w:val="0"/>
-                <w:sz w:val="19"/>
-              </w:rPr>
-              <w:t>适合开放式复杂任务和多角色对话</w:t>
-            </w:r>
-          </w:p>
-        </w:tc>
-        <w:tc>
-          <w:tcPr>
-            <w:tcW w:type="dxa" w:w="2197"/>
-            <w:vAlign w:val="center"/>
-          </w:tcPr>
-          <w:p>
-            <w:pPr>
-              <w:spacing w:before="0" w:after="0" w:line="360" w:lineRule="exact"/>
-            </w:pPr>
-            <w:r/>
-            <w:r>
-              <w:rPr>
-                <w:rFonts w:ascii="宋体" w:hAnsi="宋体" w:eastAsia="宋体" w:cs="宋体"/>
-                <w:b w:val="0"/>
-                <w:sz w:val="19"/>
-              </w:rPr>
-              <w:t>借鉴职责拆分思想，但不采用完全开放对话</w:t>
-            </w:r>
-          </w:p>
-        </w:tc>
-      </w:tr>
-      <w:tr>
-        <w:tc>
-          <w:tcPr>
-            <w:tcW w:type="dxa" w:w="2197"/>
-            <w:vAlign w:val="center"/>
-          </w:tcPr>
-          <w:p>
-            <w:pPr>
-              <w:spacing w:before="0" w:after="0" w:line="360" w:lineRule="exact"/>
-            </w:pPr>
-            <w:r/>
-            <w:r>
-              <w:rPr>
-                <w:rFonts w:ascii="宋体" w:hAnsi="宋体" w:eastAsia="宋体" w:cs="宋体"/>
-                <w:b w:val="0"/>
-                <w:sz w:val="19"/>
-              </w:rPr>
-              <w:t>LangGraph</w:t>
-            </w:r>
-          </w:p>
-        </w:tc>
-        <w:tc>
-          <w:tcPr>
-            <w:tcW w:type="dxa" w:w="2197"/>
-            <w:vAlign w:val="center"/>
-          </w:tcPr>
-          <w:p>
-            <w:pPr>
-              <w:spacing w:before="0" w:after="0" w:line="360" w:lineRule="exact"/>
-            </w:pPr>
-            <w:r/>
-            <w:r>
-              <w:rPr>
-                <w:rFonts w:ascii="宋体" w:hAnsi="宋体" w:eastAsia="宋体" w:cs="宋体"/>
-                <w:b w:val="0"/>
-                <w:sz w:val="19"/>
-              </w:rPr>
-              <w:t>状态图、条件边和持久化工作流</w:t>
-            </w:r>
-          </w:p>
-        </w:tc>
-        <w:tc>
-          <w:tcPr>
-            <w:tcW w:type="dxa" w:w="2197"/>
-            <w:vAlign w:val="center"/>
-          </w:tcPr>
-          <w:p>
-            <w:pPr>
-              <w:spacing w:before="0" w:after="0" w:line="360" w:lineRule="exact"/>
-            </w:pPr>
-            <w:r/>
-            <w:r>
-              <w:rPr>
-                <w:rFonts w:ascii="宋体" w:hAnsi="宋体" w:eastAsia="宋体" w:cs="宋体"/>
-                <w:b w:val="0"/>
-                <w:sz w:val="19"/>
-              </w:rPr>
-              <w:t>适合长运行、有状态、可回环、可观察的 Agent 流程</w:t>
-            </w:r>
-          </w:p>
-        </w:tc>
-        <w:tc>
-          <w:tcPr>
-            <w:tcW w:type="dxa" w:w="2197"/>
-            <w:vAlign w:val="center"/>
-          </w:tcPr>
-          <w:p>
-            <w:pPr>
-              <w:spacing w:before="0" w:after="0" w:line="360" w:lineRule="exact"/>
-            </w:pPr>
-            <w:r/>
-            <w:r>
-              <w:rPr>
-                <w:rFonts w:ascii="宋体" w:hAnsi="宋体" w:eastAsia="宋体" w:cs="宋体"/>
-                <w:b w:val="0"/>
-                <w:sz w:val="19"/>
-              </w:rPr>
-              <w:t>作为综合审计报告核心编排方式</w:t>
-            </w:r>
-          </w:p>
-        </w:tc>
-      </w:tr>
-    </w:tbl>
-    <w:p/>
-    <w:p>
-      <w:pPr>
-        <w:spacing w:before="0" w:after="0" w:line="360" w:lineRule="exact"/>
-        <w:ind w:firstLine="420"/>
-      </w:pPr>
-      <w:r>
-        <w:rPr>
-          <w:rFonts w:ascii="宋体" w:hAnsi="宋体" w:eastAsia="宋体" w:cs="宋体"/>
-          <w:b w:val="0"/>
-          <w:sz w:val="21"/>
-        </w:rPr>
         <w:t>本文采用 LangGraph 的原因正来自上述需求。系统中的 document_quality_agent、timeline_builder、measurement_consistency_agent、risk_agent、knowledge_retrieval_agent、evidence_agent、conflict_agent、compliance_agent、report_composer、citation_checker 和 safety_reviewer 都围绕同一个 AuditGraphState 工作。每个节点只负责一个有限任务，路由节点根据 completed_agents、citation_issues、safety_issues、needs_report_revision 等字段决定下一步。相比 AutoGen 式的开放会话，本文更强调状态机可控性和审计可追溯性。</w:t>
-      </w:r>
-    </w:p>
-    <w:p>
-      <w:pPr>
-        <w:spacing w:before="0" w:after="0" w:line="360" w:lineRule="exact"/>
-        <w:ind w:firstLine="420"/>
-      </w:pPr>
-      <w:r>
-        <w:rPr>
-          <w:rFonts w:ascii="宋体" w:hAnsi="宋体" w:eastAsia="宋体" w:cs="宋体"/>
-          <w:b w:val="0"/>
-          <w:sz w:val="21"/>
-        </w:rPr>
-        <w:t>这种设计使“多 Agent”具有可解释的工程含义。本文中的 Agent 不是随机对话角色，而是能够在状态图中定位的处理节点；每个节点的输入来自 GraphState，输出写回 GraphState，执行过程写入 audit_report_events。前端展示的节点高亮、边流转和 visit_count 都来自后端真实事件。这样，论文中关于多 Agent 协作的描述能够对应数据库表、后端代码和页面截图，而不是停留在概念层面。</w:t>
       </w:r>
     </w:p>
     <w:p>
@@ -6897,7 +5135,7 @@
           <w:b/>
           <w:sz w:val="21"/>
         </w:rPr>
-        <w:t>表2-3 Provider 抽象及当前配置</w:t>
+        <w:t>表2-2 Provider 抽象及当前配置</w:t>
       </w:r>
     </w:p>
     <w:tbl>

</xml_diff>